<commit_message>
Adiciona novos campos do contrato
</commit_message>
<xml_diff>
--- a/contrato_padrao.docx
+++ b/contrato_padrao.docx
@@ -2189,7 +2189,6 @@
                 <w:rFonts w:asciiTheme="minorHAnsi" w:hAnsiTheme="minorHAnsi" w:cstheme="minorBidi"/>
                 <w:sz w:val="18"/>
                 <w:szCs w:val="18"/>
-                <w:highlight w:val="yellow"/>
               </w:rPr>
             </w:pPr>
             <w:r>
@@ -2197,9 +2196,24 @@
                 <w:rFonts w:asciiTheme="minorHAnsi" w:hAnsiTheme="minorHAnsi" w:cstheme="minorBidi"/>
                 <w:sz w:val="18"/>
                 <w:szCs w:val="18"/>
-                <w:highlight w:val="yellow"/>
-              </w:rPr>
-              <w:t>-</w:t>
+              </w:rPr>
+              <w:t>{{</w:t>
+            </w:r>
+            <w:r>
+              <w:rPr>
+                <w:rFonts w:asciiTheme="minorHAnsi" w:hAnsiTheme="minorHAnsi" w:cstheme="minorBidi"/>
+                <w:sz w:val="18"/>
+                <w:szCs w:val="18"/>
+              </w:rPr>
+              <w:t xml:space="preserve"> indicadores_qualidade </w:t>
+            </w:r>
+            <w:r>
+              <w:rPr>
+                <w:rFonts w:asciiTheme="minorHAnsi" w:hAnsiTheme="minorHAnsi" w:cstheme="minorBidi"/>
+                <w:sz w:val="18"/>
+                <w:szCs w:val="18"/>
+              </w:rPr>
+              <w:t>}}</w:t>
             </w:r>
           </w:p>
         </w:tc>
@@ -2338,9 +2352,32 @@
                 <w:rFonts w:asciiTheme="minorHAnsi" w:hAnsiTheme="minorHAnsi" w:cstheme="minorBidi"/>
                 <w:sz w:val="18"/>
                 <w:szCs w:val="18"/>
-                <w:highlight w:val="yellow"/>
-              </w:rPr>
-              <w:t>-</w:t>
+              </w:rPr>
+              <w:t>{{</w:t>
+            </w:r>
+            <w:r>
+              <w:rPr>
+                <w:rFonts w:asciiTheme="minorHAnsi" w:hAnsiTheme="minorHAnsi" w:cstheme="minorBidi"/>
+                <w:sz w:val="18"/>
+                <w:szCs w:val="18"/>
+              </w:rPr>
+              <w:t xml:space="preserve"> qualidade_energia</w:t>
+            </w:r>
+            <w:r>
+              <w:rPr>
+                <w:rFonts w:asciiTheme="minorHAnsi" w:hAnsiTheme="minorHAnsi" w:cstheme="minorBidi"/>
+                <w:sz w:val="18"/>
+                <w:szCs w:val="18"/>
+              </w:rPr>
+              <w:t xml:space="preserve"> </w:t>
+            </w:r>
+            <w:r>
+              <w:rPr>
+                <w:rFonts w:asciiTheme="minorHAnsi" w:hAnsiTheme="minorHAnsi" w:cstheme="minorBidi"/>
+                <w:sz w:val="18"/>
+                <w:szCs w:val="18"/>
+              </w:rPr>
+              <w:t>}}</w:t>
             </w:r>
           </w:p>
         </w:tc>
@@ -3120,7 +3157,6 @@
                 <w:color w:val="auto"/>
                 <w:sz w:val="20"/>
                 <w:szCs w:val="20"/>
-                <w:highlight w:val="yellow"/>
               </w:rPr>
             </w:pPr>
             <w:r>
@@ -3129,7 +3165,6 @@
                 <w:color w:val="auto"/>
                 <w:sz w:val="20"/>
                 <w:szCs w:val="20"/>
-                <w:highlight w:val="yellow"/>
               </w:rPr>
               <w:t xml:space="preserve"> </w:t>
             </w:r>
@@ -3139,9 +3174,8 @@
                 <w:color w:val="auto"/>
                 <w:sz w:val="20"/>
                 <w:szCs w:val="20"/>
-                <w:highlight w:val="yellow"/>
-              </w:rPr>
-              <w:t>XX</w:t>
+              </w:rPr>
+              <w:t xml:space="preserve">{{ </w:t>
             </w:r>
             <w:r>
               <w:rPr>
@@ -3149,9 +3183,8 @@
                 <w:color w:val="auto"/>
                 <w:sz w:val="20"/>
                 <w:szCs w:val="20"/>
-                <w:highlight w:val="yellow"/>
-              </w:rPr>
-              <w:t>/</w:t>
+              </w:rPr>
+              <w:t>data_pagamento_implantacao</w:t>
             </w:r>
             <w:r>
               <w:rPr>
@@ -3159,49 +3192,8 @@
                 <w:color w:val="auto"/>
                 <w:sz w:val="20"/>
                 <w:szCs w:val="20"/>
-                <w:highlight w:val="yellow"/>
-              </w:rPr>
-              <w:t>XX</w:t>
-            </w:r>
-            <w:r>
-              <w:rPr>
-                <w:rFonts w:asciiTheme="minorHAnsi" w:hAnsiTheme="minorHAnsi" w:cstheme="minorBidi"/>
-                <w:color w:val="auto"/>
-                <w:sz w:val="20"/>
-                <w:szCs w:val="20"/>
-                <w:highlight w:val="yellow"/>
-              </w:rPr>
-              <w:t>/202</w:t>
-            </w:r>
-            <w:r>
-              <w:rPr>
-                <w:rFonts w:asciiTheme="minorHAnsi" w:hAnsiTheme="minorHAnsi" w:cstheme="minorBidi"/>
-                <w:color w:val="auto"/>
-                <w:sz w:val="20"/>
-                <w:szCs w:val="20"/>
-                <w:highlight w:val="yellow"/>
-              </w:rPr>
-              <w:t>X</w:t>
-            </w:r>
-            <w:r>
-              <w:rPr>
-                <w:rFonts w:asciiTheme="minorHAnsi" w:hAnsiTheme="minorHAnsi" w:cstheme="minorBidi"/>
-                <w:color w:val="auto"/>
-                <w:sz w:val="20"/>
-                <w:szCs w:val="20"/>
-                <w:highlight w:val="yellow"/>
-              </w:rPr>
-              <w:t xml:space="preserve"> </w:t>
-            </w:r>
-            <w:r>
-              <w:rPr>
-                <w:rFonts w:asciiTheme="minorHAnsi" w:hAnsiTheme="minorHAnsi" w:cstheme="minorBidi"/>
-                <w:color w:val="auto"/>
-                <w:sz w:val="20"/>
-                <w:szCs w:val="20"/>
-                <w:highlight w:val="yellow"/>
-              </w:rPr>
-              <w:t xml:space="preserve">                                           </w:t>
+              </w:rPr>
+              <w:t xml:space="preserve"> }}</w:t>
             </w:r>
           </w:p>
         </w:tc>
@@ -3317,7 +3309,6 @@
                 <w:color w:val="auto"/>
                 <w:sz w:val="20"/>
                 <w:szCs w:val="20"/>
-                <w:highlight w:val="yellow"/>
               </w:rPr>
               <w:t xml:space="preserve"> </w:t>
             </w:r>
@@ -3327,9 +3318,8 @@
                 <w:color w:val="auto"/>
                 <w:sz w:val="20"/>
                 <w:szCs w:val="20"/>
-                <w:highlight w:val="yellow"/>
-              </w:rPr>
-              <w:t>XX</w:t>
+              </w:rPr>
+              <w:t xml:space="preserve">{{ </w:t>
             </w:r>
             <w:r>
               <w:rPr>
@@ -3337,9 +3327,8 @@
                 <w:color w:val="auto"/>
                 <w:sz w:val="20"/>
                 <w:szCs w:val="20"/>
-                <w:highlight w:val="yellow"/>
-              </w:rPr>
-              <w:t>/</w:t>
+              </w:rPr>
+              <w:t>data_pagamento_</w:t>
             </w:r>
             <w:r>
               <w:rPr>
@@ -3347,9 +3336,8 @@
                 <w:color w:val="auto"/>
                 <w:sz w:val="20"/>
                 <w:szCs w:val="20"/>
-                <w:highlight w:val="yellow"/>
-              </w:rPr>
-              <w:t>XX</w:t>
+              </w:rPr>
+              <w:t>primeira_cobranca</w:t>
             </w:r>
             <w:r>
               <w:rPr>
@@ -3357,19 +3345,8 @@
                 <w:color w:val="auto"/>
                 <w:sz w:val="20"/>
                 <w:szCs w:val="20"/>
-                <w:highlight w:val="yellow"/>
-              </w:rPr>
-              <w:t>/202</w:t>
-            </w:r>
-            <w:r>
-              <w:rPr>
-                <w:rFonts w:asciiTheme="minorHAnsi" w:hAnsiTheme="minorHAnsi" w:cstheme="minorBidi"/>
-                <w:color w:val="auto"/>
-                <w:sz w:val="20"/>
-                <w:szCs w:val="20"/>
-                <w:highlight w:val="yellow"/>
-              </w:rPr>
-              <w:t>X</w:t>
+              </w:rPr>
+              <w:t xml:space="preserve"> }}</w:t>
             </w:r>
           </w:p>
         </w:tc>
@@ -3463,8 +3440,9 @@
                 <w:szCs w:val="20"/>
                 <w:lang w:val="en-US"/>
               </w:rPr>
-              <w:t>EMAIL|</w:t>
-            </w:r>
+              <w:t>EMAIL</w:t>
+            </w:r>
+            <w:proofErr w:type="gramStart"/>
             <w:r>
               <w:rPr>
                 <w:rFonts w:asciiTheme="minorHAnsi" w:hAnsiTheme="minorHAnsi" w:cstheme="minorBidi"/>
@@ -3473,7 +3451,7 @@
                 <w:szCs w:val="20"/>
                 <w:lang w:val="en-US"/>
               </w:rPr>
-              <w:t xml:space="preserve"> </w:t>
+              <w:t>|</w:t>
             </w:r>
             <w:r>
               <w:rPr>
@@ -3481,10 +3459,46 @@
                 <w:color w:val="auto"/>
                 <w:sz w:val="20"/>
                 <w:szCs w:val="20"/>
-                <w:highlight w:val="yellow"/>
                 <w:lang w:val="en-US"/>
               </w:rPr>
-              <w:t>XXXX</w:t>
+              <w:t xml:space="preserve"> </w:t>
+            </w:r>
+            <w:r>
+              <w:rPr>
+                <w:rFonts w:asciiTheme="minorHAnsi" w:hAnsiTheme="minorHAnsi" w:cstheme="minorBidi"/>
+                <w:color w:val="auto"/>
+                <w:sz w:val="20"/>
+                <w:szCs w:val="20"/>
+              </w:rPr>
+              <w:t xml:space="preserve"> {{ </w:t>
+            </w:r>
+            <w:r>
+              <w:rPr>
+                <w:rFonts w:asciiTheme="minorHAnsi" w:hAnsiTheme="minorHAnsi" w:cstheme="minorBidi"/>
+                <w:color w:val="auto"/>
+                <w:sz w:val="20"/>
+                <w:szCs w:val="20"/>
+              </w:rPr>
+              <w:t>contato</w:t>
+            </w:r>
+            <w:proofErr w:type="gramEnd"/>
+            <w:r>
+              <w:rPr>
+                <w:rFonts w:asciiTheme="minorHAnsi" w:hAnsiTheme="minorHAnsi" w:cstheme="minorBidi"/>
+                <w:color w:val="auto"/>
+                <w:sz w:val="20"/>
+                <w:szCs w:val="20"/>
+              </w:rPr>
+              <w:t>_financeiro</w:t>
+            </w:r>
+            <w:r>
+              <w:rPr>
+                <w:rFonts w:asciiTheme="minorHAnsi" w:hAnsiTheme="minorHAnsi" w:cstheme="minorBidi"/>
+                <w:color w:val="auto"/>
+                <w:sz w:val="20"/>
+                <w:szCs w:val="20"/>
+              </w:rPr>
+              <w:t xml:space="preserve"> }}</w:t>
             </w:r>
           </w:p>
         </w:tc>
@@ -3557,7 +3571,6 @@
                 <w:color w:val="auto"/>
                 <w:sz w:val="20"/>
                 <w:szCs w:val="20"/>
-                <w:lang w:val="en-US"/>
               </w:rPr>
             </w:pPr>
             <w:r>
@@ -3566,7 +3579,6 @@
                 <w:color w:val="auto"/>
                 <w:sz w:val="20"/>
                 <w:szCs w:val="20"/>
-                <w:lang w:val="en-US"/>
               </w:rPr>
               <w:t xml:space="preserve"> </w:t>
             </w:r>
@@ -3576,7 +3588,6 @@
                 <w:color w:val="auto"/>
                 <w:sz w:val="20"/>
                 <w:szCs w:val="20"/>
-                <w:lang w:val="en-US"/>
               </w:rPr>
               <w:t>EMAIL|</w:t>
             </w:r>
@@ -3586,7 +3597,6 @@
                 <w:color w:val="auto"/>
                 <w:sz w:val="20"/>
                 <w:szCs w:val="20"/>
-                <w:lang w:val="en-US"/>
               </w:rPr>
               <w:t xml:space="preserve"> </w:t>
             </w:r>
@@ -3597,7 +3607,6 @@
                   <w:rFonts w:asciiTheme="minorHAnsi" w:hAnsiTheme="minorHAnsi" w:cstheme="minorBidi"/>
                   <w:sz w:val="20"/>
                   <w:szCs w:val="20"/>
-                  <w:lang w:val="en-US"/>
                 </w:rPr>
                 <w:t>gpo@gebras.com</w:t>
               </w:r>
@@ -3608,7 +3617,6 @@
                 <w:color w:val="auto"/>
                 <w:sz w:val="20"/>
                 <w:szCs w:val="20"/>
-                <w:lang w:val="en-US"/>
               </w:rPr>
               <w:t xml:space="preserve">; </w:t>
             </w:r>
@@ -3618,10 +3626,35 @@
                 <w:color w:val="auto"/>
                 <w:sz w:val="20"/>
                 <w:szCs w:val="20"/>
-                <w:highlight w:val="yellow"/>
-                <w:lang w:val="en-US"/>
-              </w:rPr>
-              <w:t>XXXX@gebras.com</w:t>
+              </w:rPr>
+              <w:t xml:space="preserve">{{ </w:t>
+            </w:r>
+            <w:r>
+              <w:rPr>
+                <w:rFonts w:asciiTheme="minorHAnsi" w:hAnsiTheme="minorHAnsi" w:cstheme="minorBidi"/>
+                <w:color w:val="auto"/>
+                <w:sz w:val="20"/>
+                <w:szCs w:val="20"/>
+              </w:rPr>
+              <w:t>contato</w:t>
+            </w:r>
+            <w:r>
+              <w:rPr>
+                <w:rFonts w:asciiTheme="minorHAnsi" w:hAnsiTheme="minorHAnsi" w:cstheme="minorBidi"/>
+                <w:color w:val="auto"/>
+                <w:sz w:val="20"/>
+                <w:szCs w:val="20"/>
+              </w:rPr>
+              <w:t>_gestor</w:t>
+            </w:r>
+            <w:r>
+              <w:rPr>
+                <w:rFonts w:asciiTheme="minorHAnsi" w:hAnsiTheme="minorHAnsi" w:cstheme="minorBidi"/>
+                <w:color w:val="auto"/>
+                <w:sz w:val="20"/>
+                <w:szCs w:val="20"/>
+              </w:rPr>
+              <w:t xml:space="preserve"> }}</w:t>
             </w:r>
           </w:p>
         </w:tc>
@@ -3730,16 +3763,52 @@
               </w:rPr>
               <w:t xml:space="preserve"> </w:t>
             </w:r>
+            <w:proofErr w:type="gramStart"/>
             <w:r>
               <w:rPr>
                 <w:rFonts w:asciiTheme="minorHAnsi" w:hAnsiTheme="minorHAnsi" w:cstheme="minorBidi"/>
                 <w:color w:val="auto"/>
                 <w:sz w:val="20"/>
                 <w:szCs w:val="20"/>
-                <w:highlight w:val="yellow"/>
-                <w:lang w:val="en-US"/>
-              </w:rPr>
-              <w:t>XXXX</w:t>
+              </w:rPr>
+              <w:t xml:space="preserve">{{ </w:t>
+            </w:r>
+            <w:r>
+              <w:rPr>
+                <w:rFonts w:asciiTheme="minorHAnsi" w:hAnsiTheme="minorHAnsi" w:cstheme="minorBidi"/>
+                <w:color w:val="auto"/>
+                <w:sz w:val="20"/>
+                <w:szCs w:val="20"/>
+              </w:rPr>
+              <w:t>contato</w:t>
+            </w:r>
+            <w:proofErr w:type="gramEnd"/>
+            <w:r>
+              <w:rPr>
+                <w:rFonts w:asciiTheme="minorHAnsi" w:hAnsiTheme="minorHAnsi" w:cstheme="minorBidi"/>
+                <w:color w:val="auto"/>
+                <w:sz w:val="20"/>
+                <w:szCs w:val="20"/>
+              </w:rPr>
+              <w:t>_</w:t>
+            </w:r>
+            <w:r>
+              <w:rPr>
+                <w:rFonts w:asciiTheme="minorHAnsi" w:hAnsiTheme="minorHAnsi" w:cstheme="minorBidi"/>
+                <w:color w:val="auto"/>
+                <w:sz w:val="20"/>
+                <w:szCs w:val="20"/>
+              </w:rPr>
+              <w:t>contratante</w:t>
+            </w:r>
+            <w:r>
+              <w:rPr>
+                <w:rFonts w:asciiTheme="minorHAnsi" w:hAnsiTheme="minorHAnsi" w:cstheme="minorBidi"/>
+                <w:color w:val="auto"/>
+                <w:sz w:val="20"/>
+                <w:szCs w:val="20"/>
+              </w:rPr>
+              <w:t xml:space="preserve"> }}</w:t>
             </w:r>
           </w:p>
         </w:tc>
@@ -18991,6 +19060,7 @@
   <w:style w:type="character" w:default="1" w:styleId="DefaultParagraphFont">
     <w:name w:val="Default Paragraph Font"/>
     <w:uiPriority w:val="1"/>
+    <w:semiHidden/>
     <w:unhideWhenUsed/>
   </w:style>
   <w:style w:type="table" w:default="1" w:styleId="TableNormal">
@@ -19575,6 +19645,10 @@
 </file>
 
 <file path=customXml/item1.xml><?xml version="1.0" encoding="utf-8"?>
+<b:Sources xmlns:b="http://schemas.openxmlformats.org/officeDocument/2006/bibliography" xmlns="http://schemas.openxmlformats.org/officeDocument/2006/bibliography" SelectedStyle="\APA.XSL" StyleName="APA"/>
+</file>
+
+<file path=customXml/item2.xml><?xml version="1.0" encoding="utf-8"?>
 <?mso-contentType ?>
 <FormTemplates xmlns="http://schemas.microsoft.com/sharepoint/v3/contenttype/forms">
   <Display>DocumentLibraryForm</Display>
@@ -19583,11 +19657,19 @@
 </FormTemplates>
 </file>
 
-<file path=customXml/item2.xml><?xml version="1.0" encoding="utf-8"?>
-<b:Sources xmlns:b="http://schemas.openxmlformats.org/officeDocument/2006/bibliography" xmlns="http://schemas.openxmlformats.org/officeDocument/2006/bibliography" SelectedStyle="\APA.XSL" StyleName="APA"/>
+<file path=customXml/item3.xml><?xml version="1.0" encoding="utf-8"?>
+<p:properties xmlns:p="http://schemas.microsoft.com/office/2006/metadata/properties" xmlns:xsi="http://www.w3.org/2001/XMLSchema-instance" xmlns:pc="http://schemas.microsoft.com/office/infopath/2007/PartnerControls">
+  <documentManagement>
+    <TaxCatchAll xmlns="a0876069-188c-4c9d-b65c-12a8bdb3bb4f" xsi:nil="true"/>
+    <lcf76f155ced4ddcb4097134ff3c332f xmlns="5ff00d40-7534-4276-883e-c1d1cd643ab8">
+      <Terms xmlns="http://schemas.microsoft.com/office/infopath/2007/PartnerControls"/>
+    </lcf76f155ced4ddcb4097134ff3c332f>
+    <_Flow_SignoffStatus xmlns="5ff00d40-7534-4276-883e-c1d1cd643ab8" xsi:nil="true"/>
+  </documentManagement>
+</p:properties>
 </file>
 
-<file path=customXml/item3.xml><?xml version="1.0" encoding="utf-8"?>
+<file path=customXml/item4.xml><?xml version="1.0" encoding="utf-8"?>
 <ct:contentTypeSchema xmlns:ct="http://schemas.microsoft.com/office/2006/metadata/contentType" xmlns:ma="http://schemas.microsoft.com/office/2006/metadata/properties/metaAttributes" ct:_="" ma:_="" ma:contentTypeName="Documento" ma:contentTypeID="0x010100EAF5358B3CDDA44AAB518F78C76C0609" ma:contentTypeVersion="17" ma:contentTypeDescription="Crie um novo documento." ma:contentTypeScope="" ma:versionID="92977606681051f29132fcedb6e8c321">
   <xsd:schema xmlns:xsd="http://www.w3.org/2001/XMLSchema" xmlns:xs="http://www.w3.org/2001/XMLSchema" xmlns:p="http://schemas.microsoft.com/office/2006/metadata/properties" xmlns:ns2="5ff00d40-7534-4276-883e-c1d1cd643ab8" xmlns:ns3="a0876069-188c-4c9d-b65c-12a8bdb3bb4f" targetNamespace="http://schemas.microsoft.com/office/2006/metadata/properties" ma:root="true" ma:fieldsID="22dc4ef72a065640184ce4aac95a39e2" ns2:_="" ns3:_="">
     <xsd:import namespace="5ff00d40-7534-4276-883e-c1d1cd643ab8"/>
@@ -19828,19 +19910,15 @@
 </ct:contentTypeSchema>
 </file>
 
-<file path=customXml/item4.xml><?xml version="1.0" encoding="utf-8"?>
-<p:properties xmlns:p="http://schemas.microsoft.com/office/2006/metadata/properties" xmlns:xsi="http://www.w3.org/2001/XMLSchema-instance" xmlns:pc="http://schemas.microsoft.com/office/infopath/2007/PartnerControls">
-  <documentManagement>
-    <TaxCatchAll xmlns="a0876069-188c-4c9d-b65c-12a8bdb3bb4f" xsi:nil="true"/>
-    <lcf76f155ced4ddcb4097134ff3c332f xmlns="5ff00d40-7534-4276-883e-c1d1cd643ab8">
-      <Terms xmlns="http://schemas.microsoft.com/office/infopath/2007/PartnerControls"/>
-    </lcf76f155ced4ddcb4097134ff3c332f>
-    <_Flow_SignoffStatus xmlns="5ff00d40-7534-4276-883e-c1d1cd643ab8" xsi:nil="true"/>
-  </documentManagement>
-</p:properties>
+<file path=customXml/itemProps1.xml><?xml version="1.0" encoding="utf-8"?>
+<ds:datastoreItem xmlns:ds="http://schemas.openxmlformats.org/officeDocument/2006/customXml" ds:itemID="{3561726F-1BF0-4E93-ADF0-016D77FC5C39}">
+  <ds:schemaRefs>
+    <ds:schemaRef ds:uri="http://schemas.openxmlformats.org/officeDocument/2006/bibliography"/>
+  </ds:schemaRefs>
+</ds:datastoreItem>
 </file>
 
-<file path=customXml/itemProps1.xml><?xml version="1.0" encoding="utf-8"?>
+<file path=customXml/itemProps2.xml><?xml version="1.0" encoding="utf-8"?>
 <ds:datastoreItem xmlns:ds="http://schemas.openxmlformats.org/officeDocument/2006/customXml" ds:itemID="{33F2141A-BC78-4F54-B5A4-F37AFD5E501C}">
   <ds:schemaRefs>
     <ds:schemaRef ds:uri="http://schemas.microsoft.com/sharepoint/v3/contenttype/forms"/>
@@ -19848,15 +19926,18 @@
 </ds:datastoreItem>
 </file>
 
-<file path=customXml/itemProps2.xml><?xml version="1.0" encoding="utf-8"?>
-<ds:datastoreItem xmlns:ds="http://schemas.openxmlformats.org/officeDocument/2006/customXml" ds:itemID="{3561726F-1BF0-4E93-ADF0-016D77FC5C39}">
+<file path=customXml/itemProps3.xml><?xml version="1.0" encoding="utf-8"?>
+<ds:datastoreItem xmlns:ds="http://schemas.openxmlformats.org/officeDocument/2006/customXml" ds:itemID="{85AA12C2-AFD2-43B5-98ED-01DAD8DF0DEC}">
   <ds:schemaRefs>
-    <ds:schemaRef ds:uri="http://schemas.openxmlformats.org/officeDocument/2006/bibliography"/>
+    <ds:schemaRef ds:uri="http://schemas.microsoft.com/office/2006/metadata/properties"/>
+    <ds:schemaRef ds:uri="http://schemas.microsoft.com/office/infopath/2007/PartnerControls"/>
+    <ds:schemaRef ds:uri="a0876069-188c-4c9d-b65c-12a8bdb3bb4f"/>
+    <ds:schemaRef ds:uri="5ff00d40-7534-4276-883e-c1d1cd643ab8"/>
   </ds:schemaRefs>
 </ds:datastoreItem>
 </file>
 
-<file path=customXml/itemProps3.xml><?xml version="1.0" encoding="utf-8"?>
+<file path=customXml/itemProps4.xml><?xml version="1.0" encoding="utf-8"?>
 <ds:datastoreItem xmlns:ds="http://schemas.openxmlformats.org/officeDocument/2006/customXml" ds:itemID="{ACB1B833-DE79-4FC2-A8BD-CB85D950FDD3}">
   <ds:schemaRefs>
     <ds:schemaRef ds:uri="http://schemas.microsoft.com/office/2006/metadata/contentType"/>
@@ -19873,15 +19954,4 @@
     <ds:schemaRef ds:uri="http://schemas.microsoft.com/internal/obd"/>
   </ds:schemaRefs>
 </ds:datastoreItem>
-</file>
-
-<file path=customXml/itemProps4.xml><?xml version="1.0" encoding="utf-8"?>
-<ds:datastoreItem xmlns:ds="http://schemas.openxmlformats.org/officeDocument/2006/customXml" ds:itemID="{85AA12C2-AFD2-43B5-98ED-01DAD8DF0DEC}">
-  <ds:schemaRefs>
-    <ds:schemaRef ds:uri="http://schemas.microsoft.com/office/2006/metadata/properties"/>
-    <ds:schemaRef ds:uri="http://schemas.microsoft.com/office/infopath/2007/PartnerControls"/>
-    <ds:schemaRef ds:uri="a0876069-188c-4c9d-b65c-12a8bdb3bb4f"/>
-    <ds:schemaRef ds:uri="5ff00d40-7534-4276-883e-c1d1cd643ab8"/>
-  </ds:schemaRefs>
-</ds:datastoreItem>
 </file>
</xml_diff>

<commit_message>
Adiciona suporte a persistência em MySQL para estado da automação de contratos, incluindo tabelas para deals processados e envelopes pendentes. Atualiza a configuração para utilizar variáveis do .env e remove arquivos de estado em formato texto. Introduz novos arquivos de configuração e scripts para gerenciar a lógica de pedidos no Plune.
</commit_message>
<xml_diff>
--- a/contrato_padrao.docx
+++ b/contrato_padrao.docx
@@ -1761,7 +1761,7 @@
                 <w:sz w:val="18"/>
                 <w:szCs w:val="18"/>
               </w:rPr>
-              <w:t>-</w:t>
+              <w:t>{{ sole_consultoria }}</w:t>
             </w:r>
           </w:p>
         </w:tc>
@@ -1967,7 +1967,7 @@
                 <w:sz w:val="18"/>
                 <w:szCs w:val="18"/>
               </w:rPr>
-              <w:t>-</w:t>
+              <w:t>{{ gestao_acl }}</w:t>
             </w:r>
           </w:p>
         </w:tc>
@@ -2070,7 +2070,7 @@
                 <w:sz w:val="18"/>
                 <w:szCs w:val="18"/>
               </w:rPr>
-              <w:t>-</w:t>
+              <w:t>{{ gestao_usina_fotovoltaica }}</w:t>
             </w:r>
           </w:p>
         </w:tc>

</xml_diff>

<commit_message>
Adiciona suporte para inclusão de números de pedidos Plune no contrato padrão e nos contratos gerados. Atualiza a lógica de preenchimento do contrato para extrair e formatar os números de pedidos, além de modificar a configuração do banco de dados para incluir novos campos relacionados a pedidos. Implementa testes para garantir a correta formatação e extração dos dados dos pedidos.
</commit_message>
<xml_diff>
--- a/contrato_padrao.docx
+++ b/contrato_padrao.docx
@@ -254,6 +254,22 @@
                 <w:bCs/>
               </w:rPr>
             </w:pPr>
+            <w:r>
+              <w:rPr>
+                <w:rFonts w:asciiTheme="minorHAnsi" w:hAnsiTheme="minorHAnsi" w:cstheme="minorBidi"/>
+                <w:b/>
+                <w:bCs/>
+              </w:rPr>
+              <w:t xml:space="preserve">Nº Pedidos Plune: </w:t>
+            </w:r>
+            <w:r>
+              <w:rPr>
+                <w:rFonts w:asciiTheme="minorHAnsi" w:hAnsiTheme="minorHAnsi" w:cstheme="minorBidi"/>
+                <w:b/>
+                <w:bCs/>
+              </w:rPr>
+              <w:t>{{ numeros_pedidos }}</w:t>
+            </w:r>
           </w:p>
         </w:tc>
       </w:tr>

</xml_diff>

<commit_message>
Atualiza a lógica de preenchimento de contratos para utilizar novos campos e variáveis, incluindo a extração do número do contrato e nome fantasia do cliente. Implementa funções para gerenciar templates de contratos e remove campos obsoletos. Melhora a automação de pedidos no HUB, garantindo a correta formatação das observações e a persistência de dados. Atualiza a documentação para refletir as mudanças na estrutura e no fluxo de integração com o Pipedrive e Plune.
</commit_message>
<xml_diff>
--- a/contrato_padrao.docx
+++ b/contrato_padrao.docx
@@ -19,8 +19,8 @@
       <w:tblGrid>
         <w:gridCol w:w="3208"/>
         <w:gridCol w:w="1232"/>
-        <w:gridCol w:w="4292"/>
-        <w:gridCol w:w="1334"/>
+        <w:gridCol w:w="4293"/>
+        <w:gridCol w:w="1333"/>
       </w:tblGrid>
       <w:tr>
         <w:trPr>
@@ -185,17 +185,11 @@
               </w:rPr>
               <w:t>Nº Contrato:</w:t>
             </w:r>
-            <w:r>
-              <w:rPr>
-                <w:rFonts w:cs="Calibri" w:ascii="Calibri" w:hAnsi="Calibri" w:asciiTheme="minorHAnsi" w:cstheme="minorHAnsi" w:hAnsiTheme="minorHAnsi"/>
-              </w:rPr>
-              <w:t xml:space="preserve"> </w:t>
-            </w:r>
           </w:p>
         </w:tc>
         <w:tc>
           <w:tcPr>
-            <w:tcW w:w="4292" w:type="dxa"/>
+            <w:tcW w:w="4293" w:type="dxa"/>
             <w:tcBorders>
               <w:top w:val="single" w:sz="2" w:space="0" w:color="000000"/>
               <w:bottom w:val="single" w:sz="2" w:space="0" w:color="000000"/>
@@ -227,7 +221,7 @@
         </w:tc>
         <w:tc>
           <w:tcPr>
-            <w:tcW w:w="1334" w:type="dxa"/>
+            <w:tcW w:w="1333" w:type="dxa"/>
             <w:tcBorders>
               <w:bottom w:val="single" w:sz="2" w:space="0" w:color="000000"/>
               <w:right w:val="single" w:sz="18" w:space="0" w:color="000000"/>
@@ -307,15 +301,7 @@
                 <w:b/>
                 <w:bCs/>
               </w:rPr>
-              <w:t xml:space="preserve">Nº Pedido Plune: </w:t>
-            </w:r>
-            <w:r>
-              <w:rPr>
-                <w:rFonts w:cs="Calibri" w:ascii="Calibri" w:hAnsi="Calibri" w:asciiTheme="minorHAnsi" w:cstheme="minorHAnsi" w:hAnsiTheme="minorHAnsi"/>
-                <w:b/>
-                <w:bCs/>
-              </w:rPr>
-              <w:t>{</w:t>
+              <w:t>Nº Pedido Plune: {</w:t>
             </w:r>
             <w:r>
               <w:rPr>
@@ -521,7 +507,19 @@
               <w:rPr>
                 <w:rFonts w:cs="" w:ascii="Calibri" w:hAnsi="Calibri" w:asciiTheme="minorHAnsi" w:cstheme="minorBidi" w:hAnsiTheme="minorHAnsi"/>
               </w:rPr>
-              <w:t>{{ endereco }}</w:t>
+              <w:t xml:space="preserve">{{ </w:t>
+            </w:r>
+            <w:r>
+              <w:rPr>
+                <w:rFonts w:cs="" w:ascii="Calibri" w:hAnsi="Calibri" w:asciiTheme="minorHAnsi" w:cstheme="minorBidi" w:hAnsiTheme="minorHAnsi"/>
+              </w:rPr>
+              <w:t>nome_fantasia</w:t>
+            </w:r>
+            <w:r>
+              <w:rPr>
+                <w:rFonts w:cs="" w:ascii="Calibri" w:hAnsi="Calibri" w:asciiTheme="minorHAnsi" w:cstheme="minorBidi" w:hAnsiTheme="minorHAnsi"/>
+              </w:rPr>
+              <w:t>}}</w:t>
             </w:r>
           </w:p>
         </w:tc>
@@ -580,19 +578,7 @@
               <w:rPr>
                 <w:rFonts w:cs="" w:ascii="Calibri" w:hAnsi="Calibri" w:asciiTheme="minorHAnsi" w:cstheme="minorBidi" w:hAnsiTheme="minorHAnsi"/>
               </w:rPr>
-              <w:t xml:space="preserve">{{ </w:t>
-            </w:r>
-            <w:r>
-              <w:rPr>
-                <w:rFonts w:cs="" w:ascii="Calibri" w:hAnsi="Calibri" w:asciiTheme="minorHAnsi" w:cstheme="minorBidi" w:hAnsiTheme="minorHAnsi"/>
-              </w:rPr>
-              <w:t>endereco</w:t>
-            </w:r>
-            <w:r>
-              <w:rPr>
-                <w:rFonts w:cs="" w:ascii="Calibri" w:hAnsi="Calibri" w:asciiTheme="minorHAnsi" w:cstheme="minorBidi" w:hAnsiTheme="minorHAnsi"/>
-              </w:rPr>
-              <w:t xml:space="preserve"> }}</w:t>
+              <w:t>{{ endereco }}</w:t>
             </w:r>
           </w:p>
         </w:tc>
@@ -765,19 +751,7 @@
               <w:rPr>
                 <w:rFonts w:cs="" w:cstheme="minorBidi"/>
               </w:rPr>
-              <w:t xml:space="preserve">{{ </w:t>
-            </w:r>
-            <w:r>
-              <w:rPr>
-                <w:rFonts w:cs="" w:cstheme="minorBidi"/>
-              </w:rPr>
-              <w:t>inscricao_estadual</w:t>
-            </w:r>
-            <w:r>
-              <w:rPr>
-                <w:rFonts w:cs="" w:cstheme="minorBidi"/>
-              </w:rPr>
-              <w:t xml:space="preserve"> }}</w:t>
+              <w:t>{{ inscricao_estadual }}</w:t>
             </w:r>
           </w:p>
         </w:tc>
@@ -871,8 +845,8 @@
         <w:tblLook w:firstRow="1" w:noVBand="1" w:lastRow="0" w:firstColumn="1" w:lastColumn="0" w:noHBand="0" w:val="04a0"/>
       </w:tblPr>
       <w:tblGrid>
-        <w:gridCol w:w="2179"/>
-        <w:gridCol w:w="1971"/>
+        <w:gridCol w:w="2178"/>
+        <w:gridCol w:w="1972"/>
         <w:gridCol w:w="930"/>
         <w:gridCol w:w="4983"/>
       </w:tblGrid>
@@ -882,7 +856,7 @@
         </w:trPr>
         <w:tc>
           <w:tcPr>
-            <w:tcW w:w="2179" w:type="dxa"/>
+            <w:tcW w:w="2178" w:type="dxa"/>
             <w:tcBorders>
               <w:top w:val="single" w:sz="18" w:space="0" w:color="000000"/>
               <w:left w:val="single" w:sz="18" w:space="0" w:color="000000"/>
@@ -910,7 +884,7 @@
         </w:tc>
         <w:tc>
           <w:tcPr>
-            <w:tcW w:w="7884" w:type="dxa"/>
+            <w:tcW w:w="7885" w:type="dxa"/>
             <w:gridSpan w:val="3"/>
             <w:tcBorders>
               <w:top w:val="single" w:sz="18" w:space="0" w:color="000000"/>
@@ -945,7 +919,7 @@
         </w:trPr>
         <w:tc>
           <w:tcPr>
-            <w:tcW w:w="2179" w:type="dxa"/>
+            <w:tcW w:w="2178" w:type="dxa"/>
             <w:tcBorders>
               <w:top w:val="single" w:sz="8" w:space="0" w:color="000000"/>
               <w:left w:val="single" w:sz="18" w:space="0" w:color="000000"/>
@@ -975,7 +949,7 @@
         </w:tc>
         <w:tc>
           <w:tcPr>
-            <w:tcW w:w="7884" w:type="dxa"/>
+            <w:tcW w:w="7885" w:type="dxa"/>
             <w:gridSpan w:val="3"/>
             <w:tcBorders>
               <w:top w:val="single" w:sz="8" w:space="0" w:color="000000"/>
@@ -1010,7 +984,7 @@
         </w:trPr>
         <w:tc>
           <w:tcPr>
-            <w:tcW w:w="2179" w:type="dxa"/>
+            <w:tcW w:w="2178" w:type="dxa"/>
             <w:tcBorders>
               <w:top w:val="single" w:sz="4" w:space="0" w:color="000000"/>
               <w:left w:val="single" w:sz="18" w:space="0" w:color="000000"/>
@@ -1038,7 +1012,7 @@
         </w:tc>
         <w:tc>
           <w:tcPr>
-            <w:tcW w:w="7884" w:type="dxa"/>
+            <w:tcW w:w="7885" w:type="dxa"/>
             <w:gridSpan w:val="3"/>
             <w:tcBorders>
               <w:top w:val="single" w:sz="4" w:space="0" w:color="000000"/>
@@ -1069,7 +1043,7 @@
         </w:trPr>
         <w:tc>
           <w:tcPr>
-            <w:tcW w:w="2179" w:type="dxa"/>
+            <w:tcW w:w="2178" w:type="dxa"/>
             <w:tcBorders>
               <w:left w:val="single" w:sz="18" w:space="0" w:color="000000"/>
               <w:bottom w:val="single" w:sz="18" w:space="0" w:color="000000"/>
@@ -1096,7 +1070,7 @@
         </w:tc>
         <w:tc>
           <w:tcPr>
-            <w:tcW w:w="1971" w:type="dxa"/>
+            <w:tcW w:w="1972" w:type="dxa"/>
             <w:tcBorders>
               <w:bottom w:val="single" w:sz="18" w:space="0" w:color="000000"/>
               <w:right w:val="single" w:sz="8" w:space="0" w:color="000000"/>
@@ -2362,7 +2336,7 @@
             </w:pPr>
             <w:r>
               <w:rPr>
-                <w:rFonts w:cs="" w:cstheme="minorBidi" w:ascii="Calibri" w:hAnsi="Calibri"/>
+                <w:rFonts w:cs="" w:ascii="Calibri" w:hAnsi="Calibri" w:cstheme="minorBidi"/>
                 <w:sz w:val="18"/>
                 <w:szCs w:val="18"/>
               </w:rPr>
@@ -7324,6 +7298,7 @@
             <w:pPr>
               <w:pStyle w:val="Normal"/>
               <w:widowControl/>
+              <w:suppressAutoHyphens w:val="true"/>
               <w:spacing w:before="60" w:after="60"/>
               <w:ind w:right="-1"/>
               <w:jc w:val="both"/>
@@ -7363,6 +7338,7 @@
             <w:pPr>
               <w:pStyle w:val="Normal"/>
               <w:widowControl/>
+              <w:suppressAutoHyphens w:val="true"/>
               <w:spacing w:before="60" w:after="60"/>
               <w:ind w:right="-1"/>
               <w:jc w:val="both"/>
@@ -7376,13 +7352,11 @@
             </w:pPr>
             <w:r>
               <w:rPr>
-                <w:rFonts w:eastAsia="Times New Roman" w:cs="Calibri" w:cstheme="minorHAnsi" w:ascii="Calibri" w:hAnsi="Calibri"/>
+                <w:rFonts w:cs="Calibri" w:cstheme="minorHAnsi" w:ascii="Calibri" w:hAnsi="Calibri"/>
                 <w:b/>
                 <w:bCs/>
-                <w:kern w:val="0"/>
-                <w:sz w:val="18"/>
-                <w:szCs w:val="18"/>
-                <w:lang w:val="pt-BR" w:eastAsia="pt-BR" w:bidi="ar-SA"/>
+                <w:sz w:val="18"/>
+                <w:szCs w:val="18"/>
               </w:rPr>
             </w:r>
           </w:p>
@@ -7399,6 +7373,7 @@
             <w:pPr>
               <w:pStyle w:val="Normal"/>
               <w:widowControl/>
+              <w:suppressAutoHyphens w:val="true"/>
               <w:spacing w:before="60" w:after="60"/>
               <w:ind w:right="-1"/>
               <w:jc w:val="both"/>
@@ -7440,6 +7415,7 @@
             <w:pPr>
               <w:pStyle w:val="Normal"/>
               <w:widowControl/>
+              <w:suppressAutoHyphens w:val="true"/>
               <w:spacing w:before="0" w:after="0"/>
               <w:jc w:val="both"/>
               <w:rPr>
@@ -7463,6 +7439,7 @@
             <w:pPr>
               <w:pStyle w:val="Normal"/>
               <w:widowControl/>
+              <w:suppressAutoHyphens w:val="true"/>
               <w:spacing w:before="0" w:after="0"/>
               <w:jc w:val="both"/>
               <w:rPr>
@@ -7497,6 +7474,7 @@
             <w:pPr>
               <w:pStyle w:val="Normal"/>
               <w:widowControl/>
+              <w:suppressAutoHyphens w:val="true"/>
               <w:spacing w:before="0" w:after="0"/>
               <w:jc w:val="both"/>
               <w:rPr>
@@ -7507,11 +7485,9 @@
             </w:pPr>
             <w:r>
               <w:rPr>
-                <w:rFonts w:eastAsia="Times New Roman" w:cs="Calibri" w:cstheme="minorHAnsi" w:ascii="Calibri" w:hAnsi="Calibri"/>
-                <w:kern w:val="0"/>
-                <w:sz w:val="18"/>
-                <w:szCs w:val="18"/>
-                <w:lang w:val="pt-BR" w:eastAsia="pt-BR" w:bidi="ar-SA"/>
+                <w:rFonts w:cs="Calibri" w:cstheme="minorHAnsi" w:ascii="Calibri" w:hAnsi="Calibri"/>
+                <w:sz w:val="18"/>
+                <w:szCs w:val="18"/>
               </w:rPr>
             </w:r>
           </w:p>
@@ -7529,6 +7505,7 @@
             <w:pPr>
               <w:pStyle w:val="Normal"/>
               <w:widowControl/>
+              <w:suppressAutoHyphens w:val="true"/>
               <w:spacing w:before="0" w:after="0"/>
               <w:jc w:val="both"/>
               <w:rPr>
@@ -7552,6 +7529,7 @@
             <w:pPr>
               <w:pStyle w:val="Normal"/>
               <w:widowControl/>
+              <w:suppressAutoHyphens w:val="true"/>
               <w:spacing w:before="0" w:after="0"/>
               <w:jc w:val="both"/>
               <w:rPr>
@@ -9141,949 +9119,6 @@
           <w:rFonts w:ascii="Calibri" w:hAnsi="Calibri" w:cs="Calibri" w:asciiTheme="minorHAnsi" w:cstheme="minorHAnsi" w:hAnsiTheme="minorHAnsi"/>
           <w:sz w:val="18"/>
           <w:szCs w:val="18"/>
-        </w:rPr>
-      </w:pPr>
-      <w:r>
-        <w:rPr>
-          <w:rFonts w:cs="Calibri" w:cstheme="minorHAnsi" w:ascii="Calibri" w:hAnsi="Calibri"/>
-          <w:sz w:val="18"/>
-          <w:szCs w:val="18"/>
-        </w:rPr>
-      </w:r>
-    </w:p>
-    <w:p>
-      <w:pPr>
-        <w:pStyle w:val="Normal"/>
-        <w:shd w:val="clear" w:color="auto" w:fill="000000" w:themeFill="text1"/>
-        <w:spacing w:before="60" w:after="60"/>
-        <w:ind w:right="-1"/>
-        <w:jc w:val="center"/>
-        <w:rPr>
-          <w:rFonts w:ascii="Calibri" w:hAnsi="Calibri" w:cs="Calibri" w:asciiTheme="minorHAnsi" w:cstheme="minorHAnsi" w:hAnsiTheme="minorHAnsi"/>
-          <w:b/>
-        </w:rPr>
-      </w:pPr>
-      <w:r>
-        <w:rPr>
-          <w:rFonts w:cs="Calibri" w:ascii="Calibri" w:hAnsi="Calibri" w:asciiTheme="minorHAnsi" w:cstheme="minorHAnsi" w:hAnsiTheme="minorHAnsi"/>
-          <w:b/>
-        </w:rPr>
-        <w:t>ANEXO II</w:t>
-      </w:r>
-    </w:p>
-    <w:p>
-      <w:pPr>
-        <w:pStyle w:val="Normal"/>
-        <w:tabs>
-          <w:tab w:val="clear" w:pos="708"/>
-          <w:tab w:val="left" w:pos="284" w:leader="none"/>
-        </w:tabs>
-        <w:jc w:val="both"/>
-        <w:rPr>
-          <w:rFonts w:ascii="Calibri" w:hAnsi="Calibri" w:cs="Calibri" w:asciiTheme="minorHAnsi" w:cstheme="minorHAnsi" w:hAnsiTheme="minorHAnsi"/>
-          <w:sz w:val="14"/>
-          <w:szCs w:val="14"/>
-        </w:rPr>
-      </w:pPr>
-      <w:r>
-        <w:rPr>
-          <w:rFonts w:cs="Calibri" w:cstheme="minorHAnsi" w:ascii="Calibri" w:hAnsi="Calibri"/>
-          <w:sz w:val="14"/>
-          <w:szCs w:val="14"/>
-        </w:rPr>
-      </w:r>
-    </w:p>
-    <w:p>
-      <w:pPr>
-        <w:pStyle w:val="Normal"/>
-        <w:tabs>
-          <w:tab w:val="clear" w:pos="708"/>
-          <w:tab w:val="left" w:pos="284" w:leader="none"/>
-        </w:tabs>
-        <w:jc w:val="both"/>
-        <w:rPr>
-          <w:rFonts w:ascii="Calibri" w:hAnsi="Calibri" w:cs="Calibri" w:asciiTheme="minorHAnsi" w:cstheme="minorHAnsi" w:hAnsiTheme="minorHAnsi"/>
-          <w:sz w:val="14"/>
-          <w:szCs w:val="14"/>
-        </w:rPr>
-      </w:pPr>
-      <w:r>
-        <w:rPr>
-          <w:rFonts w:cs="Calibri" w:cstheme="minorHAnsi" w:ascii="Calibri" w:hAnsi="Calibri"/>
-          <w:sz w:val="14"/>
-          <w:szCs w:val="14"/>
-        </w:rPr>
-      </w:r>
-    </w:p>
-    <w:tbl>
-      <w:tblPr>
-        <w:tblStyle w:val="TabeladeGrade1Clara"/>
-        <w:tblW w:w="5382" w:type="dxa"/>
-        <w:jc w:val="left"/>
-        <w:tblInd w:w="0" w:type="dxa"/>
-        <w:tblLayout w:type="fixed"/>
-        <w:tblCellMar>
-          <w:top w:w="0" w:type="dxa"/>
-          <w:left w:w="108" w:type="dxa"/>
-          <w:bottom w:w="0" w:type="dxa"/>
-          <w:right w:w="108" w:type="dxa"/>
-        </w:tblCellMar>
-        <w:tblLook w:firstRow="1" w:noVBand="1" w:lastRow="0" w:firstColumn="1" w:lastColumn="0" w:noHBand="0" w:val="04a0"/>
-      </w:tblPr>
-      <w:tblGrid>
-        <w:gridCol w:w="2546"/>
-        <w:gridCol w:w="2835"/>
-      </w:tblGrid>
-      <w:tr>
-        <w:trPr>
-          <w:trHeight w:val="288" w:hRule="atLeast"/>
-          <w:cnfStyle w:val="100000000000" w:firstRow="1" w:lastRow="0" w:firstColumn="0" w:lastColumn="0" w:oddVBand="0" w:evenVBand="0" w:oddHBand="0" w:evenHBand="0" w:firstRowFirstColumn="0" w:firstRowLastColumn="0" w:lastRowFirstColumn="0" w:lastRowLastColumn="0"/>
-        </w:trPr>
-        <w:tc>
-          <w:tcPr>
-            <w:tcW w:w="2546" w:type="dxa"/>
-            <w:cnfStyle w:val="001000000000" w:firstRow="0" w:lastRow="0" w:firstColumn="1" w:lastColumn="0" w:oddVBand="0" w:evenVBand="0" w:oddHBand="0" w:evenHBand="0" w:firstRowFirstColumn="0" w:firstRowLastColumn="0" w:lastRowFirstColumn="0" w:lastRowLastColumn="0"/>
-            <w:tcBorders>
-              <w:bottom w:val="single" w:sz="12" w:space="0" w:color="666666"/>
-            </w:tcBorders>
-          </w:tcPr>
-          <w:p>
-            <w:pPr>
-              <w:pStyle w:val="Normal"/>
-              <w:widowControl/>
-              <w:spacing w:before="0" w:after="0"/>
-              <w:jc w:val="center"/>
-              <w:rPr>
-                <w:rFonts w:ascii="Calibri" w:hAnsi="Calibri" w:cs="Calibri" w:asciiTheme="minorHAnsi" w:cstheme="minorHAnsi" w:hAnsiTheme="minorHAnsi"/>
-                <w:color w:val="000000"/>
-                <w:sz w:val="18"/>
-                <w:szCs w:val="18"/>
-              </w:rPr>
-            </w:pPr>
-            <w:r>
-              <w:rPr>
-                <w:rFonts w:eastAsia="Times New Roman" w:cs="Calibri" w:ascii="Calibri" w:hAnsi="Calibri" w:asciiTheme="minorHAnsi" w:cstheme="minorHAnsi" w:hAnsiTheme="minorHAnsi"/>
-                <w:b/>
-                <w:bCs/>
-                <w:color w:val="000000"/>
-                <w:kern w:val="0"/>
-                <w:sz w:val="18"/>
-                <w:szCs w:val="18"/>
-                <w:lang w:val="pt-BR" w:eastAsia="pt-BR" w:bidi="ar-SA"/>
-              </w:rPr>
-              <w:t>UC</w:t>
-            </w:r>
-          </w:p>
-        </w:tc>
-        <w:tc>
-          <w:tcPr>
-            <w:tcW w:w="2835" w:type="dxa"/>
-            <w:tcBorders>
-              <w:bottom w:val="single" w:sz="12" w:space="0" w:color="666666"/>
-            </w:tcBorders>
-          </w:tcPr>
-          <w:p>
-            <w:pPr>
-              <w:pStyle w:val="Normal"/>
-              <w:widowControl/>
-              <w:spacing w:before="0" w:after="0"/>
-              <w:jc w:val="center"/>
-              <w:cnfStyle w:val="100000000000" w:firstRow="1" w:lastRow="0" w:firstColumn="0" w:lastColumn="0" w:oddVBand="0" w:evenVBand="0" w:oddHBand="0" w:evenHBand="0" w:firstRowFirstColumn="0" w:firstRowLastColumn="0" w:lastRowFirstColumn="0" w:lastRowLastColumn="0"/>
-              <w:rPr>
-                <w:rFonts w:ascii="Calibri" w:hAnsi="Calibri" w:cs="Calibri" w:asciiTheme="minorHAnsi" w:cstheme="minorHAnsi" w:hAnsiTheme="minorHAnsi"/>
-                <w:color w:val="000000"/>
-                <w:sz w:val="18"/>
-                <w:szCs w:val="18"/>
-              </w:rPr>
-            </w:pPr>
-            <w:r>
-              <w:rPr>
-                <w:rFonts w:eastAsia="Times New Roman" w:cs="Calibri" w:ascii="Calibri" w:hAnsi="Calibri" w:asciiTheme="minorHAnsi" w:cstheme="minorHAnsi" w:hAnsiTheme="minorHAnsi"/>
-                <w:b/>
-                <w:bCs/>
-                <w:color w:val="000000"/>
-                <w:kern w:val="0"/>
-                <w:sz w:val="18"/>
-                <w:szCs w:val="18"/>
-                <w:lang w:val="pt-BR" w:eastAsia="pt-BR" w:bidi="ar-SA"/>
-              </w:rPr>
-              <w:t>SERVIÇO</w:t>
-            </w:r>
-          </w:p>
-        </w:tc>
-      </w:tr>
-      <w:tr>
-        <w:trPr>
-          <w:trHeight w:val="288" w:hRule="atLeast"/>
-        </w:trPr>
-        <w:tc>
-          <w:tcPr>
-            <w:tcW w:w="2546" w:type="dxa"/>
-            <w:cnfStyle w:val="001000000000" w:firstRow="0" w:lastRow="0" w:firstColumn="1" w:lastColumn="0" w:oddVBand="0" w:evenVBand="0" w:oddHBand="0" w:evenHBand="0" w:firstRowFirstColumn="0" w:firstRowLastColumn="0" w:lastRowFirstColumn="0" w:lastRowLastColumn="0"/>
-            <w:tcBorders/>
-          </w:tcPr>
-          <w:p>
-            <w:pPr>
-              <w:pStyle w:val="Normal"/>
-              <w:widowControl/>
-              <w:spacing w:before="0" w:after="0"/>
-              <w:jc w:val="center"/>
-              <w:rPr>
-                <w:rFonts w:ascii="Calibri" w:hAnsi="Calibri" w:cs="Calibri" w:asciiTheme="minorHAnsi" w:cstheme="minorHAnsi" w:hAnsiTheme="minorHAnsi"/>
-                <w:color w:val="000000"/>
-                <w:sz w:val="18"/>
-                <w:szCs w:val="18"/>
-              </w:rPr>
-            </w:pPr>
-            <w:r>
-              <w:rPr>
-                <w:rFonts w:eastAsia="Times New Roman" w:cs="Calibri" w:cstheme="minorHAnsi" w:ascii="Calibri" w:hAnsi="Calibri"/>
-                <w:b/>
-                <w:bCs/>
-                <w:color w:val="000000"/>
-                <w:kern w:val="0"/>
-                <w:sz w:val="18"/>
-                <w:szCs w:val="18"/>
-                <w:lang w:val="pt-BR" w:eastAsia="pt-BR" w:bidi="ar-SA"/>
-              </w:rPr>
-            </w:r>
-          </w:p>
-        </w:tc>
-        <w:tc>
-          <w:tcPr>
-            <w:tcW w:w="2835" w:type="dxa"/>
-            <w:tcBorders/>
-          </w:tcPr>
-          <w:p>
-            <w:pPr>
-              <w:pStyle w:val="Normal"/>
-              <w:widowControl/>
-              <w:spacing w:before="0" w:after="0"/>
-              <w:jc w:val="center"/>
-              <w:cnfStyle w:val="000000000000" w:firstRow="0" w:lastRow="0" w:firstColumn="0" w:lastColumn="0" w:oddVBand="0" w:evenVBand="0" w:oddHBand="0" w:evenHBand="0" w:firstRowFirstColumn="0" w:firstRowLastColumn="0" w:lastRowFirstColumn="0" w:lastRowLastColumn="0"/>
-              <w:rPr>
-                <w:rFonts w:ascii="Calibri" w:hAnsi="Calibri" w:cs="Calibri" w:asciiTheme="minorHAnsi" w:cstheme="minorHAnsi" w:hAnsiTheme="minorHAnsi"/>
-                <w:color w:val="000000"/>
-                <w:sz w:val="18"/>
-                <w:szCs w:val="18"/>
-              </w:rPr>
-            </w:pPr>
-            <w:r>
-              <w:rPr>
-                <w:rFonts w:eastAsia="Times New Roman" w:cs="Calibri" w:cstheme="minorHAnsi" w:ascii="Calibri" w:hAnsi="Calibri"/>
-                <w:color w:val="000000"/>
-                <w:kern w:val="0"/>
-                <w:sz w:val="18"/>
-                <w:szCs w:val="18"/>
-                <w:lang w:val="pt-BR" w:eastAsia="pt-BR" w:bidi="ar-SA"/>
-              </w:rPr>
-            </w:r>
-          </w:p>
-        </w:tc>
-      </w:tr>
-      <w:tr>
-        <w:trPr>
-          <w:trHeight w:val="288" w:hRule="atLeast"/>
-        </w:trPr>
-        <w:tc>
-          <w:tcPr>
-            <w:tcW w:w="2546" w:type="dxa"/>
-            <w:cnfStyle w:val="001000000000" w:firstRow="0" w:lastRow="0" w:firstColumn="1" w:lastColumn="0" w:oddVBand="0" w:evenVBand="0" w:oddHBand="0" w:evenHBand="0" w:firstRowFirstColumn="0" w:firstRowLastColumn="0" w:lastRowFirstColumn="0" w:lastRowLastColumn="0"/>
-            <w:tcBorders/>
-          </w:tcPr>
-          <w:p>
-            <w:pPr>
-              <w:pStyle w:val="Normal"/>
-              <w:widowControl/>
-              <w:spacing w:before="0" w:after="0"/>
-              <w:jc w:val="center"/>
-              <w:rPr>
-                <w:rFonts w:ascii="Calibri" w:hAnsi="Calibri" w:cs="Calibri" w:asciiTheme="minorHAnsi" w:cstheme="minorHAnsi" w:hAnsiTheme="minorHAnsi"/>
-                <w:color w:val="000000"/>
-                <w:sz w:val="18"/>
-                <w:szCs w:val="18"/>
-              </w:rPr>
-            </w:pPr>
-            <w:r>
-              <w:rPr>
-                <w:rFonts w:eastAsia="Times New Roman" w:cs="Calibri" w:cstheme="minorHAnsi" w:ascii="Calibri" w:hAnsi="Calibri"/>
-                <w:b/>
-                <w:bCs/>
-                <w:color w:val="000000"/>
-                <w:kern w:val="0"/>
-                <w:sz w:val="18"/>
-                <w:szCs w:val="18"/>
-                <w:lang w:val="pt-BR" w:eastAsia="pt-BR" w:bidi="ar-SA"/>
-              </w:rPr>
-            </w:r>
-          </w:p>
-        </w:tc>
-        <w:tc>
-          <w:tcPr>
-            <w:tcW w:w="2835" w:type="dxa"/>
-            <w:tcBorders/>
-          </w:tcPr>
-          <w:p>
-            <w:pPr>
-              <w:pStyle w:val="Normal"/>
-              <w:widowControl/>
-              <w:spacing w:before="0" w:after="0"/>
-              <w:jc w:val="center"/>
-              <w:cnfStyle w:val="000000000000" w:firstRow="0" w:lastRow="0" w:firstColumn="0" w:lastColumn="0" w:oddVBand="0" w:evenVBand="0" w:oddHBand="0" w:evenHBand="0" w:firstRowFirstColumn="0" w:firstRowLastColumn="0" w:lastRowFirstColumn="0" w:lastRowLastColumn="0"/>
-              <w:rPr>
-                <w:rFonts w:ascii="Calibri" w:hAnsi="Calibri" w:cs="Calibri" w:asciiTheme="minorHAnsi" w:cstheme="minorHAnsi" w:hAnsiTheme="minorHAnsi"/>
-                <w:color w:val="000000"/>
-                <w:sz w:val="18"/>
-                <w:szCs w:val="18"/>
-              </w:rPr>
-            </w:pPr>
-            <w:r>
-              <w:rPr>
-                <w:rFonts w:eastAsia="Times New Roman" w:cs="Calibri" w:cstheme="minorHAnsi" w:ascii="Calibri" w:hAnsi="Calibri"/>
-                <w:color w:val="000000"/>
-                <w:kern w:val="0"/>
-                <w:sz w:val="18"/>
-                <w:szCs w:val="18"/>
-                <w:lang w:val="pt-BR" w:eastAsia="pt-BR" w:bidi="ar-SA"/>
-              </w:rPr>
-            </w:r>
-          </w:p>
-        </w:tc>
-      </w:tr>
-      <w:tr>
-        <w:trPr>
-          <w:trHeight w:val="288" w:hRule="atLeast"/>
-        </w:trPr>
-        <w:tc>
-          <w:tcPr>
-            <w:tcW w:w="2546" w:type="dxa"/>
-            <w:cnfStyle w:val="001000000000" w:firstRow="0" w:lastRow="0" w:firstColumn="1" w:lastColumn="0" w:oddVBand="0" w:evenVBand="0" w:oddHBand="0" w:evenHBand="0" w:firstRowFirstColumn="0" w:firstRowLastColumn="0" w:lastRowFirstColumn="0" w:lastRowLastColumn="0"/>
-            <w:tcBorders/>
-          </w:tcPr>
-          <w:p>
-            <w:pPr>
-              <w:pStyle w:val="Normal"/>
-              <w:widowControl/>
-              <w:spacing w:before="0" w:after="0"/>
-              <w:jc w:val="center"/>
-              <w:rPr>
-                <w:rFonts w:ascii="Calibri" w:hAnsi="Calibri" w:cs="Calibri" w:asciiTheme="minorHAnsi" w:cstheme="minorHAnsi" w:hAnsiTheme="minorHAnsi"/>
-                <w:color w:val="000000"/>
-                <w:sz w:val="18"/>
-                <w:szCs w:val="18"/>
-              </w:rPr>
-            </w:pPr>
-            <w:r>
-              <w:rPr>
-                <w:rFonts w:eastAsia="Times New Roman" w:cs="Calibri" w:cstheme="minorHAnsi" w:ascii="Calibri" w:hAnsi="Calibri"/>
-                <w:b/>
-                <w:bCs/>
-                <w:color w:val="000000"/>
-                <w:kern w:val="0"/>
-                <w:sz w:val="18"/>
-                <w:szCs w:val="18"/>
-                <w:lang w:val="pt-BR" w:eastAsia="pt-BR" w:bidi="ar-SA"/>
-              </w:rPr>
-            </w:r>
-          </w:p>
-        </w:tc>
-        <w:tc>
-          <w:tcPr>
-            <w:tcW w:w="2835" w:type="dxa"/>
-            <w:tcBorders/>
-          </w:tcPr>
-          <w:p>
-            <w:pPr>
-              <w:pStyle w:val="Normal"/>
-              <w:widowControl/>
-              <w:spacing w:before="0" w:after="0"/>
-              <w:jc w:val="center"/>
-              <w:cnfStyle w:val="000000000000" w:firstRow="0" w:lastRow="0" w:firstColumn="0" w:lastColumn="0" w:oddVBand="0" w:evenVBand="0" w:oddHBand="0" w:evenHBand="0" w:firstRowFirstColumn="0" w:firstRowLastColumn="0" w:lastRowFirstColumn="0" w:lastRowLastColumn="0"/>
-              <w:rPr>
-                <w:rFonts w:ascii="Calibri" w:hAnsi="Calibri" w:cs="Calibri" w:asciiTheme="minorHAnsi" w:cstheme="minorHAnsi" w:hAnsiTheme="minorHAnsi"/>
-                <w:color w:val="000000"/>
-                <w:sz w:val="18"/>
-                <w:szCs w:val="18"/>
-              </w:rPr>
-            </w:pPr>
-            <w:r>
-              <w:rPr>
-                <w:rFonts w:eastAsia="Times New Roman" w:cs="Calibri" w:cstheme="minorHAnsi" w:ascii="Calibri" w:hAnsi="Calibri"/>
-                <w:color w:val="000000"/>
-                <w:kern w:val="0"/>
-                <w:sz w:val="18"/>
-                <w:szCs w:val="18"/>
-                <w:lang w:val="pt-BR" w:eastAsia="pt-BR" w:bidi="ar-SA"/>
-              </w:rPr>
-            </w:r>
-          </w:p>
-        </w:tc>
-      </w:tr>
-      <w:tr>
-        <w:trPr>
-          <w:trHeight w:val="288" w:hRule="atLeast"/>
-        </w:trPr>
-        <w:tc>
-          <w:tcPr>
-            <w:tcW w:w="2546" w:type="dxa"/>
-            <w:cnfStyle w:val="001000000000" w:firstRow="0" w:lastRow="0" w:firstColumn="1" w:lastColumn="0" w:oddVBand="0" w:evenVBand="0" w:oddHBand="0" w:evenHBand="0" w:firstRowFirstColumn="0" w:firstRowLastColumn="0" w:lastRowFirstColumn="0" w:lastRowLastColumn="0"/>
-            <w:tcBorders/>
-          </w:tcPr>
-          <w:p>
-            <w:pPr>
-              <w:pStyle w:val="Normal"/>
-              <w:widowControl/>
-              <w:spacing w:before="0" w:after="0"/>
-              <w:jc w:val="center"/>
-              <w:rPr>
-                <w:rFonts w:ascii="Calibri" w:hAnsi="Calibri" w:cs="Calibri" w:asciiTheme="minorHAnsi" w:cstheme="minorHAnsi" w:hAnsiTheme="minorHAnsi"/>
-                <w:color w:val="000000"/>
-                <w:sz w:val="18"/>
-                <w:szCs w:val="18"/>
-              </w:rPr>
-            </w:pPr>
-            <w:r>
-              <w:rPr>
-                <w:rFonts w:eastAsia="Times New Roman" w:cs="Calibri" w:cstheme="minorHAnsi" w:ascii="Calibri" w:hAnsi="Calibri"/>
-                <w:b/>
-                <w:bCs/>
-                <w:color w:val="000000"/>
-                <w:kern w:val="0"/>
-                <w:sz w:val="18"/>
-                <w:szCs w:val="18"/>
-                <w:lang w:val="pt-BR" w:eastAsia="pt-BR" w:bidi="ar-SA"/>
-              </w:rPr>
-            </w:r>
-          </w:p>
-        </w:tc>
-        <w:tc>
-          <w:tcPr>
-            <w:tcW w:w="2835" w:type="dxa"/>
-            <w:tcBorders/>
-          </w:tcPr>
-          <w:p>
-            <w:pPr>
-              <w:pStyle w:val="Normal"/>
-              <w:widowControl/>
-              <w:spacing w:before="0" w:after="0"/>
-              <w:jc w:val="center"/>
-              <w:cnfStyle w:val="000000000000" w:firstRow="0" w:lastRow="0" w:firstColumn="0" w:lastColumn="0" w:oddVBand="0" w:evenVBand="0" w:oddHBand="0" w:evenHBand="0" w:firstRowFirstColumn="0" w:firstRowLastColumn="0" w:lastRowFirstColumn="0" w:lastRowLastColumn="0"/>
-              <w:rPr>
-                <w:rFonts w:ascii="Calibri" w:hAnsi="Calibri" w:cs="Calibri" w:asciiTheme="minorHAnsi" w:cstheme="minorHAnsi" w:hAnsiTheme="minorHAnsi"/>
-                <w:color w:val="000000"/>
-                <w:sz w:val="18"/>
-                <w:szCs w:val="18"/>
-              </w:rPr>
-            </w:pPr>
-            <w:r>
-              <w:rPr>
-                <w:rFonts w:eastAsia="Times New Roman" w:cs="Calibri" w:cstheme="minorHAnsi" w:ascii="Calibri" w:hAnsi="Calibri"/>
-                <w:color w:val="000000"/>
-                <w:kern w:val="0"/>
-                <w:sz w:val="18"/>
-                <w:szCs w:val="18"/>
-                <w:lang w:val="pt-BR" w:eastAsia="pt-BR" w:bidi="ar-SA"/>
-              </w:rPr>
-            </w:r>
-          </w:p>
-        </w:tc>
-      </w:tr>
-      <w:tr>
-        <w:trPr>
-          <w:trHeight w:val="288" w:hRule="atLeast"/>
-        </w:trPr>
-        <w:tc>
-          <w:tcPr>
-            <w:tcW w:w="2546" w:type="dxa"/>
-            <w:cnfStyle w:val="001000000000" w:firstRow="0" w:lastRow="0" w:firstColumn="1" w:lastColumn="0" w:oddVBand="0" w:evenVBand="0" w:oddHBand="0" w:evenHBand="0" w:firstRowFirstColumn="0" w:firstRowLastColumn="0" w:lastRowFirstColumn="0" w:lastRowLastColumn="0"/>
-            <w:tcBorders/>
-          </w:tcPr>
-          <w:p>
-            <w:pPr>
-              <w:pStyle w:val="Normal"/>
-              <w:widowControl/>
-              <w:spacing w:before="0" w:after="0"/>
-              <w:jc w:val="center"/>
-              <w:rPr>
-                <w:rFonts w:ascii="Calibri" w:hAnsi="Calibri" w:cs="Calibri" w:asciiTheme="minorHAnsi" w:cstheme="minorHAnsi" w:hAnsiTheme="minorHAnsi"/>
-                <w:color w:val="000000"/>
-                <w:sz w:val="18"/>
-                <w:szCs w:val="18"/>
-              </w:rPr>
-            </w:pPr>
-            <w:r>
-              <w:rPr>
-                <w:rFonts w:eastAsia="Times New Roman" w:cs="Calibri" w:cstheme="minorHAnsi" w:ascii="Calibri" w:hAnsi="Calibri"/>
-                <w:b/>
-                <w:bCs/>
-                <w:color w:val="000000"/>
-                <w:kern w:val="0"/>
-                <w:sz w:val="18"/>
-                <w:szCs w:val="18"/>
-                <w:lang w:val="pt-BR" w:eastAsia="pt-BR" w:bidi="ar-SA"/>
-              </w:rPr>
-            </w:r>
-          </w:p>
-        </w:tc>
-        <w:tc>
-          <w:tcPr>
-            <w:tcW w:w="2835" w:type="dxa"/>
-            <w:tcBorders/>
-          </w:tcPr>
-          <w:p>
-            <w:pPr>
-              <w:pStyle w:val="Normal"/>
-              <w:widowControl/>
-              <w:spacing w:before="0" w:after="0"/>
-              <w:jc w:val="center"/>
-              <w:cnfStyle w:val="000000000000" w:firstRow="0" w:lastRow="0" w:firstColumn="0" w:lastColumn="0" w:oddVBand="0" w:evenVBand="0" w:oddHBand="0" w:evenHBand="0" w:firstRowFirstColumn="0" w:firstRowLastColumn="0" w:lastRowFirstColumn="0" w:lastRowLastColumn="0"/>
-              <w:rPr>
-                <w:rFonts w:ascii="Calibri" w:hAnsi="Calibri" w:cs="Calibri" w:asciiTheme="minorHAnsi" w:cstheme="minorHAnsi" w:hAnsiTheme="minorHAnsi"/>
-                <w:color w:val="000000"/>
-                <w:sz w:val="18"/>
-                <w:szCs w:val="18"/>
-              </w:rPr>
-            </w:pPr>
-            <w:r>
-              <w:rPr>
-                <w:rFonts w:eastAsia="Times New Roman" w:cs="Calibri" w:cstheme="minorHAnsi" w:ascii="Calibri" w:hAnsi="Calibri"/>
-                <w:color w:val="000000"/>
-                <w:kern w:val="0"/>
-                <w:sz w:val="18"/>
-                <w:szCs w:val="18"/>
-                <w:lang w:val="pt-BR" w:eastAsia="pt-BR" w:bidi="ar-SA"/>
-              </w:rPr>
-            </w:r>
-          </w:p>
-        </w:tc>
-      </w:tr>
-      <w:tr>
-        <w:trPr>
-          <w:trHeight w:val="288" w:hRule="atLeast"/>
-        </w:trPr>
-        <w:tc>
-          <w:tcPr>
-            <w:tcW w:w="2546" w:type="dxa"/>
-            <w:cnfStyle w:val="001000000000" w:firstRow="0" w:lastRow="0" w:firstColumn="1" w:lastColumn="0" w:oddVBand="0" w:evenVBand="0" w:oddHBand="0" w:evenHBand="0" w:firstRowFirstColumn="0" w:firstRowLastColumn="0" w:lastRowFirstColumn="0" w:lastRowLastColumn="0"/>
-            <w:tcBorders/>
-          </w:tcPr>
-          <w:p>
-            <w:pPr>
-              <w:pStyle w:val="Normal"/>
-              <w:widowControl/>
-              <w:spacing w:before="0" w:after="0"/>
-              <w:jc w:val="center"/>
-              <w:rPr>
-                <w:rFonts w:ascii="Calibri" w:hAnsi="Calibri" w:cs="Calibri" w:asciiTheme="minorHAnsi" w:cstheme="minorHAnsi" w:hAnsiTheme="minorHAnsi"/>
-                <w:color w:val="000000"/>
-                <w:sz w:val="18"/>
-                <w:szCs w:val="18"/>
-              </w:rPr>
-            </w:pPr>
-            <w:r>
-              <w:rPr>
-                <w:rFonts w:eastAsia="Times New Roman" w:cs="Calibri" w:cstheme="minorHAnsi" w:ascii="Calibri" w:hAnsi="Calibri"/>
-                <w:b/>
-                <w:bCs/>
-                <w:color w:val="000000"/>
-                <w:kern w:val="0"/>
-                <w:sz w:val="18"/>
-                <w:szCs w:val="18"/>
-                <w:lang w:val="pt-BR" w:eastAsia="pt-BR" w:bidi="ar-SA"/>
-              </w:rPr>
-            </w:r>
-          </w:p>
-        </w:tc>
-        <w:tc>
-          <w:tcPr>
-            <w:tcW w:w="2835" w:type="dxa"/>
-            <w:tcBorders/>
-          </w:tcPr>
-          <w:p>
-            <w:pPr>
-              <w:pStyle w:val="Normal"/>
-              <w:widowControl/>
-              <w:spacing w:before="0" w:after="0"/>
-              <w:jc w:val="center"/>
-              <w:cnfStyle w:val="000000000000" w:firstRow="0" w:lastRow="0" w:firstColumn="0" w:lastColumn="0" w:oddVBand="0" w:evenVBand="0" w:oddHBand="0" w:evenHBand="0" w:firstRowFirstColumn="0" w:firstRowLastColumn="0" w:lastRowFirstColumn="0" w:lastRowLastColumn="0"/>
-              <w:rPr>
-                <w:rFonts w:ascii="Calibri" w:hAnsi="Calibri" w:cs="Calibri" w:asciiTheme="minorHAnsi" w:cstheme="minorHAnsi" w:hAnsiTheme="minorHAnsi"/>
-                <w:color w:val="000000"/>
-                <w:sz w:val="18"/>
-                <w:szCs w:val="18"/>
-              </w:rPr>
-            </w:pPr>
-            <w:r>
-              <w:rPr>
-                <w:rFonts w:eastAsia="Times New Roman" w:cs="Calibri" w:cstheme="minorHAnsi" w:ascii="Calibri" w:hAnsi="Calibri"/>
-                <w:color w:val="000000"/>
-                <w:kern w:val="0"/>
-                <w:sz w:val="18"/>
-                <w:szCs w:val="18"/>
-                <w:lang w:val="pt-BR" w:eastAsia="pt-BR" w:bidi="ar-SA"/>
-              </w:rPr>
-            </w:r>
-          </w:p>
-        </w:tc>
-      </w:tr>
-      <w:tr>
-        <w:trPr>
-          <w:trHeight w:val="288" w:hRule="atLeast"/>
-        </w:trPr>
-        <w:tc>
-          <w:tcPr>
-            <w:tcW w:w="2546" w:type="dxa"/>
-            <w:cnfStyle w:val="001000000000" w:firstRow="0" w:lastRow="0" w:firstColumn="1" w:lastColumn="0" w:oddVBand="0" w:evenVBand="0" w:oddHBand="0" w:evenHBand="0" w:firstRowFirstColumn="0" w:firstRowLastColumn="0" w:lastRowFirstColumn="0" w:lastRowLastColumn="0"/>
-            <w:tcBorders/>
-          </w:tcPr>
-          <w:p>
-            <w:pPr>
-              <w:pStyle w:val="Normal"/>
-              <w:widowControl/>
-              <w:spacing w:before="0" w:after="0"/>
-              <w:jc w:val="center"/>
-              <w:rPr>
-                <w:rFonts w:ascii="Calibri" w:hAnsi="Calibri" w:cs="Calibri" w:asciiTheme="minorHAnsi" w:cstheme="minorHAnsi" w:hAnsiTheme="minorHAnsi"/>
-                <w:color w:val="000000"/>
-                <w:sz w:val="18"/>
-                <w:szCs w:val="18"/>
-              </w:rPr>
-            </w:pPr>
-            <w:r>
-              <w:rPr>
-                <w:rFonts w:eastAsia="Times New Roman" w:cs="Calibri" w:cstheme="minorHAnsi" w:ascii="Calibri" w:hAnsi="Calibri"/>
-                <w:b/>
-                <w:bCs/>
-                <w:color w:val="000000"/>
-                <w:kern w:val="0"/>
-                <w:sz w:val="18"/>
-                <w:szCs w:val="18"/>
-                <w:lang w:val="pt-BR" w:eastAsia="pt-BR" w:bidi="ar-SA"/>
-              </w:rPr>
-            </w:r>
-          </w:p>
-        </w:tc>
-        <w:tc>
-          <w:tcPr>
-            <w:tcW w:w="2835" w:type="dxa"/>
-            <w:tcBorders/>
-          </w:tcPr>
-          <w:p>
-            <w:pPr>
-              <w:pStyle w:val="Normal"/>
-              <w:widowControl/>
-              <w:spacing w:before="0" w:after="0"/>
-              <w:jc w:val="center"/>
-              <w:cnfStyle w:val="000000000000" w:firstRow="0" w:lastRow="0" w:firstColumn="0" w:lastColumn="0" w:oddVBand="0" w:evenVBand="0" w:oddHBand="0" w:evenHBand="0" w:firstRowFirstColumn="0" w:firstRowLastColumn="0" w:lastRowFirstColumn="0" w:lastRowLastColumn="0"/>
-              <w:rPr>
-                <w:rFonts w:ascii="Calibri" w:hAnsi="Calibri" w:cs="Calibri" w:asciiTheme="minorHAnsi" w:cstheme="minorHAnsi" w:hAnsiTheme="minorHAnsi"/>
-                <w:color w:val="000000"/>
-                <w:sz w:val="18"/>
-                <w:szCs w:val="18"/>
-              </w:rPr>
-            </w:pPr>
-            <w:r>
-              <w:rPr>
-                <w:rFonts w:eastAsia="Times New Roman" w:cs="Calibri" w:cstheme="minorHAnsi" w:ascii="Calibri" w:hAnsi="Calibri"/>
-                <w:color w:val="000000"/>
-                <w:kern w:val="0"/>
-                <w:sz w:val="18"/>
-                <w:szCs w:val="18"/>
-                <w:lang w:val="pt-BR" w:eastAsia="pt-BR" w:bidi="ar-SA"/>
-              </w:rPr>
-            </w:r>
-          </w:p>
-        </w:tc>
-      </w:tr>
-      <w:tr>
-        <w:trPr>
-          <w:trHeight w:val="288" w:hRule="atLeast"/>
-        </w:trPr>
-        <w:tc>
-          <w:tcPr>
-            <w:tcW w:w="2546" w:type="dxa"/>
-            <w:cnfStyle w:val="001000000000" w:firstRow="0" w:lastRow="0" w:firstColumn="1" w:lastColumn="0" w:oddVBand="0" w:evenVBand="0" w:oddHBand="0" w:evenHBand="0" w:firstRowFirstColumn="0" w:firstRowLastColumn="0" w:lastRowFirstColumn="0" w:lastRowLastColumn="0"/>
-            <w:tcBorders/>
-          </w:tcPr>
-          <w:p>
-            <w:pPr>
-              <w:pStyle w:val="Normal"/>
-              <w:widowControl/>
-              <w:spacing w:before="0" w:after="0"/>
-              <w:jc w:val="center"/>
-              <w:rPr>
-                <w:rFonts w:ascii="Calibri" w:hAnsi="Calibri" w:cs="Calibri" w:asciiTheme="minorHAnsi" w:cstheme="minorHAnsi" w:hAnsiTheme="minorHAnsi"/>
-                <w:color w:val="000000"/>
-                <w:sz w:val="18"/>
-                <w:szCs w:val="18"/>
-              </w:rPr>
-            </w:pPr>
-            <w:r>
-              <w:rPr>
-                <w:rFonts w:eastAsia="Times New Roman" w:cs="Calibri" w:cstheme="minorHAnsi" w:ascii="Calibri" w:hAnsi="Calibri"/>
-                <w:b/>
-                <w:bCs/>
-                <w:color w:val="000000"/>
-                <w:kern w:val="0"/>
-                <w:sz w:val="18"/>
-                <w:szCs w:val="18"/>
-                <w:lang w:val="pt-BR" w:eastAsia="pt-BR" w:bidi="ar-SA"/>
-              </w:rPr>
-            </w:r>
-          </w:p>
-        </w:tc>
-        <w:tc>
-          <w:tcPr>
-            <w:tcW w:w="2835" w:type="dxa"/>
-            <w:tcBorders/>
-          </w:tcPr>
-          <w:p>
-            <w:pPr>
-              <w:pStyle w:val="Normal"/>
-              <w:widowControl/>
-              <w:spacing w:before="0" w:after="0"/>
-              <w:jc w:val="center"/>
-              <w:cnfStyle w:val="000000000000" w:firstRow="0" w:lastRow="0" w:firstColumn="0" w:lastColumn="0" w:oddVBand="0" w:evenVBand="0" w:oddHBand="0" w:evenHBand="0" w:firstRowFirstColumn="0" w:firstRowLastColumn="0" w:lastRowFirstColumn="0" w:lastRowLastColumn="0"/>
-              <w:rPr>
-                <w:rFonts w:ascii="Calibri" w:hAnsi="Calibri" w:cs="Calibri" w:asciiTheme="minorHAnsi" w:cstheme="minorHAnsi" w:hAnsiTheme="minorHAnsi"/>
-                <w:color w:val="000000"/>
-                <w:sz w:val="18"/>
-                <w:szCs w:val="18"/>
-              </w:rPr>
-            </w:pPr>
-            <w:r>
-              <w:rPr>
-                <w:rFonts w:eastAsia="Times New Roman" w:cs="Calibri" w:cstheme="minorHAnsi" w:ascii="Calibri" w:hAnsi="Calibri"/>
-                <w:color w:val="000000"/>
-                <w:kern w:val="0"/>
-                <w:sz w:val="18"/>
-                <w:szCs w:val="18"/>
-                <w:lang w:val="pt-BR" w:eastAsia="pt-BR" w:bidi="ar-SA"/>
-              </w:rPr>
-            </w:r>
-          </w:p>
-        </w:tc>
-      </w:tr>
-      <w:tr>
-        <w:trPr>
-          <w:trHeight w:val="288" w:hRule="atLeast"/>
-        </w:trPr>
-        <w:tc>
-          <w:tcPr>
-            <w:tcW w:w="2546" w:type="dxa"/>
-            <w:cnfStyle w:val="001000000000" w:firstRow="0" w:lastRow="0" w:firstColumn="1" w:lastColumn="0" w:oddVBand="0" w:evenVBand="0" w:oddHBand="0" w:evenHBand="0" w:firstRowFirstColumn="0" w:firstRowLastColumn="0" w:lastRowFirstColumn="0" w:lastRowLastColumn="0"/>
-            <w:tcBorders/>
-          </w:tcPr>
-          <w:p>
-            <w:pPr>
-              <w:pStyle w:val="Normal"/>
-              <w:widowControl/>
-              <w:spacing w:before="0" w:after="0"/>
-              <w:jc w:val="center"/>
-              <w:rPr>
-                <w:rFonts w:ascii="Calibri" w:hAnsi="Calibri" w:cs="Calibri" w:asciiTheme="minorHAnsi" w:cstheme="minorHAnsi" w:hAnsiTheme="minorHAnsi"/>
-                <w:color w:val="000000"/>
-                <w:sz w:val="18"/>
-                <w:szCs w:val="18"/>
-              </w:rPr>
-            </w:pPr>
-            <w:r>
-              <w:rPr>
-                <w:rFonts w:eastAsia="Times New Roman" w:cs="Calibri" w:cstheme="minorHAnsi" w:ascii="Calibri" w:hAnsi="Calibri"/>
-                <w:b/>
-                <w:bCs/>
-                <w:color w:val="000000"/>
-                <w:kern w:val="0"/>
-                <w:sz w:val="18"/>
-                <w:szCs w:val="18"/>
-                <w:lang w:val="pt-BR" w:eastAsia="pt-BR" w:bidi="ar-SA"/>
-              </w:rPr>
-            </w:r>
-          </w:p>
-        </w:tc>
-        <w:tc>
-          <w:tcPr>
-            <w:tcW w:w="2835" w:type="dxa"/>
-            <w:tcBorders/>
-          </w:tcPr>
-          <w:p>
-            <w:pPr>
-              <w:pStyle w:val="Normal"/>
-              <w:widowControl/>
-              <w:spacing w:before="0" w:after="0"/>
-              <w:jc w:val="center"/>
-              <w:cnfStyle w:val="000000000000" w:firstRow="0" w:lastRow="0" w:firstColumn="0" w:lastColumn="0" w:oddVBand="0" w:evenVBand="0" w:oddHBand="0" w:evenHBand="0" w:firstRowFirstColumn="0" w:firstRowLastColumn="0" w:lastRowFirstColumn="0" w:lastRowLastColumn="0"/>
-              <w:rPr>
-                <w:rFonts w:ascii="Calibri" w:hAnsi="Calibri" w:cs="Calibri" w:asciiTheme="minorHAnsi" w:cstheme="minorHAnsi" w:hAnsiTheme="minorHAnsi"/>
-                <w:color w:val="000000"/>
-                <w:sz w:val="18"/>
-                <w:szCs w:val="18"/>
-              </w:rPr>
-            </w:pPr>
-            <w:r>
-              <w:rPr>
-                <w:rFonts w:eastAsia="Times New Roman" w:cs="Calibri" w:cstheme="minorHAnsi" w:ascii="Calibri" w:hAnsi="Calibri"/>
-                <w:color w:val="000000"/>
-                <w:kern w:val="0"/>
-                <w:sz w:val="18"/>
-                <w:szCs w:val="18"/>
-                <w:lang w:val="pt-BR" w:eastAsia="pt-BR" w:bidi="ar-SA"/>
-              </w:rPr>
-            </w:r>
-          </w:p>
-        </w:tc>
-      </w:tr>
-      <w:tr>
-        <w:trPr>
-          <w:trHeight w:val="288" w:hRule="atLeast"/>
-        </w:trPr>
-        <w:tc>
-          <w:tcPr>
-            <w:tcW w:w="2546" w:type="dxa"/>
-            <w:cnfStyle w:val="001000000000" w:firstRow="0" w:lastRow="0" w:firstColumn="1" w:lastColumn="0" w:oddVBand="0" w:evenVBand="0" w:oddHBand="0" w:evenHBand="0" w:firstRowFirstColumn="0" w:firstRowLastColumn="0" w:lastRowFirstColumn="0" w:lastRowLastColumn="0"/>
-            <w:tcBorders/>
-          </w:tcPr>
-          <w:p>
-            <w:pPr>
-              <w:pStyle w:val="Normal"/>
-              <w:widowControl/>
-              <w:spacing w:before="0" w:after="0"/>
-              <w:jc w:val="center"/>
-              <w:rPr>
-                <w:rFonts w:ascii="Calibri" w:hAnsi="Calibri" w:cs="Calibri" w:asciiTheme="minorHAnsi" w:cstheme="minorHAnsi" w:hAnsiTheme="minorHAnsi"/>
-                <w:color w:val="000000"/>
-                <w:sz w:val="18"/>
-                <w:szCs w:val="18"/>
-              </w:rPr>
-            </w:pPr>
-            <w:r>
-              <w:rPr>
-                <w:rFonts w:eastAsia="Times New Roman" w:cs="Calibri" w:cstheme="minorHAnsi" w:ascii="Calibri" w:hAnsi="Calibri"/>
-                <w:b/>
-                <w:bCs/>
-                <w:color w:val="000000"/>
-                <w:kern w:val="0"/>
-                <w:sz w:val="18"/>
-                <w:szCs w:val="18"/>
-                <w:lang w:val="pt-BR" w:eastAsia="pt-BR" w:bidi="ar-SA"/>
-              </w:rPr>
-            </w:r>
-          </w:p>
-        </w:tc>
-        <w:tc>
-          <w:tcPr>
-            <w:tcW w:w="2835" w:type="dxa"/>
-            <w:tcBorders/>
-          </w:tcPr>
-          <w:p>
-            <w:pPr>
-              <w:pStyle w:val="Normal"/>
-              <w:widowControl/>
-              <w:spacing w:before="0" w:after="0"/>
-              <w:jc w:val="center"/>
-              <w:cnfStyle w:val="000000000000" w:firstRow="0" w:lastRow="0" w:firstColumn="0" w:lastColumn="0" w:oddVBand="0" w:evenVBand="0" w:oddHBand="0" w:evenHBand="0" w:firstRowFirstColumn="0" w:firstRowLastColumn="0" w:lastRowFirstColumn="0" w:lastRowLastColumn="0"/>
-              <w:rPr>
-                <w:rFonts w:ascii="Calibri" w:hAnsi="Calibri" w:cs="Calibri" w:asciiTheme="minorHAnsi" w:cstheme="minorHAnsi" w:hAnsiTheme="minorHAnsi"/>
-                <w:color w:val="000000"/>
-                <w:sz w:val="18"/>
-                <w:szCs w:val="18"/>
-              </w:rPr>
-            </w:pPr>
-            <w:r>
-              <w:rPr>
-                <w:rFonts w:eastAsia="Times New Roman" w:cs="Calibri" w:cstheme="minorHAnsi" w:ascii="Calibri" w:hAnsi="Calibri"/>
-                <w:color w:val="000000"/>
-                <w:kern w:val="0"/>
-                <w:sz w:val="18"/>
-                <w:szCs w:val="18"/>
-                <w:lang w:val="pt-BR" w:eastAsia="pt-BR" w:bidi="ar-SA"/>
-              </w:rPr>
-            </w:r>
-          </w:p>
-        </w:tc>
-      </w:tr>
-      <w:tr>
-        <w:trPr>
-          <w:trHeight w:val="288" w:hRule="atLeast"/>
-        </w:trPr>
-        <w:tc>
-          <w:tcPr>
-            <w:tcW w:w="2546" w:type="dxa"/>
-            <w:cnfStyle w:val="001000000000" w:firstRow="0" w:lastRow="0" w:firstColumn="1" w:lastColumn="0" w:oddVBand="0" w:evenVBand="0" w:oddHBand="0" w:evenHBand="0" w:firstRowFirstColumn="0" w:firstRowLastColumn="0" w:lastRowFirstColumn="0" w:lastRowLastColumn="0"/>
-            <w:tcBorders/>
-          </w:tcPr>
-          <w:p>
-            <w:pPr>
-              <w:pStyle w:val="Normal"/>
-              <w:widowControl/>
-              <w:spacing w:before="0" w:after="0"/>
-              <w:jc w:val="center"/>
-              <w:rPr>
-                <w:rFonts w:ascii="Calibri" w:hAnsi="Calibri" w:cs="Calibri" w:asciiTheme="minorHAnsi" w:cstheme="minorHAnsi" w:hAnsiTheme="minorHAnsi"/>
-                <w:color w:val="000000"/>
-                <w:sz w:val="18"/>
-                <w:szCs w:val="18"/>
-              </w:rPr>
-            </w:pPr>
-            <w:r>
-              <w:rPr>
-                <w:rFonts w:eastAsia="Times New Roman" w:cs="Calibri" w:cstheme="minorHAnsi" w:ascii="Calibri" w:hAnsi="Calibri"/>
-                <w:b/>
-                <w:bCs/>
-                <w:color w:val="000000"/>
-                <w:kern w:val="0"/>
-                <w:sz w:val="18"/>
-                <w:szCs w:val="18"/>
-                <w:lang w:val="pt-BR" w:eastAsia="pt-BR" w:bidi="ar-SA"/>
-              </w:rPr>
-            </w:r>
-          </w:p>
-        </w:tc>
-        <w:tc>
-          <w:tcPr>
-            <w:tcW w:w="2835" w:type="dxa"/>
-            <w:tcBorders/>
-          </w:tcPr>
-          <w:p>
-            <w:pPr>
-              <w:pStyle w:val="Normal"/>
-              <w:widowControl/>
-              <w:spacing w:before="0" w:after="0"/>
-              <w:jc w:val="center"/>
-              <w:cnfStyle w:val="000000000000" w:firstRow="0" w:lastRow="0" w:firstColumn="0" w:lastColumn="0" w:oddVBand="0" w:evenVBand="0" w:oddHBand="0" w:evenHBand="0" w:firstRowFirstColumn="0" w:firstRowLastColumn="0" w:lastRowFirstColumn="0" w:lastRowLastColumn="0"/>
-              <w:rPr>
-                <w:rFonts w:ascii="Calibri" w:hAnsi="Calibri" w:cs="Calibri" w:asciiTheme="minorHAnsi" w:cstheme="minorHAnsi" w:hAnsiTheme="minorHAnsi"/>
-                <w:color w:val="000000"/>
-                <w:sz w:val="18"/>
-                <w:szCs w:val="18"/>
-              </w:rPr>
-            </w:pPr>
-            <w:r>
-              <w:rPr>
-                <w:rFonts w:eastAsia="Times New Roman" w:cs="Calibri" w:cstheme="minorHAnsi" w:ascii="Calibri" w:hAnsi="Calibri"/>
-                <w:color w:val="000000"/>
-                <w:kern w:val="0"/>
-                <w:sz w:val="18"/>
-                <w:szCs w:val="18"/>
-                <w:lang w:val="pt-BR" w:eastAsia="pt-BR" w:bidi="ar-SA"/>
-              </w:rPr>
-            </w:r>
-          </w:p>
-        </w:tc>
-      </w:tr>
-    </w:tbl>
-    <w:p>
-      <w:pPr>
-        <w:pStyle w:val="Normal"/>
-        <w:tabs>
-          <w:tab w:val="clear" w:pos="708"/>
-          <w:tab w:val="left" w:pos="284" w:leader="none"/>
-        </w:tabs>
-        <w:jc w:val="both"/>
-        <w:rPr>
-          <w:rFonts w:ascii="Calibri" w:hAnsi="Calibri" w:cs="Calibri" w:asciiTheme="minorHAnsi" w:cstheme="minorHAnsi" w:hAnsiTheme="minorHAnsi"/>
-          <w:sz w:val="14"/>
-          <w:szCs w:val="14"/>
         </w:rPr>
       </w:pPr>
       <w:r>
@@ -10118,12 +9153,10 @@
     </w:pPr>
     <w:r>
       <w:rPr/>
-    </w:r>
-    <w:r>
       <mc:AlternateContent>
         <mc:Choice Requires="wps">
           <w:drawing>
-            <wp:anchor behindDoc="0" distT="0" distB="0" distL="0" distR="0" simplePos="0" locked="0" layoutInCell="1" allowOverlap="1" relativeHeight="0">
+            <wp:anchor behindDoc="1" distT="0" distB="0" distL="0" distR="0" simplePos="0" locked="0" layoutInCell="0" allowOverlap="1" relativeHeight="3">
               <wp:simplePos x="0" y="0"/>
               <wp:positionH relativeFrom="margin">
                 <wp:align>right</wp:align>
@@ -10138,25 +9171,31 @@
               <a:graphic xmlns:a="http://schemas.openxmlformats.org/drawingml/2006/main">
                 <a:graphicData uri="http://schemas.microsoft.com/office/word/2010/wordprocessingShape">
                   <wps:wsp>
-                    <wps:cNvSpPr txBox="1"/>
+                    <wps:cNvSpPr/>
                     <wps:spPr>
                       <a:xfrm>
                         <a:off x="0" y="0"/>
-                        <a:ext cx="14605" cy="14605"/>
+                        <a:ext cx="14760" cy="14760"/>
                       </a:xfrm>
-                      <a:prstGeom prst="rect"/>
-                      <a:solidFill>
-                        <a:srgbClr val="FFFFFF">
-                          <a:alpha val="0"/>
-                        </a:srgbClr>
-                      </a:solidFill>
+                      <a:prstGeom prst="rect">
+                        <a:avLst/>
+                      </a:prstGeom>
+                      <a:noFill/>
+                      <a:ln w="0">
+                        <a:noFill/>
+                      </a:ln>
                     </wps:spPr>
+                    <wps:style>
+                      <a:lnRef idx="0"/>
+                      <a:fillRef idx="0"/>
+                      <a:effectRef idx="0"/>
+                      <a:fontRef idx="minor"/>
+                    </wps:style>
                     <wps:txbx>
                       <w:txbxContent>
                         <w:p>
                           <w:pPr>
                             <w:pStyle w:val="Footer"/>
-                            <w:pBdr/>
                             <w:rPr>
                               <w:rStyle w:val="PageNumber"/>
                             </w:rPr>
@@ -10194,7 +9233,7 @@
                         </w:p>
                       </w:txbxContent>
                     </wps:txbx>
-                    <wps:bodyPr anchor="t" lIns="0" tIns="0" rIns="0" bIns="0">
+                    <wps:bodyPr lIns="0" rIns="0" tIns="0" bIns="0" anchor="t">
                       <a:spAutoFit/>
                     </wps:bodyPr>
                   </wps:wsp>
@@ -10205,14 +9244,14 @@
         </mc:Choice>
         <mc:Fallback>
           <w:pict>
-            <v:rect fillcolor="#FFFFFF" style="position:absolute;rotation:-0;width:1.15pt;height:1.15pt;mso-wrap-distance-left:0pt;mso-wrap-distance-right:0pt;mso-wrap-distance-top:0pt;mso-wrap-distance-bottom:0pt;margin-top:0.05pt;mso-position-vertical-relative:text;margin-left:0pt;mso-position-horizontal:right;mso-position-horizontal-relative:margin">
-              <v:fill opacity="0f"/>
-              <v:textbox inset="0in,0in,0in,0in">
+            <v:rect id="shape_0" ID="Quadro2" path="m0,0l-2147483645,0l-2147483645,-2147483646l0,-2147483646xe" fillcolor="white" stroked="f" o:allowincell="f" style="position:absolute;margin-left:0pt;margin-top:0.05pt;width:1.1pt;height:1.1pt;mso-wrap-style:square;v-text-anchor:top;mso-position-horizontal:right;mso-position-horizontal-relative:margin">
+              <v:fill o:detectmouseclick="t" type="solid" color2="black" opacity="0"/>
+              <v:stroke color="#3465a4" joinstyle="round" endcap="flat"/>
+              <v:textbox>
                 <w:txbxContent>
                   <w:p>
                     <w:pPr>
                       <w:pStyle w:val="Footer"/>
-                      <w:pBdr/>
                       <w:rPr>
                         <w:rStyle w:val="PageNumber"/>
                       </w:rPr>
@@ -10583,12 +9622,10 @@
     </w:pPr>
     <w:r>
       <w:rPr/>
-    </w:r>
-    <w:r>
       <mc:AlternateContent>
         <mc:Choice Requires="wps">
           <w:drawing>
-            <wp:anchor behindDoc="0" distT="0" distB="0" distL="0" distR="0" simplePos="0" locked="0" layoutInCell="1" allowOverlap="1" relativeHeight="0">
+            <wp:anchor behindDoc="1" distT="0" distB="0" distL="0" distR="0" simplePos="0" locked="0" layoutInCell="0" allowOverlap="1" relativeHeight="2">
               <wp:simplePos x="0" y="0"/>
               <wp:positionH relativeFrom="margin">
                 <wp:align>right</wp:align>
@@ -10603,25 +9640,31 @@
               <a:graphic xmlns:a="http://schemas.openxmlformats.org/drawingml/2006/main">
                 <a:graphicData uri="http://schemas.microsoft.com/office/word/2010/wordprocessingShape">
                   <wps:wsp>
-                    <wps:cNvSpPr txBox="1"/>
+                    <wps:cNvSpPr/>
                     <wps:spPr>
                       <a:xfrm>
                         <a:off x="0" y="0"/>
-                        <a:ext cx="14605" cy="14605"/>
+                        <a:ext cx="14760" cy="14760"/>
                       </a:xfrm>
-                      <a:prstGeom prst="rect"/>
-                      <a:solidFill>
-                        <a:srgbClr val="FFFFFF">
-                          <a:alpha val="0"/>
-                        </a:srgbClr>
-                      </a:solidFill>
+                      <a:prstGeom prst="rect">
+                        <a:avLst/>
+                      </a:prstGeom>
+                      <a:noFill/>
+                      <a:ln w="0">
+                        <a:noFill/>
+                      </a:ln>
                     </wps:spPr>
+                    <wps:style>
+                      <a:lnRef idx="0"/>
+                      <a:fillRef idx="0"/>
+                      <a:effectRef idx="0"/>
+                      <a:fontRef idx="minor"/>
+                    </wps:style>
                     <wps:txbx>
                       <w:txbxContent>
                         <w:p>
                           <w:pPr>
                             <w:pStyle w:val="Header"/>
-                            <w:pBdr/>
                             <w:rPr>
                               <w:rStyle w:val="PageNumber"/>
                             </w:rPr>
@@ -10659,7 +9702,7 @@
                         </w:p>
                       </w:txbxContent>
                     </wps:txbx>
-                    <wps:bodyPr anchor="t" lIns="0" tIns="0" rIns="0" bIns="0">
+                    <wps:bodyPr lIns="0" rIns="0" tIns="0" bIns="0" anchor="t">
                       <a:spAutoFit/>
                     </wps:bodyPr>
                   </wps:wsp>
@@ -10670,14 +9713,14 @@
         </mc:Choice>
         <mc:Fallback>
           <w:pict>
-            <v:rect fillcolor="#FFFFFF" style="position:absolute;rotation:-0;width:1.15pt;height:1.15pt;mso-wrap-distance-left:0pt;mso-wrap-distance-right:0pt;mso-wrap-distance-top:0pt;mso-wrap-distance-bottom:0pt;margin-top:0.05pt;mso-position-vertical-relative:text;margin-left:0pt;mso-position-horizontal:right;mso-position-horizontal-relative:margin">
-              <v:fill opacity="0f"/>
-              <v:textbox inset="0in,0in,0in,0in">
+            <v:rect id="shape_0" ID="Quadro1" path="m0,0l-2147483645,0l-2147483645,-2147483646l0,-2147483646xe" fillcolor="white" stroked="f" o:allowincell="f" style="position:absolute;margin-left:0pt;margin-top:0.05pt;width:1.1pt;height:1.1pt;mso-wrap-style:square;v-text-anchor:top;mso-position-horizontal:right;mso-position-horizontal-relative:margin">
+              <v:fill o:detectmouseclick="t" type="solid" color2="black" opacity="0"/>
+              <v:stroke color="#3465a4" joinstyle="round" endcap="flat"/>
+              <v:textbox>
                 <w:txbxContent>
                   <w:p>
                     <w:pPr>
                       <w:pStyle w:val="Header"/>
-                      <w:pBdr/>
                       <w:rPr>
                         <w:rStyle w:val="PageNumber"/>
                       </w:rPr>
@@ -11878,6 +10921,7 @@
     <w:rsid w:val="00ab5ab9"/>
     <w:pPr>
       <w:widowControl/>
+      <w:suppressAutoHyphens w:val="true"/>
       <w:bidi w:val="0"/>
       <w:spacing w:before="0" w:after="0"/>
       <w:jc w:val="left"/>
@@ -12080,6 +11124,13 @@
   </w:style>
   <w:style w:type="character" w:styleId="FootnoteCharacters">
     <w:name w:val="Footnote Characters"/>
+    <w:qFormat/>
+    <w:rPr>
+      <w:vertAlign w:val="superscript"/>
+    </w:rPr>
+  </w:style>
+  <w:style w:type="character" w:styleId="FootnoteCharacters1">
+    <w:name w:val="Footnote Characters1"/>
     <w:basedOn w:val="DefaultParagraphFont"/>
     <w:uiPriority w:val="99"/>
     <w:semiHidden/>
@@ -12137,6 +11188,14 @@
     <w:qFormat/>
     <w:rsid w:val="004a28fe"/>
     <w:rPr/>
+  </w:style>
+  <w:style w:type="character" w:styleId="InternetLink1">
+    <w:name w:val="Internet Link1"/>
+    <w:qFormat/>
+    <w:rPr>
+      <w:color w:val="000080"/>
+      <w:u w:val="single"/>
+    </w:rPr>
   </w:style>
   <w:style w:type="character" w:styleId="Hyperlink">
     <w:name w:val="Hyperlink"/>
@@ -12319,6 +11378,7 @@
     <w:qFormat/>
     <w:pPr>
       <w:widowControl/>
+      <w:suppressAutoHyphens w:val="true"/>
       <w:bidi w:val="0"/>
       <w:spacing w:before="0" w:after="0"/>
       <w:jc w:val="left"/>

</xml_diff>

<commit_message>
Adiciona suporte para envio de e-mails informativos ao comercial na etapa 1, incluindo novos campos de configuração SMTP no .env.example. Atualiza a lógica de preenchimento de contratos para incluir Inscrição Municipal e Estado, além de refatorar a extração de cidade e estado. Implementa validações para garantir a presença de anexos de Proposta Comercial nos deals e adiciona testes para as novas funcionalidades.
</commit_message>
<xml_diff>
--- a/contrato_padrao.docx
+++ b/contrato_padrao.docx
@@ -19,8 +19,8 @@
       <w:tblGrid>
         <w:gridCol w:w="3208"/>
         <w:gridCol w:w="1232"/>
-        <w:gridCol w:w="4293"/>
-        <w:gridCol w:w="1333"/>
+        <w:gridCol w:w="4294"/>
+        <w:gridCol w:w="1332"/>
       </w:tblGrid>
       <w:tr>
         <w:trPr>
@@ -189,7 +189,7 @@
         </w:tc>
         <w:tc>
           <w:tcPr>
-            <w:tcW w:w="4293" w:type="dxa"/>
+            <w:tcW w:w="4294" w:type="dxa"/>
             <w:tcBorders>
               <w:top w:val="single" w:sz="2" w:space="0" w:color="000000"/>
               <w:bottom w:val="single" w:sz="2" w:space="0" w:color="000000"/>
@@ -221,7 +221,7 @@
         </w:tc>
         <w:tc>
           <w:tcPr>
-            <w:tcW w:w="1333" w:type="dxa"/>
+            <w:tcW w:w="1332" w:type="dxa"/>
             <w:tcBorders>
               <w:bottom w:val="single" w:sz="2" w:space="0" w:color="000000"/>
               <w:right w:val="single" w:sz="18" w:space="0" w:color="000000"/>
@@ -507,19 +507,7 @@
               <w:rPr>
                 <w:rFonts w:cs="" w:ascii="Calibri" w:hAnsi="Calibri" w:asciiTheme="minorHAnsi" w:cstheme="minorBidi" w:hAnsiTheme="minorHAnsi"/>
               </w:rPr>
-              <w:t xml:space="preserve">{{ </w:t>
-            </w:r>
-            <w:r>
-              <w:rPr>
-                <w:rFonts w:cs="" w:ascii="Calibri" w:hAnsi="Calibri" w:asciiTheme="minorHAnsi" w:cstheme="minorBidi" w:hAnsiTheme="minorHAnsi"/>
-              </w:rPr>
-              <w:t>nome_fantasia</w:t>
-            </w:r>
-            <w:r>
-              <w:rPr>
-                <w:rFonts w:cs="" w:ascii="Calibri" w:hAnsi="Calibri" w:asciiTheme="minorHAnsi" w:cstheme="minorBidi" w:hAnsiTheme="minorHAnsi"/>
-              </w:rPr>
-              <w:t>}}</w:t>
+              <w:t>{{ nome_fantasia}}</w:t>
             </w:r>
           </w:p>
         </w:tc>
@@ -636,6 +624,12 @@
               <w:rPr>
                 <w:rFonts w:cs="" w:ascii="Calibri" w:hAnsi="Calibri" w:asciiTheme="minorHAnsi" w:cstheme="minorBidi" w:hAnsiTheme="minorHAnsi"/>
               </w:rPr>
+              <w:t xml:space="preserve">{{estado}} - </w:t>
+            </w:r>
+            <w:r>
+              <w:rPr>
+                <w:rFonts w:cs="" w:ascii="Calibri" w:hAnsi="Calibri" w:asciiTheme="minorHAnsi" w:cstheme="minorBidi" w:hAnsiTheme="minorHAnsi"/>
+              </w:rPr>
               <w:t>{{ cidade }}</w:t>
             </w:r>
           </w:p>
@@ -690,7 +684,19 @@
               <w:rPr>
                 <w:rFonts w:cs="" w:cstheme="minorBidi"/>
               </w:rPr>
-              <w:t>{{ documento }}</w:t>
+              <w:t xml:space="preserve">{{ </w:t>
+            </w:r>
+            <w:r>
+              <w:rPr>
+                <w:rFonts w:cs="" w:ascii="Calibri" w:hAnsi="Calibri" w:cstheme="minorBidi"/>
+              </w:rPr>
+              <w:t>documento</w:t>
+            </w:r>
+            <w:r>
+              <w:rPr>
+                <w:rFonts w:cs="" w:cstheme="minorBidi"/>
+              </w:rPr>
+              <w:t xml:space="preserve"> }}</w:t>
             </w:r>
           </w:p>
         </w:tc>
@@ -703,8 +709,8 @@
           <w:tcPr>
             <w:tcW w:w="2529" w:type="dxa"/>
             <w:tcBorders>
-              <w:top w:val="single" w:sz="8" w:space="0" w:color="000000"/>
               <w:left w:val="single" w:sz="18" w:space="0" w:color="000000"/>
+              <w:bottom w:val="single" w:sz="8" w:space="0" w:color="000000"/>
               <w:right w:val="single" w:sz="8" w:space="0" w:color="000000"/>
             </w:tcBorders>
             <w:vAlign w:val="center"/>
@@ -713,14 +719,12 @@
             <w:pPr>
               <w:pStyle w:val="Normal"/>
               <w:rPr>
-                <w:rFonts w:ascii="Calibri" w:hAnsi="Calibri" w:cs="Calibri" w:asciiTheme="minorHAnsi" w:cstheme="minorHAnsi" w:hAnsiTheme="minorHAnsi"/>
-                <w:b/>
-                <w:bCs/>
+                <w:rFonts w:ascii="Calibri" w:hAnsi="Calibri"/>
               </w:rPr>
             </w:pPr>
             <w:r>
               <w:rPr>
-                <w:rFonts w:cs="Calibri" w:ascii="Calibri" w:hAnsi="Calibri" w:asciiTheme="minorHAnsi" w:cstheme="minorHAnsi" w:hAnsiTheme="minorHAnsi"/>
+                <w:rFonts w:ascii="Calibri" w:hAnsi="Calibri"/>
                 <w:b/>
                 <w:bCs/>
               </w:rPr>
@@ -732,40 +736,53 @@
           <w:tcPr>
             <w:tcW w:w="7534" w:type="dxa"/>
             <w:gridSpan w:val="3"/>
-            <w:vMerge w:val="restart"/>
             <w:tcBorders>
-              <w:top w:val="single" w:sz="8" w:space="0" w:color="000000"/>
-              <w:bottom w:val="single" w:sz="18" w:space="0" w:color="000000"/>
+              <w:bottom w:val="single" w:sz="8" w:space="0" w:color="000000"/>
               <w:right w:val="single" w:sz="18" w:space="0" w:color="000000"/>
             </w:tcBorders>
             <w:vAlign w:val="center"/>
           </w:tcPr>
           <w:p>
             <w:pPr>
-              <w:pStyle w:val="Normal"/>
-              <w:rPr>
-                <w:rFonts w:ascii="Calibri" w:hAnsi="Calibri" w:cs="" w:asciiTheme="minorHAnsi" w:cstheme="minorBidi" w:hAnsiTheme="minorHAnsi"/>
+              <w:pStyle w:val="BodyText"/>
+              <w:rPr>
+                <w:rFonts w:ascii="Calibri" w:hAnsi="Calibri" w:cs="Calibri" w:asciiTheme="minorHAnsi" w:cstheme="minorHAnsi" w:hAnsiTheme="minorHAnsi"/>
               </w:rPr>
             </w:pPr>
             <w:r>
               <w:rPr>
-                <w:rFonts w:cs="" w:cstheme="minorBidi"/>
-              </w:rPr>
-              <w:t>{{ inscricao_estadual }}</w:t>
+                <w:rFonts w:cs="Calibri" w:cstheme="minorHAnsi" w:ascii="Times New Roman;serif" w:hAnsi="Times New Roman;serif"/>
+                <w:sz w:val="20"/>
+              </w:rPr>
+              <w:t xml:space="preserve">{{ </w:t>
+            </w:r>
+            <w:r>
+              <w:rPr>
+                <w:rFonts w:cs="Calibri" w:cstheme="minorHAnsi" w:ascii="Calibri" w:hAnsi="Calibri"/>
+                <w:sz w:val="20"/>
+              </w:rPr>
+              <w:t>inscricao_estadual</w:t>
+            </w:r>
+            <w:r>
+              <w:rPr>
+                <w:rFonts w:cs="Calibri" w:cstheme="minorHAnsi" w:ascii="Times New Roman;serif" w:hAnsi="Times New Roman;serif"/>
+                <w:sz w:val="20"/>
+              </w:rPr>
+              <w:t xml:space="preserve"> }}</w:t>
             </w:r>
           </w:p>
         </w:tc>
       </w:tr>
       <w:tr>
         <w:trPr>
-          <w:trHeight w:val="63" w:hRule="atLeast"/>
+          <w:trHeight w:val="244" w:hRule="atLeast"/>
         </w:trPr>
         <w:tc>
           <w:tcPr>
             <w:tcW w:w="2529" w:type="dxa"/>
             <w:tcBorders>
               <w:left w:val="single" w:sz="18" w:space="0" w:color="000000"/>
-              <w:bottom w:val="single" w:sz="18" w:space="0" w:color="000000"/>
+              <w:bottom w:val="single" w:sz="8" w:space="0" w:color="000000"/>
               <w:right w:val="single" w:sz="8" w:space="0" w:color="000000"/>
             </w:tcBorders>
             <w:vAlign w:val="center"/>
@@ -774,17 +791,48 @@
             <w:pPr>
               <w:pStyle w:val="Normal"/>
               <w:rPr>
-                <w:rFonts w:ascii="Calibri" w:hAnsi="Calibri" w:cs="Calibri" w:asciiTheme="minorHAnsi" w:cstheme="minorHAnsi" w:hAnsiTheme="minorHAnsi"/>
+                <w:rFonts w:ascii="Calibri" w:hAnsi="Calibri"/>
+              </w:rPr>
+            </w:pPr>
+            <w:r>
+              <w:rPr>
+                <w:rFonts w:ascii="Calibri" w:hAnsi="Calibri"/>
                 <w:b/>
                 <w:bCs/>
               </w:rPr>
-            </w:pPr>
-            <w:r>
-              <w:rPr>
-                <w:rFonts w:cs="Calibri" w:cstheme="minorHAnsi" w:ascii="Calibri" w:hAnsi="Calibri"/>
+              <w:t>1.</w:t>
+            </w:r>
+            <w:r>
+              <w:rPr>
+                <w:rFonts w:ascii="Calibri" w:hAnsi="Calibri"/>
                 <w:b/>
                 <w:bCs/>
               </w:rPr>
+              <w:t>6</w:t>
+            </w:r>
+            <w:r>
+              <w:rPr>
+                <w:rFonts w:ascii="Calibri" w:hAnsi="Calibri"/>
+                <w:b/>
+                <w:bCs/>
+              </w:rPr>
+              <w:t xml:space="preserve"> Inscrição </w:t>
+            </w:r>
+            <w:r>
+              <w:rPr>
+                <w:rFonts w:ascii="Calibri" w:hAnsi="Calibri"/>
+                <w:b/>
+                <w:bCs/>
+              </w:rPr>
+              <w:t>Municipal</w:t>
+            </w:r>
+            <w:r>
+              <w:rPr>
+                <w:rFonts w:ascii="Calibri" w:hAnsi="Calibri"/>
+                <w:b/>
+                <w:bCs/>
+              </w:rPr>
+              <w:t>:</w:t>
             </w:r>
           </w:p>
         </w:tc>
@@ -792,24 +840,53 @@
           <w:tcPr>
             <w:tcW w:w="7534" w:type="dxa"/>
             <w:gridSpan w:val="3"/>
-            <w:vMerge w:val="continue"/>
             <w:tcBorders>
-              <w:bottom w:val="single" w:sz="18" w:space="0" w:color="000000"/>
+              <w:bottom w:val="single" w:sz="8" w:space="0" w:color="000000"/>
               <w:right w:val="single" w:sz="18" w:space="0" w:color="000000"/>
             </w:tcBorders>
             <w:vAlign w:val="center"/>
           </w:tcPr>
           <w:p>
             <w:pPr>
-              <w:pStyle w:val="Normal"/>
+              <w:pStyle w:val="BodyText"/>
               <w:rPr>
                 <w:rFonts w:ascii="Calibri" w:hAnsi="Calibri" w:cs="Calibri" w:asciiTheme="minorHAnsi" w:cstheme="minorHAnsi" w:hAnsiTheme="minorHAnsi"/>
               </w:rPr>
             </w:pPr>
             <w:r>
               <w:rPr>
+                <w:rFonts w:cs="Calibri" w:cstheme="minorHAnsi" w:ascii="Times New Roman;serif" w:hAnsi="Times New Roman;serif"/>
+                <w:sz w:val="20"/>
+              </w:rPr>
+              <w:t xml:space="preserve">{{ </w:t>
+            </w:r>
+            <w:r>
+              <w:rPr>
                 <w:rFonts w:cs="Calibri" w:cstheme="minorHAnsi" w:ascii="Calibri" w:hAnsi="Calibri"/>
-              </w:rPr>
+                <w:sz w:val="20"/>
+              </w:rPr>
+              <w:t>inscricao_</w:t>
+            </w:r>
+            <w:r>
+              <w:rPr>
+                <w:rFonts w:cs="Calibri" w:cstheme="minorHAnsi" w:ascii="Calibri" w:hAnsi="Calibri"/>
+                <w:sz w:val="20"/>
+              </w:rPr>
+              <w:t>municipal</w:t>
+            </w:r>
+            <w:r>
+              <w:rPr>
+                <w:rFonts w:cs="Calibri" w:cstheme="minorHAnsi" w:ascii="Calibri" w:hAnsi="Calibri"/>
+                <w:sz w:val="20"/>
+              </w:rPr>
+              <w:t xml:space="preserve"> </w:t>
+            </w:r>
+            <w:r>
+              <w:rPr>
+                <w:rFonts w:cs="Calibri" w:cstheme="minorHAnsi" w:ascii="Times New Roman;serif" w:hAnsi="Times New Roman;serif"/>
+                <w:sz w:val="20"/>
+              </w:rPr>
+              <w:t>}}</w:t>
             </w:r>
           </w:p>
         </w:tc>
@@ -845,8 +922,8 @@
         <w:tblLook w:firstRow="1" w:noVBand="1" w:lastRow="0" w:firstColumn="1" w:lastColumn="0" w:noHBand="0" w:val="04a0"/>
       </w:tblPr>
       <w:tblGrid>
-        <w:gridCol w:w="2178"/>
-        <w:gridCol w:w="1972"/>
+        <w:gridCol w:w="2177"/>
+        <w:gridCol w:w="1973"/>
         <w:gridCol w:w="930"/>
         <w:gridCol w:w="4983"/>
       </w:tblGrid>
@@ -856,7 +933,7 @@
         </w:trPr>
         <w:tc>
           <w:tcPr>
-            <w:tcW w:w="2178" w:type="dxa"/>
+            <w:tcW w:w="2177" w:type="dxa"/>
             <w:tcBorders>
               <w:top w:val="single" w:sz="18" w:space="0" w:color="000000"/>
               <w:left w:val="single" w:sz="18" w:space="0" w:color="000000"/>
@@ -884,7 +961,7 @@
         </w:tc>
         <w:tc>
           <w:tcPr>
-            <w:tcW w:w="7885" w:type="dxa"/>
+            <w:tcW w:w="7886" w:type="dxa"/>
             <w:gridSpan w:val="3"/>
             <w:tcBorders>
               <w:top w:val="single" w:sz="18" w:space="0" w:color="000000"/>
@@ -919,7 +996,7 @@
         </w:trPr>
         <w:tc>
           <w:tcPr>
-            <w:tcW w:w="2178" w:type="dxa"/>
+            <w:tcW w:w="2177" w:type="dxa"/>
             <w:tcBorders>
               <w:top w:val="single" w:sz="8" w:space="0" w:color="000000"/>
               <w:left w:val="single" w:sz="18" w:space="0" w:color="000000"/>
@@ -949,7 +1026,7 @@
         </w:tc>
         <w:tc>
           <w:tcPr>
-            <w:tcW w:w="7885" w:type="dxa"/>
+            <w:tcW w:w="7886" w:type="dxa"/>
             <w:gridSpan w:val="3"/>
             <w:tcBorders>
               <w:top w:val="single" w:sz="8" w:space="0" w:color="000000"/>
@@ -984,7 +1061,7 @@
         </w:trPr>
         <w:tc>
           <w:tcPr>
-            <w:tcW w:w="2178" w:type="dxa"/>
+            <w:tcW w:w="2177" w:type="dxa"/>
             <w:tcBorders>
               <w:top w:val="single" w:sz="4" w:space="0" w:color="000000"/>
               <w:left w:val="single" w:sz="18" w:space="0" w:color="000000"/>
@@ -1012,7 +1089,7 @@
         </w:tc>
         <w:tc>
           <w:tcPr>
-            <w:tcW w:w="7885" w:type="dxa"/>
+            <w:tcW w:w="7886" w:type="dxa"/>
             <w:gridSpan w:val="3"/>
             <w:tcBorders>
               <w:top w:val="single" w:sz="4" w:space="0" w:color="000000"/>
@@ -1043,7 +1120,7 @@
         </w:trPr>
         <w:tc>
           <w:tcPr>
-            <w:tcW w:w="2178" w:type="dxa"/>
+            <w:tcW w:w="2177" w:type="dxa"/>
             <w:tcBorders>
               <w:left w:val="single" w:sz="18" w:space="0" w:color="000000"/>
               <w:bottom w:val="single" w:sz="18" w:space="0" w:color="000000"/>
@@ -1070,7 +1147,7 @@
         </w:tc>
         <w:tc>
           <w:tcPr>
-            <w:tcW w:w="1972" w:type="dxa"/>
+            <w:tcW w:w="1973" w:type="dxa"/>
             <w:tcBorders>
               <w:bottom w:val="single" w:sz="18" w:space="0" w:color="000000"/>
               <w:right w:val="single" w:sz="8" w:space="0" w:color="000000"/>
@@ -9124,8 +9201,8 @@
       <w:r>
         <w:rPr>
           <w:rFonts w:cs="Calibri" w:cstheme="minorHAnsi" w:ascii="Calibri" w:hAnsi="Calibri"/>
-          <w:sz w:val="14"/>
-          <w:szCs w:val="14"/>
+          <w:sz w:val="18"/>
+          <w:szCs w:val="18"/>
         </w:rPr>
       </w:r>
     </w:p>
@@ -9156,7 +9233,7 @@
       <mc:AlternateContent>
         <mc:Choice Requires="wps">
           <w:drawing>
-            <wp:anchor behindDoc="1" distT="0" distB="0" distL="0" distR="0" simplePos="0" locked="0" layoutInCell="0" allowOverlap="1" relativeHeight="3">
+            <wp:anchor behindDoc="1" distT="0" distB="0" distL="0" distR="0" simplePos="0" locked="0" layoutInCell="0" allowOverlap="1" relativeHeight="9">
               <wp:simplePos x="0" y="0"/>
               <wp:positionH relativeFrom="margin">
                 <wp:align>right</wp:align>
@@ -9203,30 +9280,35 @@
                           <w:r>
                             <w:rPr>
                               <w:rStyle w:val="PageNumber"/>
+                              <w:color w:val="000000"/>
                             </w:rPr>
                             <w:fldChar w:fldCharType="begin"/>
                           </w:r>
                           <w:r>
                             <w:rPr>
                               <w:rStyle w:val="PageNumber"/>
+                              <w:color w:val="000000"/>
                             </w:rPr>
                             <w:instrText xml:space="preserve"> PAGE </w:instrText>
                           </w:r>
                           <w:r>
                             <w:rPr>
                               <w:rStyle w:val="PageNumber"/>
+                              <w:color w:val="000000"/>
                             </w:rPr>
                             <w:fldChar w:fldCharType="separate"/>
                           </w:r>
                           <w:r>
                             <w:rPr>
                               <w:rStyle w:val="PageNumber"/>
+                              <w:color w:val="000000"/>
                             </w:rPr>
                             <w:t>0</w:t>
                           </w:r>
                           <w:r>
                             <w:rPr>
                               <w:rStyle w:val="PageNumber"/>
+                              <w:color w:val="000000"/>
                             </w:rPr>
                             <w:fldChar w:fldCharType="end"/>
                           </w:r>
@@ -9244,8 +9326,8 @@
         </mc:Choice>
         <mc:Fallback>
           <w:pict>
-            <v:rect id="shape_0" ID="Quadro2" path="m0,0l-2147483645,0l-2147483645,-2147483646l0,-2147483646xe" fillcolor="white" stroked="f" o:allowincell="f" style="position:absolute;margin-left:0pt;margin-top:0.05pt;width:1.1pt;height:1.1pt;mso-wrap-style:square;v-text-anchor:top;mso-position-horizontal:right;mso-position-horizontal-relative:margin">
-              <v:fill o:detectmouseclick="t" type="solid" color2="black" opacity="0"/>
+            <v:rect id="shape_0" ID="Quadro2" path="m0,0l-2147483645,0l-2147483645,-2147483646l0,-2147483646xe" stroked="f" o:allowincell="f" style="position:absolute;margin-left:0pt;margin-top:0.05pt;width:1.1pt;height:1.1pt;mso-wrap-style:square;v-text-anchor:top;mso-position-horizontal:right;mso-position-horizontal-relative:margin">
+              <v:fill o:detectmouseclick="t" on="false"/>
               <v:stroke color="#3465a4" joinstyle="round" endcap="flat"/>
               <v:textbox>
                 <w:txbxContent>
@@ -9259,30 +9341,35 @@
                     <w:r>
                       <w:rPr>
                         <w:rStyle w:val="PageNumber"/>
+                        <w:color w:val="000000"/>
                       </w:rPr>
                       <w:fldChar w:fldCharType="begin"/>
                     </w:r>
                     <w:r>
                       <w:rPr>
                         <w:rStyle w:val="PageNumber"/>
+                        <w:color w:val="000000"/>
                       </w:rPr>
                       <w:instrText xml:space="preserve"> PAGE </w:instrText>
                     </w:r>
                     <w:r>
                       <w:rPr>
                         <w:rStyle w:val="PageNumber"/>
+                        <w:color w:val="000000"/>
                       </w:rPr>
                       <w:fldChar w:fldCharType="separate"/>
                     </w:r>
                     <w:r>
                       <w:rPr>
                         <w:rStyle w:val="PageNumber"/>
+                        <w:color w:val="000000"/>
                       </w:rPr>
                       <w:t>0</w:t>
                     </w:r>
                     <w:r>
                       <w:rPr>
                         <w:rStyle w:val="PageNumber"/>
+                        <w:color w:val="000000"/>
                       </w:rPr>
                       <w:fldChar w:fldCharType="end"/>
                     </w:r>
@@ -9625,7 +9712,7 @@
       <mc:AlternateContent>
         <mc:Choice Requires="wps">
           <w:drawing>
-            <wp:anchor behindDoc="1" distT="0" distB="0" distL="0" distR="0" simplePos="0" locked="0" layoutInCell="0" allowOverlap="1" relativeHeight="2">
+            <wp:anchor behindDoc="1" distT="0" distB="0" distL="0" distR="0" simplePos="0" locked="0" layoutInCell="0" allowOverlap="1" relativeHeight="8">
               <wp:simplePos x="0" y="0"/>
               <wp:positionH relativeFrom="margin">
                 <wp:align>right</wp:align>
@@ -9672,30 +9759,35 @@
                           <w:r>
                             <w:rPr>
                               <w:rStyle w:val="PageNumber"/>
+                              <w:color w:val="000000"/>
                             </w:rPr>
                             <w:fldChar w:fldCharType="begin"/>
                           </w:r>
                           <w:r>
                             <w:rPr>
                               <w:rStyle w:val="PageNumber"/>
+                              <w:color w:val="000000"/>
                             </w:rPr>
                             <w:instrText xml:space="preserve"> PAGE </w:instrText>
                           </w:r>
                           <w:r>
                             <w:rPr>
                               <w:rStyle w:val="PageNumber"/>
+                              <w:color w:val="000000"/>
                             </w:rPr>
                             <w:fldChar w:fldCharType="separate"/>
                           </w:r>
                           <w:r>
                             <w:rPr>
                               <w:rStyle w:val="PageNumber"/>
+                              <w:color w:val="000000"/>
                             </w:rPr>
                             <w:t>0</w:t>
                           </w:r>
                           <w:r>
                             <w:rPr>
                               <w:rStyle w:val="PageNumber"/>
+                              <w:color w:val="000000"/>
                             </w:rPr>
                             <w:fldChar w:fldCharType="end"/>
                           </w:r>
@@ -9713,8 +9805,8 @@
         </mc:Choice>
         <mc:Fallback>
           <w:pict>
-            <v:rect id="shape_0" ID="Quadro1" path="m0,0l-2147483645,0l-2147483645,-2147483646l0,-2147483646xe" fillcolor="white" stroked="f" o:allowincell="f" style="position:absolute;margin-left:0pt;margin-top:0.05pt;width:1.1pt;height:1.1pt;mso-wrap-style:square;v-text-anchor:top;mso-position-horizontal:right;mso-position-horizontal-relative:margin">
-              <v:fill o:detectmouseclick="t" type="solid" color2="black" opacity="0"/>
+            <v:rect id="shape_0" ID="Quadro1" path="m0,0l-2147483645,0l-2147483645,-2147483646l0,-2147483646xe" stroked="f" o:allowincell="f" style="position:absolute;margin-left:0pt;margin-top:0.05pt;width:1.1pt;height:1.1pt;mso-wrap-style:square;v-text-anchor:top;mso-position-horizontal:right;mso-position-horizontal-relative:margin">
+              <v:fill o:detectmouseclick="t" on="false"/>
               <v:stroke color="#3465a4" joinstyle="round" endcap="flat"/>
               <v:textbox>
                 <w:txbxContent>
@@ -9728,30 +9820,35 @@
                     <w:r>
                       <w:rPr>
                         <w:rStyle w:val="PageNumber"/>
+                        <w:color w:val="000000"/>
                       </w:rPr>
                       <w:fldChar w:fldCharType="begin"/>
                     </w:r>
                     <w:r>
                       <w:rPr>
                         <w:rStyle w:val="PageNumber"/>
+                        <w:color w:val="000000"/>
                       </w:rPr>
                       <w:instrText xml:space="preserve"> PAGE </w:instrText>
                     </w:r>
                     <w:r>
                       <w:rPr>
                         <w:rStyle w:val="PageNumber"/>
+                        <w:color w:val="000000"/>
                       </w:rPr>
                       <w:fldChar w:fldCharType="separate"/>
                     </w:r>
                     <w:r>
                       <w:rPr>
                         <w:rStyle w:val="PageNumber"/>
+                        <w:color w:val="000000"/>
                       </w:rPr>
                       <w:t>0</w:t>
                     </w:r>
                     <w:r>
                       <w:rPr>
                         <w:rStyle w:val="PageNumber"/>
+                        <w:color w:val="000000"/>
                       </w:rPr>
                       <w:fldChar w:fldCharType="end"/>
                     </w:r>
@@ -11131,6 +11228,13 @@
   </w:style>
   <w:style w:type="character" w:styleId="FootnoteCharacters1">
     <w:name w:val="Footnote Characters1"/>
+    <w:qFormat/>
+    <w:rPr>
+      <w:vertAlign w:val="superscript"/>
+    </w:rPr>
+  </w:style>
+  <w:style w:type="character" w:styleId="FootnoteCharacters11">
+    <w:name w:val="Footnote Characters11"/>
     <w:basedOn w:val="DefaultParagraphFont"/>
     <w:uiPriority w:val="99"/>
     <w:semiHidden/>
@@ -11191,6 +11295,14 @@
   </w:style>
   <w:style w:type="character" w:styleId="InternetLink1">
     <w:name w:val="Internet Link1"/>
+    <w:qFormat/>
+    <w:rPr>
+      <w:color w:val="000080"/>
+      <w:u w:val="single"/>
+    </w:rPr>
+  </w:style>
+  <w:style w:type="character" w:styleId="InternetLink2">
+    <w:name w:val="Internet Link2"/>
     <w:qFormat/>
     <w:rPr>
       <w:color w:val="000080"/>
@@ -11461,6 +11573,29 @@
     <w:qFormat/>
     <w:pPr/>
     <w:rPr/>
+  </w:style>
+  <w:style w:type="paragraph" w:styleId="Contedodatabela">
+    <w:name w:val="Conteúdo da tabela"/>
+    <w:basedOn w:val="Normal"/>
+    <w:qFormat/>
+    <w:pPr>
+      <w:widowControl w:val="false"/>
+      <w:suppressLineNumbers/>
+    </w:pPr>
+    <w:rPr/>
+  </w:style>
+  <w:style w:type="paragraph" w:styleId="Ttulodetabela">
+    <w:name w:val="Título de tabela"/>
+    <w:basedOn w:val="Contedodatabela"/>
+    <w:qFormat/>
+    <w:pPr>
+      <w:suppressLineNumbers/>
+      <w:jc w:val="center"/>
+    </w:pPr>
+    <w:rPr>
+      <w:b/>
+      <w:bCs/>
+    </w:rPr>
   </w:style>
   <w:style w:type="numbering" w:styleId="Semlista" w:default="1">
     <w:name w:val="Sem lista"/>

</xml_diff>

<commit_message>
Atualiza a configuração do .env.example para suportar envio de e-mails via Microsoft Graph, removendo campos SMTP obsoletos. Adiciona novos campos de autenticação e refatora a lógica de envio de e-mails na automação comercial. Modifica a estrutura do banco de dados para garantir a integridade dos dados processados e implementa melhorias na validação de deals, incluindo a atualização da chave primária na tabela de deals processados. Refatora a lógica de contratos para incluir novos campos e melhorar a formatação do texto gerado.
</commit_message>
<xml_diff>
--- a/contrato_padrao.docx
+++ b/contrato_padrao.docx
@@ -119,7 +119,7 @@
             </w:pPr>
             <w:r>
               <w:rPr>
-                <w:rFonts w:cs="Calibri" w:ascii="Calibri" w:hAnsi="Calibri" w:asciiTheme="minorHAnsi" w:cstheme="minorHAnsi" w:hAnsiTheme="minorHAnsi"/>
+                <w:rFonts w:cs="Calibri" w:ascii="Calibri" w:hAnsi="Calibri" w:asciiTheme="minorHAnsi" w:cstheme="minorHAnsi" w:hAnsiTheme="minorHAnsi" w:eastAsia="Calibri"/>
                 <w:b/>
                 <w:sz w:val="24"/>
                 <w:szCs w:val="24"/>
@@ -179,7 +179,7 @@
             </w:pPr>
             <w:r>
               <w:rPr>
-                <w:rFonts w:cs="Calibri" w:ascii="Calibri" w:hAnsi="Calibri" w:asciiTheme="minorHAnsi" w:cstheme="minorHAnsi" w:hAnsiTheme="minorHAnsi"/>
+                <w:rFonts w:cs="Calibri" w:ascii="Calibri" w:hAnsi="Calibri" w:asciiTheme="minorHAnsi" w:cstheme="minorHAnsi" w:hAnsiTheme="minorHAnsi" w:eastAsia="Calibri"/>
                 <w:b/>
                 <w:bCs/>
               </w:rPr>
@@ -208,7 +208,7 @@
             </w:pPr>
             <w:r>
               <w:rPr>
-                <w:rFonts w:cs="" w:ascii="Calibri" w:hAnsi="Calibri" w:asciiTheme="minorHAnsi" w:cstheme="minorBidi" w:hAnsiTheme="minorHAnsi"/>
+                <w:rFonts w:cs="Calibri" w:ascii="Calibri" w:hAnsi="Calibri" w:asciiTheme="minorHAnsi" w:cstheme="minorBidi" w:hAnsiTheme="minorHAnsi" w:eastAsia="Calibri"/>
                 <w:b/>
                 <w:bCs/>
                 <w:color w:val="000000"/>
@@ -297,7 +297,7 @@
             </w:pPr>
             <w:r>
               <w:rPr>
-                <w:rFonts w:cs="Calibri" w:ascii="Calibri" w:hAnsi="Calibri" w:asciiTheme="minorHAnsi" w:cstheme="minorHAnsi" w:hAnsiTheme="minorHAnsi"/>
+                <w:rFonts w:cs="Calibri" w:ascii="Calibri" w:hAnsi="Calibri" w:asciiTheme="minorHAnsi" w:cstheme="minorHAnsi" w:hAnsiTheme="minorHAnsi" w:eastAsia="Calibri"/>
                 <w:b/>
                 <w:bCs/>
               </w:rPr>
@@ -305,7 +305,7 @@
             </w:r>
             <w:r>
               <w:rPr>
-                <w:rFonts w:cs="" w:ascii="Calibri" w:hAnsi="Calibri" w:asciiTheme="minorHAnsi" w:cstheme="minorBidi" w:hAnsiTheme="minorHAnsi"/>
+                <w:rFonts w:cs="Calibri" w:ascii="Calibri" w:hAnsi="Calibri" w:asciiTheme="minorHAnsi" w:cstheme="minorBidi" w:hAnsiTheme="minorHAnsi" w:eastAsia="Calibri"/>
                 <w:b/>
                 <w:bCs/>
               </w:rPr>
@@ -344,7 +344,7 @@
       </w:pPr>
       <w:r>
         <w:rPr>
-          <w:rFonts w:cs="Calibri" w:ascii="Calibri" w:hAnsi="Calibri" w:asciiTheme="minorHAnsi" w:cstheme="minorHAnsi" w:hAnsiTheme="minorHAnsi"/>
+          <w:rFonts w:cs="Calibri" w:ascii="Calibri" w:hAnsi="Calibri" w:asciiTheme="minorHAnsi" w:cstheme="minorHAnsi" w:hAnsiTheme="minorHAnsi" w:eastAsia="Calibri"/>
           <w:b/>
           <w:bCs/>
           <w:sz w:val="22"/>
@@ -411,7 +411,7 @@
             </w:pPr>
             <w:r>
               <w:rPr>
-                <w:rFonts w:cs="Calibri" w:ascii="Calibri" w:hAnsi="Calibri" w:asciiTheme="minorHAnsi" w:cstheme="minorHAnsi" w:hAnsiTheme="minorHAnsi"/>
+                <w:rFonts w:cs="Calibri" w:ascii="Calibri" w:hAnsi="Calibri" w:asciiTheme="minorHAnsi" w:cstheme="minorHAnsi" w:hAnsiTheme="minorHAnsi" w:eastAsia="Calibri"/>
                 <w:b/>
                 <w:bCs/>
               </w:rPr>
@@ -441,7 +441,7 @@
             </w:pPr>
             <w:r>
               <w:rPr>
-                <w:rFonts w:cs="" w:ascii="Calibri" w:hAnsi="Calibri" w:asciiTheme="minorHAnsi" w:cstheme="minorBidi" w:hAnsiTheme="minorHAnsi"/>
+                <w:rFonts w:cs="Calibri" w:ascii="Calibri" w:hAnsi="Calibri" w:asciiTheme="minorHAnsi" w:cstheme="minorBidi" w:hAnsiTheme="minorHAnsi" w:eastAsia="Calibri"/>
                 <w:b/>
                 <w:bCs/>
               </w:rPr>
@@ -476,7 +476,7 @@
             </w:pPr>
             <w:r>
               <w:rPr>
-                <w:rFonts w:cs="Calibri" w:ascii="Calibri" w:hAnsi="Calibri" w:asciiTheme="minorHAnsi" w:cstheme="minorHAnsi" w:hAnsiTheme="minorHAnsi"/>
+                <w:rFonts w:cs="Calibri" w:ascii="Calibri" w:hAnsi="Calibri" w:asciiTheme="minorHAnsi" w:cstheme="minorHAnsi" w:hAnsiTheme="minorHAnsi" w:eastAsia="Calibri"/>
                 <w:b/>
                 <w:bCs/>
               </w:rPr>
@@ -505,7 +505,7 @@
             </w:pPr>
             <w:r>
               <w:rPr>
-                <w:rFonts w:cs="" w:ascii="Calibri" w:hAnsi="Calibri" w:asciiTheme="minorHAnsi" w:cstheme="minorBidi" w:hAnsiTheme="minorHAnsi"/>
+                <w:rFonts w:cs="Calibri" w:ascii="Calibri" w:hAnsi="Calibri" w:asciiTheme="minorHAnsi" w:cstheme="minorBidi" w:hAnsiTheme="minorHAnsi" w:eastAsia="Calibri"/>
               </w:rPr>
               <w:t>{{ nome_fantasia}}</w:t>
             </w:r>
@@ -536,7 +536,7 @@
             </w:pPr>
             <w:r>
               <w:rPr>
-                <w:rFonts w:cs="Calibri" w:ascii="Calibri" w:hAnsi="Calibri" w:asciiTheme="minorHAnsi" w:cstheme="minorHAnsi" w:hAnsiTheme="minorHAnsi"/>
+                <w:rFonts w:cs="Calibri" w:ascii="Calibri" w:hAnsi="Calibri" w:asciiTheme="minorHAnsi" w:cstheme="minorHAnsi" w:hAnsiTheme="minorHAnsi" w:eastAsia="Calibri"/>
                 <w:b/>
                 <w:bCs/>
               </w:rPr>
@@ -564,7 +564,7 @@
             </w:pPr>
             <w:r>
               <w:rPr>
-                <w:rFonts w:cs="" w:ascii="Calibri" w:hAnsi="Calibri" w:asciiTheme="minorHAnsi" w:cstheme="minorBidi" w:hAnsiTheme="minorHAnsi"/>
+                <w:rFonts w:cs="Calibri" w:ascii="Calibri" w:hAnsi="Calibri" w:asciiTheme="minorHAnsi" w:cstheme="minorBidi" w:hAnsiTheme="minorHAnsi" w:eastAsia="Calibri"/>
               </w:rPr>
               <w:t>{{ endereco }}</w:t>
             </w:r>
@@ -595,7 +595,7 @@
             </w:pPr>
             <w:r>
               <w:rPr>
-                <w:rFonts w:cs="Calibri" w:ascii="Calibri" w:hAnsi="Calibri" w:asciiTheme="minorHAnsi" w:cstheme="minorHAnsi" w:hAnsiTheme="minorHAnsi"/>
+                <w:rFonts w:cs="Calibri" w:ascii="Calibri" w:hAnsi="Calibri" w:asciiTheme="minorHAnsi" w:cstheme="minorHAnsi" w:hAnsiTheme="minorHAnsi" w:eastAsia="Calibri"/>
                 <w:b/>
                 <w:bCs/>
               </w:rPr>
@@ -622,13 +622,13 @@
             </w:pPr>
             <w:r>
               <w:rPr>
-                <w:rFonts w:cs="" w:ascii="Calibri" w:hAnsi="Calibri" w:asciiTheme="minorHAnsi" w:cstheme="minorBidi" w:hAnsiTheme="minorHAnsi"/>
+                <w:rFonts w:cs="Calibri" w:ascii="Calibri" w:hAnsi="Calibri" w:asciiTheme="minorHAnsi" w:cstheme="minorBidi" w:hAnsiTheme="minorHAnsi" w:eastAsia="Calibri"/>
               </w:rPr>
               <w:t xml:space="preserve">{{estado}} - </w:t>
             </w:r>
             <w:r>
               <w:rPr>
-                <w:rFonts w:cs="" w:ascii="Calibri" w:hAnsi="Calibri" w:asciiTheme="minorHAnsi" w:cstheme="minorBidi" w:hAnsiTheme="minorHAnsi"/>
+                <w:rFonts w:cs="Calibri" w:ascii="Calibri" w:hAnsi="Calibri" w:asciiTheme="minorHAnsi" w:cstheme="minorBidi" w:hAnsiTheme="minorHAnsi" w:eastAsia="Calibri"/>
               </w:rPr>
               <w:t>{{ cidade }}</w:t>
             </w:r>
@@ -655,7 +655,7 @@
             </w:pPr>
             <w:r>
               <w:rPr>
-                <w:rFonts w:cs="Calibri" w:ascii="Calibri" w:hAnsi="Calibri" w:asciiTheme="minorHAnsi" w:cstheme="minorHAnsi" w:hAnsiTheme="minorHAnsi"/>
+                <w:rFonts w:cs="Calibri" w:ascii="Calibri" w:hAnsi="Calibri" w:asciiTheme="minorHAnsi" w:cstheme="minorHAnsi" w:hAnsiTheme="minorHAnsi" w:eastAsia="Calibri"/>
                 <w:b/>
                 <w:bCs/>
               </w:rPr>
@@ -682,19 +682,19 @@
             </w:pPr>
             <w:r>
               <w:rPr>
-                <w:rFonts w:cs="" w:cstheme="minorBidi"/>
+                <w:rFonts w:cs="Calibri" w:cstheme="minorBidi" w:ascii="Calibri" w:hAnsi="Calibri" w:eastAsia="Calibri"/>
               </w:rPr>
               <w:t xml:space="preserve">{{ </w:t>
             </w:r>
             <w:r>
               <w:rPr>
-                <w:rFonts w:cs="" w:ascii="Calibri" w:hAnsi="Calibri" w:cstheme="minorBidi"/>
+                <w:rFonts w:cs="Calibri" w:ascii="Calibri" w:hAnsi="Calibri" w:cstheme="minorBidi" w:eastAsia="Calibri"/>
               </w:rPr>
               <w:t>documento</w:t>
             </w:r>
             <w:r>
               <w:rPr>
-                <w:rFonts w:cs="" w:cstheme="minorBidi"/>
+                <w:rFonts w:cs="Calibri" w:cstheme="minorBidi" w:ascii="Calibri" w:hAnsi="Calibri" w:eastAsia="Calibri"/>
               </w:rPr>
               <w:t xml:space="preserve"> }}</w:t>
             </w:r>
@@ -724,7 +724,7 @@
             </w:pPr>
             <w:r>
               <w:rPr>
-                <w:rFonts w:ascii="Calibri" w:hAnsi="Calibri"/>
+                <w:rFonts w:ascii="Calibri" w:hAnsi="Calibri" w:cs="Calibri" w:eastAsia="Calibri"/>
                 <w:b/>
                 <w:bCs/>
               </w:rPr>
@@ -751,21 +751,21 @@
             </w:pPr>
             <w:r>
               <w:rPr>
-                <w:rFonts w:cs="Calibri" w:cstheme="minorHAnsi" w:ascii="Times New Roman;serif" w:hAnsi="Times New Roman;serif"/>
+                <w:rFonts w:cs="Calibri" w:cstheme="minorHAnsi" w:ascii="Calibri" w:hAnsi="Calibri" w:eastAsia="Calibri"/>
                 <w:sz w:val="20"/>
               </w:rPr>
               <w:t xml:space="preserve">{{ </w:t>
             </w:r>
             <w:r>
               <w:rPr>
-                <w:rFonts w:cs="Calibri" w:cstheme="minorHAnsi" w:ascii="Calibri" w:hAnsi="Calibri"/>
+                <w:rFonts w:cs="Calibri" w:cstheme="minorHAnsi" w:ascii="Calibri" w:hAnsi="Calibri" w:eastAsia="Calibri"/>
                 <w:sz w:val="20"/>
               </w:rPr>
               <w:t>inscricao_estadual</w:t>
             </w:r>
             <w:r>
               <w:rPr>
-                <w:rFonts w:cs="Calibri" w:cstheme="minorHAnsi" w:ascii="Times New Roman;serif" w:hAnsi="Times New Roman;serif"/>
+                <w:rFonts w:cs="Calibri" w:cstheme="minorHAnsi" w:ascii="Calibri" w:hAnsi="Calibri" w:eastAsia="Calibri"/>
                 <w:sz w:val="20"/>
               </w:rPr>
               <w:t xml:space="preserve"> }}</w:t>
@@ -796,7 +796,7 @@
             </w:pPr>
             <w:r>
               <w:rPr>
-                <w:rFonts w:ascii="Calibri" w:hAnsi="Calibri"/>
+                <w:rFonts w:ascii="Calibri" w:hAnsi="Calibri" w:cs="Calibri" w:eastAsia="Calibri"/>
                 <w:b/>
                 <w:bCs/>
               </w:rPr>
@@ -804,7 +804,7 @@
             </w:r>
             <w:r>
               <w:rPr>
-                <w:rFonts w:ascii="Calibri" w:hAnsi="Calibri"/>
+                <w:rFonts w:ascii="Calibri" w:hAnsi="Calibri" w:cs="Calibri" w:eastAsia="Calibri"/>
                 <w:b/>
                 <w:bCs/>
               </w:rPr>
@@ -812,7 +812,7 @@
             </w:r>
             <w:r>
               <w:rPr>
-                <w:rFonts w:ascii="Calibri" w:hAnsi="Calibri"/>
+                <w:rFonts w:ascii="Calibri" w:hAnsi="Calibri" w:cs="Calibri" w:eastAsia="Calibri"/>
                 <w:b/>
                 <w:bCs/>
               </w:rPr>
@@ -820,7 +820,7 @@
             </w:r>
             <w:r>
               <w:rPr>
-                <w:rFonts w:ascii="Calibri" w:hAnsi="Calibri"/>
+                <w:rFonts w:ascii="Calibri" w:hAnsi="Calibri" w:cs="Calibri" w:eastAsia="Calibri"/>
                 <w:b/>
                 <w:bCs/>
               </w:rPr>
@@ -828,7 +828,7 @@
             </w:r>
             <w:r>
               <w:rPr>
-                <w:rFonts w:ascii="Calibri" w:hAnsi="Calibri"/>
+                <w:rFonts w:ascii="Calibri" w:hAnsi="Calibri" w:cs="Calibri" w:eastAsia="Calibri"/>
                 <w:b/>
                 <w:bCs/>
               </w:rPr>
@@ -855,35 +855,35 @@
             </w:pPr>
             <w:r>
               <w:rPr>
-                <w:rFonts w:cs="Calibri" w:cstheme="minorHAnsi" w:ascii="Times New Roman;serif" w:hAnsi="Times New Roman;serif"/>
+                <w:rFonts w:cs="Calibri" w:cstheme="minorHAnsi" w:ascii="Calibri" w:hAnsi="Calibri" w:eastAsia="Calibri"/>
                 <w:sz w:val="20"/>
               </w:rPr>
               <w:t xml:space="preserve">{{ </w:t>
             </w:r>
             <w:r>
               <w:rPr>
-                <w:rFonts w:cs="Calibri" w:cstheme="minorHAnsi" w:ascii="Calibri" w:hAnsi="Calibri"/>
+                <w:rFonts w:cs="Calibri" w:cstheme="minorHAnsi" w:ascii="Calibri" w:hAnsi="Calibri" w:eastAsia="Calibri"/>
                 <w:sz w:val="20"/>
               </w:rPr>
               <w:t>inscricao_</w:t>
             </w:r>
             <w:r>
               <w:rPr>
-                <w:rFonts w:cs="Calibri" w:cstheme="minorHAnsi" w:ascii="Calibri" w:hAnsi="Calibri"/>
+                <w:rFonts w:cs="Calibri" w:cstheme="minorHAnsi" w:ascii="Calibri" w:hAnsi="Calibri" w:eastAsia="Calibri"/>
                 <w:sz w:val="20"/>
               </w:rPr>
               <w:t>municipal</w:t>
             </w:r>
             <w:r>
               <w:rPr>
-                <w:rFonts w:cs="Calibri" w:cstheme="minorHAnsi" w:ascii="Calibri" w:hAnsi="Calibri"/>
+                <w:rFonts w:cs="Calibri" w:cstheme="minorHAnsi" w:ascii="Calibri" w:hAnsi="Calibri" w:eastAsia="Calibri"/>
                 <w:sz w:val="20"/>
               </w:rPr>
               <w:t xml:space="preserve"> </w:t>
             </w:r>
             <w:r>
               <w:rPr>
-                <w:rFonts w:cs="Calibri" w:cstheme="minorHAnsi" w:ascii="Times New Roman;serif" w:hAnsi="Times New Roman;serif"/>
+                <w:rFonts w:cs="Calibri" w:cstheme="minorHAnsi" w:ascii="Calibri" w:hAnsi="Calibri" w:eastAsia="Calibri"/>
                 <w:sz w:val="20"/>
               </w:rPr>
               <w:t>}}</w:t>
@@ -902,7 +902,7 @@
       </w:pPr>
       <w:r>
         <w:rPr>
-          <w:rFonts w:cs="Calibri" w:ascii="Calibri" w:hAnsi="Calibri" w:asciiTheme="minorHAnsi" w:cstheme="minorHAnsi" w:hAnsiTheme="minorHAnsi"/>
+          <w:rFonts w:cs="Calibri" w:ascii="Calibri" w:hAnsi="Calibri" w:asciiTheme="minorHAnsi" w:cstheme="minorHAnsi" w:hAnsiTheme="minorHAnsi" w:eastAsia="Calibri"/>
         </w:rPr>
         <w:t> </w:t>
       </w:r>
@@ -951,7 +951,7 @@
             </w:pPr>
             <w:r>
               <w:rPr>
-                <w:rFonts w:cs="Calibri" w:ascii="Calibri" w:hAnsi="Calibri" w:asciiTheme="minorHAnsi" w:cstheme="minorHAnsi" w:hAnsiTheme="minorHAnsi"/>
+                <w:rFonts w:cs="Calibri" w:ascii="Calibri" w:hAnsi="Calibri" w:asciiTheme="minorHAnsi" w:cstheme="minorHAnsi" w:hAnsiTheme="minorHAnsi" w:eastAsia="Calibri"/>
                 <w:b/>
                 <w:bCs/>
               </w:rPr>
@@ -981,7 +981,7 @@
             </w:pPr>
             <w:r>
               <w:rPr>
-                <w:rFonts w:cs="Calibri" w:ascii="Calibri" w:hAnsi="Calibri" w:asciiTheme="minorHAnsi" w:cstheme="minorHAnsi" w:hAnsiTheme="minorHAnsi"/>
+                <w:rFonts w:cs="Calibri" w:ascii="Calibri" w:hAnsi="Calibri" w:asciiTheme="minorHAnsi" w:cstheme="minorHAnsi" w:hAnsiTheme="minorHAnsi" w:eastAsia="Calibri"/>
                 <w:b/>
                 <w:bCs/>
               </w:rPr>
@@ -1016,7 +1016,7 @@
             </w:pPr>
             <w:r>
               <w:rPr>
-                <w:rFonts w:cs="Calibri" w:ascii="Calibri" w:hAnsi="Calibri" w:asciiTheme="minorHAnsi" w:cstheme="minorHAnsi" w:hAnsiTheme="minorHAnsi"/>
+                <w:rFonts w:cs="Calibri" w:ascii="Calibri" w:hAnsi="Calibri" w:asciiTheme="minorHAnsi" w:cstheme="minorHAnsi" w:hAnsiTheme="minorHAnsi" w:eastAsia="Calibri"/>
                 <w:b/>
                 <w:bCs/>
               </w:rPr>
@@ -1046,7 +1046,7 @@
             </w:pPr>
             <w:r>
               <w:rPr>
-                <w:rFonts w:cs="Calibri" w:ascii="Calibri" w:hAnsi="Calibri" w:asciiTheme="minorHAnsi" w:cstheme="minorHAnsi" w:hAnsiTheme="minorHAnsi"/>
+                <w:rFonts w:cs="Calibri" w:ascii="Calibri" w:hAnsi="Calibri" w:asciiTheme="minorHAnsi" w:cstheme="minorHAnsi" w:hAnsiTheme="minorHAnsi" w:eastAsia="Calibri"/>
                 <w:b/>
                 <w:bCs/>
               </w:rPr>
@@ -1079,7 +1079,7 @@
             </w:pPr>
             <w:r>
               <w:rPr>
-                <w:rFonts w:cs="Calibri" w:ascii="Calibri" w:hAnsi="Calibri" w:asciiTheme="minorHAnsi" w:cstheme="minorHAnsi" w:hAnsiTheme="minorHAnsi"/>
+                <w:rFonts w:cs="Calibri" w:ascii="Calibri" w:hAnsi="Calibri" w:asciiTheme="minorHAnsi" w:cstheme="minorHAnsi" w:hAnsiTheme="minorHAnsi" w:eastAsia="Calibri"/>
                 <w:b/>
                 <w:bCs/>
               </w:rPr>
@@ -1107,7 +1107,7 @@
             </w:pPr>
             <w:r>
               <w:rPr>
-                <w:rFonts w:cs="Calibri" w:ascii="Calibri" w:hAnsi="Calibri" w:asciiTheme="minorHAnsi" w:cstheme="minorHAnsi" w:hAnsiTheme="minorHAnsi"/>
+                <w:rFonts w:cs="Calibri" w:ascii="Calibri" w:hAnsi="Calibri" w:asciiTheme="minorHAnsi" w:cstheme="minorHAnsi" w:hAnsiTheme="minorHAnsi" w:eastAsia="Calibri"/>
               </w:rPr>
               <w:t>Rua Dr Benjamin Gastal, nº 1019, Areal</w:t>
             </w:r>
@@ -1137,7 +1137,7 @@
             </w:pPr>
             <w:r>
               <w:rPr>
-                <w:rFonts w:cs="Calibri" w:ascii="Calibri" w:hAnsi="Calibri" w:asciiTheme="minorHAnsi" w:cstheme="minorHAnsi" w:hAnsiTheme="minorHAnsi"/>
+                <w:rFonts w:cs="Calibri" w:ascii="Calibri" w:hAnsi="Calibri" w:asciiTheme="minorHAnsi" w:cstheme="minorHAnsi" w:hAnsiTheme="minorHAnsi" w:eastAsia="Calibri"/>
                 <w:b/>
                 <w:bCs/>
               </w:rPr>
@@ -1163,7 +1163,7 @@
             </w:pPr>
             <w:r>
               <w:rPr>
-                <w:rFonts w:cs="Calibri" w:ascii="Calibri" w:hAnsi="Calibri" w:asciiTheme="minorHAnsi" w:cstheme="minorHAnsi" w:hAnsiTheme="minorHAnsi"/>
+                <w:rFonts w:cs="Calibri" w:ascii="Calibri" w:hAnsi="Calibri" w:asciiTheme="minorHAnsi" w:cstheme="minorHAnsi" w:hAnsiTheme="minorHAnsi" w:eastAsia="Calibri"/>
                 <w:lang w:val="en-US"/>
               </w:rPr>
               <w:t>Pelotas/RS</w:t>
@@ -1188,7 +1188,7 @@
             </w:pPr>
             <w:r>
               <w:rPr>
-                <w:rFonts w:cs="Calibri" w:ascii="Calibri" w:hAnsi="Calibri" w:asciiTheme="minorHAnsi" w:cstheme="minorHAnsi" w:hAnsiTheme="minorHAnsi"/>
+                <w:rFonts w:cs="Calibri" w:ascii="Calibri" w:hAnsi="Calibri" w:asciiTheme="minorHAnsi" w:cstheme="minorHAnsi" w:hAnsiTheme="minorHAnsi" w:eastAsia="Calibri"/>
                 <w:b/>
                 <w:bCs/>
                 <w:lang w:val="en-US"/>
@@ -1215,7 +1215,7 @@
             </w:pPr>
             <w:r>
               <w:rPr>
-                <w:rFonts w:cs="Calibri" w:ascii="Calibri" w:hAnsi="Calibri" w:asciiTheme="minorHAnsi" w:cstheme="minorHAnsi" w:hAnsiTheme="minorHAnsi"/>
+                <w:rFonts w:cs="Calibri" w:ascii="Calibri" w:hAnsi="Calibri" w:asciiTheme="minorHAnsi" w:cstheme="minorHAnsi" w:hAnsiTheme="minorHAnsi" w:eastAsia="Calibri"/>
                 <w:lang w:val="en-US"/>
               </w:rPr>
               <w:t>07.936.028/0001-84</w:t>
@@ -1234,7 +1234,7 @@
       </w:pPr>
       <w:r>
         <w:rPr>
-          <w:rFonts w:cs="Calibri" w:ascii="Calibri" w:hAnsi="Calibri" w:asciiTheme="minorHAnsi" w:cstheme="minorHAnsi" w:hAnsiTheme="minorHAnsi"/>
+          <w:rFonts w:cs="Calibri" w:ascii="Calibri" w:hAnsi="Calibri" w:asciiTheme="minorHAnsi" w:cstheme="minorHAnsi" w:hAnsiTheme="minorHAnsi" w:eastAsia="Calibri"/>
         </w:rPr>
         <w:t> </w:t>
       </w:r>
@@ -1286,7 +1286,7 @@
             </w:pPr>
             <w:r>
               <w:rPr>
-                <w:rFonts w:cs="Calibri" w:ascii="Calibri" w:hAnsi="Calibri" w:asciiTheme="minorHAnsi" w:cstheme="minorHAnsi" w:hAnsiTheme="minorHAnsi"/>
+                <w:rFonts w:cs="Calibri" w:ascii="Calibri" w:hAnsi="Calibri" w:asciiTheme="minorHAnsi" w:cstheme="minorHAnsi" w:hAnsiTheme="minorHAnsi" w:eastAsia="Calibri"/>
                 <w:b/>
                 <w:bCs/>
                 <w:sz w:val="18"/>
@@ -1320,7 +1320,7 @@
             </w:pPr>
             <w:r>
               <w:rPr>
-                <w:rFonts w:cs="Calibri" w:ascii="Calibri" w:hAnsi="Calibri" w:asciiTheme="minorHAnsi" w:cstheme="minorHAnsi" w:hAnsiTheme="minorHAnsi"/>
+                <w:rFonts w:cs="Calibri" w:ascii="Calibri" w:hAnsi="Calibri" w:asciiTheme="minorHAnsi" w:cstheme="minorHAnsi" w:hAnsiTheme="minorHAnsi" w:eastAsia="Calibri"/>
                 <w:sz w:val="18"/>
                 <w:szCs w:val="18"/>
               </w:rPr>
@@ -1328,7 +1328,7 @@
             </w:r>
             <w:r>
               <w:rPr>
-                <w:rFonts w:cs="Calibri" w:ascii="Calibri" w:hAnsi="Calibri" w:asciiTheme="minorHAnsi" w:cstheme="minorHAnsi" w:hAnsiTheme="minorHAnsi"/>
+                <w:rFonts w:cs="Calibri" w:ascii="Calibri" w:hAnsi="Calibri" w:asciiTheme="minorHAnsi" w:cstheme="minorHAnsi" w:hAnsiTheme="minorHAnsi" w:eastAsia="Calibri"/>
                 <w:b/>
                 <w:bCs/>
                 <w:sz w:val="18"/>
@@ -1338,7 +1338,7 @@
             </w:r>
             <w:r>
               <w:rPr>
-                <w:rFonts w:cs="Calibri" w:ascii="Calibri" w:hAnsi="Calibri" w:asciiTheme="minorHAnsi" w:cstheme="minorHAnsi" w:hAnsiTheme="minorHAnsi"/>
+                <w:rFonts w:cs="Calibri" w:ascii="Calibri" w:hAnsi="Calibri" w:asciiTheme="minorHAnsi" w:cstheme="minorHAnsi" w:hAnsiTheme="minorHAnsi" w:eastAsia="Calibri"/>
                 <w:sz w:val="18"/>
                 <w:szCs w:val="18"/>
               </w:rPr>
@@ -1375,7 +1375,7 @@
             </w:pPr>
             <w:r>
               <w:rPr>
-                <w:rFonts w:cs="Calibri" w:ascii="Calibri" w:hAnsi="Calibri" w:asciiTheme="minorHAnsi" w:cstheme="minorHAnsi" w:hAnsiTheme="minorHAnsi"/>
+                <w:rFonts w:cs="Calibri" w:ascii="Calibri" w:hAnsi="Calibri" w:asciiTheme="minorHAnsi" w:cstheme="minorHAnsi" w:hAnsiTheme="minorHAnsi" w:eastAsia="Calibri"/>
                 <w:b/>
                 <w:sz w:val="18"/>
                 <w:szCs w:val="18"/>
@@ -1415,7 +1415,7 @@
             </w:pPr>
             <w:r>
               <w:rPr>
-                <w:rFonts w:cs="Calibri" w:ascii="Calibri" w:hAnsi="Calibri" w:asciiTheme="minorHAnsi" w:cstheme="minorHAnsi" w:hAnsiTheme="minorHAnsi"/>
+                <w:rFonts w:cs="Calibri" w:ascii="Calibri" w:hAnsi="Calibri" w:asciiTheme="minorHAnsi" w:cstheme="minorHAnsi" w:hAnsiTheme="minorHAnsi" w:eastAsia="Calibri"/>
                 <w:b/>
                 <w:bCs/>
                 <w:sz w:val="18"/>
@@ -1455,7 +1455,7 @@
             </w:pPr>
             <w:r>
               <w:rPr>
-                <w:rFonts w:cs="Calibri" w:ascii="Calibri" w:hAnsi="Calibri" w:asciiTheme="minorHAnsi" w:cstheme="minorHAnsi" w:hAnsiTheme="minorHAnsi"/>
+                <w:rFonts w:cs="Calibri" w:ascii="Calibri" w:hAnsi="Calibri" w:asciiTheme="minorHAnsi" w:cstheme="minorHAnsi" w:hAnsiTheme="minorHAnsi" w:eastAsia="Calibri"/>
                 <w:b/>
                 <w:bCs/>
                 <w:sz w:val="18"/>
@@ -1535,7 +1535,7 @@
             </w:pPr>
             <w:r>
               <w:rPr>
-                <w:rFonts w:cs="Calibri" w:ascii="Calibri" w:hAnsi="Calibri" w:asciiTheme="minorHAnsi" w:cstheme="minorHAnsi" w:hAnsiTheme="minorHAnsi"/>
+                <w:rFonts w:cs="Calibri" w:ascii="Calibri" w:hAnsi="Calibri" w:asciiTheme="minorHAnsi" w:cstheme="minorHAnsi" w:hAnsiTheme="minorHAnsi" w:eastAsia="Calibri"/>
                 <w:b/>
                 <w:bCs/>
                 <w:i/>
@@ -1575,7 +1575,7 @@
             </w:pPr>
             <w:r>
               <w:rPr>
-                <w:rFonts w:cs="" w:ascii="Calibri" w:hAnsi="Calibri" w:asciiTheme="minorHAnsi" w:cstheme="minorBidi" w:hAnsiTheme="minorHAnsi"/>
+                <w:rFonts w:cs="Calibri" w:ascii="Calibri" w:hAnsi="Calibri" w:asciiTheme="minorHAnsi" w:cstheme="minorBidi" w:hAnsiTheme="minorHAnsi" w:eastAsia="Calibri"/>
                 <w:sz w:val="18"/>
                 <w:szCs w:val="18"/>
               </w:rPr>
@@ -1653,7 +1653,7 @@
             </w:pPr>
             <w:r>
               <w:rPr>
-                <w:rFonts w:cs="Calibri" w:ascii="Calibri" w:hAnsi="Calibri" w:asciiTheme="minorHAnsi" w:cstheme="minorHAnsi" w:hAnsiTheme="minorHAnsi"/>
+                <w:rFonts w:cs="Calibri" w:ascii="Calibri" w:hAnsi="Calibri" w:asciiTheme="minorHAnsi" w:cstheme="minorHAnsi" w:hAnsiTheme="minorHAnsi" w:eastAsia="Calibri"/>
                 <w:b/>
                 <w:bCs/>
                 <w:i/>
@@ -1693,7 +1693,7 @@
             </w:pPr>
             <w:r>
               <w:rPr>
-                <w:rFonts w:cs="" w:ascii="Calibri" w:hAnsi="Calibri" w:asciiTheme="minorHAnsi" w:cstheme="minorBidi" w:hAnsiTheme="minorHAnsi"/>
+                <w:rFonts w:cs="Calibri" w:ascii="Calibri" w:hAnsi="Calibri" w:asciiTheme="minorHAnsi" w:cstheme="minorBidi" w:hAnsiTheme="minorHAnsi" w:eastAsia="Calibri"/>
                 <w:sz w:val="18"/>
                 <w:szCs w:val="18"/>
               </w:rPr>
@@ -1771,7 +1771,7 @@
             </w:pPr>
             <w:r>
               <w:rPr>
-                <w:rFonts w:cs="Calibri" w:ascii="Calibri" w:hAnsi="Calibri" w:asciiTheme="minorHAnsi" w:cstheme="minorHAnsi" w:hAnsiTheme="minorHAnsi"/>
+                <w:rFonts w:cs="Calibri" w:ascii="Calibri" w:hAnsi="Calibri" w:asciiTheme="minorHAnsi" w:cstheme="minorHAnsi" w:hAnsiTheme="minorHAnsi" w:eastAsia="Calibri"/>
                 <w:b/>
                 <w:bCs/>
                 <w:i/>
@@ -1811,7 +1811,7 @@
             </w:pPr>
             <w:r>
               <w:rPr>
-                <w:rFonts w:cs="" w:ascii="Calibri" w:hAnsi="Calibri" w:asciiTheme="minorHAnsi" w:cstheme="minorBidi" w:hAnsiTheme="minorHAnsi"/>
+                <w:rFonts w:cs="Calibri" w:ascii="Calibri" w:hAnsi="Calibri" w:asciiTheme="minorHAnsi" w:cstheme="minorBidi" w:hAnsiTheme="minorHAnsi" w:eastAsia="Calibri"/>
                 <w:sz w:val="18"/>
                 <w:szCs w:val="18"/>
               </w:rPr>
@@ -1890,7 +1890,7 @@
             </w:pPr>
             <w:r>
               <w:rPr>
-                <w:rFonts w:cs="Calibri" w:ascii="Calibri" w:hAnsi="Calibri" w:asciiTheme="minorHAnsi" w:cstheme="minorHAnsi" w:hAnsiTheme="minorHAnsi"/>
+                <w:rFonts w:cs="Calibri" w:ascii="Calibri" w:hAnsi="Calibri" w:asciiTheme="minorHAnsi" w:cstheme="minorHAnsi" w:hAnsiTheme="minorHAnsi" w:eastAsia="Calibri"/>
                 <w:b/>
                 <w:bCs/>
                 <w:i/>
@@ -1930,7 +1930,7 @@
             </w:pPr>
             <w:r>
               <w:rPr>
-                <w:rFonts w:cs="" w:ascii="Calibri" w:hAnsi="Calibri" w:asciiTheme="minorHAnsi" w:cstheme="minorBidi" w:hAnsiTheme="minorHAnsi"/>
+                <w:rFonts w:cs="Calibri" w:ascii="Calibri" w:hAnsi="Calibri" w:asciiTheme="minorHAnsi" w:cstheme="minorBidi" w:hAnsiTheme="minorHAnsi" w:eastAsia="Calibri"/>
                 <w:sz w:val="18"/>
                 <w:szCs w:val="18"/>
               </w:rPr>
@@ -2009,7 +2009,7 @@
             </w:pPr>
             <w:r>
               <w:rPr>
-                <w:rFonts w:cs="Calibri" w:ascii="Calibri" w:hAnsi="Calibri" w:asciiTheme="minorHAnsi" w:cstheme="minorHAnsi" w:hAnsiTheme="minorHAnsi"/>
+                <w:rFonts w:cs="Calibri" w:ascii="Calibri" w:hAnsi="Calibri" w:asciiTheme="minorHAnsi" w:cstheme="minorHAnsi" w:hAnsiTheme="minorHAnsi" w:eastAsia="Calibri"/>
                 <w:b/>
                 <w:bCs/>
                 <w:i/>
@@ -2050,7 +2050,7 @@
             </w:pPr>
             <w:r>
               <w:rPr>
-                <w:rFonts w:cs="" w:ascii="Calibri" w:hAnsi="Calibri" w:asciiTheme="minorHAnsi" w:cstheme="minorBidi" w:hAnsiTheme="minorHAnsi"/>
+                <w:rFonts w:cs="Calibri" w:ascii="Calibri" w:hAnsi="Calibri" w:asciiTheme="minorHAnsi" w:cstheme="minorBidi" w:hAnsiTheme="minorHAnsi" w:eastAsia="Calibri"/>
                 <w:sz w:val="18"/>
                 <w:szCs w:val="18"/>
               </w:rPr>
@@ -2088,7 +2088,7 @@
             </w:pPr>
             <w:r>
               <w:rPr>
-                <w:rFonts w:cs="Calibri" w:ascii="Calibri" w:hAnsi="Calibri" w:asciiTheme="minorHAnsi" w:cstheme="minorHAnsi" w:hAnsiTheme="minorHAnsi"/>
+                <w:rFonts w:cs="Calibri" w:ascii="Calibri" w:hAnsi="Calibri" w:asciiTheme="minorHAnsi" w:cstheme="minorHAnsi" w:hAnsiTheme="minorHAnsi" w:eastAsia="Calibri"/>
                 <w:b/>
                 <w:bCs/>
                 <w:sz w:val="18"/>
@@ -2129,7 +2129,7 @@
             </w:pPr>
             <w:r>
               <w:rPr>
-                <w:rFonts w:cs="Calibri" w:ascii="Calibri" w:hAnsi="Calibri" w:asciiTheme="minorHAnsi" w:cstheme="minorHAnsi" w:hAnsiTheme="minorHAnsi"/>
+                <w:rFonts w:cs="Calibri" w:ascii="Calibri" w:hAnsi="Calibri" w:asciiTheme="minorHAnsi" w:cstheme="minorHAnsi" w:hAnsiTheme="minorHAnsi" w:eastAsia="Calibri"/>
                 <w:b/>
                 <w:bCs/>
                 <w:i/>
@@ -2169,7 +2169,7 @@
             </w:pPr>
             <w:r>
               <w:rPr>
-                <w:rFonts w:cs="" w:ascii="Calibri" w:hAnsi="Calibri" w:asciiTheme="minorHAnsi" w:cstheme="minorBidi" w:hAnsiTheme="minorHAnsi"/>
+                <w:rFonts w:cs="Calibri" w:ascii="Calibri" w:hAnsi="Calibri" w:asciiTheme="minorHAnsi" w:cstheme="minorBidi" w:hAnsiTheme="minorHAnsi" w:eastAsia="Calibri"/>
                 <w:sz w:val="18"/>
                 <w:szCs w:val="18"/>
               </w:rPr>
@@ -2177,7 +2177,7 @@
             </w:r>
             <w:r>
               <w:rPr>
-                <w:rFonts w:cs="" w:ascii="Calibri" w:hAnsi="Calibri" w:asciiTheme="minorHAnsi" w:cstheme="minorBidi" w:hAnsiTheme="minorHAnsi"/>
+                <w:rFonts w:cs="Calibri" w:ascii="Calibri" w:hAnsi="Calibri" w:asciiTheme="minorHAnsi" w:cstheme="minorBidi" w:hAnsiTheme="minorHAnsi" w:eastAsia="Calibri"/>
                 <w:sz w:val="18"/>
                 <w:szCs w:val="18"/>
               </w:rPr>
@@ -2255,7 +2255,7 @@
             </w:pPr>
             <w:r>
               <w:rPr>
-                <w:rFonts w:cs="Calibri" w:ascii="Calibri" w:hAnsi="Calibri" w:asciiTheme="minorHAnsi" w:cstheme="minorHAnsi" w:hAnsiTheme="minorHAnsi"/>
+                <w:rFonts w:cs="Calibri" w:ascii="Calibri" w:hAnsi="Calibri" w:asciiTheme="minorHAnsi" w:cstheme="minorHAnsi" w:hAnsiTheme="minorHAnsi" w:eastAsia="Calibri"/>
                 <w:b/>
                 <w:bCs/>
                 <w:i/>
@@ -2295,7 +2295,7 @@
             </w:pPr>
             <w:r>
               <w:rPr>
-                <w:rFonts w:cs="" w:ascii="Calibri" w:hAnsi="Calibri" w:asciiTheme="minorHAnsi" w:cstheme="minorBidi" w:hAnsiTheme="minorHAnsi"/>
+                <w:rFonts w:cs="Calibri" w:ascii="Calibri" w:hAnsi="Calibri" w:asciiTheme="minorHAnsi" w:cstheme="minorBidi" w:hAnsiTheme="minorHAnsi" w:eastAsia="Calibri"/>
                 <w:sz w:val="18"/>
                 <w:szCs w:val="18"/>
               </w:rPr>
@@ -2373,7 +2373,7 @@
             </w:pPr>
             <w:r>
               <w:rPr>
-                <w:rFonts w:cs="Calibri" w:ascii="Calibri" w:hAnsi="Calibri" w:asciiTheme="minorHAnsi" w:cstheme="minorHAnsi" w:hAnsiTheme="minorHAnsi"/>
+                <w:rFonts w:cs="Calibri" w:ascii="Calibri" w:hAnsi="Calibri" w:asciiTheme="minorHAnsi" w:cstheme="minorHAnsi" w:hAnsiTheme="minorHAnsi" w:eastAsia="Calibri"/>
                 <w:b/>
                 <w:bCs/>
                 <w:i/>
@@ -2413,7 +2413,7 @@
             </w:pPr>
             <w:r>
               <w:rPr>
-                <w:rFonts w:cs="" w:ascii="Calibri" w:hAnsi="Calibri" w:cstheme="minorBidi"/>
+                <w:rFonts w:cs="Calibri" w:ascii="Calibri" w:hAnsi="Calibri" w:cstheme="minorBidi" w:eastAsia="Calibri"/>
                 <w:sz w:val="18"/>
                 <w:szCs w:val="18"/>
               </w:rPr>
@@ -2448,7 +2448,7 @@
             </w:pPr>
             <w:r>
               <w:rPr>
-                <w:rFonts w:cs="Calibri" w:ascii="Calibri" w:hAnsi="Calibri" w:asciiTheme="minorHAnsi" w:cstheme="minorHAnsi" w:hAnsiTheme="minorHAnsi"/>
+                <w:rFonts w:cs="Calibri" w:ascii="Calibri" w:hAnsi="Calibri" w:asciiTheme="minorHAnsi" w:cstheme="minorHAnsi" w:hAnsiTheme="minorHAnsi" w:eastAsia="Calibri"/>
                 <w:b/>
                 <w:bCs/>
                 <w:sz w:val="18"/>
@@ -2481,7 +2481,7 @@
             </w:pPr>
             <w:r>
               <w:rPr>
-                <w:rFonts w:cs="Calibri" w:ascii="Calibri" w:hAnsi="Calibri" w:asciiTheme="minorHAnsi" w:cstheme="minorHAnsi" w:hAnsiTheme="minorHAnsi"/>
+                <w:rFonts w:cs="Calibri" w:ascii="Calibri" w:hAnsi="Calibri" w:asciiTheme="minorHAnsi" w:cstheme="minorHAnsi" w:hAnsiTheme="minorHAnsi" w:eastAsia="Calibri"/>
                 <w:sz w:val="18"/>
                 <w:szCs w:val="18"/>
               </w:rPr>
@@ -2513,7 +2513,7 @@
             </w:pPr>
             <w:r>
               <w:rPr>
-                <w:rFonts w:cs="Calibri" w:ascii="Calibri" w:hAnsi="Calibri" w:asciiTheme="minorHAnsi" w:cstheme="minorHAnsi" w:hAnsiTheme="minorHAnsi"/>
+                <w:rFonts w:cs="Calibri" w:ascii="Calibri" w:hAnsi="Calibri" w:asciiTheme="minorHAnsi" w:cstheme="minorHAnsi" w:hAnsiTheme="minorHAnsi" w:eastAsia="Calibri"/>
                 <w:b/>
                 <w:bCs/>
                 <w:sz w:val="18"/>
@@ -2546,7 +2546,7 @@
             </w:pPr>
             <w:r>
               <w:rPr>
-                <w:rFonts w:cs="" w:cstheme="minorBidi"/>
+                <w:rFonts w:cs="Calibri" w:cstheme="minorBidi" w:ascii="Calibri" w:hAnsi="Calibri" w:eastAsia="Calibri"/>
               </w:rPr>
               <w:t>{{ data_hoje }}</w:t>
             </w:r>
@@ -2579,7 +2579,7 @@
             </w:pPr>
             <w:r>
               <w:rPr>
-                <w:rFonts w:cs="Calibri" w:ascii="Calibri" w:hAnsi="Calibri" w:asciiTheme="minorHAnsi" w:cstheme="minorHAnsi" w:hAnsiTheme="minorHAnsi"/>
+                <w:rFonts w:cs="Calibri" w:ascii="Calibri" w:hAnsi="Calibri" w:asciiTheme="minorHAnsi" w:cstheme="minorHAnsi" w:hAnsiTheme="minorHAnsi" w:eastAsia="Calibri"/>
                 <w:b/>
                 <w:bCs/>
                 <w:sz w:val="18"/>
@@ -2612,7 +2612,7 @@
             </w:pPr>
             <w:r>
               <w:rPr>
-                <w:rFonts w:cs="" w:ascii="Calibri" w:hAnsi="Calibri" w:asciiTheme="minorHAnsi" w:cstheme="minorBidi" w:hAnsiTheme="minorHAnsi"/>
+                <w:rFonts w:cs="Calibri" w:ascii="Calibri" w:hAnsi="Calibri" w:asciiTheme="minorHAnsi" w:cstheme="minorBidi" w:hAnsiTheme="minorHAnsi" w:eastAsia="Calibri"/>
                 <w:sz w:val="18"/>
                 <w:szCs w:val="18"/>
               </w:rPr>
@@ -2644,7 +2644,7 @@
             </w:pPr>
             <w:r>
               <w:rPr>
-                <w:rFonts w:cs="Calibri" w:ascii="Calibri" w:hAnsi="Calibri" w:asciiTheme="minorHAnsi" w:cstheme="minorHAnsi" w:hAnsiTheme="minorHAnsi"/>
+                <w:rFonts w:cs="Calibri" w:ascii="Calibri" w:hAnsi="Calibri" w:asciiTheme="minorHAnsi" w:cstheme="minorHAnsi" w:hAnsiTheme="minorHAnsi" w:eastAsia="Calibri"/>
                 <w:b/>
                 <w:bCs/>
                 <w:sz w:val="18"/>
@@ -2677,7 +2677,7 @@
             </w:pPr>
             <w:r>
               <w:rPr>
-                <w:rFonts w:cs="Calibri" w:ascii="Calibri" w:hAnsi="Calibri" w:asciiTheme="minorHAnsi" w:cstheme="minorHAnsi" w:hAnsiTheme="minorHAnsi"/>
+                <w:rFonts w:cs="Calibri" w:ascii="Calibri" w:hAnsi="Calibri" w:asciiTheme="minorHAnsi" w:cstheme="minorHAnsi" w:hAnsiTheme="minorHAnsi" w:eastAsia="Calibri"/>
                 <w:sz w:val="18"/>
                 <w:szCs w:val="18"/>
               </w:rPr>
@@ -2750,7 +2750,7 @@
             </w:pPr>
             <w:r>
               <w:rPr>
-                <w:rFonts w:cs="Calibri" w:ascii="Calibri" w:hAnsi="Calibri" w:asciiTheme="minorHAnsi" w:cstheme="minorHAnsi" w:hAnsiTheme="minorHAnsi"/>
+                <w:rFonts w:cs="Calibri" w:ascii="Calibri" w:hAnsi="Calibri" w:asciiTheme="minorHAnsi" w:cstheme="minorHAnsi" w:hAnsiTheme="minorHAnsi" w:eastAsia="Calibri"/>
                 <w:b/>
                 <w:sz w:val="18"/>
                 <w:szCs w:val="18"/>
@@ -2788,7 +2788,7 @@
             </w:pPr>
             <w:r>
               <w:rPr>
-                <w:rFonts w:cs="Calibri" w:ascii="Calibri" w:hAnsi="Calibri" w:asciiTheme="minorHAnsi" w:cstheme="minorHAnsi" w:hAnsiTheme="minorHAnsi"/>
+                <w:rFonts w:cs="Calibri" w:ascii="Calibri" w:hAnsi="Calibri" w:asciiTheme="minorHAnsi" w:cstheme="minorHAnsi" w:hAnsiTheme="minorHAnsi" w:eastAsia="Calibri"/>
                 <w:b/>
                 <w:sz w:val="18"/>
                 <w:szCs w:val="18"/>
@@ -2825,7 +2825,7 @@
             </w:pPr>
             <w:r>
               <w:rPr>
-                <w:rFonts w:cs="Calibri" w:ascii="Calibri" w:hAnsi="Calibri" w:asciiTheme="minorHAnsi" w:cstheme="minorHAnsi" w:hAnsiTheme="minorHAnsi"/>
+                <w:rFonts w:cs="Calibri" w:ascii="Calibri" w:hAnsi="Calibri" w:asciiTheme="minorHAnsi" w:cstheme="minorHAnsi" w:hAnsiTheme="minorHAnsi" w:eastAsia="Calibri"/>
                 <w:sz w:val="18"/>
                 <w:szCs w:val="18"/>
               </w:rPr>
@@ -2863,7 +2863,7 @@
             </w:pPr>
             <w:r>
               <w:rPr>
-                <w:rFonts w:cs="Calibri" w:ascii="Calibri" w:hAnsi="Calibri" w:asciiTheme="minorHAnsi" w:cstheme="minorHAnsi" w:hAnsiTheme="minorHAnsi"/>
+                <w:rFonts w:cs="Calibri" w:ascii="Calibri" w:hAnsi="Calibri" w:asciiTheme="minorHAnsi" w:cstheme="minorHAnsi" w:hAnsiTheme="minorHAnsi" w:eastAsia="Calibri"/>
                 <w:b/>
                 <w:sz w:val="18"/>
                 <w:szCs w:val="18"/>
@@ -2901,7 +2901,7 @@
             </w:pPr>
             <w:r>
               <w:rPr>
-                <w:rFonts w:cs="" w:ascii="Calibri" w:hAnsi="Calibri" w:asciiTheme="minorHAnsi" w:cstheme="minorBidi" w:hAnsiTheme="minorHAnsi"/>
+                <w:rFonts w:cs="Calibri" w:ascii="Calibri" w:hAnsi="Calibri" w:asciiTheme="minorHAnsi" w:cstheme="minorBidi" w:hAnsiTheme="minorHAnsi" w:eastAsia="Calibri"/>
                 <w:color w:val="auto"/>
                 <w:sz w:val="20"/>
                 <w:szCs w:val="20"/>
@@ -2910,7 +2910,7 @@
             </w:r>
             <w:r>
               <w:rPr>
-                <w:rFonts w:cs="" w:ascii="Calibri" w:hAnsi="Calibri" w:asciiTheme="minorHAnsi" w:cstheme="minorBidi" w:hAnsiTheme="minorHAnsi"/>
+                <w:rFonts w:cs="Calibri" w:ascii="Calibri" w:hAnsi="Calibri" w:asciiTheme="minorHAnsi" w:cstheme="minorBidi" w:hAnsiTheme="minorHAnsi" w:eastAsia="Calibri"/>
                 <w:color w:val="auto"/>
                 <w:sz w:val="20"/>
                 <w:szCs w:val="20"/>
@@ -2949,7 +2949,7 @@
             </w:pPr>
             <w:r>
               <w:rPr>
-                <w:rFonts w:cs="Calibri" w:ascii="Calibri" w:hAnsi="Calibri" w:asciiTheme="minorHAnsi" w:cstheme="minorHAnsi" w:hAnsiTheme="minorHAnsi"/>
+                <w:rFonts w:cs="Calibri" w:ascii="Calibri" w:hAnsi="Calibri" w:asciiTheme="minorHAnsi" w:cstheme="minorHAnsi" w:hAnsiTheme="minorHAnsi" w:eastAsia="Calibri"/>
                 <w:b/>
                 <w:sz w:val="18"/>
                 <w:szCs w:val="18"/>
@@ -2988,7 +2988,7 @@
             </w:pPr>
             <w:r>
               <w:rPr>
-                <w:rFonts w:cs="" w:ascii="Calibri" w:hAnsi="Calibri" w:asciiTheme="minorHAnsi" w:cstheme="minorBidi" w:hAnsiTheme="minorHAnsi"/>
+                <w:rFonts w:cs="Calibri" w:ascii="Calibri" w:hAnsi="Calibri" w:asciiTheme="minorHAnsi" w:cstheme="minorBidi" w:hAnsiTheme="minorHAnsi" w:eastAsia="Calibri"/>
                 <w:color w:val="auto"/>
                 <w:sz w:val="20"/>
                 <w:szCs w:val="20"/>
@@ -2997,7 +2997,7 @@
             </w:r>
             <w:r>
               <w:rPr>
-                <w:rFonts w:cs="" w:ascii="Calibri" w:hAnsi="Calibri" w:asciiTheme="minorHAnsi" w:cstheme="minorBidi" w:hAnsiTheme="minorHAnsi"/>
+                <w:rFonts w:cs="Calibri" w:ascii="Calibri" w:hAnsi="Calibri" w:asciiTheme="minorHAnsi" w:cstheme="minorBidi" w:hAnsiTheme="minorHAnsi" w:eastAsia="Calibri"/>
                 <w:color w:val="auto"/>
                 <w:sz w:val="20"/>
                 <w:szCs w:val="20"/>
@@ -3036,7 +3036,7 @@
             </w:pPr>
             <w:r>
               <w:rPr>
-                <w:rFonts w:cs="Calibri" w:ascii="Calibri" w:hAnsi="Calibri" w:asciiTheme="minorHAnsi" w:cstheme="minorHAnsi" w:hAnsiTheme="minorHAnsi"/>
+                <w:rFonts w:cs="Calibri" w:ascii="Calibri" w:hAnsi="Calibri" w:asciiTheme="minorHAnsi" w:cstheme="minorHAnsi" w:hAnsiTheme="minorHAnsi" w:eastAsia="Calibri"/>
                 <w:b/>
                 <w:sz w:val="18"/>
                 <w:szCs w:val="18"/>
@@ -3075,7 +3075,7 @@
             </w:pPr>
             <w:r>
               <w:rPr>
-                <w:rFonts w:cs="Calibri" w:ascii="Calibri" w:hAnsi="Calibri" w:asciiTheme="minorHAnsi" w:cstheme="minorHAnsi" w:hAnsiTheme="minorHAnsi"/>
+                <w:rFonts w:cs="Calibri" w:ascii="Calibri" w:hAnsi="Calibri" w:asciiTheme="minorHAnsi" w:cstheme="minorHAnsi" w:hAnsiTheme="minorHAnsi" w:eastAsia="Calibri"/>
                 <w:color w:themeColor="text1" w:val="000000"/>
                 <w:sz w:val="18"/>
                 <w:szCs w:val="18"/>
@@ -3084,7 +3084,7 @@
             </w:r>
             <w:r>
               <w:rPr>
-                <w:rFonts w:cs="" w:ascii="Calibri" w:hAnsi="Calibri" w:asciiTheme="minorHAnsi" w:cstheme="minorBidi" w:hAnsiTheme="minorHAnsi"/>
+                <w:rFonts w:cs="Calibri" w:ascii="Calibri" w:hAnsi="Calibri" w:asciiTheme="minorHAnsi" w:cstheme="minorBidi" w:hAnsiTheme="minorHAnsi" w:eastAsia="Calibri"/>
                 <w:color w:val="auto"/>
                 <w:sz w:val="20"/>
                 <w:szCs w:val="20"/>
@@ -3123,7 +3123,7 @@
             </w:pPr>
             <w:r>
               <w:rPr>
-                <w:rFonts w:cs="Calibri" w:ascii="Calibri" w:hAnsi="Calibri" w:asciiTheme="minorHAnsi" w:cstheme="minorHAnsi" w:hAnsiTheme="minorHAnsi"/>
+                <w:rFonts w:cs="Calibri" w:ascii="Calibri" w:hAnsi="Calibri" w:asciiTheme="minorHAnsi" w:cstheme="minorHAnsi" w:hAnsiTheme="minorHAnsi" w:eastAsia="Calibri"/>
                 <w:b/>
                 <w:sz w:val="18"/>
                 <w:szCs w:val="18"/>
@@ -3163,7 +3163,7 @@
             </w:pPr>
             <w:r>
               <w:rPr>
-                <w:rFonts w:cs="Calibri" w:ascii="Calibri" w:hAnsi="Calibri" w:asciiTheme="minorHAnsi" w:cstheme="minorHAnsi" w:hAnsiTheme="minorHAnsi"/>
+                <w:rFonts w:cs="Calibri" w:ascii="Calibri" w:hAnsi="Calibri" w:asciiTheme="minorHAnsi" w:cstheme="minorHAnsi" w:hAnsiTheme="minorHAnsi" w:eastAsia="Calibri"/>
                 <w:color w:themeColor="text1" w:val="000000"/>
                 <w:sz w:val="18"/>
                 <w:szCs w:val="18"/>
@@ -3185,7 +3185,7 @@
             </w:hyperlink>
             <w:r>
               <w:rPr>
-                <w:rFonts w:cs="Calibri" w:ascii="Calibri" w:hAnsi="Calibri" w:asciiTheme="minorHAnsi" w:cstheme="minorHAnsi" w:hAnsiTheme="minorHAnsi"/>
+                <w:rFonts w:cs="Calibri" w:ascii="Calibri" w:hAnsi="Calibri" w:asciiTheme="minorHAnsi" w:cstheme="minorHAnsi" w:hAnsiTheme="minorHAnsi" w:eastAsia="Calibri"/>
                 <w:color w:themeColor="text1" w:val="000000"/>
                 <w:sz w:val="18"/>
                 <w:szCs w:val="18"/>
@@ -3195,7 +3195,7 @@
             </w:r>
             <w:r>
               <w:rPr>
-                <w:rFonts w:cs="" w:ascii="Calibri" w:hAnsi="Calibri" w:asciiTheme="minorHAnsi" w:cstheme="minorBidi" w:hAnsiTheme="minorHAnsi"/>
+                <w:rFonts w:cs="Calibri" w:ascii="Calibri" w:hAnsi="Calibri" w:asciiTheme="minorHAnsi" w:cstheme="minorBidi" w:hAnsiTheme="minorHAnsi" w:eastAsia="Calibri"/>
                 <w:color w:val="auto"/>
                 <w:sz w:val="20"/>
                 <w:szCs w:val="20"/>
@@ -3235,7 +3235,7 @@
             </w:pPr>
             <w:r>
               <w:rPr>
-                <w:rFonts w:cs="Calibri" w:ascii="Calibri" w:hAnsi="Calibri" w:asciiTheme="minorHAnsi" w:cstheme="minorHAnsi" w:hAnsiTheme="minorHAnsi"/>
+                <w:rFonts w:cs="Calibri" w:ascii="Calibri" w:hAnsi="Calibri" w:asciiTheme="minorHAnsi" w:cstheme="minorHAnsi" w:hAnsiTheme="minorHAnsi" w:eastAsia="Calibri"/>
                 <w:b/>
                 <w:sz w:val="18"/>
                 <w:szCs w:val="18"/>
@@ -3273,7 +3273,7 @@
             </w:pPr>
             <w:r>
               <w:rPr>
-                <w:rFonts w:cs="Calibri" w:ascii="Calibri" w:hAnsi="Calibri" w:asciiTheme="minorHAnsi" w:cstheme="minorHAnsi" w:hAnsiTheme="minorHAnsi"/>
+                <w:rFonts w:cs="Calibri" w:ascii="Calibri" w:hAnsi="Calibri" w:asciiTheme="minorHAnsi" w:cstheme="minorHAnsi" w:hAnsiTheme="minorHAnsi" w:eastAsia="Calibri"/>
                 <w:sz w:val="18"/>
                 <w:szCs w:val="18"/>
               </w:rPr>
@@ -3281,7 +3281,7 @@
             </w:r>
             <w:r>
               <w:rPr>
-                <w:rFonts w:cs="" w:ascii="Calibri" w:hAnsi="Calibri" w:asciiTheme="minorHAnsi" w:cstheme="minorBidi" w:hAnsiTheme="minorHAnsi"/>
+                <w:rFonts w:cs="Calibri" w:ascii="Calibri" w:hAnsi="Calibri" w:asciiTheme="minorHAnsi" w:cstheme="minorBidi" w:hAnsiTheme="minorHAnsi" w:eastAsia="Calibri"/>
                 <w:color w:val="auto"/>
                 <w:sz w:val="20"/>
                 <w:szCs w:val="20"/>
@@ -3291,7 +3291,7 @@
             </w:r>
             <w:r>
               <w:rPr>
-                <w:rFonts w:cs="" w:ascii="Calibri" w:hAnsi="Calibri" w:asciiTheme="minorHAnsi" w:cstheme="minorBidi" w:hAnsiTheme="minorHAnsi"/>
+                <w:rFonts w:cs="Calibri" w:ascii="Calibri" w:hAnsi="Calibri" w:asciiTheme="minorHAnsi" w:cstheme="minorBidi" w:hAnsiTheme="minorHAnsi" w:eastAsia="Calibri"/>
                 <w:color w:val="auto"/>
                 <w:sz w:val="20"/>
                 <w:szCs w:val="20"/>
@@ -3330,7 +3330,7 @@
             </w:pPr>
             <w:r>
               <w:rPr>
-                <w:rFonts w:cs="Calibri" w:ascii="Calibri" w:hAnsi="Calibri" w:asciiTheme="minorHAnsi" w:cstheme="minorHAnsi" w:hAnsiTheme="minorHAnsi"/>
+                <w:rFonts w:cs="Calibri" w:ascii="Calibri" w:hAnsi="Calibri" w:asciiTheme="minorHAnsi" w:cstheme="minorHAnsi" w:hAnsiTheme="minorHAnsi" w:eastAsia="Calibri"/>
                 <w:b/>
                 <w:sz w:val="18"/>
                 <w:szCs w:val="18"/>
@@ -3368,7 +3368,7 @@
             </w:pPr>
             <w:r>
               <w:rPr>
-                <w:rFonts w:cs="Calibri" w:ascii="Calibri" w:hAnsi="Calibri" w:asciiTheme="minorHAnsi" w:cstheme="minorHAnsi" w:hAnsiTheme="minorHAnsi"/>
+                <w:rFonts w:cs="Calibri" w:ascii="Calibri" w:hAnsi="Calibri" w:asciiTheme="minorHAnsi" w:cstheme="minorHAnsi" w:hAnsiTheme="minorHAnsi" w:eastAsia="Calibri"/>
                 <w:color w:val="FF0000"/>
                 <w:sz w:val="18"/>
                 <w:szCs w:val="18"/>
@@ -3377,7 +3377,7 @@
             </w:r>
             <w:r>
               <w:rPr>
-                <w:rFonts w:cs="Calibri" w:ascii="Calibri" w:hAnsi="Calibri" w:asciiTheme="minorHAnsi" w:cstheme="minorHAnsi" w:hAnsiTheme="minorHAnsi"/>
+                <w:rFonts w:cs="Calibri" w:ascii="Calibri" w:hAnsi="Calibri" w:asciiTheme="minorHAnsi" w:cstheme="minorHAnsi" w:hAnsiTheme="minorHAnsi" w:eastAsia="Calibri"/>
                 <w:color w:val="auto"/>
                 <w:sz w:val="18"/>
                 <w:szCs w:val="18"/>
@@ -3416,7 +3416,7 @@
             </w:pPr>
             <w:r>
               <w:rPr>
-                <w:rFonts w:cs="Calibri" w:ascii="Calibri" w:hAnsi="Calibri" w:asciiTheme="minorHAnsi" w:cstheme="minorHAnsi" w:hAnsiTheme="minorHAnsi"/>
+                <w:rFonts w:cs="Calibri" w:ascii="Calibri" w:hAnsi="Calibri" w:asciiTheme="minorHAnsi" w:cstheme="minorHAnsi" w:hAnsiTheme="minorHAnsi" w:eastAsia="Calibri"/>
                 <w:b/>
                 <w:sz w:val="18"/>
                 <w:szCs w:val="18"/>
@@ -3454,7 +3454,7 @@
             </w:pPr>
             <w:r>
               <w:rPr>
-                <w:rFonts w:cs="Calibri" w:ascii="Calibri" w:hAnsi="Calibri" w:asciiTheme="minorHAnsi" w:cstheme="minorHAnsi" w:hAnsiTheme="minorHAnsi"/>
+                <w:rFonts w:cs="Calibri" w:ascii="Calibri" w:hAnsi="Calibri" w:asciiTheme="minorHAnsi" w:cstheme="minorHAnsi" w:hAnsiTheme="minorHAnsi" w:eastAsia="Calibri"/>
                 <w:sz w:val="18"/>
                 <w:szCs w:val="18"/>
               </w:rPr>
@@ -3462,7 +3462,7 @@
             </w:r>
             <w:r>
               <w:rPr>
-                <w:rFonts w:cs="Calibri" w:ascii="Calibri" w:hAnsi="Calibri" w:asciiTheme="minorHAnsi" w:cstheme="minorHAnsi" w:hAnsiTheme="minorHAnsi"/>
+                <w:rFonts w:cs="Calibri" w:ascii="Calibri" w:hAnsi="Calibri" w:asciiTheme="minorHAnsi" w:cstheme="minorHAnsi" w:hAnsiTheme="minorHAnsi" w:eastAsia="Calibri"/>
                 <w:sz w:val="18"/>
                 <w:szCs w:val="18"/>
               </w:rPr>
@@ -3500,7 +3500,7 @@
             </w:pPr>
             <w:r>
               <w:rPr>
-                <w:rFonts w:cs="Calibri" w:ascii="Calibri" w:hAnsi="Calibri" w:asciiTheme="minorHAnsi" w:cstheme="minorHAnsi" w:hAnsiTheme="minorHAnsi"/>
+                <w:rFonts w:cs="Calibri" w:ascii="Calibri" w:hAnsi="Calibri" w:asciiTheme="minorHAnsi" w:cstheme="minorHAnsi" w:hAnsiTheme="minorHAnsi" w:eastAsia="Calibri"/>
                 <w:b/>
                 <w:sz w:val="18"/>
                 <w:szCs w:val="18"/>
@@ -3538,7 +3538,7 @@
             </w:pPr>
             <w:r>
               <w:rPr>
-                <w:rFonts w:cs="Calibri" w:ascii="Calibri" w:hAnsi="Calibri" w:asciiTheme="minorHAnsi" w:cstheme="minorHAnsi" w:hAnsiTheme="minorHAnsi"/>
+                <w:rFonts w:cs="Calibri" w:ascii="Calibri" w:hAnsi="Calibri" w:asciiTheme="minorHAnsi" w:cstheme="minorHAnsi" w:hAnsiTheme="minorHAnsi" w:eastAsia="Calibri"/>
                 <w:sz w:val="18"/>
                 <w:szCs w:val="18"/>
               </w:rPr>
@@ -3546,7 +3546,7 @@
             </w:r>
             <w:r>
               <w:rPr>
-                <w:rFonts w:cs="Calibri" w:ascii="Calibri" w:hAnsi="Calibri" w:asciiTheme="minorHAnsi" w:cstheme="minorHAnsi" w:hAnsiTheme="minorHAnsi"/>
+                <w:rFonts w:cs="Calibri" w:ascii="Calibri" w:hAnsi="Calibri" w:asciiTheme="minorHAnsi" w:cstheme="minorHAnsi" w:hAnsiTheme="minorHAnsi" w:eastAsia="Calibri"/>
                 <w:sz w:val="18"/>
                 <w:szCs w:val="18"/>
               </w:rPr>
@@ -3614,7 +3614,7 @@
             </w:pPr>
             <w:r>
               <w:rPr>
-                <w:rFonts w:cs="Calibri" w:ascii="Calibri" w:hAnsi="Calibri" w:asciiTheme="minorHAnsi" w:cstheme="minorHAnsi" w:hAnsiTheme="minorHAnsi"/>
+                <w:rFonts w:cs="Calibri" w:ascii="Calibri" w:hAnsi="Calibri" w:asciiTheme="minorHAnsi" w:cstheme="minorHAnsi" w:hAnsiTheme="minorHAnsi" w:eastAsia="Calibri"/>
                 <w:b/>
                 <w:sz w:val="18"/>
                 <w:szCs w:val="18"/>
@@ -3721,7 +3721,7 @@
       </w:pPr>
       <w:r>
         <w:rPr>
-          <w:rFonts w:cs="Calibri" w:ascii="Calibri" w:hAnsi="Calibri" w:asciiTheme="minorHAnsi" w:cstheme="minorHAnsi" w:hAnsiTheme="minorHAnsi"/>
+          <w:rFonts w:cs="Calibri" w:ascii="Calibri" w:hAnsi="Calibri" w:asciiTheme="minorHAnsi" w:cstheme="minorHAnsi" w:hAnsiTheme="minorHAnsi" w:eastAsia="Calibri"/>
           <w:b/>
           <w:bCs/>
           <w:sz w:val="18"/>
@@ -3731,7 +3731,7 @@
       </w:r>
       <w:r>
         <w:rPr>
-          <w:rFonts w:cs="Calibri" w:ascii="Calibri" w:hAnsi="Calibri" w:asciiTheme="minorHAnsi" w:cstheme="minorHAnsi" w:hAnsiTheme="minorHAnsi"/>
+          <w:rFonts w:cs="Calibri" w:ascii="Calibri" w:hAnsi="Calibri" w:asciiTheme="minorHAnsi" w:cstheme="minorHAnsi" w:hAnsiTheme="minorHAnsi" w:eastAsia="Calibri"/>
           <w:sz w:val="18"/>
           <w:szCs w:val="18"/>
         </w:rPr>
@@ -3739,7 +3739,7 @@
       </w:r>
       <w:r>
         <w:rPr>
-          <w:rFonts w:cs="Calibri" w:ascii="Calibri" w:hAnsi="Calibri" w:asciiTheme="minorHAnsi" w:cstheme="minorHAnsi" w:hAnsiTheme="minorHAnsi"/>
+          <w:rFonts w:cs="Calibri" w:ascii="Calibri" w:hAnsi="Calibri" w:asciiTheme="minorHAnsi" w:cstheme="minorHAnsi" w:hAnsiTheme="minorHAnsi" w:eastAsia="Calibri"/>
           <w:b/>
           <w:bCs/>
           <w:sz w:val="18"/>
@@ -3749,7 +3749,7 @@
       </w:r>
       <w:r>
         <w:rPr>
-          <w:rFonts w:cs="Calibri" w:ascii="Calibri" w:hAnsi="Calibri" w:asciiTheme="minorHAnsi" w:cstheme="minorHAnsi" w:hAnsiTheme="minorHAnsi"/>
+          <w:rFonts w:cs="Calibri" w:ascii="Calibri" w:hAnsi="Calibri" w:asciiTheme="minorHAnsi" w:cstheme="minorHAnsi" w:hAnsiTheme="minorHAnsi" w:eastAsia="Calibri"/>
           <w:sz w:val="18"/>
           <w:szCs w:val="18"/>
         </w:rPr>
@@ -3757,7 +3757,7 @@
       </w:r>
       <w:r>
         <w:rPr>
-          <w:rFonts w:cs="Calibri" w:ascii="Calibri" w:hAnsi="Calibri" w:asciiTheme="minorHAnsi" w:cstheme="minorHAnsi" w:hAnsiTheme="minorHAnsi"/>
+          <w:rFonts w:cs="Calibri" w:ascii="Calibri" w:hAnsi="Calibri" w:asciiTheme="minorHAnsi" w:cstheme="minorHAnsi" w:hAnsiTheme="minorHAnsi" w:eastAsia="Calibri"/>
           <w:b/>
           <w:bCs/>
           <w:sz w:val="18"/>
@@ -3767,7 +3767,7 @@
       </w:r>
       <w:r>
         <w:rPr>
-          <w:rFonts w:cs="Calibri" w:ascii="Calibri" w:hAnsi="Calibri" w:asciiTheme="minorHAnsi" w:cstheme="minorHAnsi" w:hAnsiTheme="minorHAnsi"/>
+          <w:rFonts w:cs="Calibri" w:ascii="Calibri" w:hAnsi="Calibri" w:asciiTheme="minorHAnsi" w:cstheme="minorHAnsi" w:hAnsiTheme="minorHAnsi" w:eastAsia="Calibri"/>
           <w:sz w:val="18"/>
           <w:szCs w:val="18"/>
         </w:rPr>
@@ -3775,7 +3775,7 @@
       </w:r>
       <w:r>
         <w:rPr>
-          <w:rFonts w:cs="Calibri" w:ascii="Calibri" w:hAnsi="Calibri" w:asciiTheme="minorHAnsi" w:cstheme="minorHAnsi" w:hAnsiTheme="minorHAnsi"/>
+          <w:rFonts w:cs="Calibri" w:ascii="Calibri" w:hAnsi="Calibri" w:asciiTheme="minorHAnsi" w:cstheme="minorHAnsi" w:hAnsiTheme="minorHAnsi" w:eastAsia="Calibri"/>
           <w:b/>
           <w:bCs/>
           <w:sz w:val="18"/>
@@ -3785,7 +3785,7 @@
       </w:r>
       <w:r>
         <w:rPr>
-          <w:rFonts w:cs="Calibri" w:ascii="Calibri" w:hAnsi="Calibri" w:asciiTheme="minorHAnsi" w:cstheme="minorHAnsi" w:hAnsiTheme="minorHAnsi"/>
+          <w:rFonts w:cs="Calibri" w:ascii="Calibri" w:hAnsi="Calibri" w:asciiTheme="minorHAnsi" w:cstheme="minorHAnsi" w:hAnsiTheme="minorHAnsi" w:eastAsia="Calibri"/>
           <w:sz w:val="18"/>
           <w:szCs w:val="18"/>
         </w:rPr>
@@ -3793,7 +3793,7 @@
       </w:r>
       <w:r>
         <w:rPr>
-          <w:rFonts w:cs="Calibri" w:ascii="Calibri" w:hAnsi="Calibri" w:asciiTheme="minorHAnsi" w:cstheme="minorHAnsi" w:hAnsiTheme="minorHAnsi"/>
+          <w:rFonts w:cs="Calibri" w:ascii="Calibri" w:hAnsi="Calibri" w:asciiTheme="minorHAnsi" w:cstheme="minorHAnsi" w:hAnsiTheme="minorHAnsi" w:eastAsia="Calibri"/>
           <w:b/>
           <w:bCs/>
           <w:sz w:val="18"/>
@@ -3803,7 +3803,7 @@
       </w:r>
       <w:r>
         <w:rPr>
-          <w:rFonts w:cs="Calibri" w:ascii="Calibri" w:hAnsi="Calibri" w:asciiTheme="minorHAnsi" w:cstheme="minorHAnsi" w:hAnsiTheme="minorHAnsi"/>
+          <w:rFonts w:cs="Calibri" w:ascii="Calibri" w:hAnsi="Calibri" w:asciiTheme="minorHAnsi" w:cstheme="minorHAnsi" w:hAnsiTheme="minorHAnsi" w:eastAsia="Calibri"/>
           <w:sz w:val="18"/>
           <w:szCs w:val="18"/>
         </w:rPr>
@@ -3811,7 +3811,7 @@
       </w:r>
       <w:r>
         <w:rPr>
-          <w:rFonts w:cs="Calibri" w:ascii="Calibri" w:hAnsi="Calibri" w:asciiTheme="minorHAnsi" w:cstheme="minorHAnsi" w:hAnsiTheme="minorHAnsi"/>
+          <w:rFonts w:cs="Calibri" w:ascii="Calibri" w:hAnsi="Calibri" w:asciiTheme="minorHAnsi" w:cstheme="minorHAnsi" w:hAnsiTheme="minorHAnsi" w:eastAsia="Calibri"/>
           <w:b/>
           <w:bCs/>
           <w:sz w:val="18"/>
@@ -3821,7 +3821,7 @@
       </w:r>
       <w:r>
         <w:rPr>
-          <w:rFonts w:cs="Calibri" w:ascii="Calibri" w:hAnsi="Calibri" w:asciiTheme="minorHAnsi" w:cstheme="minorHAnsi" w:hAnsiTheme="minorHAnsi"/>
+          <w:rFonts w:cs="Calibri" w:ascii="Calibri" w:hAnsi="Calibri" w:asciiTheme="minorHAnsi" w:cstheme="minorHAnsi" w:hAnsiTheme="minorHAnsi" w:eastAsia="Calibri"/>
           <w:sz w:val="18"/>
           <w:szCs w:val="18"/>
         </w:rPr>
@@ -3829,7 +3829,7 @@
       </w:r>
       <w:r>
         <w:rPr>
-          <w:rFonts w:cs="Calibri" w:ascii="Calibri" w:hAnsi="Calibri" w:asciiTheme="minorHAnsi" w:cstheme="minorHAnsi" w:hAnsiTheme="minorHAnsi"/>
+          <w:rFonts w:cs="Calibri" w:ascii="Calibri" w:hAnsi="Calibri" w:asciiTheme="minorHAnsi" w:cstheme="minorHAnsi" w:hAnsiTheme="minorHAnsi" w:eastAsia="Calibri"/>
           <w:b/>
           <w:bCs/>
           <w:sz w:val="18"/>
@@ -3839,7 +3839,7 @@
       </w:r>
       <w:r>
         <w:rPr>
-          <w:rFonts w:cs="Calibri" w:ascii="Calibri" w:hAnsi="Calibri" w:asciiTheme="minorHAnsi" w:cstheme="minorHAnsi" w:hAnsiTheme="minorHAnsi"/>
+          <w:rFonts w:cs="Calibri" w:ascii="Calibri" w:hAnsi="Calibri" w:asciiTheme="minorHAnsi" w:cstheme="minorHAnsi" w:hAnsiTheme="minorHAnsi" w:eastAsia="Calibri"/>
           <w:sz w:val="18"/>
           <w:szCs w:val="18"/>
         </w:rPr>
@@ -3847,7 +3847,7 @@
       </w:r>
       <w:r>
         <w:rPr>
-          <w:rFonts w:cs="Calibri" w:ascii="Calibri" w:hAnsi="Calibri" w:asciiTheme="minorHAnsi" w:cstheme="minorHAnsi" w:hAnsiTheme="minorHAnsi"/>
+          <w:rFonts w:cs="Calibri" w:ascii="Calibri" w:hAnsi="Calibri" w:asciiTheme="minorHAnsi" w:cstheme="minorHAnsi" w:hAnsiTheme="minorHAnsi" w:eastAsia="Calibri"/>
           <w:b/>
           <w:bCs/>
           <w:sz w:val="18"/>
@@ -3857,7 +3857,7 @@
       </w:r>
       <w:r>
         <w:rPr>
-          <w:rFonts w:cs="Calibri" w:ascii="Calibri" w:hAnsi="Calibri" w:asciiTheme="minorHAnsi" w:cstheme="minorHAnsi" w:hAnsiTheme="minorHAnsi"/>
+          <w:rFonts w:cs="Calibri" w:ascii="Calibri" w:hAnsi="Calibri" w:asciiTheme="minorHAnsi" w:cstheme="minorHAnsi" w:hAnsiTheme="minorHAnsi" w:eastAsia="Calibri"/>
           <w:sz w:val="18"/>
           <w:szCs w:val="18"/>
         </w:rPr>
@@ -3865,7 +3865,7 @@
       </w:r>
       <w:r>
         <w:rPr>
-          <w:rFonts w:cs="Calibri" w:ascii="Calibri" w:hAnsi="Calibri" w:asciiTheme="minorHAnsi" w:cstheme="minorHAnsi" w:hAnsiTheme="minorHAnsi"/>
+          <w:rFonts w:cs="Calibri" w:ascii="Calibri" w:hAnsi="Calibri" w:asciiTheme="minorHAnsi" w:cstheme="minorHAnsi" w:hAnsiTheme="minorHAnsi" w:eastAsia="Calibri"/>
           <w:b/>
           <w:bCs/>
           <w:sz w:val="18"/>
@@ -3875,7 +3875,7 @@
       </w:r>
       <w:r>
         <w:rPr>
-          <w:rFonts w:cs="Calibri" w:ascii="Calibri" w:hAnsi="Calibri" w:asciiTheme="minorHAnsi" w:cstheme="minorHAnsi" w:hAnsiTheme="minorHAnsi"/>
+          <w:rFonts w:cs="Calibri" w:ascii="Calibri" w:hAnsi="Calibri" w:asciiTheme="minorHAnsi" w:cstheme="minorHAnsi" w:hAnsiTheme="minorHAnsi" w:eastAsia="Calibri"/>
           <w:sz w:val="18"/>
           <w:szCs w:val="18"/>
         </w:rPr>
@@ -4137,7 +4137,7 @@
       </w:pPr>
       <w:r>
         <w:rPr>
-          <w:rFonts w:cs="Calibri" w:ascii="Calibri" w:hAnsi="Calibri" w:asciiTheme="minorHAnsi" w:cstheme="minorHAnsi" w:hAnsiTheme="minorHAnsi"/>
+          <w:rFonts w:cs="Calibri" w:ascii="Calibri" w:hAnsi="Calibri" w:asciiTheme="minorHAnsi" w:cstheme="minorHAnsi" w:hAnsiTheme="minorHAnsi" w:eastAsia="Calibri"/>
           <w:b/>
           <w:sz w:val="18"/>
           <w:szCs w:val="18"/>
@@ -4160,7 +4160,7 @@
       </w:pPr>
       <w:r>
         <w:rPr>
-          <w:rFonts w:cs="Calibri" w:ascii="Calibri" w:hAnsi="Calibri" w:asciiTheme="minorHAnsi" w:cstheme="minorHAnsi" w:hAnsiTheme="minorHAnsi"/>
+          <w:rFonts w:cs="Calibri" w:ascii="Calibri" w:hAnsi="Calibri" w:asciiTheme="minorHAnsi" w:cstheme="minorHAnsi" w:hAnsiTheme="minorHAnsi" w:eastAsia="Calibri"/>
           <w:b/>
           <w:sz w:val="18"/>
           <w:szCs w:val="18"/>
@@ -4169,7 +4169,7 @@
       </w:r>
       <w:r>
         <w:rPr>
-          <w:rFonts w:cs="Calibri" w:ascii="Calibri" w:hAnsi="Calibri" w:asciiTheme="minorHAnsi" w:cstheme="minorHAnsi" w:hAnsiTheme="minorHAnsi"/>
+          <w:rFonts w:cs="Calibri" w:ascii="Calibri" w:hAnsi="Calibri" w:asciiTheme="minorHAnsi" w:cstheme="minorHAnsi" w:hAnsiTheme="minorHAnsi" w:eastAsia="Calibri"/>
           <w:sz w:val="18"/>
           <w:szCs w:val="18"/>
         </w:rPr>
@@ -4177,7 +4177,7 @@
       </w:r>
       <w:r>
         <w:rPr>
-          <w:rFonts w:cs="Calibri" w:ascii="Calibri" w:hAnsi="Calibri" w:asciiTheme="minorHAnsi" w:cstheme="minorHAnsi" w:hAnsiTheme="minorHAnsi"/>
+          <w:rFonts w:cs="Calibri" w:ascii="Calibri" w:hAnsi="Calibri" w:asciiTheme="minorHAnsi" w:cstheme="minorHAnsi" w:hAnsiTheme="minorHAnsi" w:eastAsia="Calibri"/>
           <w:bCs/>
           <w:sz w:val="18"/>
           <w:szCs w:val="18"/>
@@ -4199,7 +4199,7 @@
       </w:pPr>
       <w:r>
         <w:rPr>
-          <w:rFonts w:cs="Calibri" w:ascii="Calibri" w:hAnsi="Calibri" w:asciiTheme="minorHAnsi" w:cstheme="minorHAnsi" w:hAnsiTheme="minorHAnsi"/>
+          <w:rFonts w:cs="Calibri" w:ascii="Calibri" w:hAnsi="Calibri" w:asciiTheme="minorHAnsi" w:cstheme="minorHAnsi" w:hAnsiTheme="minorHAnsi" w:eastAsia="Calibri"/>
           <w:b/>
           <w:sz w:val="18"/>
           <w:szCs w:val="18"/>
@@ -4208,7 +4208,7 @@
       </w:r>
       <w:r>
         <w:rPr>
-          <w:rFonts w:cs="Calibri" w:ascii="Calibri" w:hAnsi="Calibri" w:asciiTheme="minorHAnsi" w:cstheme="minorHAnsi" w:hAnsiTheme="minorHAnsi"/>
+          <w:rFonts w:cs="Calibri" w:ascii="Calibri" w:hAnsi="Calibri" w:asciiTheme="minorHAnsi" w:cstheme="minorHAnsi" w:hAnsiTheme="minorHAnsi" w:eastAsia="Calibri"/>
           <w:sz w:val="18"/>
           <w:szCs w:val="18"/>
         </w:rPr>
@@ -4216,7 +4216,7 @@
       </w:r>
       <w:r>
         <w:rPr>
-          <w:rFonts w:cs="Calibri" w:ascii="Calibri" w:hAnsi="Calibri" w:asciiTheme="minorHAnsi" w:cstheme="minorHAnsi" w:hAnsiTheme="minorHAnsi"/>
+          <w:rFonts w:cs="Calibri" w:ascii="Calibri" w:hAnsi="Calibri" w:asciiTheme="minorHAnsi" w:cstheme="minorHAnsi" w:hAnsiTheme="minorHAnsi" w:eastAsia="Calibri"/>
           <w:b/>
           <w:bCs/>
           <w:sz w:val="18"/>
@@ -4226,7 +4226,7 @@
       </w:r>
       <w:r>
         <w:rPr>
-          <w:rFonts w:cs="Calibri" w:ascii="Calibri" w:hAnsi="Calibri" w:asciiTheme="minorHAnsi" w:cstheme="minorHAnsi" w:hAnsiTheme="minorHAnsi"/>
+          <w:rFonts w:cs="Calibri" w:ascii="Calibri" w:hAnsi="Calibri" w:asciiTheme="minorHAnsi" w:cstheme="minorHAnsi" w:hAnsiTheme="minorHAnsi" w:eastAsia="Calibri"/>
           <w:sz w:val="18"/>
           <w:szCs w:val="18"/>
         </w:rPr>
@@ -4234,7 +4234,7 @@
       </w:r>
       <w:r>
         <w:rPr>
-          <w:rFonts w:cs="Calibri" w:ascii="Calibri" w:hAnsi="Calibri" w:asciiTheme="minorHAnsi" w:cstheme="minorHAnsi" w:hAnsiTheme="minorHAnsi"/>
+          <w:rFonts w:cs="Calibri" w:ascii="Calibri" w:hAnsi="Calibri" w:asciiTheme="minorHAnsi" w:cstheme="minorHAnsi" w:hAnsiTheme="minorHAnsi" w:eastAsia="Calibri"/>
           <w:b/>
           <w:bCs/>
           <w:sz w:val="18"/>
@@ -4244,7 +4244,7 @@
       </w:r>
       <w:r>
         <w:rPr>
-          <w:rFonts w:cs="Calibri" w:ascii="Calibri" w:hAnsi="Calibri" w:asciiTheme="minorHAnsi" w:cstheme="minorHAnsi" w:hAnsiTheme="minorHAnsi"/>
+          <w:rFonts w:cs="Calibri" w:ascii="Calibri" w:hAnsi="Calibri" w:asciiTheme="minorHAnsi" w:cstheme="minorHAnsi" w:hAnsiTheme="minorHAnsi" w:eastAsia="Calibri"/>
           <w:sz w:val="18"/>
           <w:szCs w:val="18"/>
         </w:rPr>
@@ -4252,7 +4252,7 @@
       </w:r>
       <w:r>
         <w:rPr>
-          <w:rFonts w:cs="Calibri" w:ascii="Calibri" w:hAnsi="Calibri" w:asciiTheme="minorHAnsi" w:cstheme="minorHAnsi" w:hAnsiTheme="minorHAnsi"/>
+          <w:rFonts w:cs="Calibri" w:ascii="Calibri" w:hAnsi="Calibri" w:asciiTheme="minorHAnsi" w:cstheme="minorHAnsi" w:hAnsiTheme="minorHAnsi" w:eastAsia="Calibri"/>
           <w:b/>
           <w:bCs/>
           <w:sz w:val="18"/>
@@ -4262,7 +4262,7 @@
       </w:r>
       <w:r>
         <w:rPr>
-          <w:rFonts w:cs="Calibri" w:ascii="Calibri" w:hAnsi="Calibri" w:asciiTheme="minorHAnsi" w:cstheme="minorHAnsi" w:hAnsiTheme="minorHAnsi"/>
+          <w:rFonts w:cs="Calibri" w:ascii="Calibri" w:hAnsi="Calibri" w:asciiTheme="minorHAnsi" w:cstheme="minorHAnsi" w:hAnsiTheme="minorHAnsi" w:eastAsia="Calibri"/>
           <w:sz w:val="18"/>
           <w:szCs w:val="18"/>
         </w:rPr>
@@ -4282,7 +4282,7 @@
       </w:pPr>
       <w:r>
         <w:rPr>
-          <w:rFonts w:cs="Calibri" w:ascii="Calibri" w:hAnsi="Calibri" w:asciiTheme="minorHAnsi" w:cstheme="minorHAnsi" w:hAnsiTheme="minorHAnsi"/>
+          <w:rFonts w:cs="Calibri" w:ascii="Calibri" w:hAnsi="Calibri" w:asciiTheme="minorHAnsi" w:cstheme="minorHAnsi" w:hAnsiTheme="minorHAnsi" w:eastAsia="Calibri"/>
           <w:sz w:val="18"/>
           <w:szCs w:val="18"/>
         </w:rPr>
@@ -4290,7 +4290,7 @@
       </w:r>
       <w:r>
         <w:rPr>
-          <w:rFonts w:cs="Calibri" w:ascii="Calibri" w:hAnsi="Calibri" w:asciiTheme="minorHAnsi" w:cstheme="minorHAnsi" w:hAnsiTheme="minorHAnsi"/>
+          <w:rFonts w:cs="Calibri" w:ascii="Calibri" w:hAnsi="Calibri" w:asciiTheme="minorHAnsi" w:cstheme="minorHAnsi" w:hAnsiTheme="minorHAnsi" w:eastAsia="Calibri"/>
           <w:b/>
           <w:bCs/>
           <w:sz w:val="18"/>
@@ -4300,7 +4300,7 @@
       </w:r>
       <w:r>
         <w:rPr>
-          <w:rFonts w:cs="Calibri" w:ascii="Calibri" w:hAnsi="Calibri" w:asciiTheme="minorHAnsi" w:cstheme="minorHAnsi" w:hAnsiTheme="minorHAnsi"/>
+          <w:rFonts w:cs="Calibri" w:ascii="Calibri" w:hAnsi="Calibri" w:asciiTheme="minorHAnsi" w:cstheme="minorHAnsi" w:hAnsiTheme="minorHAnsi" w:eastAsia="Calibri"/>
           <w:sz w:val="18"/>
           <w:szCs w:val="18"/>
         </w:rPr>
@@ -4320,7 +4320,7 @@
       </w:pPr>
       <w:r>
         <w:rPr>
-          <w:rFonts w:cs="Calibri" w:ascii="Calibri" w:hAnsi="Calibri" w:asciiTheme="minorHAnsi" w:cstheme="minorHAnsi" w:hAnsiTheme="minorHAnsi"/>
+          <w:rFonts w:cs="Calibri" w:ascii="Calibri" w:hAnsi="Calibri" w:asciiTheme="minorHAnsi" w:cstheme="minorHAnsi" w:hAnsiTheme="minorHAnsi" w:eastAsia="Calibri"/>
           <w:b/>
           <w:bCs/>
           <w:sz w:val="18"/>
@@ -4330,7 +4330,7 @@
       </w:r>
       <w:r>
         <w:rPr>
-          <w:rFonts w:cs="Calibri" w:ascii="Calibri" w:hAnsi="Calibri" w:asciiTheme="minorHAnsi" w:cstheme="minorHAnsi" w:hAnsiTheme="minorHAnsi"/>
+          <w:rFonts w:cs="Calibri" w:ascii="Calibri" w:hAnsi="Calibri" w:asciiTheme="minorHAnsi" w:cstheme="minorHAnsi" w:hAnsiTheme="minorHAnsi" w:eastAsia="Calibri"/>
           <w:sz w:val="18"/>
           <w:szCs w:val="18"/>
         </w:rPr>
@@ -4338,7 +4338,7 @@
       </w:r>
       <w:r>
         <w:rPr>
-          <w:rFonts w:cs="Calibri" w:ascii="Calibri" w:hAnsi="Calibri" w:asciiTheme="minorHAnsi" w:cstheme="minorHAnsi" w:hAnsiTheme="minorHAnsi"/>
+          <w:rFonts w:cs="Calibri" w:ascii="Calibri" w:hAnsi="Calibri" w:asciiTheme="minorHAnsi" w:cstheme="minorHAnsi" w:hAnsiTheme="minorHAnsi" w:eastAsia="Calibri"/>
           <w:b/>
           <w:bCs/>
           <w:sz w:val="18"/>
@@ -4348,7 +4348,7 @@
       </w:r>
       <w:r>
         <w:rPr>
-          <w:rFonts w:cs="Calibri" w:ascii="Calibri" w:hAnsi="Calibri" w:asciiTheme="minorHAnsi" w:cstheme="minorHAnsi" w:hAnsiTheme="minorHAnsi"/>
+          <w:rFonts w:cs="Calibri" w:ascii="Calibri" w:hAnsi="Calibri" w:asciiTheme="minorHAnsi" w:cstheme="minorHAnsi" w:hAnsiTheme="minorHAnsi" w:eastAsia="Calibri"/>
           <w:sz w:val="18"/>
           <w:szCs w:val="18"/>
         </w:rPr>
@@ -4356,7 +4356,7 @@
       </w:r>
       <w:r>
         <w:rPr>
-          <w:rFonts w:cs="Calibri" w:ascii="Calibri" w:hAnsi="Calibri" w:asciiTheme="minorHAnsi" w:cstheme="minorHAnsi" w:hAnsiTheme="minorHAnsi"/>
+          <w:rFonts w:cs="Calibri" w:ascii="Calibri" w:hAnsi="Calibri" w:asciiTheme="minorHAnsi" w:cstheme="minorHAnsi" w:hAnsiTheme="minorHAnsi" w:eastAsia="Calibri"/>
           <w:i/>
           <w:iCs/>
           <w:sz w:val="18"/>
@@ -4366,7 +4366,7 @@
       </w:r>
       <w:r>
         <w:rPr>
-          <w:rFonts w:cs="Calibri" w:ascii="Calibri" w:hAnsi="Calibri" w:asciiTheme="minorHAnsi" w:cstheme="minorHAnsi" w:hAnsiTheme="minorHAnsi"/>
+          <w:rFonts w:cs="Calibri" w:ascii="Calibri" w:hAnsi="Calibri" w:asciiTheme="minorHAnsi" w:cstheme="minorHAnsi" w:hAnsiTheme="minorHAnsi" w:eastAsia="Calibri"/>
           <w:sz w:val="18"/>
           <w:szCs w:val="18"/>
         </w:rPr>
@@ -4386,7 +4386,7 @@
       </w:pPr>
       <w:r>
         <w:rPr>
-          <w:rFonts w:cs="Calibri" w:ascii="Calibri" w:hAnsi="Calibri" w:asciiTheme="minorHAnsi" w:cstheme="minorHAnsi" w:hAnsiTheme="minorHAnsi"/>
+          <w:rFonts w:cs="Calibri" w:ascii="Calibri" w:hAnsi="Calibri" w:asciiTheme="minorHAnsi" w:cstheme="minorHAnsi" w:hAnsiTheme="minorHAnsi" w:eastAsia="Calibri"/>
           <w:sz w:val="18"/>
           <w:szCs w:val="18"/>
         </w:rPr>
@@ -4394,7 +4394,7 @@
       </w:r>
       <w:r>
         <w:rPr>
-          <w:rFonts w:cs="Calibri" w:ascii="Calibri" w:hAnsi="Calibri" w:asciiTheme="minorHAnsi" w:cstheme="minorHAnsi" w:hAnsiTheme="minorHAnsi"/>
+          <w:rFonts w:cs="Calibri" w:ascii="Calibri" w:hAnsi="Calibri" w:asciiTheme="minorHAnsi" w:cstheme="minorHAnsi" w:hAnsiTheme="minorHAnsi" w:eastAsia="Calibri"/>
           <w:b/>
           <w:bCs/>
           <w:sz w:val="18"/>
@@ -4404,7 +4404,7 @@
       </w:r>
       <w:r>
         <w:rPr>
-          <w:rFonts w:cs="Calibri" w:ascii="Calibri" w:hAnsi="Calibri" w:asciiTheme="minorHAnsi" w:cstheme="minorHAnsi" w:hAnsiTheme="minorHAnsi"/>
+          <w:rFonts w:cs="Calibri" w:ascii="Calibri" w:hAnsi="Calibri" w:asciiTheme="minorHAnsi" w:cstheme="minorHAnsi" w:hAnsiTheme="minorHAnsi" w:eastAsia="Calibri"/>
           <w:sz w:val="18"/>
           <w:szCs w:val="18"/>
         </w:rPr>
@@ -4412,7 +4412,7 @@
       </w:r>
       <w:r>
         <w:rPr>
-          <w:rFonts w:cs="Calibri" w:ascii="Calibri" w:hAnsi="Calibri" w:asciiTheme="minorHAnsi" w:cstheme="minorHAnsi" w:hAnsiTheme="minorHAnsi"/>
+          <w:rFonts w:cs="Calibri" w:ascii="Calibri" w:hAnsi="Calibri" w:asciiTheme="minorHAnsi" w:cstheme="minorHAnsi" w:hAnsiTheme="minorHAnsi" w:eastAsia="Calibri"/>
           <w:i/>
           <w:iCs/>
           <w:sz w:val="18"/>
@@ -4422,7 +4422,7 @@
       </w:r>
       <w:r>
         <w:rPr>
-          <w:rFonts w:cs="Calibri" w:ascii="Calibri" w:hAnsi="Calibri" w:asciiTheme="minorHAnsi" w:cstheme="minorHAnsi" w:hAnsiTheme="minorHAnsi"/>
+          <w:rFonts w:cs="Calibri" w:ascii="Calibri" w:hAnsi="Calibri" w:asciiTheme="minorHAnsi" w:cstheme="minorHAnsi" w:hAnsiTheme="minorHAnsi" w:eastAsia="Calibri"/>
           <w:sz w:val="18"/>
           <w:szCs w:val="18"/>
         </w:rPr>
@@ -4430,7 +4430,7 @@
       </w:r>
       <w:r>
         <w:rPr>
-          <w:rFonts w:cs="Calibri" w:ascii="Calibri" w:hAnsi="Calibri" w:asciiTheme="minorHAnsi" w:cstheme="minorHAnsi" w:hAnsiTheme="minorHAnsi"/>
+          <w:rFonts w:cs="Calibri" w:ascii="Calibri" w:hAnsi="Calibri" w:asciiTheme="minorHAnsi" w:cstheme="minorHAnsi" w:hAnsiTheme="minorHAnsi" w:eastAsia="Calibri"/>
           <w:b/>
           <w:bCs/>
           <w:sz w:val="18"/>
@@ -4440,7 +4440,7 @@
       </w:r>
       <w:r>
         <w:rPr>
-          <w:rFonts w:cs="Calibri" w:ascii="Calibri" w:hAnsi="Calibri" w:asciiTheme="minorHAnsi" w:cstheme="minorHAnsi" w:hAnsiTheme="minorHAnsi"/>
+          <w:rFonts w:cs="Calibri" w:ascii="Calibri" w:hAnsi="Calibri" w:asciiTheme="minorHAnsi" w:cstheme="minorHAnsi" w:hAnsiTheme="minorHAnsi" w:eastAsia="Calibri"/>
           <w:sz w:val="18"/>
           <w:szCs w:val="18"/>
         </w:rPr>
@@ -4460,7 +4460,7 @@
       </w:pPr>
       <w:r>
         <w:rPr>
-          <w:rFonts w:cs="Calibri" w:ascii="Calibri" w:hAnsi="Calibri" w:asciiTheme="minorHAnsi" w:cstheme="minorHAnsi" w:hAnsiTheme="minorHAnsi"/>
+          <w:rFonts w:cs="Calibri" w:ascii="Calibri" w:hAnsi="Calibri" w:asciiTheme="minorHAnsi" w:cstheme="minorHAnsi" w:hAnsiTheme="minorHAnsi" w:eastAsia="Calibri"/>
           <w:sz w:val="18"/>
           <w:szCs w:val="18"/>
         </w:rPr>
@@ -4468,7 +4468,7 @@
       </w:r>
       <w:r>
         <w:rPr>
-          <w:rFonts w:cs="Calibri" w:ascii="Calibri" w:hAnsi="Calibri" w:asciiTheme="minorHAnsi" w:cstheme="minorHAnsi" w:hAnsiTheme="minorHAnsi"/>
+          <w:rFonts w:cs="Calibri" w:ascii="Calibri" w:hAnsi="Calibri" w:asciiTheme="minorHAnsi" w:cstheme="minorHAnsi" w:hAnsiTheme="minorHAnsi" w:eastAsia="Calibri"/>
           <w:b/>
           <w:bCs/>
           <w:sz w:val="18"/>
@@ -4478,7 +4478,7 @@
       </w:r>
       <w:r>
         <w:rPr>
-          <w:rFonts w:cs="Calibri" w:ascii="Calibri" w:hAnsi="Calibri" w:asciiTheme="minorHAnsi" w:cstheme="minorHAnsi" w:hAnsiTheme="minorHAnsi"/>
+          <w:rFonts w:cs="Calibri" w:ascii="Calibri" w:hAnsi="Calibri" w:asciiTheme="minorHAnsi" w:cstheme="minorHAnsi" w:hAnsiTheme="minorHAnsi" w:eastAsia="Calibri"/>
           <w:sz w:val="18"/>
           <w:szCs w:val="18"/>
         </w:rPr>
@@ -4486,7 +4486,7 @@
       </w:r>
       <w:r>
         <w:rPr>
-          <w:rFonts w:cs="Calibri" w:ascii="Calibri" w:hAnsi="Calibri" w:asciiTheme="minorHAnsi" w:cstheme="minorHAnsi" w:hAnsiTheme="minorHAnsi"/>
+          <w:rFonts w:cs="Calibri" w:ascii="Calibri" w:hAnsi="Calibri" w:asciiTheme="minorHAnsi" w:cstheme="minorHAnsi" w:hAnsiTheme="minorHAnsi" w:eastAsia="Calibri"/>
           <w:i/>
           <w:iCs/>
           <w:sz w:val="18"/>
@@ -4496,7 +4496,7 @@
       </w:r>
       <w:r>
         <w:rPr>
-          <w:rFonts w:cs="Calibri" w:ascii="Calibri" w:hAnsi="Calibri" w:asciiTheme="minorHAnsi" w:cstheme="minorHAnsi" w:hAnsiTheme="minorHAnsi"/>
+          <w:rFonts w:cs="Calibri" w:ascii="Calibri" w:hAnsi="Calibri" w:asciiTheme="minorHAnsi" w:cstheme="minorHAnsi" w:hAnsiTheme="minorHAnsi" w:eastAsia="Calibri"/>
           <w:sz w:val="18"/>
           <w:szCs w:val="18"/>
         </w:rPr>
@@ -4516,7 +4516,7 @@
       </w:pPr>
       <w:r>
         <w:rPr>
-          <w:rFonts w:cs="Calibri" w:ascii="Calibri" w:hAnsi="Calibri" w:asciiTheme="minorHAnsi" w:cstheme="minorHAnsi" w:hAnsiTheme="minorHAnsi"/>
+          <w:rFonts w:cs="Calibri" w:ascii="Calibri" w:hAnsi="Calibri" w:asciiTheme="minorHAnsi" w:cstheme="minorHAnsi" w:hAnsiTheme="minorHAnsi" w:eastAsia="Calibri"/>
           <w:sz w:val="18"/>
           <w:szCs w:val="18"/>
         </w:rPr>
@@ -4524,7 +4524,7 @@
       </w:r>
       <w:r>
         <w:rPr>
-          <w:rFonts w:cs="Calibri" w:ascii="Calibri" w:hAnsi="Calibri" w:asciiTheme="minorHAnsi" w:cstheme="minorHAnsi" w:hAnsiTheme="minorHAnsi"/>
+          <w:rFonts w:cs="Calibri" w:ascii="Calibri" w:hAnsi="Calibri" w:asciiTheme="minorHAnsi" w:cstheme="minorHAnsi" w:hAnsiTheme="minorHAnsi" w:eastAsia="Calibri"/>
           <w:b/>
           <w:bCs/>
           <w:sz w:val="18"/>
@@ -4534,7 +4534,7 @@
       </w:r>
       <w:r>
         <w:rPr>
-          <w:rFonts w:cs="Calibri" w:ascii="Calibri" w:hAnsi="Calibri" w:asciiTheme="minorHAnsi" w:cstheme="minorHAnsi" w:hAnsiTheme="minorHAnsi"/>
+          <w:rFonts w:cs="Calibri" w:ascii="Calibri" w:hAnsi="Calibri" w:asciiTheme="minorHAnsi" w:cstheme="minorHAnsi" w:hAnsiTheme="minorHAnsi" w:eastAsia="Calibri"/>
           <w:sz w:val="18"/>
           <w:szCs w:val="18"/>
         </w:rPr>
@@ -4542,7 +4542,7 @@
       </w:r>
       <w:r>
         <w:rPr>
-          <w:rFonts w:cs="Calibri" w:ascii="Calibri" w:hAnsi="Calibri" w:asciiTheme="minorHAnsi" w:cstheme="minorHAnsi" w:hAnsiTheme="minorHAnsi"/>
+          <w:rFonts w:cs="Calibri" w:ascii="Calibri" w:hAnsi="Calibri" w:asciiTheme="minorHAnsi" w:cstheme="minorHAnsi" w:hAnsiTheme="minorHAnsi" w:eastAsia="Calibri"/>
           <w:b/>
           <w:bCs/>
           <w:sz w:val="18"/>
@@ -4552,7 +4552,7 @@
       </w:r>
       <w:r>
         <w:rPr>
-          <w:rFonts w:cs="Calibri" w:ascii="Calibri" w:hAnsi="Calibri" w:asciiTheme="minorHAnsi" w:cstheme="minorHAnsi" w:hAnsiTheme="minorHAnsi"/>
+          <w:rFonts w:cs="Calibri" w:ascii="Calibri" w:hAnsi="Calibri" w:asciiTheme="minorHAnsi" w:cstheme="minorHAnsi" w:hAnsiTheme="minorHAnsi" w:eastAsia="Calibri"/>
           <w:sz w:val="18"/>
           <w:szCs w:val="18"/>
         </w:rPr>
@@ -4560,7 +4560,7 @@
       </w:r>
       <w:r>
         <w:rPr>
-          <w:rFonts w:cs="Calibri" w:ascii="Calibri" w:hAnsi="Calibri" w:asciiTheme="minorHAnsi" w:cstheme="minorHAnsi" w:hAnsiTheme="minorHAnsi"/>
+          <w:rFonts w:cs="Calibri" w:ascii="Calibri" w:hAnsi="Calibri" w:asciiTheme="minorHAnsi" w:cstheme="minorHAnsi" w:hAnsiTheme="minorHAnsi" w:eastAsia="Calibri"/>
           <w:b/>
           <w:bCs/>
           <w:sz w:val="18"/>
@@ -4570,7 +4570,7 @@
       </w:r>
       <w:r>
         <w:rPr>
-          <w:rFonts w:cs="Calibri" w:ascii="Calibri" w:hAnsi="Calibri" w:asciiTheme="minorHAnsi" w:cstheme="minorHAnsi" w:hAnsiTheme="minorHAnsi"/>
+          <w:rFonts w:cs="Calibri" w:ascii="Calibri" w:hAnsi="Calibri" w:asciiTheme="minorHAnsi" w:cstheme="minorHAnsi" w:hAnsiTheme="minorHAnsi" w:eastAsia="Calibri"/>
           <w:sz w:val="18"/>
           <w:szCs w:val="18"/>
         </w:rPr>
@@ -4578,7 +4578,7 @@
       </w:r>
       <w:r>
         <w:rPr>
-          <w:rFonts w:cs="Calibri" w:ascii="Calibri" w:hAnsi="Calibri" w:asciiTheme="minorHAnsi" w:cstheme="minorHAnsi" w:hAnsiTheme="minorHAnsi"/>
+          <w:rFonts w:cs="Calibri" w:ascii="Calibri" w:hAnsi="Calibri" w:asciiTheme="minorHAnsi" w:cstheme="minorHAnsi" w:hAnsiTheme="minorHAnsi" w:eastAsia="Calibri"/>
           <w:bCs/>
           <w:sz w:val="18"/>
           <w:szCs w:val="18"/>
@@ -4587,7 +4587,7 @@
       </w:r>
       <w:r>
         <w:rPr>
-          <w:rFonts w:cs="Calibri" w:ascii="Calibri" w:hAnsi="Calibri" w:asciiTheme="minorHAnsi" w:cstheme="minorHAnsi" w:hAnsiTheme="minorHAnsi"/>
+          <w:rFonts w:cs="Calibri" w:ascii="Calibri" w:hAnsi="Calibri" w:asciiTheme="minorHAnsi" w:cstheme="minorHAnsi" w:hAnsiTheme="minorHAnsi" w:eastAsia="Calibri"/>
           <w:b/>
           <w:sz w:val="18"/>
           <w:szCs w:val="18"/>
@@ -4596,7 +4596,7 @@
       </w:r>
       <w:r>
         <w:rPr>
-          <w:rFonts w:cs="Calibri" w:ascii="Calibri" w:hAnsi="Calibri" w:asciiTheme="minorHAnsi" w:cstheme="minorHAnsi" w:hAnsiTheme="minorHAnsi"/>
+          <w:rFonts w:cs="Calibri" w:ascii="Calibri" w:hAnsi="Calibri" w:asciiTheme="minorHAnsi" w:cstheme="minorHAnsi" w:hAnsiTheme="minorHAnsi" w:eastAsia="Calibri"/>
           <w:sz w:val="18"/>
           <w:szCs w:val="18"/>
         </w:rPr>
@@ -4604,7 +4604,7 @@
       </w:r>
       <w:r>
         <w:rPr>
-          <w:rFonts w:cs="Calibri" w:ascii="Calibri" w:hAnsi="Calibri" w:asciiTheme="minorHAnsi" w:cstheme="minorHAnsi" w:hAnsiTheme="minorHAnsi"/>
+          <w:rFonts w:cs="Calibri" w:ascii="Calibri" w:hAnsi="Calibri" w:asciiTheme="minorHAnsi" w:cstheme="minorHAnsi" w:hAnsiTheme="minorHAnsi" w:eastAsia="Calibri"/>
           <w:b/>
           <w:bCs/>
           <w:sz w:val="18"/>
@@ -4614,7 +4614,7 @@
       </w:r>
       <w:r>
         <w:rPr>
-          <w:rFonts w:cs="Calibri" w:ascii="Calibri" w:hAnsi="Calibri" w:asciiTheme="minorHAnsi" w:cstheme="minorHAnsi" w:hAnsiTheme="minorHAnsi"/>
+          <w:rFonts w:cs="Calibri" w:ascii="Calibri" w:hAnsi="Calibri" w:asciiTheme="minorHAnsi" w:cstheme="minorHAnsi" w:hAnsiTheme="minorHAnsi" w:eastAsia="Calibri"/>
           <w:sz w:val="18"/>
           <w:szCs w:val="18"/>
         </w:rPr>
@@ -4622,7 +4622,7 @@
       </w:r>
       <w:r>
         <w:rPr>
-          <w:rFonts w:cs="Calibri" w:ascii="Calibri" w:hAnsi="Calibri" w:asciiTheme="minorHAnsi" w:cstheme="minorHAnsi" w:hAnsiTheme="minorHAnsi"/>
+          <w:rFonts w:cs="Calibri" w:ascii="Calibri" w:hAnsi="Calibri" w:asciiTheme="minorHAnsi" w:cstheme="minorHAnsi" w:hAnsiTheme="minorHAnsi" w:eastAsia="Calibri"/>
           <w:b/>
           <w:bCs/>
           <w:sz w:val="18"/>
@@ -4632,7 +4632,7 @@
       </w:r>
       <w:r>
         <w:rPr>
-          <w:rFonts w:cs="Calibri" w:ascii="Calibri" w:hAnsi="Calibri" w:asciiTheme="minorHAnsi" w:cstheme="minorHAnsi" w:hAnsiTheme="minorHAnsi"/>
+          <w:rFonts w:cs="Calibri" w:ascii="Calibri" w:hAnsi="Calibri" w:asciiTheme="minorHAnsi" w:cstheme="minorHAnsi" w:hAnsiTheme="minorHAnsi" w:eastAsia="Calibri"/>
           <w:sz w:val="18"/>
           <w:szCs w:val="18"/>
         </w:rPr>
@@ -4655,7 +4655,7 @@
       </w:pPr>
       <w:r>
         <w:rPr>
-          <w:rFonts w:cs="Calibri" w:ascii="Calibri" w:hAnsi="Calibri" w:asciiTheme="minorHAnsi" w:cstheme="minorHAnsi" w:hAnsiTheme="minorHAnsi"/>
+          <w:rFonts w:cs="Calibri" w:ascii="Calibri" w:hAnsi="Calibri" w:asciiTheme="minorHAnsi" w:cstheme="minorHAnsi" w:hAnsiTheme="minorHAnsi" w:eastAsia="Calibri"/>
           <w:b/>
           <w:sz w:val="18"/>
           <w:szCs w:val="18"/>
@@ -4664,7 +4664,7 @@
       </w:r>
       <w:r>
         <w:rPr>
-          <w:rFonts w:cs="Calibri" w:ascii="Calibri" w:hAnsi="Calibri" w:asciiTheme="minorHAnsi" w:cstheme="minorHAnsi" w:hAnsiTheme="minorHAnsi"/>
+          <w:rFonts w:cs="Calibri" w:ascii="Calibri" w:hAnsi="Calibri" w:asciiTheme="minorHAnsi" w:cstheme="minorHAnsi" w:hAnsiTheme="minorHAnsi" w:eastAsia="Calibri"/>
           <w:bCs/>
           <w:color w:val="FF0000"/>
           <w:sz w:val="18"/>
@@ -4674,7 +4674,7 @@
       </w:r>
       <w:r>
         <w:rPr>
-          <w:rFonts w:cs="Calibri" w:ascii="Calibri" w:hAnsi="Calibri" w:asciiTheme="minorHAnsi" w:cstheme="minorHAnsi" w:hAnsiTheme="minorHAnsi"/>
+          <w:rFonts w:cs="Calibri" w:ascii="Calibri" w:hAnsi="Calibri" w:asciiTheme="minorHAnsi" w:cstheme="minorHAnsi" w:hAnsiTheme="minorHAnsi" w:eastAsia="Calibri"/>
           <w:bCs/>
           <w:sz w:val="18"/>
           <w:szCs w:val="18"/>
@@ -4683,7 +4683,7 @@
       </w:r>
       <w:r>
         <w:rPr>
-          <w:rFonts w:cs="Calibri" w:ascii="Calibri" w:hAnsi="Calibri" w:asciiTheme="minorHAnsi" w:cstheme="minorHAnsi" w:hAnsiTheme="minorHAnsi"/>
+          <w:rFonts w:cs="Calibri" w:ascii="Calibri" w:hAnsi="Calibri" w:asciiTheme="minorHAnsi" w:cstheme="minorHAnsi" w:hAnsiTheme="minorHAnsi" w:eastAsia="Calibri"/>
           <w:b/>
           <w:sz w:val="18"/>
           <w:szCs w:val="18"/>
@@ -4692,7 +4692,7 @@
       </w:r>
       <w:r>
         <w:rPr>
-          <w:rFonts w:cs="Calibri" w:ascii="Calibri" w:hAnsi="Calibri" w:asciiTheme="minorHAnsi" w:cstheme="minorHAnsi" w:hAnsiTheme="minorHAnsi"/>
+          <w:rFonts w:cs="Calibri" w:ascii="Calibri" w:hAnsi="Calibri" w:asciiTheme="minorHAnsi" w:cstheme="minorHAnsi" w:hAnsiTheme="minorHAnsi" w:eastAsia="Calibri"/>
           <w:bCs/>
           <w:sz w:val="18"/>
           <w:szCs w:val="18"/>
@@ -4701,7 +4701,7 @@
       </w:r>
       <w:r>
         <w:rPr>
-          <w:rFonts w:cs="Calibri" w:ascii="Calibri" w:hAnsi="Calibri" w:asciiTheme="minorHAnsi" w:cstheme="minorHAnsi" w:hAnsiTheme="minorHAnsi"/>
+          <w:rFonts w:cs="Calibri" w:ascii="Calibri" w:hAnsi="Calibri" w:asciiTheme="minorHAnsi" w:cstheme="minorHAnsi" w:hAnsiTheme="minorHAnsi" w:eastAsia="Calibri"/>
           <w:b/>
           <w:sz w:val="18"/>
           <w:szCs w:val="18"/>
@@ -4710,7 +4710,7 @@
       </w:r>
       <w:r>
         <w:rPr>
-          <w:rFonts w:cs="Calibri" w:ascii="Calibri" w:hAnsi="Calibri" w:asciiTheme="minorHAnsi" w:cstheme="minorHAnsi" w:hAnsiTheme="minorHAnsi"/>
+          <w:rFonts w:cs="Calibri" w:ascii="Calibri" w:hAnsi="Calibri" w:asciiTheme="minorHAnsi" w:cstheme="minorHAnsi" w:hAnsiTheme="minorHAnsi" w:eastAsia="Calibri"/>
           <w:bCs/>
           <w:sz w:val="18"/>
           <w:szCs w:val="18"/>
@@ -4733,7 +4733,7 @@
       </w:pPr>
       <w:r>
         <w:rPr>
-          <w:rFonts w:cs="Calibri" w:ascii="Calibri" w:hAnsi="Calibri" w:asciiTheme="minorHAnsi" w:cstheme="minorHAnsi" w:hAnsiTheme="minorHAnsi"/>
+          <w:rFonts w:cs="Calibri" w:ascii="Calibri" w:hAnsi="Calibri" w:asciiTheme="minorHAnsi" w:cstheme="minorHAnsi" w:hAnsiTheme="minorHAnsi" w:eastAsia="Calibri"/>
           <w:b/>
           <w:sz w:val="18"/>
           <w:szCs w:val="18"/>
@@ -4742,7 +4742,7 @@
       </w:r>
       <w:r>
         <w:rPr>
-          <w:rFonts w:cs="Calibri" w:ascii="Calibri" w:hAnsi="Calibri" w:asciiTheme="minorHAnsi" w:cstheme="minorHAnsi" w:hAnsiTheme="minorHAnsi"/>
+          <w:rFonts w:cs="Calibri" w:ascii="Calibri" w:hAnsi="Calibri" w:asciiTheme="minorHAnsi" w:cstheme="minorHAnsi" w:hAnsiTheme="minorHAnsi" w:eastAsia="Calibri"/>
           <w:bCs/>
           <w:sz w:val="18"/>
           <w:szCs w:val="18"/>
@@ -4751,7 +4751,7 @@
       </w:r>
       <w:r>
         <w:rPr>
-          <w:rFonts w:cs="Calibri" w:ascii="Calibri" w:hAnsi="Calibri" w:asciiTheme="minorHAnsi" w:cstheme="minorHAnsi" w:hAnsiTheme="minorHAnsi"/>
+          <w:rFonts w:cs="Calibri" w:ascii="Calibri" w:hAnsi="Calibri" w:asciiTheme="minorHAnsi" w:cstheme="minorHAnsi" w:hAnsiTheme="minorHAnsi" w:eastAsia="Calibri"/>
           <w:b/>
           <w:sz w:val="18"/>
           <w:szCs w:val="18"/>
@@ -4760,7 +4760,7 @@
       </w:r>
       <w:r>
         <w:rPr>
-          <w:rFonts w:cs="Calibri" w:ascii="Calibri" w:hAnsi="Calibri" w:asciiTheme="minorHAnsi" w:cstheme="minorHAnsi" w:hAnsiTheme="minorHAnsi"/>
+          <w:rFonts w:cs="Calibri" w:ascii="Calibri" w:hAnsi="Calibri" w:asciiTheme="minorHAnsi" w:cstheme="minorHAnsi" w:hAnsiTheme="minorHAnsi" w:eastAsia="Calibri"/>
           <w:bCs/>
           <w:sz w:val="18"/>
           <w:szCs w:val="18"/>
@@ -4769,7 +4769,7 @@
       </w:r>
       <w:r>
         <w:rPr>
-          <w:rFonts w:cs="Calibri" w:ascii="Calibri" w:hAnsi="Calibri" w:asciiTheme="minorHAnsi" w:cstheme="minorHAnsi" w:hAnsiTheme="minorHAnsi"/>
+          <w:rFonts w:cs="Calibri" w:ascii="Calibri" w:hAnsi="Calibri" w:asciiTheme="minorHAnsi" w:cstheme="minorHAnsi" w:hAnsiTheme="minorHAnsi" w:eastAsia="Calibri"/>
           <w:b/>
           <w:sz w:val="18"/>
           <w:szCs w:val="18"/>
@@ -4778,7 +4778,7 @@
       </w:r>
       <w:r>
         <w:rPr>
-          <w:rFonts w:cs="Calibri" w:ascii="Calibri" w:hAnsi="Calibri" w:asciiTheme="minorHAnsi" w:cstheme="minorHAnsi" w:hAnsiTheme="minorHAnsi"/>
+          <w:rFonts w:cs="Calibri" w:ascii="Calibri" w:hAnsi="Calibri" w:asciiTheme="minorHAnsi" w:cstheme="minorHAnsi" w:hAnsiTheme="minorHAnsi" w:eastAsia="Calibri"/>
           <w:bCs/>
           <w:sz w:val="18"/>
           <w:szCs w:val="18"/>
@@ -4801,7 +4801,7 @@
       </w:pPr>
       <w:r>
         <w:rPr>
-          <w:rFonts w:cs="Calibri" w:ascii="Calibri" w:hAnsi="Calibri" w:asciiTheme="minorHAnsi" w:cstheme="minorHAnsi" w:hAnsiTheme="minorHAnsi"/>
+          <w:rFonts w:cs="Calibri" w:ascii="Calibri" w:hAnsi="Calibri" w:asciiTheme="minorHAnsi" w:cstheme="minorHAnsi" w:hAnsiTheme="minorHAnsi" w:eastAsia="Calibri"/>
           <w:bCs/>
           <w:sz w:val="18"/>
           <w:szCs w:val="18"/>
@@ -4810,7 +4810,7 @@
       </w:r>
       <w:r>
         <w:rPr>
-          <w:rFonts w:cs="Calibri" w:ascii="Calibri" w:hAnsi="Calibri" w:asciiTheme="minorHAnsi" w:cstheme="minorHAnsi" w:hAnsiTheme="minorHAnsi"/>
+          <w:rFonts w:cs="Calibri" w:ascii="Calibri" w:hAnsi="Calibri" w:asciiTheme="minorHAnsi" w:cstheme="minorHAnsi" w:hAnsiTheme="minorHAnsi" w:eastAsia="Calibri"/>
           <w:b/>
           <w:sz w:val="18"/>
           <w:szCs w:val="18"/>
@@ -4819,7 +4819,7 @@
       </w:r>
       <w:r>
         <w:rPr>
-          <w:rFonts w:cs="Calibri" w:ascii="Calibri" w:hAnsi="Calibri" w:asciiTheme="minorHAnsi" w:cstheme="minorHAnsi" w:hAnsiTheme="minorHAnsi"/>
+          <w:rFonts w:cs="Calibri" w:ascii="Calibri" w:hAnsi="Calibri" w:asciiTheme="minorHAnsi" w:cstheme="minorHAnsi" w:hAnsiTheme="minorHAnsi" w:eastAsia="Calibri"/>
           <w:bCs/>
           <w:sz w:val="18"/>
           <w:szCs w:val="18"/>
@@ -4842,7 +4842,7 @@
       </w:pPr>
       <w:r>
         <w:rPr>
-          <w:rFonts w:cs="Calibri" w:ascii="Calibri" w:hAnsi="Calibri" w:asciiTheme="minorHAnsi" w:cstheme="minorHAnsi" w:hAnsiTheme="minorHAnsi"/>
+          <w:rFonts w:cs="Calibri" w:ascii="Calibri" w:hAnsi="Calibri" w:asciiTheme="minorHAnsi" w:cstheme="minorHAnsi" w:hAnsiTheme="minorHAnsi" w:eastAsia="Calibri"/>
           <w:b/>
           <w:sz w:val="18"/>
           <w:szCs w:val="18"/>
@@ -4851,7 +4851,7 @@
       </w:r>
       <w:r>
         <w:rPr>
-          <w:rFonts w:cs="Calibri" w:ascii="Calibri" w:hAnsi="Calibri" w:asciiTheme="minorHAnsi" w:cstheme="minorHAnsi" w:hAnsiTheme="minorHAnsi"/>
+          <w:rFonts w:cs="Calibri" w:ascii="Calibri" w:hAnsi="Calibri" w:asciiTheme="minorHAnsi" w:cstheme="minorHAnsi" w:hAnsiTheme="minorHAnsi" w:eastAsia="Calibri"/>
           <w:bCs/>
           <w:sz w:val="18"/>
           <w:szCs w:val="18"/>
@@ -4860,7 +4860,7 @@
       </w:r>
       <w:r>
         <w:rPr>
-          <w:rFonts w:cs="Calibri" w:ascii="Calibri" w:hAnsi="Calibri" w:asciiTheme="minorHAnsi" w:cstheme="minorHAnsi" w:hAnsiTheme="minorHAnsi"/>
+          <w:rFonts w:cs="Calibri" w:ascii="Calibri" w:hAnsi="Calibri" w:asciiTheme="minorHAnsi" w:cstheme="minorHAnsi" w:hAnsiTheme="minorHAnsi" w:eastAsia="Calibri"/>
           <w:bCs/>
           <w:sz w:val="18"/>
           <w:szCs w:val="18"/>
@@ -4870,7 +4870,7 @@
       </w:r>
       <w:r>
         <w:rPr>
-          <w:rFonts w:cs="Calibri" w:ascii="Calibri" w:hAnsi="Calibri" w:asciiTheme="minorHAnsi" w:cstheme="minorHAnsi" w:hAnsiTheme="minorHAnsi"/>
+          <w:rFonts w:cs="Calibri" w:ascii="Calibri" w:hAnsi="Calibri" w:asciiTheme="minorHAnsi" w:cstheme="minorHAnsi" w:hAnsiTheme="minorHAnsi" w:eastAsia="Calibri"/>
           <w:bCs/>
           <w:sz w:val="18"/>
           <w:szCs w:val="18"/>
@@ -4879,7 +4879,7 @@
       </w:r>
       <w:r>
         <w:rPr>
-          <w:rFonts w:cs="Calibri" w:ascii="Calibri" w:hAnsi="Calibri" w:asciiTheme="minorHAnsi" w:cstheme="minorHAnsi" w:hAnsiTheme="minorHAnsi"/>
+          <w:rFonts w:cs="Calibri" w:ascii="Calibri" w:hAnsi="Calibri" w:asciiTheme="minorHAnsi" w:cstheme="minorHAnsi" w:hAnsiTheme="minorHAnsi" w:eastAsia="Calibri"/>
           <w:b/>
           <w:sz w:val="18"/>
           <w:szCs w:val="18"/>
@@ -4888,7 +4888,7 @@
       </w:r>
       <w:r>
         <w:rPr>
-          <w:rFonts w:cs="Calibri" w:ascii="Calibri" w:hAnsi="Calibri" w:asciiTheme="minorHAnsi" w:cstheme="minorHAnsi" w:hAnsiTheme="minorHAnsi"/>
+          <w:rFonts w:cs="Calibri" w:ascii="Calibri" w:hAnsi="Calibri" w:asciiTheme="minorHAnsi" w:cstheme="minorHAnsi" w:hAnsiTheme="minorHAnsi" w:eastAsia="Calibri"/>
           <w:bCs/>
           <w:sz w:val="18"/>
           <w:szCs w:val="18"/>
@@ -4897,7 +4897,7 @@
       </w:r>
       <w:r>
         <w:rPr>
-          <w:rFonts w:cs="Calibri" w:ascii="Calibri" w:hAnsi="Calibri" w:asciiTheme="minorHAnsi" w:cstheme="minorHAnsi" w:hAnsiTheme="minorHAnsi"/>
+          <w:rFonts w:cs="Calibri" w:ascii="Calibri" w:hAnsi="Calibri" w:asciiTheme="minorHAnsi" w:cstheme="minorHAnsi" w:hAnsiTheme="minorHAnsi" w:eastAsia="Calibri"/>
           <w:b/>
           <w:sz w:val="18"/>
           <w:szCs w:val="18"/>
@@ -4906,7 +4906,7 @@
       </w:r>
       <w:r>
         <w:rPr>
-          <w:rFonts w:cs="Calibri" w:ascii="Calibri" w:hAnsi="Calibri" w:asciiTheme="minorHAnsi" w:cstheme="minorHAnsi" w:hAnsiTheme="minorHAnsi"/>
+          <w:rFonts w:cs="Calibri" w:ascii="Calibri" w:hAnsi="Calibri" w:asciiTheme="minorHAnsi" w:cstheme="minorHAnsi" w:hAnsiTheme="minorHAnsi" w:eastAsia="Calibri"/>
           <w:bCs/>
           <w:color w:val="FF0000"/>
           <w:sz w:val="18"/>
@@ -4930,7 +4930,7 @@
       </w:pPr>
       <w:r>
         <w:rPr>
-          <w:rFonts w:cs="Calibri" w:ascii="Calibri" w:hAnsi="Calibri" w:asciiTheme="minorHAnsi" w:cstheme="minorHAnsi" w:hAnsiTheme="minorHAnsi"/>
+          <w:rFonts w:cs="Calibri" w:ascii="Calibri" w:hAnsi="Calibri" w:asciiTheme="minorHAnsi" w:cstheme="minorHAnsi" w:hAnsiTheme="minorHAnsi" w:eastAsia="Calibri"/>
           <w:b/>
           <w:sz w:val="18"/>
           <w:szCs w:val="18"/>
@@ -4939,7 +4939,7 @@
       </w:r>
       <w:r>
         <w:rPr>
-          <w:rFonts w:cs="Calibri" w:ascii="Calibri" w:hAnsi="Calibri" w:asciiTheme="minorHAnsi" w:cstheme="minorHAnsi" w:hAnsiTheme="minorHAnsi"/>
+          <w:rFonts w:cs="Calibri" w:ascii="Calibri" w:hAnsi="Calibri" w:asciiTheme="minorHAnsi" w:cstheme="minorHAnsi" w:hAnsiTheme="minorHAnsi" w:eastAsia="Calibri"/>
           <w:bCs/>
           <w:sz w:val="18"/>
           <w:szCs w:val="18"/>
@@ -4948,7 +4948,7 @@
       </w:r>
       <w:r>
         <w:rPr>
-          <w:rFonts w:cs="Calibri" w:ascii="Calibri" w:hAnsi="Calibri" w:asciiTheme="minorHAnsi" w:cstheme="minorHAnsi" w:hAnsiTheme="minorHAnsi"/>
+          <w:rFonts w:cs="Calibri" w:ascii="Calibri" w:hAnsi="Calibri" w:asciiTheme="minorHAnsi" w:cstheme="minorHAnsi" w:hAnsiTheme="minorHAnsi" w:eastAsia="Calibri"/>
           <w:b/>
           <w:sz w:val="18"/>
           <w:szCs w:val="18"/>
@@ -4957,7 +4957,7 @@
       </w:r>
       <w:r>
         <w:rPr>
-          <w:rFonts w:cs="Calibri" w:ascii="Calibri" w:hAnsi="Calibri" w:asciiTheme="minorHAnsi" w:cstheme="minorHAnsi" w:hAnsiTheme="minorHAnsi"/>
+          <w:rFonts w:cs="Calibri" w:ascii="Calibri" w:hAnsi="Calibri" w:asciiTheme="minorHAnsi" w:cstheme="minorHAnsi" w:hAnsiTheme="minorHAnsi" w:eastAsia="Calibri"/>
           <w:bCs/>
           <w:sz w:val="18"/>
           <w:szCs w:val="18"/>
@@ -4966,7 +4966,7 @@
       </w:r>
       <w:r>
         <w:rPr>
-          <w:rFonts w:cs="Calibri" w:ascii="Calibri" w:hAnsi="Calibri" w:asciiTheme="minorHAnsi" w:cstheme="minorHAnsi" w:hAnsiTheme="minorHAnsi"/>
+          <w:rFonts w:cs="Calibri" w:ascii="Calibri" w:hAnsi="Calibri" w:asciiTheme="minorHAnsi" w:cstheme="minorHAnsi" w:hAnsiTheme="minorHAnsi" w:eastAsia="Calibri"/>
           <w:b/>
           <w:sz w:val="18"/>
           <w:szCs w:val="18"/>
@@ -4975,7 +4975,7 @@
       </w:r>
       <w:r>
         <w:rPr>
-          <w:rFonts w:cs="Calibri" w:ascii="Calibri" w:hAnsi="Calibri" w:asciiTheme="minorHAnsi" w:cstheme="minorHAnsi" w:hAnsiTheme="minorHAnsi"/>
+          <w:rFonts w:cs="Calibri" w:ascii="Calibri" w:hAnsi="Calibri" w:asciiTheme="minorHAnsi" w:cstheme="minorHAnsi" w:hAnsiTheme="minorHAnsi" w:eastAsia="Calibri"/>
           <w:bCs/>
           <w:sz w:val="18"/>
           <w:szCs w:val="18"/>
@@ -4997,7 +4997,7 @@
       </w:pPr>
       <w:r>
         <w:rPr>
-          <w:rFonts w:cs="Calibri" w:ascii="Calibri" w:hAnsi="Calibri" w:asciiTheme="minorHAnsi" w:cstheme="minorHAnsi" w:hAnsiTheme="minorHAnsi"/>
+          <w:rFonts w:cs="Calibri" w:ascii="Calibri" w:hAnsi="Calibri" w:asciiTheme="minorHAnsi" w:cstheme="minorHAnsi" w:hAnsiTheme="minorHAnsi" w:eastAsia="Calibri"/>
           <w:b/>
           <w:sz w:val="18"/>
           <w:szCs w:val="18"/>
@@ -5006,7 +5006,7 @@
       </w:r>
       <w:r>
         <w:rPr>
-          <w:rFonts w:cs="Calibri" w:ascii="Calibri" w:hAnsi="Calibri" w:asciiTheme="minorHAnsi" w:cstheme="minorHAnsi" w:hAnsiTheme="minorHAnsi"/>
+          <w:rFonts w:cs="Calibri" w:ascii="Calibri" w:hAnsi="Calibri" w:asciiTheme="minorHAnsi" w:cstheme="minorHAnsi" w:hAnsiTheme="minorHAnsi" w:eastAsia="Calibri"/>
           <w:bCs/>
           <w:sz w:val="18"/>
           <w:szCs w:val="18"/>
@@ -5015,7 +5015,7 @@
       </w:r>
       <w:r>
         <w:rPr>
-          <w:rFonts w:cs="Calibri" w:ascii="Calibri" w:hAnsi="Calibri" w:asciiTheme="minorHAnsi" w:cstheme="minorHAnsi" w:hAnsiTheme="minorHAnsi"/>
+          <w:rFonts w:cs="Calibri" w:ascii="Calibri" w:hAnsi="Calibri" w:asciiTheme="minorHAnsi" w:cstheme="minorHAnsi" w:hAnsiTheme="minorHAnsi" w:eastAsia="Calibri"/>
           <w:b/>
           <w:sz w:val="18"/>
           <w:szCs w:val="18"/>
@@ -5024,7 +5024,7 @@
       </w:r>
       <w:r>
         <w:rPr>
-          <w:rFonts w:cs="Calibri" w:ascii="Calibri" w:hAnsi="Calibri" w:asciiTheme="minorHAnsi" w:cstheme="minorHAnsi" w:hAnsiTheme="minorHAnsi"/>
+          <w:rFonts w:cs="Calibri" w:ascii="Calibri" w:hAnsi="Calibri" w:asciiTheme="minorHAnsi" w:cstheme="minorHAnsi" w:hAnsiTheme="minorHAnsi" w:eastAsia="Calibri"/>
           <w:bCs/>
           <w:sz w:val="18"/>
           <w:szCs w:val="18"/>
@@ -5033,7 +5033,7 @@
       </w:r>
       <w:r>
         <w:rPr>
-          <w:rFonts w:cs="Calibri" w:ascii="Calibri" w:hAnsi="Calibri" w:asciiTheme="minorHAnsi" w:cstheme="minorHAnsi" w:hAnsiTheme="minorHAnsi"/>
+          <w:rFonts w:cs="Calibri" w:ascii="Calibri" w:hAnsi="Calibri" w:asciiTheme="minorHAnsi" w:cstheme="minorHAnsi" w:hAnsiTheme="minorHAnsi" w:eastAsia="Calibri"/>
           <w:sz w:val="18"/>
           <w:szCs w:val="18"/>
         </w:rPr>
@@ -5041,7 +5041,7 @@
       </w:r>
       <w:r>
         <w:rPr>
-          <w:rFonts w:cs="Calibri" w:ascii="Calibri" w:hAnsi="Calibri" w:asciiTheme="minorHAnsi" w:cstheme="minorHAnsi" w:hAnsiTheme="minorHAnsi"/>
+          <w:rFonts w:cs="Calibri" w:ascii="Calibri" w:hAnsi="Calibri" w:asciiTheme="minorHAnsi" w:cstheme="minorHAnsi" w:hAnsiTheme="minorHAnsi" w:eastAsia="Calibri"/>
           <w:b/>
           <w:bCs/>
           <w:sz w:val="18"/>
@@ -5051,7 +5051,7 @@
       </w:r>
       <w:r>
         <w:rPr>
-          <w:rFonts w:cs="Calibri" w:ascii="Calibri" w:hAnsi="Calibri" w:asciiTheme="minorHAnsi" w:cstheme="minorHAnsi" w:hAnsiTheme="minorHAnsi"/>
+          <w:rFonts w:cs="Calibri" w:ascii="Calibri" w:hAnsi="Calibri" w:asciiTheme="minorHAnsi" w:cstheme="minorHAnsi" w:hAnsiTheme="minorHAnsi" w:eastAsia="Calibri"/>
           <w:sz w:val="18"/>
           <w:szCs w:val="18"/>
         </w:rPr>
@@ -5059,7 +5059,7 @@
       </w:r>
       <w:r>
         <w:rPr>
-          <w:rFonts w:cs="Calibri" w:ascii="Calibri" w:hAnsi="Calibri" w:asciiTheme="minorHAnsi" w:cstheme="minorHAnsi" w:hAnsiTheme="minorHAnsi"/>
+          <w:rFonts w:cs="Calibri" w:ascii="Calibri" w:hAnsi="Calibri" w:asciiTheme="minorHAnsi" w:cstheme="minorHAnsi" w:hAnsiTheme="minorHAnsi" w:eastAsia="Calibri"/>
           <w:b/>
           <w:bCs/>
           <w:sz w:val="18"/>
@@ -5069,7 +5069,7 @@
       </w:r>
       <w:r>
         <w:rPr>
-          <w:rFonts w:cs="Calibri" w:ascii="Calibri" w:hAnsi="Calibri" w:asciiTheme="minorHAnsi" w:cstheme="minorHAnsi" w:hAnsiTheme="minorHAnsi"/>
+          <w:rFonts w:cs="Calibri" w:ascii="Calibri" w:hAnsi="Calibri" w:asciiTheme="minorHAnsi" w:cstheme="minorHAnsi" w:hAnsiTheme="minorHAnsi" w:eastAsia="Calibri"/>
           <w:sz w:val="18"/>
           <w:szCs w:val="18"/>
         </w:rPr>
@@ -5077,7 +5077,7 @@
       </w:r>
       <w:r>
         <w:rPr>
-          <w:rFonts w:cs="Calibri" w:ascii="Calibri" w:hAnsi="Calibri" w:asciiTheme="minorHAnsi" w:cstheme="minorHAnsi" w:hAnsiTheme="minorHAnsi"/>
+          <w:rFonts w:cs="Calibri" w:ascii="Calibri" w:hAnsi="Calibri" w:asciiTheme="minorHAnsi" w:cstheme="minorHAnsi" w:hAnsiTheme="minorHAnsi" w:eastAsia="Calibri"/>
           <w:b/>
           <w:bCs/>
           <w:sz w:val="18"/>
@@ -5087,7 +5087,7 @@
       </w:r>
       <w:r>
         <w:rPr>
-          <w:rFonts w:cs="Calibri" w:ascii="Calibri" w:hAnsi="Calibri" w:asciiTheme="minorHAnsi" w:cstheme="minorHAnsi" w:hAnsiTheme="minorHAnsi"/>
+          <w:rFonts w:cs="Calibri" w:ascii="Calibri" w:hAnsi="Calibri" w:asciiTheme="minorHAnsi" w:cstheme="minorHAnsi" w:hAnsiTheme="minorHAnsi" w:eastAsia="Calibri"/>
           <w:sz w:val="18"/>
           <w:szCs w:val="18"/>
         </w:rPr>
@@ -5095,7 +5095,7 @@
       </w:r>
       <w:r>
         <w:rPr>
-          <w:rFonts w:cs="Calibri" w:ascii="Calibri" w:hAnsi="Calibri" w:asciiTheme="minorHAnsi" w:cstheme="minorHAnsi" w:hAnsiTheme="minorHAnsi"/>
+          <w:rFonts w:cs="Calibri" w:ascii="Calibri" w:hAnsi="Calibri" w:asciiTheme="minorHAnsi" w:cstheme="minorHAnsi" w:hAnsiTheme="minorHAnsi" w:eastAsia="Calibri"/>
           <w:b/>
           <w:bCs/>
           <w:sz w:val="18"/>
@@ -5105,7 +5105,7 @@
       </w:r>
       <w:r>
         <w:rPr>
-          <w:rFonts w:cs="Calibri" w:ascii="Calibri" w:hAnsi="Calibri" w:asciiTheme="minorHAnsi" w:cstheme="minorHAnsi" w:hAnsiTheme="minorHAnsi"/>
+          <w:rFonts w:cs="Calibri" w:ascii="Calibri" w:hAnsi="Calibri" w:asciiTheme="minorHAnsi" w:cstheme="minorHAnsi" w:hAnsiTheme="minorHAnsi" w:eastAsia="Calibri"/>
           <w:sz w:val="18"/>
           <w:szCs w:val="18"/>
         </w:rPr>
@@ -5113,7 +5113,7 @@
       </w:r>
       <w:r>
         <w:rPr>
-          <w:rFonts w:cs="Calibri" w:ascii="Calibri" w:hAnsi="Calibri" w:asciiTheme="minorHAnsi" w:cstheme="minorHAnsi" w:hAnsiTheme="minorHAnsi"/>
+          <w:rFonts w:cs="Calibri" w:ascii="Calibri" w:hAnsi="Calibri" w:asciiTheme="minorHAnsi" w:cstheme="minorHAnsi" w:hAnsiTheme="minorHAnsi" w:eastAsia="Calibri"/>
           <w:b/>
           <w:bCs/>
           <w:sz w:val="18"/>
@@ -5123,7 +5123,7 @@
       </w:r>
       <w:r>
         <w:rPr>
-          <w:rFonts w:cs="Calibri" w:ascii="Calibri" w:hAnsi="Calibri" w:asciiTheme="minorHAnsi" w:cstheme="minorHAnsi" w:hAnsiTheme="minorHAnsi"/>
+          <w:rFonts w:cs="Calibri" w:ascii="Calibri" w:hAnsi="Calibri" w:asciiTheme="minorHAnsi" w:cstheme="minorHAnsi" w:hAnsiTheme="minorHAnsi" w:eastAsia="Calibri"/>
           <w:sz w:val="18"/>
           <w:szCs w:val="18"/>
         </w:rPr>
@@ -5146,7 +5146,7 @@
       </w:pPr>
       <w:r>
         <w:rPr>
-          <w:rFonts w:cs="Calibri" w:ascii="Calibri" w:hAnsi="Calibri" w:asciiTheme="minorHAnsi" w:cstheme="minorHAnsi" w:hAnsiTheme="minorHAnsi"/>
+          <w:rFonts w:cs="Calibri" w:ascii="Calibri" w:hAnsi="Calibri" w:asciiTheme="minorHAnsi" w:cstheme="minorHAnsi" w:hAnsiTheme="minorHAnsi" w:eastAsia="Calibri"/>
           <w:b/>
           <w:sz w:val="18"/>
           <w:szCs w:val="18"/>
@@ -5168,7 +5168,7 @@
       </w:pPr>
       <w:r>
         <w:rPr>
-          <w:rFonts w:cs="Calibri" w:ascii="Calibri" w:hAnsi="Calibri" w:asciiTheme="minorHAnsi" w:cstheme="minorHAnsi" w:hAnsiTheme="minorHAnsi"/>
+          <w:rFonts w:cs="Calibri" w:ascii="Calibri" w:hAnsi="Calibri" w:asciiTheme="minorHAnsi" w:cstheme="minorHAnsi" w:hAnsiTheme="minorHAnsi" w:eastAsia="Calibri"/>
           <w:b/>
           <w:bCs/>
           <w:sz w:val="18"/>
@@ -5178,7 +5178,7 @@
       </w:r>
       <w:r>
         <w:rPr>
-          <w:rFonts w:cs="Calibri" w:ascii="Calibri" w:hAnsi="Calibri" w:asciiTheme="minorHAnsi" w:cstheme="minorHAnsi" w:hAnsiTheme="minorHAnsi"/>
+          <w:rFonts w:cs="Calibri" w:ascii="Calibri" w:hAnsi="Calibri" w:asciiTheme="minorHAnsi" w:cstheme="minorHAnsi" w:hAnsiTheme="minorHAnsi" w:eastAsia="Calibri"/>
           <w:sz w:val="18"/>
           <w:szCs w:val="18"/>
         </w:rPr>
@@ -5186,7 +5186,7 @@
       </w:r>
       <w:r>
         <w:rPr>
-          <w:rFonts w:cs="Calibri" w:ascii="Calibri" w:hAnsi="Calibri" w:asciiTheme="minorHAnsi" w:cstheme="minorHAnsi" w:hAnsiTheme="minorHAnsi"/>
+          <w:rFonts w:cs="Calibri" w:ascii="Calibri" w:hAnsi="Calibri" w:asciiTheme="minorHAnsi" w:cstheme="minorHAnsi" w:hAnsiTheme="minorHAnsi" w:eastAsia="Calibri"/>
           <w:bCs/>
           <w:sz w:val="18"/>
           <w:szCs w:val="18"/>
@@ -5209,7 +5209,7 @@
       </w:pPr>
       <w:r>
         <w:rPr>
-          <w:rFonts w:cs="Calibri" w:ascii="Calibri" w:hAnsi="Calibri" w:asciiTheme="minorHAnsi" w:cstheme="minorHAnsi" w:hAnsiTheme="minorHAnsi"/>
+          <w:rFonts w:cs="Calibri" w:ascii="Calibri" w:hAnsi="Calibri" w:asciiTheme="minorHAnsi" w:cstheme="minorHAnsi" w:hAnsiTheme="minorHAnsi" w:eastAsia="Calibri"/>
           <w:b/>
           <w:sz w:val="18"/>
           <w:szCs w:val="18"/>
@@ -5218,7 +5218,7 @@
       </w:r>
       <w:r>
         <w:rPr>
-          <w:rFonts w:cs="Calibri" w:ascii="Calibri" w:hAnsi="Calibri" w:asciiTheme="minorHAnsi" w:cstheme="minorHAnsi" w:hAnsiTheme="minorHAnsi"/>
+          <w:rFonts w:cs="Calibri" w:ascii="Calibri" w:hAnsi="Calibri" w:asciiTheme="minorHAnsi" w:cstheme="minorHAnsi" w:hAnsiTheme="minorHAnsi" w:eastAsia="Calibri"/>
           <w:bCs/>
           <w:sz w:val="18"/>
           <w:szCs w:val="18"/>
@@ -5227,7 +5227,7 @@
       </w:r>
       <w:r>
         <w:rPr>
-          <w:rFonts w:cs="Calibri" w:ascii="Calibri" w:hAnsi="Calibri" w:asciiTheme="minorHAnsi" w:cstheme="minorHAnsi" w:hAnsiTheme="minorHAnsi"/>
+          <w:rFonts w:cs="Calibri" w:ascii="Calibri" w:hAnsi="Calibri" w:asciiTheme="minorHAnsi" w:cstheme="minorHAnsi" w:hAnsiTheme="minorHAnsi" w:eastAsia="Calibri"/>
           <w:b/>
           <w:sz w:val="18"/>
           <w:szCs w:val="18"/>
@@ -5236,7 +5236,7 @@
       </w:r>
       <w:r>
         <w:rPr>
-          <w:rFonts w:cs="Calibri" w:ascii="Calibri" w:hAnsi="Calibri" w:asciiTheme="minorHAnsi" w:cstheme="minorHAnsi" w:hAnsiTheme="minorHAnsi"/>
+          <w:rFonts w:cs="Calibri" w:ascii="Calibri" w:hAnsi="Calibri" w:asciiTheme="minorHAnsi" w:cstheme="minorHAnsi" w:hAnsiTheme="minorHAnsi" w:eastAsia="Calibri"/>
           <w:bCs/>
           <w:sz w:val="18"/>
           <w:szCs w:val="18"/>
@@ -5245,7 +5245,7 @@
       </w:r>
       <w:r>
         <w:rPr>
-          <w:rFonts w:cs="Calibri" w:ascii="Calibri" w:hAnsi="Calibri" w:asciiTheme="minorHAnsi" w:cstheme="minorHAnsi" w:hAnsiTheme="minorHAnsi"/>
+          <w:rFonts w:cs="Calibri" w:ascii="Calibri" w:hAnsi="Calibri" w:asciiTheme="minorHAnsi" w:cstheme="minorHAnsi" w:hAnsiTheme="minorHAnsi" w:eastAsia="Calibri"/>
           <w:b/>
           <w:sz w:val="18"/>
           <w:szCs w:val="18"/>
@@ -5254,7 +5254,7 @@
       </w:r>
       <w:r>
         <w:rPr>
-          <w:rFonts w:cs="Calibri" w:ascii="Calibri" w:hAnsi="Calibri" w:asciiTheme="minorHAnsi" w:cstheme="minorHAnsi" w:hAnsiTheme="minorHAnsi"/>
+          <w:rFonts w:cs="Calibri" w:ascii="Calibri" w:hAnsi="Calibri" w:asciiTheme="minorHAnsi" w:cstheme="minorHAnsi" w:hAnsiTheme="minorHAnsi" w:eastAsia="Calibri"/>
           <w:bCs/>
           <w:sz w:val="18"/>
           <w:szCs w:val="18"/>
@@ -5263,7 +5263,7 @@
       </w:r>
       <w:r>
         <w:rPr>
-          <w:rFonts w:cs="Calibri" w:ascii="Calibri" w:hAnsi="Calibri" w:asciiTheme="minorHAnsi" w:cstheme="minorHAnsi" w:hAnsiTheme="minorHAnsi"/>
+          <w:rFonts w:cs="Calibri" w:ascii="Calibri" w:hAnsi="Calibri" w:asciiTheme="minorHAnsi" w:cstheme="minorHAnsi" w:hAnsiTheme="minorHAnsi" w:eastAsia="Calibri"/>
           <w:b/>
           <w:sz w:val="18"/>
           <w:szCs w:val="18"/>
@@ -5272,7 +5272,7 @@
       </w:r>
       <w:r>
         <w:rPr>
-          <w:rFonts w:cs="Calibri" w:ascii="Calibri" w:hAnsi="Calibri" w:asciiTheme="minorHAnsi" w:cstheme="minorHAnsi" w:hAnsiTheme="minorHAnsi"/>
+          <w:rFonts w:cs="Calibri" w:ascii="Calibri" w:hAnsi="Calibri" w:asciiTheme="minorHAnsi" w:cstheme="minorHAnsi" w:hAnsiTheme="minorHAnsi" w:eastAsia="Calibri"/>
           <w:bCs/>
           <w:sz w:val="18"/>
           <w:szCs w:val="18"/>
@@ -5281,7 +5281,7 @@
       </w:r>
       <w:r>
         <w:rPr>
-          <w:rFonts w:cs="Calibri" w:ascii="Calibri" w:hAnsi="Calibri" w:asciiTheme="minorHAnsi" w:cstheme="minorHAnsi" w:hAnsiTheme="minorHAnsi"/>
+          <w:rFonts w:cs="Calibri" w:ascii="Calibri" w:hAnsi="Calibri" w:asciiTheme="minorHAnsi" w:cstheme="minorHAnsi" w:hAnsiTheme="minorHAnsi" w:eastAsia="Calibri"/>
           <w:bCs/>
           <w:i/>
           <w:iCs/>
@@ -5293,7 +5293,7 @@
       </w:r>
       <w:r>
         <w:rPr>
-          <w:rFonts w:cs="Calibri" w:ascii="Calibri" w:hAnsi="Calibri" w:asciiTheme="minorHAnsi" w:cstheme="minorHAnsi" w:hAnsiTheme="minorHAnsi"/>
+          <w:rFonts w:cs="Calibri" w:ascii="Calibri" w:hAnsi="Calibri" w:asciiTheme="minorHAnsi" w:cstheme="minorHAnsi" w:hAnsiTheme="minorHAnsi" w:eastAsia="Calibri"/>
           <w:bCs/>
           <w:sz w:val="18"/>
           <w:szCs w:val="18"/>
@@ -5316,7 +5316,7 @@
       </w:pPr>
       <w:r>
         <w:rPr>
-          <w:rFonts w:cs="Calibri" w:ascii="Calibri" w:hAnsi="Calibri" w:asciiTheme="minorHAnsi" w:cstheme="minorHAnsi" w:hAnsiTheme="minorHAnsi"/>
+          <w:rFonts w:cs="Calibri" w:ascii="Calibri" w:hAnsi="Calibri" w:asciiTheme="minorHAnsi" w:cstheme="minorHAnsi" w:hAnsiTheme="minorHAnsi" w:eastAsia="Calibri"/>
           <w:b/>
           <w:sz w:val="18"/>
           <w:szCs w:val="18"/>
@@ -5325,7 +5325,7 @@
       </w:r>
       <w:r>
         <w:rPr>
-          <w:rFonts w:cs="Calibri" w:ascii="Calibri" w:hAnsi="Calibri" w:asciiTheme="minorHAnsi" w:cstheme="minorHAnsi" w:hAnsiTheme="minorHAnsi"/>
+          <w:rFonts w:cs="Calibri" w:ascii="Calibri" w:hAnsi="Calibri" w:asciiTheme="minorHAnsi" w:cstheme="minorHAnsi" w:hAnsiTheme="minorHAnsi" w:eastAsia="Calibri"/>
           <w:bCs/>
           <w:sz w:val="18"/>
           <w:szCs w:val="18"/>
@@ -5334,7 +5334,7 @@
       </w:r>
       <w:r>
         <w:rPr>
-          <w:rFonts w:cs="Calibri" w:ascii="Calibri" w:hAnsi="Calibri" w:asciiTheme="minorHAnsi" w:cstheme="minorHAnsi" w:hAnsiTheme="minorHAnsi"/>
+          <w:rFonts w:cs="Calibri" w:ascii="Calibri" w:hAnsi="Calibri" w:asciiTheme="minorHAnsi" w:cstheme="minorHAnsi" w:hAnsiTheme="minorHAnsi" w:eastAsia="Calibri"/>
           <w:b/>
           <w:sz w:val="18"/>
           <w:szCs w:val="18"/>
@@ -5343,7 +5343,7 @@
       </w:r>
       <w:r>
         <w:rPr>
-          <w:rFonts w:cs="Calibri" w:ascii="Calibri" w:hAnsi="Calibri" w:asciiTheme="minorHAnsi" w:cstheme="minorHAnsi" w:hAnsiTheme="minorHAnsi"/>
+          <w:rFonts w:cs="Calibri" w:ascii="Calibri" w:hAnsi="Calibri" w:asciiTheme="minorHAnsi" w:cstheme="minorHAnsi" w:hAnsiTheme="minorHAnsi" w:eastAsia="Calibri"/>
           <w:bCs/>
           <w:sz w:val="18"/>
           <w:szCs w:val="18"/>
@@ -5366,7 +5366,7 @@
       </w:pPr>
       <w:r>
         <w:rPr>
-          <w:rFonts w:cs="Calibri" w:ascii="Calibri" w:hAnsi="Calibri" w:asciiTheme="minorHAnsi" w:cstheme="minorHAnsi" w:hAnsiTheme="minorHAnsi"/>
+          <w:rFonts w:cs="Calibri" w:ascii="Calibri" w:hAnsi="Calibri" w:asciiTheme="minorHAnsi" w:cstheme="minorHAnsi" w:hAnsiTheme="minorHAnsi" w:eastAsia="Calibri"/>
           <w:b/>
           <w:sz w:val="18"/>
           <w:szCs w:val="18"/>
@@ -5375,7 +5375,7 @@
       </w:r>
       <w:r>
         <w:rPr>
-          <w:rFonts w:cs="Calibri" w:ascii="Calibri" w:hAnsi="Calibri" w:asciiTheme="minorHAnsi" w:cstheme="minorHAnsi" w:hAnsiTheme="minorHAnsi"/>
+          <w:rFonts w:cs="Calibri" w:ascii="Calibri" w:hAnsi="Calibri" w:asciiTheme="minorHAnsi" w:cstheme="minorHAnsi" w:hAnsiTheme="minorHAnsi" w:eastAsia="Calibri"/>
           <w:bCs/>
           <w:sz w:val="18"/>
           <w:szCs w:val="18"/>
@@ -5399,7 +5399,7 @@
       </w:pPr>
       <w:r>
         <w:rPr>
-          <w:rFonts w:cs="Calibri" w:ascii="Calibri" w:hAnsi="Calibri" w:asciiTheme="minorHAnsi" w:cstheme="minorHAnsi" w:hAnsiTheme="minorHAnsi"/>
+          <w:rFonts w:cs="Calibri" w:ascii="Calibri" w:hAnsi="Calibri" w:asciiTheme="minorHAnsi" w:cstheme="minorHAnsi" w:hAnsiTheme="minorHAnsi" w:eastAsia="Calibri"/>
           <w:b/>
           <w:sz w:val="18"/>
           <w:szCs w:val="18"/>
@@ -5421,7 +5421,7 @@
       </w:pPr>
       <w:r>
         <w:rPr>
-          <w:rFonts w:cs="Calibri" w:ascii="Calibri" w:hAnsi="Calibri" w:asciiTheme="minorHAnsi" w:cstheme="minorHAnsi" w:hAnsiTheme="minorHAnsi"/>
+          <w:rFonts w:cs="Calibri" w:ascii="Calibri" w:hAnsi="Calibri" w:asciiTheme="minorHAnsi" w:cstheme="minorHAnsi" w:hAnsiTheme="minorHAnsi" w:eastAsia="Calibri"/>
           <w:b/>
           <w:sz w:val="18"/>
           <w:szCs w:val="18"/>
@@ -5430,7 +5430,7 @@
       </w:r>
       <w:r>
         <w:rPr>
-          <w:rFonts w:cs="Calibri" w:ascii="Calibri" w:hAnsi="Calibri" w:asciiTheme="minorHAnsi" w:cstheme="minorHAnsi" w:hAnsiTheme="minorHAnsi"/>
+          <w:rFonts w:cs="Calibri" w:ascii="Calibri" w:hAnsi="Calibri" w:asciiTheme="minorHAnsi" w:cstheme="minorHAnsi" w:hAnsiTheme="minorHAnsi" w:eastAsia="Calibri"/>
           <w:bCs/>
           <w:sz w:val="18"/>
           <w:szCs w:val="18"/>
@@ -5439,7 +5439,7 @@
       </w:r>
       <w:r>
         <w:rPr>
-          <w:rFonts w:cs="Calibri" w:ascii="Calibri" w:hAnsi="Calibri" w:asciiTheme="minorHAnsi" w:cstheme="minorHAnsi" w:hAnsiTheme="minorHAnsi"/>
+          <w:rFonts w:cs="Calibri" w:ascii="Calibri" w:hAnsi="Calibri" w:asciiTheme="minorHAnsi" w:cstheme="minorHAnsi" w:hAnsiTheme="minorHAnsi" w:eastAsia="Calibri"/>
           <w:b/>
           <w:sz w:val="18"/>
           <w:szCs w:val="18"/>
@@ -5448,7 +5448,7 @@
       </w:r>
       <w:r>
         <w:rPr>
-          <w:rFonts w:cs="Calibri" w:ascii="Calibri" w:hAnsi="Calibri" w:asciiTheme="minorHAnsi" w:cstheme="minorHAnsi" w:hAnsiTheme="minorHAnsi"/>
+          <w:rFonts w:cs="Calibri" w:ascii="Calibri" w:hAnsi="Calibri" w:asciiTheme="minorHAnsi" w:cstheme="minorHAnsi" w:hAnsiTheme="minorHAnsi" w:eastAsia="Calibri"/>
           <w:bCs/>
           <w:sz w:val="18"/>
           <w:szCs w:val="18"/>
@@ -5457,7 +5457,7 @@
       </w:r>
       <w:r>
         <w:rPr>
-          <w:rFonts w:cs="Calibri" w:ascii="Calibri" w:hAnsi="Calibri" w:asciiTheme="minorHAnsi" w:cstheme="minorHAnsi" w:hAnsiTheme="minorHAnsi"/>
+          <w:rFonts w:cs="Calibri" w:ascii="Calibri" w:hAnsi="Calibri" w:asciiTheme="minorHAnsi" w:cstheme="minorHAnsi" w:hAnsiTheme="minorHAnsi" w:eastAsia="Calibri"/>
           <w:sz w:val="18"/>
           <w:szCs w:val="18"/>
         </w:rPr>
@@ -5465,7 +5465,7 @@
       </w:r>
       <w:r>
         <w:rPr>
-          <w:rFonts w:cs="Calibri" w:ascii="Calibri" w:hAnsi="Calibri" w:asciiTheme="minorHAnsi" w:cstheme="minorHAnsi" w:hAnsiTheme="minorHAnsi"/>
+          <w:rFonts w:cs="Calibri" w:ascii="Calibri" w:hAnsi="Calibri" w:asciiTheme="minorHAnsi" w:cstheme="minorHAnsi" w:hAnsiTheme="minorHAnsi" w:eastAsia="Calibri"/>
           <w:bCs/>
           <w:sz w:val="18"/>
           <w:szCs w:val="18"/>
@@ -5488,7 +5488,7 @@
       </w:pPr>
       <w:r>
         <w:rPr>
-          <w:rFonts w:cs="Calibri" w:ascii="Calibri" w:hAnsi="Calibri" w:asciiTheme="minorHAnsi" w:cstheme="minorHAnsi" w:hAnsiTheme="minorHAnsi"/>
+          <w:rFonts w:cs="Calibri" w:ascii="Calibri" w:hAnsi="Calibri" w:asciiTheme="minorHAnsi" w:cstheme="minorHAnsi" w:hAnsiTheme="minorHAnsi" w:eastAsia="Calibri"/>
           <w:b/>
           <w:sz w:val="18"/>
           <w:szCs w:val="18"/>
@@ -5497,7 +5497,7 @@
       </w:r>
       <w:r>
         <w:rPr>
-          <w:rFonts w:cs="Calibri" w:ascii="Calibri" w:hAnsi="Calibri" w:asciiTheme="minorHAnsi" w:cstheme="minorHAnsi" w:hAnsiTheme="minorHAnsi"/>
+          <w:rFonts w:cs="Calibri" w:ascii="Calibri" w:hAnsi="Calibri" w:asciiTheme="minorHAnsi" w:cstheme="minorHAnsi" w:hAnsiTheme="minorHAnsi" w:eastAsia="Calibri"/>
           <w:bCs/>
           <w:sz w:val="18"/>
           <w:szCs w:val="18"/>
@@ -5506,7 +5506,7 @@
       </w:r>
       <w:r>
         <w:rPr>
-          <w:rFonts w:cs="Calibri" w:ascii="Calibri" w:hAnsi="Calibri" w:asciiTheme="minorHAnsi" w:cstheme="minorHAnsi" w:hAnsiTheme="minorHAnsi"/>
+          <w:rFonts w:cs="Calibri" w:ascii="Calibri" w:hAnsi="Calibri" w:asciiTheme="minorHAnsi" w:cstheme="minorHAnsi" w:hAnsiTheme="minorHAnsi" w:eastAsia="Calibri"/>
           <w:b/>
           <w:sz w:val="18"/>
           <w:szCs w:val="18"/>
@@ -5515,7 +5515,7 @@
       </w:r>
       <w:r>
         <w:rPr>
-          <w:rFonts w:cs="Calibri" w:ascii="Calibri" w:hAnsi="Calibri" w:asciiTheme="minorHAnsi" w:cstheme="minorHAnsi" w:hAnsiTheme="minorHAnsi"/>
+          <w:rFonts w:cs="Calibri" w:ascii="Calibri" w:hAnsi="Calibri" w:asciiTheme="minorHAnsi" w:cstheme="minorHAnsi" w:hAnsiTheme="minorHAnsi" w:eastAsia="Calibri"/>
           <w:bCs/>
           <w:sz w:val="18"/>
           <w:szCs w:val="18"/>
@@ -5524,7 +5524,7 @@
       </w:r>
       <w:r>
         <w:rPr>
-          <w:rFonts w:cs="Calibri" w:ascii="Calibri" w:hAnsi="Calibri" w:asciiTheme="minorHAnsi" w:cstheme="minorHAnsi" w:hAnsiTheme="minorHAnsi"/>
+          <w:rFonts w:cs="Calibri" w:ascii="Calibri" w:hAnsi="Calibri" w:asciiTheme="minorHAnsi" w:cstheme="minorHAnsi" w:hAnsiTheme="minorHAnsi" w:eastAsia="Calibri"/>
           <w:b/>
           <w:sz w:val="18"/>
           <w:szCs w:val="18"/>
@@ -5533,7 +5533,7 @@
       </w:r>
       <w:r>
         <w:rPr>
-          <w:rFonts w:cs="Calibri" w:ascii="Calibri" w:hAnsi="Calibri" w:asciiTheme="minorHAnsi" w:cstheme="minorHAnsi" w:hAnsiTheme="minorHAnsi"/>
+          <w:rFonts w:cs="Calibri" w:ascii="Calibri" w:hAnsi="Calibri" w:asciiTheme="minorHAnsi" w:cstheme="minorHAnsi" w:hAnsiTheme="minorHAnsi" w:eastAsia="Calibri"/>
           <w:bCs/>
           <w:sz w:val="18"/>
           <w:szCs w:val="18"/>
@@ -5542,7 +5542,7 @@
       </w:r>
       <w:r>
         <w:rPr>
-          <w:rFonts w:cs="Calibri" w:ascii="Calibri" w:hAnsi="Calibri" w:asciiTheme="minorHAnsi" w:cstheme="minorHAnsi" w:hAnsiTheme="minorHAnsi"/>
+          <w:rFonts w:cs="Calibri" w:ascii="Calibri" w:hAnsi="Calibri" w:asciiTheme="minorHAnsi" w:cstheme="minorHAnsi" w:hAnsiTheme="minorHAnsi" w:eastAsia="Calibri"/>
           <w:b/>
           <w:sz w:val="18"/>
           <w:szCs w:val="18"/>
@@ -5551,7 +5551,7 @@
       </w:r>
       <w:r>
         <w:rPr>
-          <w:rFonts w:cs="Calibri" w:ascii="Calibri" w:hAnsi="Calibri" w:asciiTheme="minorHAnsi" w:cstheme="minorHAnsi" w:hAnsiTheme="minorHAnsi"/>
+          <w:rFonts w:cs="Calibri" w:ascii="Calibri" w:hAnsi="Calibri" w:asciiTheme="minorHAnsi" w:cstheme="minorHAnsi" w:hAnsiTheme="minorHAnsi" w:eastAsia="Calibri"/>
           <w:bCs/>
           <w:sz w:val="18"/>
           <w:szCs w:val="18"/>
@@ -5560,7 +5560,7 @@
       </w:r>
       <w:r>
         <w:rPr>
-          <w:rFonts w:cs="Calibri" w:ascii="Calibri" w:hAnsi="Calibri" w:asciiTheme="minorHAnsi" w:cstheme="minorHAnsi" w:hAnsiTheme="minorHAnsi"/>
+          <w:rFonts w:cs="Calibri" w:ascii="Calibri" w:hAnsi="Calibri" w:asciiTheme="minorHAnsi" w:cstheme="minorHAnsi" w:hAnsiTheme="minorHAnsi" w:eastAsia="Calibri"/>
           <w:b/>
           <w:sz w:val="18"/>
           <w:szCs w:val="18"/>
@@ -5569,7 +5569,7 @@
       </w:r>
       <w:r>
         <w:rPr>
-          <w:rFonts w:cs="Calibri" w:ascii="Calibri" w:hAnsi="Calibri" w:asciiTheme="minorHAnsi" w:cstheme="minorHAnsi" w:hAnsiTheme="minorHAnsi"/>
+          <w:rFonts w:cs="Calibri" w:ascii="Calibri" w:hAnsi="Calibri" w:asciiTheme="minorHAnsi" w:cstheme="minorHAnsi" w:hAnsiTheme="minorHAnsi" w:eastAsia="Calibri"/>
           <w:bCs/>
           <w:sz w:val="18"/>
           <w:szCs w:val="18"/>
@@ -5578,7 +5578,7 @@
       </w:r>
       <w:r>
         <w:rPr>
-          <w:rFonts w:cs="Calibri" w:ascii="Calibri" w:hAnsi="Calibri" w:asciiTheme="minorHAnsi" w:cstheme="minorHAnsi" w:hAnsiTheme="minorHAnsi"/>
+          <w:rFonts w:cs="Calibri" w:ascii="Calibri" w:hAnsi="Calibri" w:asciiTheme="minorHAnsi" w:cstheme="minorHAnsi" w:hAnsiTheme="minorHAnsi" w:eastAsia="Calibri"/>
           <w:b/>
           <w:sz w:val="18"/>
           <w:szCs w:val="18"/>
@@ -5587,7 +5587,7 @@
       </w:r>
       <w:r>
         <w:rPr>
-          <w:rFonts w:cs="Calibri" w:ascii="Calibri" w:hAnsi="Calibri" w:asciiTheme="minorHAnsi" w:cstheme="minorHAnsi" w:hAnsiTheme="minorHAnsi"/>
+          <w:rFonts w:cs="Calibri" w:ascii="Calibri" w:hAnsi="Calibri" w:asciiTheme="minorHAnsi" w:cstheme="minorHAnsi" w:hAnsiTheme="minorHAnsi" w:eastAsia="Calibri"/>
           <w:bCs/>
           <w:sz w:val="18"/>
           <w:szCs w:val="18"/>
@@ -5596,7 +5596,7 @@
       </w:r>
       <w:r>
         <w:rPr>
-          <w:rFonts w:cs="Calibri" w:ascii="Calibri" w:hAnsi="Calibri" w:asciiTheme="minorHAnsi" w:cstheme="minorHAnsi" w:hAnsiTheme="minorHAnsi"/>
+          <w:rFonts w:cs="Calibri" w:ascii="Calibri" w:hAnsi="Calibri" w:asciiTheme="minorHAnsi" w:cstheme="minorHAnsi" w:hAnsiTheme="minorHAnsi" w:eastAsia="Calibri"/>
           <w:bCs/>
           <w:i/>
           <w:iCs/>
@@ -5607,7 +5607,7 @@
       </w:r>
       <w:r>
         <w:rPr>
-          <w:rFonts w:cs="Calibri" w:ascii="Calibri" w:hAnsi="Calibri" w:asciiTheme="minorHAnsi" w:cstheme="minorHAnsi" w:hAnsiTheme="minorHAnsi"/>
+          <w:rFonts w:cs="Calibri" w:ascii="Calibri" w:hAnsi="Calibri" w:asciiTheme="minorHAnsi" w:cstheme="minorHAnsi" w:hAnsiTheme="minorHAnsi" w:eastAsia="Calibri"/>
           <w:bCs/>
           <w:sz w:val="18"/>
           <w:szCs w:val="18"/>
@@ -5630,7 +5630,7 @@
       </w:pPr>
       <w:r>
         <w:rPr>
-          <w:rFonts w:cs="Calibri" w:ascii="Calibri" w:hAnsi="Calibri" w:asciiTheme="minorHAnsi" w:cstheme="minorHAnsi" w:hAnsiTheme="minorHAnsi"/>
+          <w:rFonts w:cs="Calibri" w:ascii="Calibri" w:hAnsi="Calibri" w:asciiTheme="minorHAnsi" w:cstheme="minorHAnsi" w:hAnsiTheme="minorHAnsi" w:eastAsia="Calibri"/>
           <w:b/>
           <w:sz w:val="18"/>
           <w:szCs w:val="18"/>
@@ -5639,7 +5639,7 @@
       </w:r>
       <w:r>
         <w:rPr>
-          <w:rFonts w:cs="Calibri" w:ascii="Calibri" w:hAnsi="Calibri" w:asciiTheme="minorHAnsi" w:cstheme="minorHAnsi" w:hAnsiTheme="minorHAnsi"/>
+          <w:rFonts w:cs="Calibri" w:ascii="Calibri" w:hAnsi="Calibri" w:asciiTheme="minorHAnsi" w:cstheme="minorHAnsi" w:hAnsiTheme="minorHAnsi" w:eastAsia="Calibri"/>
           <w:bCs/>
           <w:sz w:val="18"/>
           <w:szCs w:val="18"/>
@@ -5648,7 +5648,7 @@
       </w:r>
       <w:r>
         <w:rPr>
-          <w:rFonts w:cs="Calibri" w:ascii="Calibri" w:hAnsi="Calibri" w:asciiTheme="minorHAnsi" w:cstheme="minorHAnsi" w:hAnsiTheme="minorHAnsi"/>
+          <w:rFonts w:cs="Calibri" w:ascii="Calibri" w:hAnsi="Calibri" w:asciiTheme="minorHAnsi" w:cstheme="minorHAnsi" w:hAnsiTheme="minorHAnsi" w:eastAsia="Calibri"/>
           <w:b/>
           <w:sz w:val="18"/>
           <w:szCs w:val="18"/>
@@ -5657,7 +5657,7 @@
       </w:r>
       <w:r>
         <w:rPr>
-          <w:rFonts w:cs="Calibri" w:ascii="Calibri" w:hAnsi="Calibri" w:asciiTheme="minorHAnsi" w:cstheme="minorHAnsi" w:hAnsiTheme="minorHAnsi"/>
+          <w:rFonts w:cs="Calibri" w:ascii="Calibri" w:hAnsi="Calibri" w:asciiTheme="minorHAnsi" w:cstheme="minorHAnsi" w:hAnsiTheme="minorHAnsi" w:eastAsia="Calibri"/>
           <w:bCs/>
           <w:sz w:val="18"/>
           <w:szCs w:val="18"/>
@@ -5679,7 +5679,7 @@
       </w:pPr>
       <w:r>
         <w:rPr>
-          <w:rFonts w:cs="Calibri" w:ascii="Calibri" w:hAnsi="Calibri" w:asciiTheme="minorHAnsi" w:cstheme="minorHAnsi" w:hAnsiTheme="minorHAnsi"/>
+          <w:rFonts w:cs="Calibri" w:ascii="Calibri" w:hAnsi="Calibri" w:asciiTheme="minorHAnsi" w:cstheme="minorHAnsi" w:hAnsiTheme="minorHAnsi" w:eastAsia="Calibri"/>
           <w:b/>
           <w:sz w:val="18"/>
           <w:szCs w:val="18"/>
@@ -5688,7 +5688,7 @@
       </w:r>
       <w:r>
         <w:rPr>
-          <w:rFonts w:cs="Calibri" w:ascii="Calibri" w:hAnsi="Calibri" w:asciiTheme="minorHAnsi" w:cstheme="minorHAnsi" w:hAnsiTheme="minorHAnsi"/>
+          <w:rFonts w:cs="Calibri" w:ascii="Calibri" w:hAnsi="Calibri" w:asciiTheme="minorHAnsi" w:cstheme="minorHAnsi" w:hAnsiTheme="minorHAnsi" w:eastAsia="Calibri"/>
           <w:bCs/>
           <w:sz w:val="18"/>
           <w:szCs w:val="18"/>
@@ -5697,7 +5697,7 @@
       </w:r>
       <w:r>
         <w:rPr>
-          <w:rFonts w:cs="Calibri" w:ascii="Calibri" w:hAnsi="Calibri" w:asciiTheme="minorHAnsi" w:cstheme="minorHAnsi" w:hAnsiTheme="minorHAnsi"/>
+          <w:rFonts w:cs="Calibri" w:ascii="Calibri" w:hAnsi="Calibri" w:asciiTheme="minorHAnsi" w:cstheme="minorHAnsi" w:hAnsiTheme="minorHAnsi" w:eastAsia="Calibri"/>
           <w:b/>
           <w:bCs/>
           <w:sz w:val="18"/>
@@ -5707,7 +5707,7 @@
       </w:r>
       <w:r>
         <w:rPr>
-          <w:rFonts w:cs="Calibri" w:ascii="Calibri" w:hAnsi="Calibri" w:asciiTheme="minorHAnsi" w:cstheme="minorHAnsi" w:hAnsiTheme="minorHAnsi"/>
+          <w:rFonts w:cs="Calibri" w:ascii="Calibri" w:hAnsi="Calibri" w:asciiTheme="minorHAnsi" w:cstheme="minorHAnsi" w:hAnsiTheme="minorHAnsi" w:eastAsia="Calibri"/>
           <w:sz w:val="18"/>
           <w:szCs w:val="18"/>
         </w:rPr>
@@ -5728,7 +5728,7 @@
       </w:pPr>
       <w:r>
         <w:rPr>
-          <w:rFonts w:cs="Calibri" w:ascii="Calibri" w:hAnsi="Calibri" w:asciiTheme="minorHAnsi" w:cstheme="minorHAnsi" w:hAnsiTheme="minorHAnsi"/>
+          <w:rFonts w:cs="Calibri" w:ascii="Calibri" w:hAnsi="Calibri" w:asciiTheme="minorHAnsi" w:cstheme="minorHAnsi" w:hAnsiTheme="minorHAnsi" w:eastAsia="Calibri"/>
           <w:b/>
           <w:bCs/>
           <w:sz w:val="18"/>
@@ -5738,7 +5738,7 @@
       </w:r>
       <w:r>
         <w:rPr>
-          <w:rFonts w:cs="Calibri" w:ascii="Calibri" w:hAnsi="Calibri" w:asciiTheme="minorHAnsi" w:cstheme="minorHAnsi" w:hAnsiTheme="minorHAnsi"/>
+          <w:rFonts w:cs="Calibri" w:ascii="Calibri" w:hAnsi="Calibri" w:asciiTheme="minorHAnsi" w:cstheme="minorHAnsi" w:hAnsiTheme="minorHAnsi" w:eastAsia="Calibri"/>
           <w:sz w:val="18"/>
           <w:szCs w:val="18"/>
         </w:rPr>
@@ -5746,7 +5746,7 @@
       </w:r>
       <w:r>
         <w:rPr>
-          <w:rFonts w:cs="Calibri" w:ascii="Calibri" w:hAnsi="Calibri" w:asciiTheme="minorHAnsi" w:cstheme="minorHAnsi" w:hAnsiTheme="minorHAnsi"/>
+          <w:rFonts w:cs="Calibri" w:ascii="Calibri" w:hAnsi="Calibri" w:asciiTheme="minorHAnsi" w:cstheme="minorHAnsi" w:hAnsiTheme="minorHAnsi" w:eastAsia="Calibri"/>
           <w:b/>
           <w:bCs/>
           <w:sz w:val="18"/>
@@ -5756,7 +5756,7 @@
       </w:r>
       <w:r>
         <w:rPr>
-          <w:rFonts w:cs="Calibri" w:ascii="Calibri" w:hAnsi="Calibri" w:asciiTheme="minorHAnsi" w:cstheme="minorHAnsi" w:hAnsiTheme="minorHAnsi"/>
+          <w:rFonts w:cs="Calibri" w:ascii="Calibri" w:hAnsi="Calibri" w:asciiTheme="minorHAnsi" w:cstheme="minorHAnsi" w:hAnsiTheme="minorHAnsi" w:eastAsia="Calibri"/>
           <w:sz w:val="18"/>
           <w:szCs w:val="18"/>
         </w:rPr>
@@ -5764,7 +5764,7 @@
       </w:r>
       <w:r>
         <w:rPr>
-          <w:rFonts w:cs="Calibri" w:ascii="Calibri" w:hAnsi="Calibri" w:asciiTheme="minorHAnsi" w:cstheme="minorHAnsi" w:hAnsiTheme="minorHAnsi"/>
+          <w:rFonts w:cs="Calibri" w:ascii="Calibri" w:hAnsi="Calibri" w:asciiTheme="minorHAnsi" w:cstheme="minorHAnsi" w:hAnsiTheme="minorHAnsi" w:eastAsia="Calibri"/>
           <w:b/>
           <w:bCs/>
           <w:sz w:val="18"/>
@@ -5774,7 +5774,7 @@
       </w:r>
       <w:r>
         <w:rPr>
-          <w:rFonts w:cs="Calibri" w:ascii="Calibri" w:hAnsi="Calibri" w:asciiTheme="minorHAnsi" w:cstheme="minorHAnsi" w:hAnsiTheme="minorHAnsi"/>
+          <w:rFonts w:cs="Calibri" w:ascii="Calibri" w:hAnsi="Calibri" w:asciiTheme="minorHAnsi" w:cstheme="minorHAnsi" w:hAnsiTheme="minorHAnsi" w:eastAsia="Calibri"/>
           <w:sz w:val="18"/>
           <w:szCs w:val="18"/>
         </w:rPr>
@@ -5782,7 +5782,7 @@
       </w:r>
       <w:r>
         <w:rPr>
-          <w:rFonts w:cs="Calibri" w:ascii="Calibri" w:hAnsi="Calibri" w:asciiTheme="minorHAnsi" w:cstheme="minorHAnsi" w:hAnsiTheme="minorHAnsi"/>
+          <w:rFonts w:cs="Calibri" w:ascii="Calibri" w:hAnsi="Calibri" w:asciiTheme="minorHAnsi" w:cstheme="minorHAnsi" w:hAnsiTheme="minorHAnsi" w:eastAsia="Calibri"/>
           <w:b/>
           <w:bCs/>
           <w:sz w:val="18"/>
@@ -5792,7 +5792,7 @@
       </w:r>
       <w:r>
         <w:rPr>
-          <w:rFonts w:cs="Calibri" w:ascii="Calibri" w:hAnsi="Calibri" w:asciiTheme="minorHAnsi" w:cstheme="minorHAnsi" w:hAnsiTheme="minorHAnsi"/>
+          <w:rFonts w:cs="Calibri" w:ascii="Calibri" w:hAnsi="Calibri" w:asciiTheme="minorHAnsi" w:cstheme="minorHAnsi" w:hAnsiTheme="minorHAnsi" w:eastAsia="Calibri"/>
           <w:sz w:val="18"/>
           <w:szCs w:val="18"/>
         </w:rPr>
@@ -5815,7 +5815,7 @@
       </w:pPr>
       <w:r>
         <w:rPr>
-          <w:rFonts w:cs="Calibri" w:ascii="Calibri" w:hAnsi="Calibri" w:asciiTheme="minorHAnsi" w:cstheme="minorHAnsi" w:hAnsiTheme="minorHAnsi"/>
+          <w:rFonts w:cs="Calibri" w:ascii="Calibri" w:hAnsi="Calibri" w:asciiTheme="minorHAnsi" w:cstheme="minorHAnsi" w:hAnsiTheme="minorHAnsi" w:eastAsia="Calibri"/>
           <w:b/>
           <w:sz w:val="18"/>
           <w:szCs w:val="18"/>
@@ -5837,7 +5837,7 @@
       </w:pPr>
       <w:r>
         <w:rPr>
-          <w:rFonts w:cs="Calibri" w:ascii="Calibri" w:hAnsi="Calibri" w:asciiTheme="minorHAnsi" w:cstheme="minorHAnsi" w:hAnsiTheme="minorHAnsi"/>
+          <w:rFonts w:cs="Calibri" w:ascii="Calibri" w:hAnsi="Calibri" w:asciiTheme="minorHAnsi" w:cstheme="minorHAnsi" w:hAnsiTheme="minorHAnsi" w:eastAsia="Calibri"/>
           <w:b/>
           <w:bCs/>
           <w:sz w:val="18"/>
@@ -5847,7 +5847,7 @@
       </w:r>
       <w:r>
         <w:rPr>
-          <w:rFonts w:cs="Calibri" w:ascii="Calibri" w:hAnsi="Calibri" w:asciiTheme="minorHAnsi" w:cstheme="minorHAnsi" w:hAnsiTheme="minorHAnsi"/>
+          <w:rFonts w:cs="Calibri" w:ascii="Calibri" w:hAnsi="Calibri" w:asciiTheme="minorHAnsi" w:cstheme="minorHAnsi" w:hAnsiTheme="minorHAnsi" w:eastAsia="Calibri"/>
           <w:sz w:val="18"/>
           <w:szCs w:val="18"/>
         </w:rPr>
@@ -5856,7 +5856,7 @@
       <w:bookmarkStart w:id="0" w:name="_Hlk115360981"/>
       <w:r>
         <w:rPr>
-          <w:rFonts w:cs="Calibri" w:ascii="Calibri" w:hAnsi="Calibri" w:asciiTheme="minorHAnsi" w:cstheme="minorHAnsi" w:hAnsiTheme="minorHAnsi"/>
+          <w:rFonts w:cs="Calibri" w:ascii="Calibri" w:hAnsi="Calibri" w:asciiTheme="minorHAnsi" w:cstheme="minorHAnsi" w:hAnsiTheme="minorHAnsi" w:eastAsia="Calibri"/>
           <w:b/>
           <w:bCs/>
           <w:sz w:val="18"/>
@@ -5866,7 +5866,7 @@
       </w:r>
       <w:r>
         <w:rPr>
-          <w:rFonts w:cs="Calibri" w:ascii="Calibri" w:hAnsi="Calibri" w:asciiTheme="minorHAnsi" w:cstheme="minorHAnsi" w:hAnsiTheme="minorHAnsi"/>
+          <w:rFonts w:cs="Calibri" w:ascii="Calibri" w:hAnsi="Calibri" w:asciiTheme="minorHAnsi" w:cstheme="minorHAnsi" w:hAnsiTheme="minorHAnsi" w:eastAsia="Calibri"/>
           <w:sz w:val="18"/>
           <w:szCs w:val="18"/>
         </w:rPr>
@@ -5875,7 +5875,7 @@
       <w:bookmarkEnd w:id="0"/>
       <w:r>
         <w:rPr>
-          <w:rFonts w:cs="Calibri" w:ascii="Calibri" w:hAnsi="Calibri" w:asciiTheme="minorHAnsi" w:cstheme="minorHAnsi" w:hAnsiTheme="minorHAnsi"/>
+          <w:rFonts w:cs="Calibri" w:ascii="Calibri" w:hAnsi="Calibri" w:asciiTheme="minorHAnsi" w:cstheme="minorHAnsi" w:hAnsiTheme="minorHAnsi" w:eastAsia="Calibri"/>
           <w:sz w:val="18"/>
           <w:szCs w:val="18"/>
         </w:rPr>
@@ -5883,7 +5883,7 @@
       </w:r>
       <w:r>
         <w:rPr>
-          <w:rFonts w:cs="Calibri" w:ascii="Calibri" w:hAnsi="Calibri" w:asciiTheme="minorHAnsi" w:cstheme="minorHAnsi" w:hAnsiTheme="minorHAnsi"/>
+          <w:rFonts w:cs="Calibri" w:ascii="Calibri" w:hAnsi="Calibri" w:asciiTheme="minorHAnsi" w:cstheme="minorHAnsi" w:hAnsiTheme="minorHAnsi" w:eastAsia="Calibri"/>
           <w:b/>
           <w:bCs/>
           <w:sz w:val="18"/>
@@ -5893,7 +5893,7 @@
       </w:r>
       <w:r>
         <w:rPr>
-          <w:rFonts w:cs="Calibri" w:ascii="Calibri" w:hAnsi="Calibri" w:asciiTheme="minorHAnsi" w:cstheme="minorHAnsi" w:hAnsiTheme="minorHAnsi"/>
+          <w:rFonts w:cs="Calibri" w:ascii="Calibri" w:hAnsi="Calibri" w:asciiTheme="minorHAnsi" w:cstheme="minorHAnsi" w:hAnsiTheme="minorHAnsi" w:eastAsia="Calibri"/>
           <w:sz w:val="18"/>
           <w:szCs w:val="18"/>
         </w:rPr>
@@ -5915,7 +5915,7 @@
       </w:pPr>
       <w:r>
         <w:rPr>
-          <w:rFonts w:cs="Calibri" w:ascii="Calibri" w:hAnsi="Calibri" w:asciiTheme="minorHAnsi" w:cstheme="minorHAnsi" w:hAnsiTheme="minorHAnsi"/>
+          <w:rFonts w:cs="Calibri" w:ascii="Calibri" w:hAnsi="Calibri" w:asciiTheme="minorHAnsi" w:cstheme="minorHAnsi" w:hAnsiTheme="minorHAnsi" w:eastAsia="Calibri"/>
           <w:b/>
           <w:sz w:val="18"/>
           <w:szCs w:val="18"/>
@@ -5924,7 +5924,7 @@
       </w:r>
       <w:r>
         <w:rPr>
-          <w:rFonts w:cs="Calibri" w:ascii="Calibri" w:hAnsi="Calibri" w:asciiTheme="minorHAnsi" w:cstheme="minorHAnsi" w:hAnsiTheme="minorHAnsi"/>
+          <w:rFonts w:cs="Calibri" w:ascii="Calibri" w:hAnsi="Calibri" w:asciiTheme="minorHAnsi" w:cstheme="minorHAnsi" w:hAnsiTheme="minorHAnsi" w:eastAsia="Calibri"/>
           <w:bCs/>
           <w:sz w:val="18"/>
           <w:szCs w:val="18"/>
@@ -5947,7 +5947,7 @@
       </w:pPr>
       <w:r>
         <w:rPr>
-          <w:rFonts w:cs="Calibri" w:ascii="Calibri" w:hAnsi="Calibri" w:asciiTheme="minorHAnsi" w:cstheme="minorHAnsi" w:hAnsiTheme="minorHAnsi"/>
+          <w:rFonts w:cs="Calibri" w:ascii="Calibri" w:hAnsi="Calibri" w:asciiTheme="minorHAnsi" w:cstheme="minorHAnsi" w:hAnsiTheme="minorHAnsi" w:eastAsia="Calibri"/>
           <w:b/>
           <w:sz w:val="18"/>
           <w:szCs w:val="18"/>
@@ -5956,7 +5956,7 @@
       </w:r>
       <w:r>
         <w:rPr>
-          <w:rFonts w:cs="Calibri" w:ascii="Calibri" w:hAnsi="Calibri" w:asciiTheme="minorHAnsi" w:cstheme="minorHAnsi" w:hAnsiTheme="minorHAnsi"/>
+          <w:rFonts w:cs="Calibri" w:ascii="Calibri" w:hAnsi="Calibri" w:asciiTheme="minorHAnsi" w:cstheme="minorHAnsi" w:hAnsiTheme="minorHAnsi" w:eastAsia="Calibri"/>
           <w:bCs/>
           <w:sz w:val="18"/>
           <w:szCs w:val="18"/>
@@ -5965,7 +5965,7 @@
       </w:r>
       <w:r>
         <w:rPr>
-          <w:rFonts w:cs="Calibri" w:ascii="Calibri" w:hAnsi="Calibri" w:asciiTheme="minorHAnsi" w:cstheme="minorHAnsi" w:hAnsiTheme="minorHAnsi"/>
+          <w:rFonts w:cs="Calibri" w:ascii="Calibri" w:hAnsi="Calibri" w:asciiTheme="minorHAnsi" w:cstheme="minorHAnsi" w:hAnsiTheme="minorHAnsi" w:eastAsia="Calibri"/>
           <w:b/>
           <w:sz w:val="18"/>
           <w:szCs w:val="18"/>
@@ -5974,7 +5974,7 @@
       </w:r>
       <w:r>
         <w:rPr>
-          <w:rFonts w:cs="Calibri" w:ascii="Calibri" w:hAnsi="Calibri" w:asciiTheme="minorHAnsi" w:cstheme="minorHAnsi" w:hAnsiTheme="minorHAnsi"/>
+          <w:rFonts w:cs="Calibri" w:ascii="Calibri" w:hAnsi="Calibri" w:asciiTheme="minorHAnsi" w:cstheme="minorHAnsi" w:hAnsiTheme="minorHAnsi" w:eastAsia="Calibri"/>
           <w:bCs/>
           <w:sz w:val="18"/>
           <w:szCs w:val="18"/>
@@ -5983,7 +5983,7 @@
       </w:r>
       <w:r>
         <w:rPr>
-          <w:rFonts w:cs="Calibri" w:ascii="Calibri" w:hAnsi="Calibri" w:asciiTheme="minorHAnsi" w:cstheme="minorHAnsi" w:hAnsiTheme="minorHAnsi"/>
+          <w:rFonts w:cs="Calibri" w:ascii="Calibri" w:hAnsi="Calibri" w:asciiTheme="minorHAnsi" w:cstheme="minorHAnsi" w:hAnsiTheme="minorHAnsi" w:eastAsia="Calibri"/>
           <w:b/>
           <w:bCs/>
           <w:sz w:val="18"/>
@@ -5993,7 +5993,7 @@
       </w:r>
       <w:r>
         <w:rPr>
-          <w:rFonts w:cs="Calibri" w:ascii="Calibri" w:hAnsi="Calibri" w:asciiTheme="minorHAnsi" w:cstheme="minorHAnsi" w:hAnsiTheme="minorHAnsi"/>
+          <w:rFonts w:cs="Calibri" w:ascii="Calibri" w:hAnsi="Calibri" w:asciiTheme="minorHAnsi" w:cstheme="minorHAnsi" w:hAnsiTheme="minorHAnsi" w:eastAsia="Calibri"/>
           <w:sz w:val="18"/>
           <w:szCs w:val="18"/>
         </w:rPr>
@@ -6001,7 +6001,7 @@
       </w:r>
       <w:r>
         <w:rPr>
-          <w:rFonts w:cs="Calibri" w:ascii="Calibri" w:hAnsi="Calibri" w:asciiTheme="minorHAnsi" w:cstheme="minorHAnsi" w:hAnsiTheme="minorHAnsi"/>
+          <w:rFonts w:cs="Calibri" w:ascii="Calibri" w:hAnsi="Calibri" w:asciiTheme="minorHAnsi" w:cstheme="minorHAnsi" w:hAnsiTheme="minorHAnsi" w:eastAsia="Calibri"/>
           <w:bCs/>
           <w:sz w:val="18"/>
           <w:szCs w:val="18"/>
@@ -6025,7 +6025,7 @@
       </w:pPr>
       <w:r>
         <w:rPr>
-          <w:rFonts w:cs="Calibri" w:ascii="Calibri" w:hAnsi="Calibri" w:asciiTheme="minorHAnsi" w:cstheme="minorHAnsi" w:hAnsiTheme="minorHAnsi"/>
+          <w:rFonts w:cs="Calibri" w:ascii="Calibri" w:hAnsi="Calibri" w:asciiTheme="minorHAnsi" w:cstheme="minorHAnsi" w:hAnsiTheme="minorHAnsi" w:eastAsia="Calibri"/>
           <w:b/>
           <w:sz w:val="18"/>
           <w:szCs w:val="18"/>
@@ -6046,7 +6046,7 @@
       </w:pPr>
       <w:r>
         <w:rPr>
-          <w:rFonts w:cs="Calibri" w:ascii="Calibri" w:hAnsi="Calibri" w:asciiTheme="minorHAnsi" w:cstheme="minorHAnsi" w:hAnsiTheme="minorHAnsi"/>
+          <w:rFonts w:cs="Calibri" w:ascii="Calibri" w:hAnsi="Calibri" w:asciiTheme="minorHAnsi" w:cstheme="minorHAnsi" w:hAnsiTheme="minorHAnsi" w:eastAsia="Calibri"/>
           <w:b/>
           <w:sz w:val="18"/>
           <w:szCs w:val="18"/>
@@ -6055,7 +6055,7 @@
       </w:r>
       <w:r>
         <w:rPr>
-          <w:rFonts w:cs="Calibri" w:ascii="Calibri" w:hAnsi="Calibri" w:asciiTheme="minorHAnsi" w:cstheme="minorHAnsi" w:hAnsiTheme="minorHAnsi"/>
+          <w:rFonts w:cs="Calibri" w:ascii="Calibri" w:hAnsi="Calibri" w:asciiTheme="minorHAnsi" w:cstheme="minorHAnsi" w:hAnsiTheme="minorHAnsi" w:eastAsia="Calibri"/>
           <w:sz w:val="18"/>
           <w:szCs w:val="18"/>
         </w:rPr>
@@ -6063,7 +6063,7 @@
       </w:r>
       <w:r>
         <w:rPr>
-          <w:rFonts w:cs="Calibri" w:ascii="Calibri" w:hAnsi="Calibri" w:asciiTheme="minorHAnsi" w:cstheme="minorHAnsi" w:hAnsiTheme="minorHAnsi"/>
+          <w:rFonts w:cs="Calibri" w:ascii="Calibri" w:hAnsi="Calibri" w:asciiTheme="minorHAnsi" w:cstheme="minorHAnsi" w:hAnsiTheme="minorHAnsi" w:eastAsia="Calibri"/>
           <w:b/>
           <w:bCs/>
           <w:sz w:val="18"/>
@@ -6073,7 +6073,7 @@
       </w:r>
       <w:r>
         <w:rPr>
-          <w:rFonts w:cs="Calibri" w:ascii="Calibri" w:hAnsi="Calibri" w:asciiTheme="minorHAnsi" w:cstheme="minorHAnsi" w:hAnsiTheme="minorHAnsi"/>
+          <w:rFonts w:cs="Calibri" w:ascii="Calibri" w:hAnsi="Calibri" w:asciiTheme="minorHAnsi" w:cstheme="minorHAnsi" w:hAnsiTheme="minorHAnsi" w:eastAsia="Calibri"/>
           <w:sz w:val="18"/>
           <w:szCs w:val="18"/>
         </w:rPr>
@@ -6081,7 +6081,7 @@
       </w:r>
       <w:r>
         <w:rPr>
-          <w:rFonts w:cs="Calibri" w:ascii="Calibri" w:hAnsi="Calibri" w:asciiTheme="minorHAnsi" w:cstheme="minorHAnsi" w:hAnsiTheme="minorHAnsi"/>
+          <w:rFonts w:cs="Calibri" w:ascii="Calibri" w:hAnsi="Calibri" w:asciiTheme="minorHAnsi" w:cstheme="minorHAnsi" w:hAnsiTheme="minorHAnsi" w:eastAsia="Calibri"/>
           <w:b/>
           <w:bCs/>
           <w:sz w:val="18"/>
@@ -6091,7 +6091,7 @@
       </w:r>
       <w:r>
         <w:rPr>
-          <w:rFonts w:cs="Calibri" w:ascii="Calibri" w:hAnsi="Calibri" w:asciiTheme="minorHAnsi" w:cstheme="minorHAnsi" w:hAnsiTheme="minorHAnsi"/>
+          <w:rFonts w:cs="Calibri" w:ascii="Calibri" w:hAnsi="Calibri" w:asciiTheme="minorHAnsi" w:cstheme="minorHAnsi" w:hAnsiTheme="minorHAnsi" w:eastAsia="Calibri"/>
           <w:sz w:val="18"/>
           <w:szCs w:val="18"/>
         </w:rPr>
@@ -6099,7 +6099,7 @@
       </w:r>
       <w:r>
         <w:rPr>
-          <w:rFonts w:cs="Calibri" w:ascii="Calibri" w:hAnsi="Calibri" w:asciiTheme="minorHAnsi" w:cstheme="minorHAnsi" w:hAnsiTheme="minorHAnsi"/>
+          <w:rFonts w:cs="Calibri" w:ascii="Calibri" w:hAnsi="Calibri" w:asciiTheme="minorHAnsi" w:cstheme="minorHAnsi" w:hAnsiTheme="minorHAnsi" w:eastAsia="Calibri"/>
           <w:b/>
           <w:bCs/>
           <w:sz w:val="18"/>
@@ -6109,7 +6109,7 @@
       </w:r>
       <w:r>
         <w:rPr>
-          <w:rFonts w:cs="Calibri" w:ascii="Calibri" w:hAnsi="Calibri" w:asciiTheme="minorHAnsi" w:cstheme="minorHAnsi" w:hAnsiTheme="minorHAnsi"/>
+          <w:rFonts w:cs="Calibri" w:ascii="Calibri" w:hAnsi="Calibri" w:asciiTheme="minorHAnsi" w:cstheme="minorHAnsi" w:hAnsiTheme="minorHAnsi" w:eastAsia="Calibri"/>
           <w:sz w:val="18"/>
           <w:szCs w:val="18"/>
         </w:rPr>
@@ -6117,7 +6117,7 @@
       </w:r>
       <w:r>
         <w:rPr>
-          <w:rFonts w:cs="Calibri" w:ascii="Calibri" w:hAnsi="Calibri" w:asciiTheme="minorHAnsi" w:cstheme="minorHAnsi" w:hAnsiTheme="minorHAnsi"/>
+          <w:rFonts w:cs="Calibri" w:ascii="Calibri" w:hAnsi="Calibri" w:asciiTheme="minorHAnsi" w:cstheme="minorHAnsi" w:hAnsiTheme="minorHAnsi" w:eastAsia="Calibri"/>
           <w:b/>
           <w:bCs/>
           <w:sz w:val="18"/>
@@ -6127,7 +6127,7 @@
       </w:r>
       <w:r>
         <w:rPr>
-          <w:rFonts w:cs="Calibri" w:ascii="Calibri" w:hAnsi="Calibri" w:asciiTheme="minorHAnsi" w:cstheme="minorHAnsi" w:hAnsiTheme="minorHAnsi"/>
+          <w:rFonts w:cs="Calibri" w:ascii="Calibri" w:hAnsi="Calibri" w:asciiTheme="minorHAnsi" w:cstheme="minorHAnsi" w:hAnsiTheme="minorHAnsi" w:eastAsia="Calibri"/>
           <w:sz w:val="18"/>
           <w:szCs w:val="18"/>
         </w:rPr>
@@ -6135,7 +6135,7 @@
       </w:r>
       <w:r>
         <w:rPr>
-          <w:rFonts w:cs="Calibri" w:ascii="Calibri" w:hAnsi="Calibri" w:asciiTheme="minorHAnsi" w:cstheme="minorHAnsi" w:hAnsiTheme="minorHAnsi"/>
+          <w:rFonts w:cs="Calibri" w:ascii="Calibri" w:hAnsi="Calibri" w:asciiTheme="minorHAnsi" w:cstheme="minorHAnsi" w:hAnsiTheme="minorHAnsi" w:eastAsia="Calibri"/>
           <w:b/>
           <w:bCs/>
           <w:sz w:val="18"/>
@@ -6145,7 +6145,7 @@
       </w:r>
       <w:r>
         <w:rPr>
-          <w:rFonts w:cs="Calibri" w:ascii="Calibri" w:hAnsi="Calibri" w:asciiTheme="minorHAnsi" w:cstheme="minorHAnsi" w:hAnsiTheme="minorHAnsi"/>
+          <w:rFonts w:cs="Calibri" w:ascii="Calibri" w:hAnsi="Calibri" w:asciiTheme="minorHAnsi" w:cstheme="minorHAnsi" w:hAnsiTheme="minorHAnsi" w:eastAsia="Calibri"/>
           <w:sz w:val="18"/>
           <w:szCs w:val="18"/>
         </w:rPr>
@@ -6168,7 +6168,7 @@
       </w:pPr>
       <w:r>
         <w:rPr>
-          <w:rFonts w:cs="Calibri" w:ascii="Calibri" w:hAnsi="Calibri" w:asciiTheme="minorHAnsi" w:cstheme="minorHAnsi" w:hAnsiTheme="minorHAnsi"/>
+          <w:rFonts w:cs="Calibri" w:ascii="Calibri" w:hAnsi="Calibri" w:asciiTheme="minorHAnsi" w:cstheme="minorHAnsi" w:hAnsiTheme="minorHAnsi" w:eastAsia="Calibri"/>
           <w:b/>
           <w:sz w:val="18"/>
           <w:szCs w:val="18"/>
@@ -6190,7 +6190,7 @@
       </w:pPr>
       <w:r>
         <w:rPr>
-          <w:rFonts w:cs="Calibri" w:ascii="Calibri" w:hAnsi="Calibri" w:asciiTheme="minorHAnsi" w:cstheme="minorHAnsi" w:hAnsiTheme="minorHAnsi"/>
+          <w:rFonts w:cs="Calibri" w:ascii="Calibri" w:hAnsi="Calibri" w:asciiTheme="minorHAnsi" w:cstheme="minorHAnsi" w:hAnsiTheme="minorHAnsi" w:eastAsia="Calibri"/>
           <w:b/>
           <w:bCs/>
           <w:sz w:val="18"/>
@@ -6200,7 +6200,7 @@
       </w:r>
       <w:r>
         <w:rPr>
-          <w:rFonts w:cs="Calibri" w:ascii="Calibri" w:hAnsi="Calibri" w:asciiTheme="minorHAnsi" w:cstheme="minorHAnsi" w:hAnsiTheme="minorHAnsi"/>
+          <w:rFonts w:cs="Calibri" w:ascii="Calibri" w:hAnsi="Calibri" w:asciiTheme="minorHAnsi" w:cstheme="minorHAnsi" w:hAnsiTheme="minorHAnsi" w:eastAsia="Calibri"/>
           <w:sz w:val="18"/>
           <w:szCs w:val="18"/>
         </w:rPr>
@@ -6208,7 +6208,7 @@
       </w:r>
       <w:r>
         <w:rPr>
-          <w:rFonts w:cs="Calibri" w:ascii="Calibri" w:hAnsi="Calibri" w:asciiTheme="minorHAnsi" w:cstheme="minorHAnsi" w:hAnsiTheme="minorHAnsi"/>
+          <w:rFonts w:cs="Calibri" w:ascii="Calibri" w:hAnsi="Calibri" w:asciiTheme="minorHAnsi" w:cstheme="minorHAnsi" w:hAnsiTheme="minorHAnsi" w:eastAsia="Calibri"/>
           <w:b/>
           <w:bCs/>
           <w:sz w:val="18"/>
@@ -6218,7 +6218,7 @@
       </w:r>
       <w:r>
         <w:rPr>
-          <w:rFonts w:cs="Calibri" w:ascii="Calibri" w:hAnsi="Calibri" w:asciiTheme="minorHAnsi" w:cstheme="minorHAnsi" w:hAnsiTheme="minorHAnsi"/>
+          <w:rFonts w:cs="Calibri" w:ascii="Calibri" w:hAnsi="Calibri" w:asciiTheme="minorHAnsi" w:cstheme="minorHAnsi" w:hAnsiTheme="minorHAnsi" w:eastAsia="Calibri"/>
           <w:sz w:val="18"/>
           <w:szCs w:val="18"/>
         </w:rPr>
@@ -6226,7 +6226,7 @@
       </w:r>
       <w:r>
         <w:rPr>
-          <w:rFonts w:cs="Calibri" w:ascii="Calibri" w:hAnsi="Calibri" w:asciiTheme="minorHAnsi" w:cstheme="minorHAnsi" w:hAnsiTheme="minorHAnsi"/>
+          <w:rFonts w:cs="Calibri" w:ascii="Calibri" w:hAnsi="Calibri" w:asciiTheme="minorHAnsi" w:cstheme="minorHAnsi" w:hAnsiTheme="minorHAnsi" w:eastAsia="Calibri"/>
           <w:b/>
           <w:bCs/>
           <w:sz w:val="18"/>
@@ -6236,7 +6236,7 @@
       </w:r>
       <w:r>
         <w:rPr>
-          <w:rFonts w:cs="Calibri" w:ascii="Calibri" w:hAnsi="Calibri" w:asciiTheme="minorHAnsi" w:cstheme="minorHAnsi" w:hAnsiTheme="minorHAnsi"/>
+          <w:rFonts w:cs="Calibri" w:ascii="Calibri" w:hAnsi="Calibri" w:asciiTheme="minorHAnsi" w:cstheme="minorHAnsi" w:hAnsiTheme="minorHAnsi" w:eastAsia="Calibri"/>
           <w:sz w:val="18"/>
           <w:szCs w:val="18"/>
         </w:rPr>
@@ -6244,7 +6244,7 @@
       </w:r>
       <w:r>
         <w:rPr>
-          <w:rFonts w:cs="Calibri" w:ascii="Calibri" w:hAnsi="Calibri" w:asciiTheme="minorHAnsi" w:cstheme="minorHAnsi" w:hAnsiTheme="minorHAnsi"/>
+          <w:rFonts w:cs="Calibri" w:ascii="Calibri" w:hAnsi="Calibri" w:asciiTheme="minorHAnsi" w:cstheme="minorHAnsi" w:hAnsiTheme="minorHAnsi" w:eastAsia="Calibri"/>
           <w:b/>
           <w:bCs/>
           <w:sz w:val="18"/>
@@ -6254,7 +6254,7 @@
       </w:r>
       <w:r>
         <w:rPr>
-          <w:rFonts w:cs="Calibri" w:ascii="Calibri" w:hAnsi="Calibri" w:asciiTheme="minorHAnsi" w:cstheme="minorHAnsi" w:hAnsiTheme="minorHAnsi"/>
+          <w:rFonts w:cs="Calibri" w:ascii="Calibri" w:hAnsi="Calibri" w:asciiTheme="minorHAnsi" w:cstheme="minorHAnsi" w:hAnsiTheme="minorHAnsi" w:eastAsia="Calibri"/>
           <w:sz w:val="18"/>
           <w:szCs w:val="18"/>
         </w:rPr>
@@ -6262,7 +6262,7 @@
       </w:r>
       <w:r>
         <w:rPr>
-          <w:rFonts w:cs="Calibri" w:ascii="Calibri" w:hAnsi="Calibri" w:asciiTheme="minorHAnsi" w:cstheme="minorHAnsi" w:hAnsiTheme="minorHAnsi"/>
+          <w:rFonts w:cs="Calibri" w:ascii="Calibri" w:hAnsi="Calibri" w:asciiTheme="minorHAnsi" w:cstheme="minorHAnsi" w:hAnsiTheme="minorHAnsi" w:eastAsia="Calibri"/>
           <w:b/>
           <w:bCs/>
           <w:sz w:val="18"/>
@@ -6272,7 +6272,7 @@
       </w:r>
       <w:r>
         <w:rPr>
-          <w:rFonts w:cs="Calibri" w:ascii="Calibri" w:hAnsi="Calibri" w:asciiTheme="minorHAnsi" w:cstheme="minorHAnsi" w:hAnsiTheme="minorHAnsi"/>
+          <w:rFonts w:cs="Calibri" w:ascii="Calibri" w:hAnsi="Calibri" w:asciiTheme="minorHAnsi" w:cstheme="minorHAnsi" w:hAnsiTheme="minorHAnsi" w:eastAsia="Calibri"/>
           <w:sz w:val="18"/>
           <w:szCs w:val="18"/>
         </w:rPr>
@@ -6280,7 +6280,7 @@
       </w:r>
       <w:r>
         <w:rPr>
-          <w:rFonts w:cs="Calibri" w:ascii="Calibri" w:hAnsi="Calibri" w:asciiTheme="minorHAnsi" w:cstheme="minorHAnsi" w:hAnsiTheme="minorHAnsi"/>
+          <w:rFonts w:cs="Calibri" w:ascii="Calibri" w:hAnsi="Calibri" w:asciiTheme="minorHAnsi" w:cstheme="minorHAnsi" w:hAnsiTheme="minorHAnsi" w:eastAsia="Calibri"/>
           <w:b/>
           <w:bCs/>
           <w:sz w:val="18"/>
@@ -6290,7 +6290,7 @@
       </w:r>
       <w:r>
         <w:rPr>
-          <w:rFonts w:cs="Calibri" w:ascii="Calibri" w:hAnsi="Calibri" w:asciiTheme="minorHAnsi" w:cstheme="minorHAnsi" w:hAnsiTheme="minorHAnsi"/>
+          <w:rFonts w:cs="Calibri" w:ascii="Calibri" w:hAnsi="Calibri" w:asciiTheme="minorHAnsi" w:cstheme="minorHAnsi" w:hAnsiTheme="minorHAnsi" w:eastAsia="Calibri"/>
           <w:sz w:val="18"/>
           <w:szCs w:val="18"/>
         </w:rPr>
@@ -6298,7 +6298,7 @@
       </w:r>
       <w:r>
         <w:rPr>
-          <w:rFonts w:cs="Calibri" w:ascii="Calibri" w:hAnsi="Calibri" w:asciiTheme="minorHAnsi" w:cstheme="minorHAnsi" w:hAnsiTheme="minorHAnsi"/>
+          <w:rFonts w:cs="Calibri" w:ascii="Calibri" w:hAnsi="Calibri" w:asciiTheme="minorHAnsi" w:cstheme="minorHAnsi" w:hAnsiTheme="minorHAnsi" w:eastAsia="Calibri"/>
           <w:b/>
           <w:bCs/>
           <w:sz w:val="18"/>
@@ -6308,7 +6308,7 @@
       </w:r>
       <w:r>
         <w:rPr>
-          <w:rFonts w:cs="Calibri" w:ascii="Calibri" w:hAnsi="Calibri" w:asciiTheme="minorHAnsi" w:cstheme="minorHAnsi" w:hAnsiTheme="minorHAnsi"/>
+          <w:rFonts w:cs="Calibri" w:ascii="Calibri" w:hAnsi="Calibri" w:asciiTheme="minorHAnsi" w:cstheme="minorHAnsi" w:hAnsiTheme="minorHAnsi" w:eastAsia="Calibri"/>
           <w:sz w:val="18"/>
           <w:szCs w:val="18"/>
         </w:rPr>
@@ -6329,7 +6329,7 @@
       </w:pPr>
       <w:r>
         <w:rPr>
-          <w:rFonts w:cs="Calibri" w:ascii="Calibri" w:hAnsi="Calibri" w:asciiTheme="minorHAnsi" w:cstheme="minorHAnsi" w:hAnsiTheme="minorHAnsi"/>
+          <w:rFonts w:cs="Calibri" w:ascii="Calibri" w:hAnsi="Calibri" w:asciiTheme="minorHAnsi" w:cstheme="minorHAnsi" w:hAnsiTheme="minorHAnsi" w:eastAsia="Calibri"/>
           <w:sz w:val="18"/>
           <w:szCs w:val="18"/>
         </w:rPr>
@@ -6337,7 +6337,7 @@
       </w:r>
       <w:r>
         <w:rPr>
-          <w:rFonts w:cs="Calibri" w:ascii="Calibri" w:hAnsi="Calibri" w:asciiTheme="minorHAnsi" w:cstheme="minorHAnsi" w:hAnsiTheme="minorHAnsi"/>
+          <w:rFonts w:cs="Calibri" w:ascii="Calibri" w:hAnsi="Calibri" w:asciiTheme="minorHAnsi" w:cstheme="minorHAnsi" w:hAnsiTheme="minorHAnsi" w:eastAsia="Calibri"/>
           <w:b/>
           <w:bCs/>
           <w:sz w:val="18"/>
@@ -6347,7 +6347,7 @@
       </w:r>
       <w:r>
         <w:rPr>
-          <w:rFonts w:cs="Calibri" w:ascii="Calibri" w:hAnsi="Calibri" w:asciiTheme="minorHAnsi" w:cstheme="minorHAnsi" w:hAnsiTheme="minorHAnsi"/>
+          <w:rFonts w:cs="Calibri" w:ascii="Calibri" w:hAnsi="Calibri" w:asciiTheme="minorHAnsi" w:cstheme="minorHAnsi" w:hAnsiTheme="minorHAnsi" w:eastAsia="Calibri"/>
           <w:sz w:val="18"/>
           <w:szCs w:val="18"/>
         </w:rPr>
@@ -6355,7 +6355,7 @@
       </w:r>
       <w:r>
         <w:rPr>
-          <w:rFonts w:cs="Calibri" w:ascii="Calibri" w:hAnsi="Calibri" w:asciiTheme="minorHAnsi" w:cstheme="minorHAnsi" w:hAnsiTheme="minorHAnsi"/>
+          <w:rFonts w:cs="Calibri" w:ascii="Calibri" w:hAnsi="Calibri" w:asciiTheme="minorHAnsi" w:cstheme="minorHAnsi" w:hAnsiTheme="minorHAnsi" w:eastAsia="Calibri"/>
           <w:b/>
           <w:bCs/>
           <w:sz w:val="18"/>
@@ -6365,7 +6365,7 @@
       </w:r>
       <w:r>
         <w:rPr>
-          <w:rFonts w:cs="Calibri" w:ascii="Calibri" w:hAnsi="Calibri" w:asciiTheme="minorHAnsi" w:cstheme="minorHAnsi" w:hAnsiTheme="minorHAnsi"/>
+          <w:rFonts w:cs="Calibri" w:ascii="Calibri" w:hAnsi="Calibri" w:asciiTheme="minorHAnsi" w:cstheme="minorHAnsi" w:hAnsiTheme="minorHAnsi" w:eastAsia="Calibri"/>
           <w:sz w:val="18"/>
           <w:szCs w:val="18"/>
         </w:rPr>
@@ -6373,7 +6373,7 @@
       </w:r>
       <w:r>
         <w:rPr>
-          <w:rFonts w:cs="Calibri" w:ascii="Calibri" w:hAnsi="Calibri" w:asciiTheme="minorHAnsi" w:cstheme="minorHAnsi" w:hAnsiTheme="minorHAnsi"/>
+          <w:rFonts w:cs="Calibri" w:ascii="Calibri" w:hAnsi="Calibri" w:asciiTheme="minorHAnsi" w:cstheme="minorHAnsi" w:hAnsiTheme="minorHAnsi" w:eastAsia="Calibri"/>
           <w:b/>
           <w:bCs/>
           <w:sz w:val="18"/>
@@ -6383,7 +6383,7 @@
       </w:r>
       <w:r>
         <w:rPr>
-          <w:rFonts w:cs="Calibri" w:ascii="Calibri" w:hAnsi="Calibri" w:asciiTheme="minorHAnsi" w:cstheme="minorHAnsi" w:hAnsiTheme="minorHAnsi"/>
+          <w:rFonts w:cs="Calibri" w:ascii="Calibri" w:hAnsi="Calibri" w:asciiTheme="minorHAnsi" w:cstheme="minorHAnsi" w:hAnsiTheme="minorHAnsi" w:eastAsia="Calibri"/>
           <w:sz w:val="18"/>
           <w:szCs w:val="18"/>
         </w:rPr>
@@ -6391,7 +6391,7 @@
       </w:r>
       <w:r>
         <w:rPr>
-          <w:rFonts w:cs="Calibri" w:ascii="Calibri" w:hAnsi="Calibri" w:asciiTheme="minorHAnsi" w:cstheme="minorHAnsi" w:hAnsiTheme="minorHAnsi"/>
+          <w:rFonts w:cs="Calibri" w:ascii="Calibri" w:hAnsi="Calibri" w:asciiTheme="minorHAnsi" w:cstheme="minorHAnsi" w:hAnsiTheme="minorHAnsi" w:eastAsia="Calibri"/>
           <w:b/>
           <w:bCs/>
           <w:sz w:val="18"/>
@@ -6401,7 +6401,7 @@
       </w:r>
       <w:r>
         <w:rPr>
-          <w:rFonts w:cs="Calibri" w:ascii="Calibri" w:hAnsi="Calibri" w:asciiTheme="minorHAnsi" w:cstheme="minorHAnsi" w:hAnsiTheme="minorHAnsi"/>
+          <w:rFonts w:cs="Calibri" w:ascii="Calibri" w:hAnsi="Calibri" w:asciiTheme="minorHAnsi" w:cstheme="minorHAnsi" w:hAnsiTheme="minorHAnsi" w:eastAsia="Calibri"/>
           <w:sz w:val="18"/>
           <w:szCs w:val="18"/>
         </w:rPr>
@@ -6409,7 +6409,7 @@
       </w:r>
       <w:r>
         <w:rPr>
-          <w:rFonts w:cs="Calibri" w:ascii="Calibri" w:hAnsi="Calibri" w:asciiTheme="minorHAnsi" w:cstheme="minorHAnsi" w:hAnsiTheme="minorHAnsi"/>
+          <w:rFonts w:cs="Calibri" w:ascii="Calibri" w:hAnsi="Calibri" w:asciiTheme="minorHAnsi" w:cstheme="minorHAnsi" w:hAnsiTheme="minorHAnsi" w:eastAsia="Calibri"/>
           <w:b/>
           <w:bCs/>
           <w:sz w:val="18"/>
@@ -6419,7 +6419,7 @@
       </w:r>
       <w:r>
         <w:rPr>
-          <w:rFonts w:cs="Calibri" w:ascii="Calibri" w:hAnsi="Calibri" w:asciiTheme="minorHAnsi" w:cstheme="minorHAnsi" w:hAnsiTheme="minorHAnsi"/>
+          <w:rFonts w:cs="Calibri" w:ascii="Calibri" w:hAnsi="Calibri" w:asciiTheme="minorHAnsi" w:cstheme="minorHAnsi" w:hAnsiTheme="minorHAnsi" w:eastAsia="Calibri"/>
           <w:sz w:val="18"/>
           <w:szCs w:val="18"/>
         </w:rPr>
@@ -6442,7 +6442,7 @@
       </w:pPr>
       <w:r>
         <w:rPr>
-          <w:rFonts w:cs="Calibri" w:ascii="Calibri" w:hAnsi="Calibri" w:asciiTheme="minorHAnsi" w:cstheme="minorHAnsi" w:hAnsiTheme="minorHAnsi"/>
+          <w:rFonts w:cs="Calibri" w:ascii="Calibri" w:hAnsi="Calibri" w:asciiTheme="minorHAnsi" w:cstheme="minorHAnsi" w:hAnsiTheme="minorHAnsi" w:eastAsia="Calibri"/>
           <w:b/>
           <w:sz w:val="18"/>
           <w:szCs w:val="18"/>
@@ -6464,7 +6464,7 @@
       </w:pPr>
       <w:r>
         <w:rPr>
-          <w:rFonts w:cs="Calibri" w:ascii="Calibri" w:hAnsi="Calibri" w:asciiTheme="minorHAnsi" w:cstheme="minorHAnsi" w:hAnsiTheme="minorHAnsi"/>
+          <w:rFonts w:cs="Calibri" w:ascii="Calibri" w:hAnsi="Calibri" w:asciiTheme="minorHAnsi" w:cstheme="minorHAnsi" w:hAnsiTheme="minorHAnsi" w:eastAsia="Calibri"/>
           <w:b/>
           <w:bCs/>
           <w:sz w:val="18"/>
@@ -6474,7 +6474,7 @@
       </w:r>
       <w:r>
         <w:rPr>
-          <w:rFonts w:cs="Calibri" w:ascii="Calibri" w:hAnsi="Calibri" w:asciiTheme="minorHAnsi" w:cstheme="minorHAnsi" w:hAnsiTheme="minorHAnsi"/>
+          <w:rFonts w:cs="Calibri" w:ascii="Calibri" w:hAnsi="Calibri" w:asciiTheme="minorHAnsi" w:cstheme="minorHAnsi" w:hAnsiTheme="minorHAnsi" w:eastAsia="Calibri"/>
           <w:sz w:val="18"/>
           <w:szCs w:val="18"/>
         </w:rPr>
@@ -6482,7 +6482,7 @@
       </w:r>
       <w:r>
         <w:rPr>
-          <w:rFonts w:cs="Calibri" w:ascii="Calibri" w:hAnsi="Calibri" w:asciiTheme="minorHAnsi" w:cstheme="minorHAnsi" w:hAnsiTheme="minorHAnsi"/>
+          <w:rFonts w:cs="Calibri" w:ascii="Calibri" w:hAnsi="Calibri" w:asciiTheme="minorHAnsi" w:cstheme="minorHAnsi" w:hAnsiTheme="minorHAnsi" w:eastAsia="Calibri"/>
           <w:b/>
           <w:bCs/>
           <w:sz w:val="18"/>
@@ -6493,7 +6493,7 @@
       </w:r>
       <w:r>
         <w:rPr>
-          <w:rFonts w:cs="Calibri" w:ascii="Calibri" w:hAnsi="Calibri" w:asciiTheme="minorHAnsi" w:cstheme="minorHAnsi" w:hAnsiTheme="minorHAnsi"/>
+          <w:rFonts w:cs="Calibri" w:ascii="Calibri" w:hAnsi="Calibri" w:asciiTheme="minorHAnsi" w:cstheme="minorHAnsi" w:hAnsiTheme="minorHAnsi" w:eastAsia="Calibri"/>
           <w:sz w:val="18"/>
           <w:szCs w:val="18"/>
         </w:rPr>
@@ -6516,7 +6516,7 @@
       </w:pPr>
       <w:r>
         <w:rPr>
-          <w:rFonts w:cs="Calibri" w:ascii="Calibri" w:hAnsi="Calibri" w:asciiTheme="minorHAnsi" w:cstheme="minorHAnsi" w:hAnsiTheme="minorHAnsi"/>
+          <w:rFonts w:cs="Calibri" w:ascii="Calibri" w:hAnsi="Calibri" w:asciiTheme="minorHAnsi" w:cstheme="minorHAnsi" w:hAnsiTheme="minorHAnsi" w:eastAsia="Calibri"/>
           <w:b/>
           <w:sz w:val="18"/>
           <w:szCs w:val="18"/>
@@ -6538,7 +6538,7 @@
       </w:pPr>
       <w:r>
         <w:rPr>
-          <w:rFonts w:cs="Calibri" w:ascii="Calibri" w:hAnsi="Calibri" w:asciiTheme="minorHAnsi" w:cstheme="minorHAnsi" w:hAnsiTheme="minorHAnsi"/>
+          <w:rFonts w:cs="Calibri" w:ascii="Calibri" w:hAnsi="Calibri" w:asciiTheme="minorHAnsi" w:cstheme="minorHAnsi" w:hAnsiTheme="minorHAnsi" w:eastAsia="Calibri"/>
           <w:b/>
           <w:sz w:val="18"/>
           <w:szCs w:val="18"/>
@@ -6547,7 +6547,7 @@
       </w:r>
       <w:r>
         <w:rPr>
-          <w:rFonts w:cs="Calibri" w:ascii="Calibri" w:hAnsi="Calibri" w:asciiTheme="minorHAnsi" w:cstheme="minorHAnsi" w:hAnsiTheme="minorHAnsi"/>
+          <w:rFonts w:cs="Calibri" w:ascii="Calibri" w:hAnsi="Calibri" w:asciiTheme="minorHAnsi" w:cstheme="minorHAnsi" w:hAnsiTheme="minorHAnsi" w:eastAsia="Calibri"/>
           <w:sz w:val="18"/>
           <w:szCs w:val="18"/>
         </w:rPr>
@@ -6568,7 +6568,7 @@
       </w:pPr>
       <w:r>
         <w:rPr>
-          <w:rFonts w:cs="Calibri" w:ascii="Calibri" w:hAnsi="Calibri" w:asciiTheme="minorHAnsi" w:cstheme="minorHAnsi" w:hAnsiTheme="minorHAnsi"/>
+          <w:rFonts w:cs="Calibri" w:ascii="Calibri" w:hAnsi="Calibri" w:asciiTheme="minorHAnsi" w:cstheme="minorHAnsi" w:hAnsiTheme="minorHAnsi" w:eastAsia="Calibri"/>
           <w:b/>
           <w:bCs/>
           <w:sz w:val="18"/>
@@ -6578,7 +6578,7 @@
       </w:r>
       <w:r>
         <w:rPr>
-          <w:rFonts w:cs="Calibri" w:ascii="Calibri" w:hAnsi="Calibri" w:asciiTheme="minorHAnsi" w:cstheme="minorHAnsi" w:hAnsiTheme="minorHAnsi"/>
+          <w:rFonts w:cs="Calibri" w:ascii="Calibri" w:hAnsi="Calibri" w:asciiTheme="minorHAnsi" w:cstheme="minorHAnsi" w:hAnsiTheme="minorHAnsi" w:eastAsia="Calibri"/>
           <w:sz w:val="18"/>
           <w:szCs w:val="18"/>
         </w:rPr>
@@ -6586,7 +6586,7 @@
       </w:r>
       <w:r>
         <w:rPr>
-          <w:rFonts w:cs="Calibri" w:ascii="Calibri" w:hAnsi="Calibri" w:asciiTheme="minorHAnsi" w:cstheme="minorHAnsi" w:hAnsiTheme="minorHAnsi"/>
+          <w:rFonts w:cs="Calibri" w:ascii="Calibri" w:hAnsi="Calibri" w:asciiTheme="minorHAnsi" w:cstheme="minorHAnsi" w:hAnsiTheme="minorHAnsi" w:eastAsia="Calibri"/>
           <w:b/>
           <w:bCs/>
           <w:sz w:val="18"/>
@@ -6596,7 +6596,7 @@
       </w:r>
       <w:r>
         <w:rPr>
-          <w:rFonts w:cs="Calibri" w:ascii="Calibri" w:hAnsi="Calibri" w:asciiTheme="minorHAnsi" w:cstheme="minorHAnsi" w:hAnsiTheme="minorHAnsi"/>
+          <w:rFonts w:cs="Calibri" w:ascii="Calibri" w:hAnsi="Calibri" w:asciiTheme="minorHAnsi" w:cstheme="minorHAnsi" w:hAnsiTheme="minorHAnsi" w:eastAsia="Calibri"/>
           <w:sz w:val="18"/>
           <w:szCs w:val="18"/>
         </w:rPr>
@@ -6604,7 +6604,7 @@
       </w:r>
       <w:r>
         <w:rPr>
-          <w:rFonts w:cs="Calibri" w:ascii="Calibri" w:hAnsi="Calibri" w:asciiTheme="minorHAnsi" w:cstheme="minorHAnsi" w:hAnsiTheme="minorHAnsi"/>
+          <w:rFonts w:cs="Calibri" w:ascii="Calibri" w:hAnsi="Calibri" w:asciiTheme="minorHAnsi" w:cstheme="minorHAnsi" w:hAnsiTheme="minorHAnsi" w:eastAsia="Calibri"/>
           <w:b/>
           <w:bCs/>
           <w:sz w:val="18"/>
@@ -6614,7 +6614,7 @@
       </w:r>
       <w:r>
         <w:rPr>
-          <w:rFonts w:cs="Calibri" w:ascii="Calibri" w:hAnsi="Calibri" w:asciiTheme="minorHAnsi" w:cstheme="minorHAnsi" w:hAnsiTheme="minorHAnsi"/>
+          <w:rFonts w:cs="Calibri" w:ascii="Calibri" w:hAnsi="Calibri" w:asciiTheme="minorHAnsi" w:cstheme="minorHAnsi" w:hAnsiTheme="minorHAnsi" w:eastAsia="Calibri"/>
           <w:sz w:val="18"/>
           <w:szCs w:val="18"/>
         </w:rPr>
@@ -6622,7 +6622,7 @@
       </w:r>
       <w:r>
         <w:rPr>
-          <w:rFonts w:cs="Calibri" w:ascii="Calibri" w:hAnsi="Calibri" w:asciiTheme="minorHAnsi" w:cstheme="minorHAnsi" w:hAnsiTheme="minorHAnsi"/>
+          <w:rFonts w:cs="Calibri" w:ascii="Calibri" w:hAnsi="Calibri" w:asciiTheme="minorHAnsi" w:cstheme="minorHAnsi" w:hAnsiTheme="minorHAnsi" w:eastAsia="Calibri"/>
           <w:b/>
           <w:bCs/>
           <w:sz w:val="18"/>
@@ -6632,7 +6632,7 @@
       </w:r>
       <w:r>
         <w:rPr>
-          <w:rFonts w:cs="Calibri" w:ascii="Calibri" w:hAnsi="Calibri" w:asciiTheme="minorHAnsi" w:cstheme="minorHAnsi" w:hAnsiTheme="minorHAnsi"/>
+          <w:rFonts w:cs="Calibri" w:ascii="Calibri" w:hAnsi="Calibri" w:asciiTheme="minorHAnsi" w:cstheme="minorHAnsi" w:hAnsiTheme="minorHAnsi" w:eastAsia="Calibri"/>
           <w:sz w:val="18"/>
           <w:szCs w:val="18"/>
         </w:rPr>
@@ -6640,7 +6640,7 @@
       </w:r>
       <w:r>
         <w:rPr>
-          <w:rFonts w:cs="Calibri" w:ascii="Calibri" w:hAnsi="Calibri" w:asciiTheme="minorHAnsi" w:cstheme="minorHAnsi" w:hAnsiTheme="minorHAnsi"/>
+          <w:rFonts w:cs="Calibri" w:ascii="Calibri" w:hAnsi="Calibri" w:asciiTheme="minorHAnsi" w:cstheme="minorHAnsi" w:hAnsiTheme="minorHAnsi" w:eastAsia="Calibri"/>
           <w:b/>
           <w:bCs/>
           <w:sz w:val="18"/>
@@ -6650,7 +6650,7 @@
       </w:r>
       <w:r>
         <w:rPr>
-          <w:rFonts w:cs="Calibri" w:ascii="Calibri" w:hAnsi="Calibri" w:asciiTheme="minorHAnsi" w:cstheme="minorHAnsi" w:hAnsiTheme="minorHAnsi"/>
+          <w:rFonts w:cs="Calibri" w:ascii="Calibri" w:hAnsi="Calibri" w:asciiTheme="minorHAnsi" w:cstheme="minorHAnsi" w:hAnsiTheme="minorHAnsi" w:eastAsia="Calibri"/>
           <w:sz w:val="18"/>
           <w:szCs w:val="18"/>
         </w:rPr>
@@ -6658,7 +6658,7 @@
       </w:r>
       <w:r>
         <w:rPr>
-          <w:rFonts w:cs="Calibri" w:ascii="Calibri" w:hAnsi="Calibri" w:asciiTheme="minorHAnsi" w:cstheme="minorHAnsi" w:hAnsiTheme="minorHAnsi"/>
+          <w:rFonts w:cs="Calibri" w:ascii="Calibri" w:hAnsi="Calibri" w:asciiTheme="minorHAnsi" w:cstheme="minorHAnsi" w:hAnsiTheme="minorHAnsi" w:eastAsia="Calibri"/>
           <w:b/>
           <w:bCs/>
           <w:sz w:val="18"/>
@@ -6668,7 +6668,7 @@
       </w:r>
       <w:r>
         <w:rPr>
-          <w:rFonts w:cs="Calibri" w:ascii="Calibri" w:hAnsi="Calibri" w:asciiTheme="minorHAnsi" w:cstheme="minorHAnsi" w:hAnsiTheme="minorHAnsi"/>
+          <w:rFonts w:cs="Calibri" w:ascii="Calibri" w:hAnsi="Calibri" w:asciiTheme="minorHAnsi" w:cstheme="minorHAnsi" w:hAnsiTheme="minorHAnsi" w:eastAsia="Calibri"/>
           <w:sz w:val="18"/>
           <w:szCs w:val="18"/>
         </w:rPr>
@@ -6676,7 +6676,7 @@
       </w:r>
       <w:r>
         <w:rPr>
-          <w:rFonts w:cs="Calibri" w:ascii="Calibri" w:hAnsi="Calibri" w:asciiTheme="minorHAnsi" w:cstheme="minorHAnsi" w:hAnsiTheme="minorHAnsi"/>
+          <w:rFonts w:cs="Calibri" w:ascii="Calibri" w:hAnsi="Calibri" w:asciiTheme="minorHAnsi" w:cstheme="minorHAnsi" w:hAnsiTheme="minorHAnsi" w:eastAsia="Calibri"/>
           <w:b/>
           <w:bCs/>
           <w:sz w:val="18"/>
@@ -6686,7 +6686,7 @@
       </w:r>
       <w:r>
         <w:rPr>
-          <w:rFonts w:cs="Calibri" w:ascii="Calibri" w:hAnsi="Calibri" w:asciiTheme="minorHAnsi" w:cstheme="minorHAnsi" w:hAnsiTheme="minorHAnsi"/>
+          <w:rFonts w:cs="Calibri" w:ascii="Calibri" w:hAnsi="Calibri" w:asciiTheme="minorHAnsi" w:cstheme="minorHAnsi" w:hAnsiTheme="minorHAnsi" w:eastAsia="Calibri"/>
           <w:sz w:val="18"/>
           <w:szCs w:val="18"/>
         </w:rPr>
@@ -6694,7 +6694,7 @@
       </w:r>
       <w:r>
         <w:rPr>
-          <w:rFonts w:cs="Calibri" w:ascii="Calibri" w:hAnsi="Calibri" w:asciiTheme="minorHAnsi" w:cstheme="minorHAnsi" w:hAnsiTheme="minorHAnsi"/>
+          <w:rFonts w:cs="Calibri" w:ascii="Calibri" w:hAnsi="Calibri" w:asciiTheme="minorHAnsi" w:cstheme="minorHAnsi" w:hAnsiTheme="minorHAnsi" w:eastAsia="Calibri"/>
           <w:b/>
           <w:bCs/>
           <w:sz w:val="18"/>
@@ -6704,7 +6704,7 @@
       </w:r>
       <w:r>
         <w:rPr>
-          <w:rFonts w:cs="Calibri" w:ascii="Calibri" w:hAnsi="Calibri" w:asciiTheme="minorHAnsi" w:cstheme="minorHAnsi" w:hAnsiTheme="minorHAnsi"/>
+          <w:rFonts w:cs="Calibri" w:ascii="Calibri" w:hAnsi="Calibri" w:asciiTheme="minorHAnsi" w:cstheme="minorHAnsi" w:hAnsiTheme="minorHAnsi" w:eastAsia="Calibri"/>
           <w:sz w:val="18"/>
           <w:szCs w:val="18"/>
         </w:rPr>
@@ -6725,7 +6725,7 @@
       </w:pPr>
       <w:r>
         <w:rPr>
-          <w:rFonts w:cs="Calibri" w:ascii="Calibri" w:hAnsi="Calibri" w:asciiTheme="minorHAnsi" w:cstheme="minorHAnsi" w:hAnsiTheme="minorHAnsi"/>
+          <w:rFonts w:cs="Calibri" w:ascii="Calibri" w:hAnsi="Calibri" w:asciiTheme="minorHAnsi" w:cstheme="minorHAnsi" w:hAnsiTheme="minorHAnsi" w:eastAsia="Calibri"/>
           <w:b/>
           <w:bCs/>
           <w:sz w:val="18"/>
@@ -6735,7 +6735,7 @@
       </w:r>
       <w:r>
         <w:rPr>
-          <w:rFonts w:cs="Calibri" w:ascii="Calibri" w:hAnsi="Calibri" w:asciiTheme="minorHAnsi" w:cstheme="minorHAnsi" w:hAnsiTheme="minorHAnsi"/>
+          <w:rFonts w:cs="Calibri" w:ascii="Calibri" w:hAnsi="Calibri" w:asciiTheme="minorHAnsi" w:cstheme="minorHAnsi" w:hAnsiTheme="minorHAnsi" w:eastAsia="Calibri"/>
           <w:sz w:val="18"/>
           <w:szCs w:val="18"/>
         </w:rPr>
@@ -6743,7 +6743,7 @@
       </w:r>
       <w:r>
         <w:rPr>
-          <w:rFonts w:cs="Calibri" w:ascii="Calibri" w:hAnsi="Calibri" w:asciiTheme="minorHAnsi" w:cstheme="minorHAnsi" w:hAnsiTheme="minorHAnsi"/>
+          <w:rFonts w:cs="Calibri" w:ascii="Calibri" w:hAnsi="Calibri" w:asciiTheme="minorHAnsi" w:cstheme="minorHAnsi" w:hAnsiTheme="minorHAnsi" w:eastAsia="Calibri"/>
           <w:b/>
           <w:bCs/>
           <w:sz w:val="18"/>
@@ -6753,7 +6753,7 @@
       </w:r>
       <w:r>
         <w:rPr>
-          <w:rFonts w:cs="Calibri" w:ascii="Calibri" w:hAnsi="Calibri" w:asciiTheme="minorHAnsi" w:cstheme="minorHAnsi" w:hAnsiTheme="minorHAnsi"/>
+          <w:rFonts w:cs="Calibri" w:ascii="Calibri" w:hAnsi="Calibri" w:asciiTheme="minorHAnsi" w:cstheme="minorHAnsi" w:hAnsiTheme="minorHAnsi" w:eastAsia="Calibri"/>
           <w:sz w:val="18"/>
           <w:szCs w:val="18"/>
         </w:rPr>
@@ -6761,7 +6761,7 @@
       </w:r>
       <w:r>
         <w:rPr>
-          <w:rFonts w:cs="Calibri" w:ascii="Calibri" w:hAnsi="Calibri" w:asciiTheme="minorHAnsi" w:cstheme="minorHAnsi" w:hAnsiTheme="minorHAnsi"/>
+          <w:rFonts w:cs="Calibri" w:ascii="Calibri" w:hAnsi="Calibri" w:asciiTheme="minorHAnsi" w:cstheme="minorHAnsi" w:hAnsiTheme="minorHAnsi" w:eastAsia="Calibri"/>
           <w:b/>
           <w:bCs/>
           <w:sz w:val="18"/>
@@ -6771,7 +6771,7 @@
       </w:r>
       <w:r>
         <w:rPr>
-          <w:rFonts w:cs="Calibri" w:ascii="Calibri" w:hAnsi="Calibri" w:asciiTheme="minorHAnsi" w:cstheme="minorHAnsi" w:hAnsiTheme="minorHAnsi"/>
+          <w:rFonts w:cs="Calibri" w:ascii="Calibri" w:hAnsi="Calibri" w:asciiTheme="minorHAnsi" w:cstheme="minorHAnsi" w:hAnsiTheme="minorHAnsi" w:eastAsia="Calibri"/>
           <w:sz w:val="18"/>
           <w:szCs w:val="18"/>
         </w:rPr>
@@ -6792,7 +6792,7 @@
       </w:pPr>
       <w:r>
         <w:rPr>
-          <w:rFonts w:cs="Calibri" w:ascii="Calibri" w:hAnsi="Calibri" w:asciiTheme="minorHAnsi" w:cstheme="minorHAnsi" w:hAnsiTheme="minorHAnsi"/>
+          <w:rFonts w:cs="Calibri" w:ascii="Calibri" w:hAnsi="Calibri" w:asciiTheme="minorHAnsi" w:cstheme="minorHAnsi" w:hAnsiTheme="minorHAnsi" w:eastAsia="Calibri"/>
           <w:b/>
           <w:bCs/>
           <w:sz w:val="18"/>
@@ -6802,7 +6802,7 @@
       </w:r>
       <w:r>
         <w:rPr>
-          <w:rFonts w:cs="Calibri" w:ascii="Calibri" w:hAnsi="Calibri" w:asciiTheme="minorHAnsi" w:cstheme="minorHAnsi" w:hAnsiTheme="minorHAnsi"/>
+          <w:rFonts w:cs="Calibri" w:ascii="Calibri" w:hAnsi="Calibri" w:asciiTheme="minorHAnsi" w:cstheme="minorHAnsi" w:hAnsiTheme="minorHAnsi" w:eastAsia="Calibri"/>
           <w:sz w:val="18"/>
           <w:szCs w:val="18"/>
         </w:rPr>
@@ -6810,7 +6810,7 @@
       </w:r>
       <w:r>
         <w:rPr>
-          <w:rFonts w:cs="Calibri" w:ascii="Calibri" w:hAnsi="Calibri" w:asciiTheme="minorHAnsi" w:cstheme="minorHAnsi" w:hAnsiTheme="minorHAnsi"/>
+          <w:rFonts w:cs="Calibri" w:ascii="Calibri" w:hAnsi="Calibri" w:asciiTheme="minorHAnsi" w:cstheme="minorHAnsi" w:hAnsiTheme="minorHAnsi" w:eastAsia="Calibri"/>
           <w:b/>
           <w:bCs/>
           <w:sz w:val="18"/>
@@ -6820,7 +6820,7 @@
       </w:r>
       <w:r>
         <w:rPr>
-          <w:rFonts w:cs="Calibri" w:ascii="Calibri" w:hAnsi="Calibri" w:asciiTheme="minorHAnsi" w:cstheme="minorHAnsi" w:hAnsiTheme="minorHAnsi"/>
+          <w:rFonts w:cs="Calibri" w:ascii="Calibri" w:hAnsi="Calibri" w:asciiTheme="minorHAnsi" w:cstheme="minorHAnsi" w:hAnsiTheme="minorHAnsi" w:eastAsia="Calibri"/>
           <w:sz w:val="18"/>
           <w:szCs w:val="18"/>
         </w:rPr>
@@ -6828,7 +6828,7 @@
       </w:r>
       <w:r>
         <w:rPr>
-          <w:rFonts w:cs="Calibri" w:ascii="Calibri" w:hAnsi="Calibri" w:asciiTheme="minorHAnsi" w:cstheme="minorHAnsi" w:hAnsiTheme="minorHAnsi"/>
+          <w:rFonts w:cs="Calibri" w:ascii="Calibri" w:hAnsi="Calibri" w:asciiTheme="minorHAnsi" w:cstheme="minorHAnsi" w:hAnsiTheme="minorHAnsi" w:eastAsia="Calibri"/>
           <w:b/>
           <w:bCs/>
           <w:sz w:val="18"/>
@@ -6838,7 +6838,7 @@
       </w:r>
       <w:r>
         <w:rPr>
-          <w:rFonts w:cs="Calibri" w:ascii="Calibri" w:hAnsi="Calibri" w:asciiTheme="minorHAnsi" w:cstheme="minorHAnsi" w:hAnsiTheme="minorHAnsi"/>
+          <w:rFonts w:cs="Calibri" w:ascii="Calibri" w:hAnsi="Calibri" w:asciiTheme="minorHAnsi" w:cstheme="minorHAnsi" w:hAnsiTheme="minorHAnsi" w:eastAsia="Calibri"/>
           <w:sz w:val="18"/>
           <w:szCs w:val="18"/>
         </w:rPr>
@@ -6846,7 +6846,7 @@
       </w:r>
       <w:r>
         <w:rPr>
-          <w:rFonts w:cs="Calibri" w:ascii="Calibri" w:hAnsi="Calibri" w:asciiTheme="minorHAnsi" w:cstheme="minorHAnsi" w:hAnsiTheme="minorHAnsi"/>
+          <w:rFonts w:cs="Calibri" w:ascii="Calibri" w:hAnsi="Calibri" w:asciiTheme="minorHAnsi" w:cstheme="minorHAnsi" w:hAnsiTheme="minorHAnsi" w:eastAsia="Calibri"/>
           <w:b/>
           <w:bCs/>
           <w:sz w:val="18"/>
@@ -6856,7 +6856,7 @@
       </w:r>
       <w:r>
         <w:rPr>
-          <w:rFonts w:cs="Calibri" w:ascii="Calibri" w:hAnsi="Calibri" w:asciiTheme="minorHAnsi" w:cstheme="minorHAnsi" w:hAnsiTheme="minorHAnsi"/>
+          <w:rFonts w:cs="Calibri" w:ascii="Calibri" w:hAnsi="Calibri" w:asciiTheme="minorHAnsi" w:cstheme="minorHAnsi" w:hAnsiTheme="minorHAnsi" w:eastAsia="Calibri"/>
           <w:sz w:val="18"/>
           <w:szCs w:val="18"/>
         </w:rPr>
@@ -6864,7 +6864,7 @@
       </w:r>
       <w:r>
         <w:rPr>
-          <w:rFonts w:cs="Calibri" w:ascii="Calibri" w:hAnsi="Calibri" w:asciiTheme="minorHAnsi" w:cstheme="minorHAnsi" w:hAnsiTheme="minorHAnsi"/>
+          <w:rFonts w:cs="Calibri" w:ascii="Calibri" w:hAnsi="Calibri" w:asciiTheme="minorHAnsi" w:cstheme="minorHAnsi" w:hAnsiTheme="minorHAnsi" w:eastAsia="Calibri"/>
           <w:b/>
           <w:bCs/>
           <w:sz w:val="18"/>
@@ -6874,7 +6874,7 @@
       </w:r>
       <w:r>
         <w:rPr>
-          <w:rFonts w:cs="Calibri" w:ascii="Calibri" w:hAnsi="Calibri" w:asciiTheme="minorHAnsi" w:cstheme="minorHAnsi" w:hAnsiTheme="minorHAnsi"/>
+          <w:rFonts w:cs="Calibri" w:ascii="Calibri" w:hAnsi="Calibri" w:asciiTheme="minorHAnsi" w:cstheme="minorHAnsi" w:hAnsiTheme="minorHAnsi" w:eastAsia="Calibri"/>
           <w:sz w:val="18"/>
           <w:szCs w:val="18"/>
         </w:rPr>
@@ -6882,7 +6882,7 @@
       </w:r>
       <w:r>
         <w:rPr>
-          <w:rFonts w:cs="Calibri" w:ascii="Calibri" w:hAnsi="Calibri" w:asciiTheme="minorHAnsi" w:cstheme="minorHAnsi" w:hAnsiTheme="minorHAnsi"/>
+          <w:rFonts w:cs="Calibri" w:ascii="Calibri" w:hAnsi="Calibri" w:asciiTheme="minorHAnsi" w:cstheme="minorHAnsi" w:hAnsiTheme="minorHAnsi" w:eastAsia="Calibri"/>
           <w:b/>
           <w:bCs/>
           <w:sz w:val="18"/>
@@ -6892,7 +6892,7 @@
       </w:r>
       <w:r>
         <w:rPr>
-          <w:rFonts w:cs="Calibri" w:ascii="Calibri" w:hAnsi="Calibri" w:asciiTheme="minorHAnsi" w:cstheme="minorHAnsi" w:hAnsiTheme="minorHAnsi"/>
+          <w:rFonts w:cs="Calibri" w:ascii="Calibri" w:hAnsi="Calibri" w:asciiTheme="minorHAnsi" w:cstheme="minorHAnsi" w:hAnsiTheme="minorHAnsi" w:eastAsia="Calibri"/>
           <w:sz w:val="18"/>
           <w:szCs w:val="18"/>
         </w:rPr>
@@ -6900,7 +6900,7 @@
       </w:r>
       <w:r>
         <w:rPr>
-          <w:rFonts w:cs="Calibri" w:ascii="Calibri" w:hAnsi="Calibri" w:asciiTheme="minorHAnsi" w:cstheme="minorHAnsi" w:hAnsiTheme="minorHAnsi"/>
+          <w:rFonts w:cs="Calibri" w:ascii="Calibri" w:hAnsi="Calibri" w:asciiTheme="minorHAnsi" w:cstheme="minorHAnsi" w:hAnsiTheme="minorHAnsi" w:eastAsia="Calibri"/>
           <w:b/>
           <w:bCs/>
           <w:sz w:val="18"/>
@@ -6910,7 +6910,7 @@
       </w:r>
       <w:r>
         <w:rPr>
-          <w:rFonts w:cs="Calibri" w:ascii="Calibri" w:hAnsi="Calibri" w:asciiTheme="minorHAnsi" w:cstheme="minorHAnsi" w:hAnsiTheme="minorHAnsi"/>
+          <w:rFonts w:cs="Calibri" w:ascii="Calibri" w:hAnsi="Calibri" w:asciiTheme="minorHAnsi" w:cstheme="minorHAnsi" w:hAnsiTheme="minorHAnsi" w:eastAsia="Calibri"/>
           <w:sz w:val="18"/>
           <w:szCs w:val="18"/>
         </w:rPr>
@@ -6931,7 +6931,7 @@
       </w:pPr>
       <w:r>
         <w:rPr>
-          <w:rFonts w:cs="Calibri" w:ascii="Calibri" w:hAnsi="Calibri" w:asciiTheme="minorHAnsi" w:cstheme="minorHAnsi" w:hAnsiTheme="minorHAnsi"/>
+          <w:rFonts w:cs="Calibri" w:ascii="Calibri" w:hAnsi="Calibri" w:asciiTheme="minorHAnsi" w:cstheme="minorHAnsi" w:hAnsiTheme="minorHAnsi" w:eastAsia="Calibri"/>
           <w:sz w:val="18"/>
           <w:szCs w:val="18"/>
         </w:rPr>
@@ -6939,7 +6939,7 @@
       </w:r>
       <w:r>
         <w:rPr>
-          <w:rFonts w:cs="Calibri" w:ascii="Calibri" w:hAnsi="Calibri" w:asciiTheme="minorHAnsi" w:cstheme="minorHAnsi" w:hAnsiTheme="minorHAnsi"/>
+          <w:rFonts w:cs="Calibri" w:ascii="Calibri" w:hAnsi="Calibri" w:asciiTheme="minorHAnsi" w:cstheme="minorHAnsi" w:hAnsiTheme="minorHAnsi" w:eastAsia="Calibri"/>
           <w:b/>
           <w:bCs/>
           <w:sz w:val="18"/>
@@ -6949,7 +6949,7 @@
       </w:r>
       <w:r>
         <w:rPr>
-          <w:rFonts w:cs="Calibri" w:ascii="Calibri" w:hAnsi="Calibri" w:asciiTheme="minorHAnsi" w:cstheme="minorHAnsi" w:hAnsiTheme="minorHAnsi"/>
+          <w:rFonts w:cs="Calibri" w:ascii="Calibri" w:hAnsi="Calibri" w:asciiTheme="minorHAnsi" w:cstheme="minorHAnsi" w:hAnsiTheme="minorHAnsi" w:eastAsia="Calibri"/>
           <w:sz w:val="18"/>
           <w:szCs w:val="18"/>
         </w:rPr>
@@ -6957,7 +6957,7 @@
       </w:r>
       <w:r>
         <w:rPr>
-          <w:rFonts w:cs="Calibri" w:ascii="Calibri" w:hAnsi="Calibri" w:asciiTheme="minorHAnsi" w:cstheme="minorHAnsi" w:hAnsiTheme="minorHAnsi"/>
+          <w:rFonts w:cs="Calibri" w:ascii="Calibri" w:hAnsi="Calibri" w:asciiTheme="minorHAnsi" w:cstheme="minorHAnsi" w:hAnsiTheme="minorHAnsi" w:eastAsia="Calibri"/>
           <w:b/>
           <w:bCs/>
           <w:sz w:val="18"/>
@@ -6967,7 +6967,7 @@
       </w:r>
       <w:r>
         <w:rPr>
-          <w:rFonts w:cs="Calibri" w:ascii="Calibri" w:hAnsi="Calibri" w:asciiTheme="minorHAnsi" w:cstheme="minorHAnsi" w:hAnsiTheme="minorHAnsi"/>
+          <w:rFonts w:cs="Calibri" w:ascii="Calibri" w:hAnsi="Calibri" w:asciiTheme="minorHAnsi" w:cstheme="minorHAnsi" w:hAnsiTheme="minorHAnsi" w:eastAsia="Calibri"/>
           <w:sz w:val="18"/>
           <w:szCs w:val="18"/>
         </w:rPr>
@@ -6975,7 +6975,7 @@
       </w:r>
       <w:r>
         <w:rPr>
-          <w:rFonts w:cs="Calibri" w:ascii="Calibri" w:hAnsi="Calibri" w:asciiTheme="minorHAnsi" w:cstheme="minorHAnsi" w:hAnsiTheme="minorHAnsi"/>
+          <w:rFonts w:cs="Calibri" w:ascii="Calibri" w:hAnsi="Calibri" w:asciiTheme="minorHAnsi" w:cstheme="minorHAnsi" w:hAnsiTheme="minorHAnsi" w:eastAsia="Calibri"/>
           <w:b/>
           <w:bCs/>
           <w:sz w:val="18"/>
@@ -6985,7 +6985,7 @@
       </w:r>
       <w:r>
         <w:rPr>
-          <w:rFonts w:cs="Calibri" w:ascii="Calibri" w:hAnsi="Calibri" w:asciiTheme="minorHAnsi" w:cstheme="minorHAnsi" w:hAnsiTheme="minorHAnsi"/>
+          <w:rFonts w:cs="Calibri" w:ascii="Calibri" w:hAnsi="Calibri" w:asciiTheme="minorHAnsi" w:cstheme="minorHAnsi" w:hAnsiTheme="minorHAnsi" w:eastAsia="Calibri"/>
           <w:sz w:val="18"/>
           <w:szCs w:val="18"/>
         </w:rPr>
@@ -6993,7 +6993,7 @@
       </w:r>
       <w:r>
         <w:rPr>
-          <w:rFonts w:cs="Calibri" w:ascii="Calibri" w:hAnsi="Calibri" w:asciiTheme="minorHAnsi" w:cstheme="minorHAnsi" w:hAnsiTheme="minorHAnsi"/>
+          <w:rFonts w:cs="Calibri" w:ascii="Calibri" w:hAnsi="Calibri" w:asciiTheme="minorHAnsi" w:cstheme="minorHAnsi" w:hAnsiTheme="minorHAnsi" w:eastAsia="Calibri"/>
           <w:b/>
           <w:bCs/>
           <w:sz w:val="18"/>
@@ -7003,7 +7003,7 @@
       </w:r>
       <w:r>
         <w:rPr>
-          <w:rFonts w:cs="Calibri" w:ascii="Calibri" w:hAnsi="Calibri" w:asciiTheme="minorHAnsi" w:cstheme="minorHAnsi" w:hAnsiTheme="minorHAnsi"/>
+          <w:rFonts w:cs="Calibri" w:ascii="Calibri" w:hAnsi="Calibri" w:asciiTheme="minorHAnsi" w:cstheme="minorHAnsi" w:hAnsiTheme="minorHAnsi" w:eastAsia="Calibri"/>
           <w:sz w:val="18"/>
           <w:szCs w:val="18"/>
         </w:rPr>
@@ -7011,7 +7011,7 @@
       </w:r>
       <w:r>
         <w:rPr>
-          <w:rFonts w:cs="Calibri" w:ascii="Calibri" w:hAnsi="Calibri" w:asciiTheme="minorHAnsi" w:cstheme="minorHAnsi" w:hAnsiTheme="minorHAnsi"/>
+          <w:rFonts w:cs="Calibri" w:ascii="Calibri" w:hAnsi="Calibri" w:asciiTheme="minorHAnsi" w:cstheme="minorHAnsi" w:hAnsiTheme="minorHAnsi" w:eastAsia="Calibri"/>
           <w:b/>
           <w:bCs/>
           <w:sz w:val="18"/>
@@ -7021,7 +7021,7 @@
       </w:r>
       <w:r>
         <w:rPr>
-          <w:rFonts w:cs="Calibri" w:ascii="Calibri" w:hAnsi="Calibri" w:asciiTheme="minorHAnsi" w:cstheme="minorHAnsi" w:hAnsiTheme="minorHAnsi"/>
+          <w:rFonts w:cs="Calibri" w:ascii="Calibri" w:hAnsi="Calibri" w:asciiTheme="minorHAnsi" w:cstheme="minorHAnsi" w:hAnsiTheme="minorHAnsi" w:eastAsia="Calibri"/>
           <w:sz w:val="18"/>
           <w:szCs w:val="18"/>
         </w:rPr>
@@ -7042,7 +7042,7 @@
       </w:pPr>
       <w:r>
         <w:rPr>
-          <w:rFonts w:cs="Calibri" w:ascii="Calibri" w:hAnsi="Calibri" w:asciiTheme="minorHAnsi" w:cstheme="minorHAnsi" w:hAnsiTheme="minorHAnsi"/>
+          <w:rFonts w:cs="Calibri" w:ascii="Calibri" w:hAnsi="Calibri" w:asciiTheme="minorHAnsi" w:cstheme="minorHAnsi" w:hAnsiTheme="minorHAnsi" w:eastAsia="Calibri"/>
           <w:b/>
           <w:bCs/>
           <w:sz w:val="18"/>
@@ -7052,7 +7052,7 @@
       </w:r>
       <w:r>
         <w:rPr>
-          <w:rFonts w:cs="Calibri" w:ascii="Calibri" w:hAnsi="Calibri" w:asciiTheme="minorHAnsi" w:cstheme="minorHAnsi" w:hAnsiTheme="minorHAnsi"/>
+          <w:rFonts w:cs="Calibri" w:ascii="Calibri" w:hAnsi="Calibri" w:asciiTheme="minorHAnsi" w:cstheme="minorHAnsi" w:hAnsiTheme="minorHAnsi" w:eastAsia="Calibri"/>
           <w:sz w:val="18"/>
           <w:szCs w:val="18"/>
         </w:rPr>
@@ -7060,7 +7060,7 @@
       </w:r>
       <w:r>
         <w:rPr>
-          <w:rFonts w:cs="Calibri" w:ascii="Calibri" w:hAnsi="Calibri" w:asciiTheme="minorHAnsi" w:cstheme="minorHAnsi" w:hAnsiTheme="minorHAnsi"/>
+          <w:rFonts w:cs="Calibri" w:ascii="Calibri" w:hAnsi="Calibri" w:asciiTheme="minorHAnsi" w:cstheme="minorHAnsi" w:hAnsiTheme="minorHAnsi" w:eastAsia="Calibri"/>
           <w:b/>
           <w:bCs/>
           <w:sz w:val="18"/>
@@ -7070,7 +7070,7 @@
       </w:r>
       <w:r>
         <w:rPr>
-          <w:rFonts w:cs="Calibri" w:ascii="Calibri" w:hAnsi="Calibri" w:asciiTheme="minorHAnsi" w:cstheme="minorHAnsi" w:hAnsiTheme="minorHAnsi"/>
+          <w:rFonts w:cs="Calibri" w:ascii="Calibri" w:hAnsi="Calibri" w:asciiTheme="minorHAnsi" w:cstheme="minorHAnsi" w:hAnsiTheme="minorHAnsi" w:eastAsia="Calibri"/>
           <w:sz w:val="18"/>
           <w:szCs w:val="18"/>
         </w:rPr>
@@ -7091,7 +7091,7 @@
       </w:pPr>
       <w:r>
         <w:rPr>
-          <w:rFonts w:cs="Calibri" w:ascii="Calibri" w:hAnsi="Calibri" w:asciiTheme="minorHAnsi" w:cstheme="minorHAnsi" w:hAnsiTheme="minorHAnsi"/>
+          <w:rFonts w:cs="Calibri" w:ascii="Calibri" w:hAnsi="Calibri" w:asciiTheme="minorHAnsi" w:cstheme="minorHAnsi" w:hAnsiTheme="minorHAnsi" w:eastAsia="Calibri"/>
           <w:b/>
           <w:bCs/>
           <w:sz w:val="18"/>
@@ -7101,7 +7101,7 @@
       </w:r>
       <w:r>
         <w:rPr>
-          <w:rFonts w:cs="Calibri" w:ascii="Calibri" w:hAnsi="Calibri" w:asciiTheme="minorHAnsi" w:cstheme="minorHAnsi" w:hAnsiTheme="minorHAnsi"/>
+          <w:rFonts w:cs="Calibri" w:ascii="Calibri" w:hAnsi="Calibri" w:asciiTheme="minorHAnsi" w:cstheme="minorHAnsi" w:hAnsiTheme="minorHAnsi" w:eastAsia="Calibri"/>
           <w:sz w:val="18"/>
           <w:szCs w:val="18"/>
         </w:rPr>
@@ -7122,7 +7122,7 @@
       </w:pPr>
       <w:r>
         <w:rPr>
-          <w:rFonts w:cs="Calibri" w:ascii="Calibri" w:hAnsi="Calibri" w:asciiTheme="minorHAnsi" w:cstheme="minorHAnsi" w:hAnsiTheme="minorHAnsi"/>
+          <w:rFonts w:cs="Calibri" w:ascii="Calibri" w:hAnsi="Calibri" w:asciiTheme="minorHAnsi" w:cstheme="minorHAnsi" w:hAnsiTheme="minorHAnsi" w:eastAsia="Calibri"/>
           <w:b/>
           <w:bCs/>
           <w:sz w:val="18"/>
@@ -7132,7 +7132,7 @@
       </w:r>
       <w:r>
         <w:rPr>
-          <w:rFonts w:cs="Calibri" w:ascii="Calibri" w:hAnsi="Calibri" w:asciiTheme="minorHAnsi" w:cstheme="minorHAnsi" w:hAnsiTheme="minorHAnsi"/>
+          <w:rFonts w:cs="Calibri" w:ascii="Calibri" w:hAnsi="Calibri" w:asciiTheme="minorHAnsi" w:cstheme="minorHAnsi" w:hAnsiTheme="minorHAnsi" w:eastAsia="Calibri"/>
           <w:sz w:val="18"/>
           <w:szCs w:val="18"/>
         </w:rPr>
@@ -7153,7 +7153,7 @@
       </w:pPr>
       <w:r>
         <w:rPr>
-          <w:rFonts w:cs="Calibri" w:ascii="Calibri" w:hAnsi="Calibri" w:asciiTheme="minorHAnsi" w:cstheme="minorHAnsi" w:hAnsiTheme="minorHAnsi"/>
+          <w:rFonts w:cs="Calibri" w:ascii="Calibri" w:hAnsi="Calibri" w:asciiTheme="minorHAnsi" w:cstheme="minorHAnsi" w:hAnsiTheme="minorHAnsi" w:eastAsia="Calibri"/>
           <w:b/>
           <w:bCs/>
           <w:sz w:val="18"/>
@@ -7163,7 +7163,7 @@
       </w:r>
       <w:r>
         <w:rPr>
-          <w:rFonts w:cs="Calibri" w:ascii="Calibri" w:hAnsi="Calibri" w:asciiTheme="minorHAnsi" w:cstheme="minorHAnsi" w:hAnsiTheme="minorHAnsi"/>
+          <w:rFonts w:cs="Calibri" w:ascii="Calibri" w:hAnsi="Calibri" w:asciiTheme="minorHAnsi" w:cstheme="minorHAnsi" w:hAnsiTheme="minorHAnsi" w:eastAsia="Calibri"/>
           <w:sz w:val="18"/>
           <w:szCs w:val="18"/>
         </w:rPr>
@@ -7186,7 +7186,7 @@
       </w:pPr>
       <w:r>
         <w:rPr>
-          <w:rFonts w:cs="Calibri" w:ascii="Calibri" w:hAnsi="Calibri" w:asciiTheme="minorHAnsi" w:cstheme="minorHAnsi" w:hAnsiTheme="minorHAnsi"/>
+          <w:rFonts w:cs="Calibri" w:ascii="Calibri" w:hAnsi="Calibri" w:asciiTheme="minorHAnsi" w:cstheme="minorHAnsi" w:hAnsiTheme="minorHAnsi" w:eastAsia="Calibri"/>
           <w:b/>
           <w:sz w:val="18"/>
           <w:szCs w:val="18"/>
@@ -7208,7 +7208,7 @@
       </w:pPr>
       <w:r>
         <w:rPr>
-          <w:rFonts w:cs="Calibri" w:ascii="Calibri" w:hAnsi="Calibri" w:asciiTheme="minorHAnsi" w:cstheme="minorHAnsi" w:hAnsiTheme="minorHAnsi"/>
+          <w:rFonts w:cs="Calibri" w:ascii="Calibri" w:hAnsi="Calibri" w:asciiTheme="minorHAnsi" w:cstheme="minorHAnsi" w:hAnsiTheme="minorHAnsi" w:eastAsia="Calibri"/>
           <w:b/>
           <w:bCs/>
           <w:sz w:val="18"/>
@@ -7218,7 +7218,7 @@
       </w:r>
       <w:r>
         <w:rPr>
-          <w:rFonts w:cs="Calibri" w:ascii="Calibri" w:hAnsi="Calibri" w:asciiTheme="minorHAnsi" w:cstheme="minorHAnsi" w:hAnsiTheme="minorHAnsi"/>
+          <w:rFonts w:cs="Calibri" w:ascii="Calibri" w:hAnsi="Calibri" w:asciiTheme="minorHAnsi" w:cstheme="minorHAnsi" w:hAnsiTheme="minorHAnsi" w:eastAsia="Calibri"/>
           <w:sz w:val="18"/>
           <w:szCs w:val="18"/>
         </w:rPr>
@@ -7240,7 +7240,7 @@
       </w:pPr>
       <w:r>
         <w:rPr>
-          <w:rFonts w:cs="Calibri" w:ascii="Calibri" w:hAnsi="Calibri" w:asciiTheme="minorHAnsi" w:cstheme="minorHAnsi" w:hAnsiTheme="minorHAnsi"/>
+          <w:rFonts w:cs="Calibri" w:ascii="Calibri" w:hAnsi="Calibri" w:asciiTheme="minorHAnsi" w:cstheme="minorHAnsi" w:hAnsiTheme="minorHAnsi" w:eastAsia="Calibri"/>
           <w:b/>
           <w:bCs/>
           <w:color w:themeColor="text1" w:val="000000"/>
@@ -7251,7 +7251,7 @@
       </w:r>
       <w:r>
         <w:rPr>
-          <w:rFonts w:cs="Calibri" w:ascii="Calibri" w:hAnsi="Calibri" w:asciiTheme="minorHAnsi" w:cstheme="minorHAnsi" w:hAnsiTheme="minorHAnsi"/>
+          <w:rFonts w:cs="Calibri" w:ascii="Calibri" w:hAnsi="Calibri" w:asciiTheme="minorHAnsi" w:cstheme="minorHAnsi" w:hAnsiTheme="minorHAnsi" w:eastAsia="Calibri"/>
           <w:color w:themeColor="text1" w:val="000000"/>
           <w:sz w:val="18"/>
           <w:szCs w:val="18"/>
@@ -7389,7 +7389,7 @@
             </w:pPr>
             <w:r>
               <w:rPr>
-                <w:rFonts w:eastAsia="Times New Roman" w:cs="Calibri" w:ascii="Calibri" w:hAnsi="Calibri" w:asciiTheme="minorHAnsi" w:cstheme="minorHAnsi" w:hAnsiTheme="minorHAnsi"/>
+                <w:rFonts w:eastAsia="Calibri" w:cs="Calibri" w:ascii="Calibri" w:hAnsi="Calibri" w:asciiTheme="minorHAnsi" w:cstheme="minorHAnsi" w:hAnsiTheme="minorHAnsi"/>
                 <w:b/>
                 <w:bCs/>
                 <w:kern w:val="0"/>
@@ -7464,7 +7464,7 @@
             </w:pPr>
             <w:r>
               <w:rPr>
-                <w:rFonts w:eastAsia="Times New Roman" w:cs="Calibri" w:ascii="Calibri" w:hAnsi="Calibri" w:asciiTheme="minorHAnsi" w:cstheme="minorHAnsi" w:hAnsiTheme="minorHAnsi"/>
+                <w:rFonts w:eastAsia="Calibri" w:cs="Calibri" w:ascii="Calibri" w:hAnsi="Calibri" w:asciiTheme="minorHAnsi" w:cstheme="minorHAnsi" w:hAnsiTheme="minorHAnsi"/>
                 <w:b/>
                 <w:bCs/>
                 <w:kern w:val="0"/>
@@ -7503,7 +7503,7 @@
             </w:pPr>
             <w:r>
               <w:rPr>
-                <w:rFonts w:eastAsia="Times New Roman" w:cs="Calibri" w:ascii="Calibri" w:hAnsi="Calibri" w:asciiTheme="minorHAnsi" w:cstheme="minorHAnsi" w:hAnsiTheme="minorHAnsi"/>
+                <w:rFonts w:eastAsia="Calibri" w:cs="Calibri" w:ascii="Calibri" w:hAnsi="Calibri" w:asciiTheme="minorHAnsi" w:cstheme="minorHAnsi" w:hAnsiTheme="minorHAnsi"/>
                 <w:kern w:val="0"/>
                 <w:sz w:val="18"/>
                 <w:szCs w:val="18"/>
@@ -7527,7 +7527,7 @@
             </w:pPr>
             <w:r>
               <w:rPr>
-                <w:rFonts w:eastAsia="Times New Roman" w:cs="Calibri" w:ascii="Calibri" w:hAnsi="Calibri" w:asciiTheme="minorHAnsi" w:cstheme="minorHAnsi" w:hAnsiTheme="minorHAnsi"/>
+                <w:rFonts w:eastAsia="Calibri" w:cs="Calibri" w:ascii="Calibri" w:hAnsi="Calibri" w:asciiTheme="minorHAnsi" w:cstheme="minorHAnsi" w:hAnsiTheme="minorHAnsi"/>
                 <w:kern w:val="0"/>
                 <w:sz w:val="18"/>
                 <w:szCs w:val="18"/>
@@ -7593,7 +7593,7 @@
             </w:pPr>
             <w:r>
               <w:rPr>
-                <w:rFonts w:eastAsia="Times New Roman" w:cs="Calibri" w:ascii="Calibri" w:hAnsi="Calibri" w:asciiTheme="minorHAnsi" w:cstheme="minorHAnsi" w:hAnsiTheme="minorHAnsi"/>
+                <w:rFonts w:eastAsia="Calibri" w:cs="Calibri" w:ascii="Calibri" w:hAnsi="Calibri" w:asciiTheme="minorHAnsi" w:cstheme="minorHAnsi" w:hAnsiTheme="minorHAnsi"/>
                 <w:kern w:val="0"/>
                 <w:sz w:val="18"/>
                 <w:szCs w:val="18"/>
@@ -7617,7 +7617,7 @@
             </w:pPr>
             <w:r>
               <w:rPr>
-                <w:rFonts w:eastAsia="Times New Roman" w:cs="Calibri" w:ascii="Calibri" w:hAnsi="Calibri" w:asciiTheme="minorHAnsi" w:cstheme="minorHAnsi" w:hAnsiTheme="minorHAnsi"/>
+                <w:rFonts w:eastAsia="Calibri" w:cs="Calibri" w:ascii="Calibri" w:hAnsi="Calibri" w:asciiTheme="minorHAnsi" w:cstheme="minorHAnsi" w:hAnsiTheme="minorHAnsi"/>
                 <w:kern w:val="0"/>
                 <w:sz w:val="18"/>
                 <w:szCs w:val="18"/>
@@ -7645,7 +7645,7 @@
       </w:pPr>
       <w:r>
         <w:rPr>
-          <w:rFonts w:cs="Calibri" w:ascii="Calibri" w:hAnsi="Calibri" w:asciiTheme="minorHAnsi" w:cstheme="minorHAnsi" w:hAnsiTheme="minorHAnsi"/>
+          <w:rFonts w:cs="Calibri" w:ascii="Calibri" w:hAnsi="Calibri" w:asciiTheme="minorHAnsi" w:cstheme="minorHAnsi" w:hAnsiTheme="minorHAnsi" w:eastAsia="Calibri"/>
           <w:b/>
           <w:sz w:val="18"/>
           <w:szCs w:val="18"/>
@@ -7683,7 +7683,7 @@
       </w:pPr>
       <w:r>
         <w:rPr>
-          <w:rFonts w:cs="Calibri" w:ascii="Calibri" w:hAnsi="Calibri" w:asciiTheme="minorHAnsi" w:cstheme="minorHAnsi" w:hAnsiTheme="minorHAnsi"/>
+          <w:rFonts w:cs="Calibri" w:ascii="Calibri" w:hAnsi="Calibri" w:asciiTheme="minorHAnsi" w:cstheme="minorHAnsi" w:hAnsiTheme="minorHAnsi" w:eastAsia="Calibri"/>
           <w:sz w:val="18"/>
           <w:szCs w:val="18"/>
         </w:rPr>
@@ -7730,7 +7730,7 @@
       </w:pPr>
       <w:r>
         <w:rPr>
-          <w:rFonts w:cs="Calibri" w:ascii="Calibri" w:hAnsi="Calibri" w:asciiTheme="minorHAnsi" w:cstheme="minorHAnsi" w:hAnsiTheme="minorHAnsi"/>
+          <w:rFonts w:cs="Calibri" w:ascii="Calibri" w:hAnsi="Calibri" w:asciiTheme="minorHAnsi" w:cstheme="minorHAnsi" w:hAnsiTheme="minorHAnsi" w:eastAsia="Calibri"/>
           <w:b/>
           <w:sz w:val="18"/>
           <w:szCs w:val="18"/>
@@ -7774,7 +7774,7 @@
       </w:pPr>
       <w:r>
         <w:rPr>
-          <w:rFonts w:cs="Calibri" w:ascii="Calibri" w:hAnsi="Calibri" w:asciiTheme="minorHAnsi" w:cstheme="minorHAnsi" w:hAnsiTheme="minorHAnsi"/>
+          <w:rFonts w:cs="Calibri" w:ascii="Calibri" w:hAnsi="Calibri" w:asciiTheme="minorHAnsi" w:cstheme="minorHAnsi" w:hAnsiTheme="minorHAnsi" w:eastAsia="Calibri"/>
           <w:sz w:val="18"/>
           <w:szCs w:val="18"/>
         </w:rPr>
@@ -7798,7 +7798,7 @@
       </w:pPr>
       <w:r>
         <w:rPr>
-          <w:rFonts w:cs="Calibri" w:ascii="Calibri" w:hAnsi="Calibri" w:asciiTheme="minorHAnsi" w:cstheme="minorHAnsi" w:hAnsiTheme="minorHAnsi"/>
+          <w:rFonts w:cs="Calibri" w:ascii="Calibri" w:hAnsi="Calibri" w:asciiTheme="minorHAnsi" w:cstheme="minorHAnsi" w:hAnsiTheme="minorHAnsi" w:eastAsia="Calibri"/>
           <w:sz w:val="18"/>
           <w:szCs w:val="18"/>
         </w:rPr>
@@ -7822,7 +7822,7 @@
       </w:pPr>
       <w:r>
         <w:rPr>
-          <w:rFonts w:cs="Calibri" w:ascii="Calibri" w:hAnsi="Calibri" w:asciiTheme="minorHAnsi" w:cstheme="minorHAnsi" w:hAnsiTheme="minorHAnsi"/>
+          <w:rFonts w:cs="Calibri" w:ascii="Calibri" w:hAnsi="Calibri" w:asciiTheme="minorHAnsi" w:cstheme="minorHAnsi" w:hAnsiTheme="minorHAnsi" w:eastAsia="Calibri"/>
           <w:sz w:val="18"/>
           <w:szCs w:val="18"/>
         </w:rPr>
@@ -7846,7 +7846,7 @@
       </w:pPr>
       <w:r>
         <w:rPr>
-          <w:rFonts w:cs="Calibri" w:ascii="Calibri" w:hAnsi="Calibri" w:asciiTheme="minorHAnsi" w:cstheme="minorHAnsi" w:hAnsiTheme="minorHAnsi"/>
+          <w:rFonts w:cs="Calibri" w:ascii="Calibri" w:hAnsi="Calibri" w:asciiTheme="minorHAnsi" w:cstheme="minorHAnsi" w:hAnsiTheme="minorHAnsi" w:eastAsia="Calibri"/>
           <w:sz w:val="18"/>
           <w:szCs w:val="18"/>
         </w:rPr>
@@ -7870,7 +7870,7 @@
       </w:pPr>
       <w:r>
         <w:rPr>
-          <w:rFonts w:cs="Calibri" w:ascii="Calibri" w:hAnsi="Calibri" w:asciiTheme="minorHAnsi" w:cstheme="minorHAnsi" w:hAnsiTheme="minorHAnsi"/>
+          <w:rFonts w:cs="Calibri" w:ascii="Calibri" w:hAnsi="Calibri" w:asciiTheme="minorHAnsi" w:cstheme="minorHAnsi" w:hAnsiTheme="minorHAnsi" w:eastAsia="Calibri"/>
           <w:sz w:val="18"/>
           <w:szCs w:val="18"/>
         </w:rPr>
@@ -7894,7 +7894,7 @@
       </w:pPr>
       <w:r>
         <w:rPr>
-          <w:rFonts w:cs="Calibri" w:ascii="Calibri" w:hAnsi="Calibri" w:asciiTheme="minorHAnsi" w:cstheme="minorHAnsi" w:hAnsiTheme="minorHAnsi"/>
+          <w:rFonts w:cs="Calibri" w:ascii="Calibri" w:hAnsi="Calibri" w:asciiTheme="minorHAnsi" w:cstheme="minorHAnsi" w:hAnsiTheme="minorHAnsi" w:eastAsia="Calibri"/>
           <w:sz w:val="18"/>
           <w:szCs w:val="18"/>
         </w:rPr>
@@ -7918,7 +7918,7 @@
       </w:pPr>
       <w:r>
         <w:rPr>
-          <w:rFonts w:cs="Calibri" w:ascii="Calibri" w:hAnsi="Calibri" w:asciiTheme="minorHAnsi" w:cstheme="minorHAnsi" w:hAnsiTheme="minorHAnsi"/>
+          <w:rFonts w:cs="Calibri" w:ascii="Calibri" w:hAnsi="Calibri" w:asciiTheme="minorHAnsi" w:cstheme="minorHAnsi" w:hAnsiTheme="minorHAnsi" w:eastAsia="Calibri"/>
           <w:sz w:val="18"/>
           <w:szCs w:val="18"/>
         </w:rPr>
@@ -7926,7 +7926,7 @@
       </w:r>
       <w:r>
         <w:rPr>
-          <w:rFonts w:cs="Calibri" w:ascii="Calibri" w:hAnsi="Calibri" w:asciiTheme="minorHAnsi" w:cstheme="minorHAnsi" w:hAnsiTheme="minorHAnsi"/>
+          <w:rFonts w:cs="Calibri" w:ascii="Calibri" w:hAnsi="Calibri" w:asciiTheme="minorHAnsi" w:cstheme="minorHAnsi" w:hAnsiTheme="minorHAnsi" w:eastAsia="Calibri"/>
           <w:i/>
           <w:iCs/>
           <w:sz w:val="18"/>
@@ -7936,7 +7936,7 @@
       </w:r>
       <w:r>
         <w:rPr>
-          <w:rFonts w:cs="Calibri" w:ascii="Calibri" w:hAnsi="Calibri" w:asciiTheme="minorHAnsi" w:cstheme="minorHAnsi" w:hAnsiTheme="minorHAnsi"/>
+          <w:rFonts w:cs="Calibri" w:ascii="Calibri" w:hAnsi="Calibri" w:asciiTheme="minorHAnsi" w:cstheme="minorHAnsi" w:hAnsiTheme="minorHAnsi" w:eastAsia="Calibri"/>
           <w:sz w:val="18"/>
           <w:szCs w:val="18"/>
         </w:rPr>
@@ -7960,7 +7960,7 @@
       </w:pPr>
       <w:r>
         <w:rPr>
-          <w:rFonts w:cs="Calibri" w:ascii="Calibri" w:hAnsi="Calibri" w:asciiTheme="minorHAnsi" w:cstheme="minorHAnsi" w:hAnsiTheme="minorHAnsi"/>
+          <w:rFonts w:cs="Calibri" w:ascii="Calibri" w:hAnsi="Calibri" w:asciiTheme="minorHAnsi" w:cstheme="minorHAnsi" w:hAnsiTheme="minorHAnsi" w:eastAsia="Calibri"/>
           <w:sz w:val="18"/>
           <w:szCs w:val="18"/>
         </w:rPr>
@@ -7968,7 +7968,7 @@
       </w:r>
       <w:r>
         <w:rPr>
-          <w:rFonts w:cs="Calibri" w:ascii="Calibri" w:hAnsi="Calibri" w:asciiTheme="minorHAnsi" w:cstheme="minorHAnsi" w:hAnsiTheme="minorHAnsi"/>
+          <w:rFonts w:cs="Calibri" w:ascii="Calibri" w:hAnsi="Calibri" w:asciiTheme="minorHAnsi" w:cstheme="minorHAnsi" w:hAnsiTheme="minorHAnsi" w:eastAsia="Calibri"/>
           <w:i/>
           <w:iCs/>
           <w:sz w:val="18"/>
@@ -7978,7 +7978,7 @@
       </w:r>
       <w:r>
         <w:rPr>
-          <w:rFonts w:cs="Calibri" w:ascii="Calibri" w:hAnsi="Calibri" w:asciiTheme="minorHAnsi" w:cstheme="minorHAnsi" w:hAnsiTheme="minorHAnsi"/>
+          <w:rFonts w:cs="Calibri" w:ascii="Calibri" w:hAnsi="Calibri" w:asciiTheme="minorHAnsi" w:cstheme="minorHAnsi" w:hAnsiTheme="minorHAnsi" w:eastAsia="Calibri"/>
           <w:sz w:val="18"/>
           <w:szCs w:val="18"/>
         </w:rPr>
@@ -8002,7 +8002,7 @@
       </w:pPr>
       <w:r>
         <w:rPr>
-          <w:rFonts w:cs="Calibri" w:ascii="Calibri" w:hAnsi="Calibri" w:asciiTheme="minorHAnsi" w:cstheme="minorHAnsi" w:hAnsiTheme="minorHAnsi"/>
+          <w:rFonts w:cs="Calibri" w:ascii="Calibri" w:hAnsi="Calibri" w:asciiTheme="minorHAnsi" w:cstheme="minorHAnsi" w:hAnsiTheme="minorHAnsi" w:eastAsia="Calibri"/>
           <w:sz w:val="18"/>
           <w:szCs w:val="18"/>
         </w:rPr>
@@ -8026,7 +8026,7 @@
       </w:pPr>
       <w:r>
         <w:rPr>
-          <w:rFonts w:cs="Calibri" w:ascii="Calibri" w:hAnsi="Calibri" w:asciiTheme="minorHAnsi" w:cstheme="minorHAnsi" w:hAnsiTheme="minorHAnsi"/>
+          <w:rFonts w:cs="Calibri" w:ascii="Calibri" w:hAnsi="Calibri" w:asciiTheme="minorHAnsi" w:cstheme="minorHAnsi" w:hAnsiTheme="minorHAnsi" w:eastAsia="Calibri"/>
           <w:sz w:val="18"/>
           <w:szCs w:val="18"/>
         </w:rPr>
@@ -8093,7 +8093,7 @@
       </w:pPr>
       <w:r>
         <w:rPr>
-          <w:rFonts w:cs="Calibri" w:ascii="Calibri" w:hAnsi="Calibri" w:asciiTheme="minorHAnsi" w:cstheme="minorHAnsi" w:hAnsiTheme="minorHAnsi"/>
+          <w:rFonts w:cs="Calibri" w:ascii="Calibri" w:hAnsi="Calibri" w:asciiTheme="minorHAnsi" w:cstheme="minorHAnsi" w:hAnsiTheme="minorHAnsi" w:eastAsia="Calibri"/>
           <w:b/>
           <w:sz w:val="18"/>
           <w:szCs w:val="18"/>
@@ -8137,7 +8137,7 @@
       </w:pPr>
       <w:r>
         <w:rPr>
-          <w:rFonts w:cs="Calibri" w:ascii="Calibri" w:hAnsi="Calibri" w:asciiTheme="minorHAnsi" w:cstheme="minorHAnsi" w:hAnsiTheme="minorHAnsi"/>
+          <w:rFonts w:cs="Calibri" w:ascii="Calibri" w:hAnsi="Calibri" w:asciiTheme="minorHAnsi" w:cstheme="minorHAnsi" w:hAnsiTheme="minorHAnsi" w:eastAsia="Calibri"/>
           <w:sz w:val="18"/>
           <w:szCs w:val="18"/>
         </w:rPr>
@@ -8161,7 +8161,7 @@
       </w:pPr>
       <w:r>
         <w:rPr>
-          <w:rFonts w:cs="Calibri" w:ascii="Calibri" w:hAnsi="Calibri" w:asciiTheme="minorHAnsi" w:cstheme="minorHAnsi" w:hAnsiTheme="minorHAnsi"/>
+          <w:rFonts w:cs="Calibri" w:ascii="Calibri" w:hAnsi="Calibri" w:asciiTheme="minorHAnsi" w:cstheme="minorHAnsi" w:hAnsiTheme="minorHAnsi" w:eastAsia="Calibri"/>
           <w:sz w:val="18"/>
           <w:szCs w:val="18"/>
         </w:rPr>
@@ -8185,7 +8185,7 @@
       </w:pPr>
       <w:r>
         <w:rPr>
-          <w:rFonts w:cs="Calibri" w:ascii="Calibri" w:hAnsi="Calibri" w:asciiTheme="minorHAnsi" w:cstheme="minorHAnsi" w:hAnsiTheme="minorHAnsi"/>
+          <w:rFonts w:cs="Calibri" w:ascii="Calibri" w:hAnsi="Calibri" w:asciiTheme="minorHAnsi" w:cstheme="minorHAnsi" w:hAnsiTheme="minorHAnsi" w:eastAsia="Calibri"/>
           <w:sz w:val="18"/>
           <w:szCs w:val="18"/>
         </w:rPr>
@@ -8209,7 +8209,7 @@
       </w:pPr>
       <w:r>
         <w:rPr>
-          <w:rFonts w:cs="Calibri" w:ascii="Calibri" w:hAnsi="Calibri" w:asciiTheme="minorHAnsi" w:cstheme="minorHAnsi" w:hAnsiTheme="minorHAnsi"/>
+          <w:rFonts w:cs="Calibri" w:ascii="Calibri" w:hAnsi="Calibri" w:asciiTheme="minorHAnsi" w:cstheme="minorHAnsi" w:hAnsiTheme="minorHAnsi" w:eastAsia="Calibri"/>
           <w:sz w:val="18"/>
           <w:szCs w:val="18"/>
         </w:rPr>
@@ -8233,7 +8233,7 @@
       </w:pPr>
       <w:r>
         <w:rPr>
-          <w:rFonts w:cs="Calibri" w:ascii="Calibri" w:hAnsi="Calibri" w:asciiTheme="minorHAnsi" w:cstheme="minorHAnsi" w:hAnsiTheme="minorHAnsi"/>
+          <w:rFonts w:cs="Calibri" w:ascii="Calibri" w:hAnsi="Calibri" w:asciiTheme="minorHAnsi" w:cstheme="minorHAnsi" w:hAnsiTheme="minorHAnsi" w:eastAsia="Calibri"/>
           <w:sz w:val="18"/>
           <w:szCs w:val="18"/>
         </w:rPr>
@@ -8276,7 +8276,7 @@
       </w:pPr>
       <w:r>
         <w:rPr>
-          <w:rFonts w:cs="Calibri" w:ascii="Calibri" w:hAnsi="Calibri" w:asciiTheme="minorHAnsi" w:cstheme="minorHAnsi" w:hAnsiTheme="minorHAnsi"/>
+          <w:rFonts w:cs="Calibri" w:ascii="Calibri" w:hAnsi="Calibri" w:asciiTheme="minorHAnsi" w:cstheme="minorHAnsi" w:hAnsiTheme="minorHAnsi" w:eastAsia="Calibri"/>
           <w:b/>
           <w:sz w:val="18"/>
           <w:szCs w:val="18"/>
@@ -8320,7 +8320,7 @@
       </w:pPr>
       <w:r>
         <w:rPr>
-          <w:rFonts w:cs="Calibri" w:ascii="Calibri" w:hAnsi="Calibri" w:asciiTheme="minorHAnsi" w:cstheme="minorHAnsi" w:hAnsiTheme="minorHAnsi"/>
+          <w:rFonts w:cs="Calibri" w:ascii="Calibri" w:hAnsi="Calibri" w:asciiTheme="minorHAnsi" w:cstheme="minorHAnsi" w:hAnsiTheme="minorHAnsi" w:eastAsia="Calibri"/>
           <w:sz w:val="18"/>
           <w:szCs w:val="18"/>
         </w:rPr>
@@ -8344,7 +8344,7 @@
       </w:pPr>
       <w:r>
         <w:rPr>
-          <w:rFonts w:cs="Calibri" w:ascii="Calibri" w:hAnsi="Calibri" w:asciiTheme="minorHAnsi" w:cstheme="minorHAnsi" w:hAnsiTheme="minorHAnsi"/>
+          <w:rFonts w:cs="Calibri" w:ascii="Calibri" w:hAnsi="Calibri" w:asciiTheme="minorHAnsi" w:cstheme="minorHAnsi" w:hAnsiTheme="minorHAnsi" w:eastAsia="Calibri"/>
           <w:sz w:val="18"/>
           <w:szCs w:val="18"/>
         </w:rPr>
@@ -8368,7 +8368,7 @@
       </w:pPr>
       <w:r>
         <w:rPr>
-          <w:rFonts w:cs="Calibri" w:ascii="Calibri" w:hAnsi="Calibri" w:asciiTheme="minorHAnsi" w:cstheme="minorHAnsi" w:hAnsiTheme="minorHAnsi"/>
+          <w:rFonts w:cs="Calibri" w:ascii="Calibri" w:hAnsi="Calibri" w:asciiTheme="minorHAnsi" w:cstheme="minorHAnsi" w:hAnsiTheme="minorHAnsi" w:eastAsia="Calibri"/>
           <w:sz w:val="18"/>
           <w:szCs w:val="18"/>
         </w:rPr>
@@ -8392,7 +8392,7 @@
       </w:pPr>
       <w:r>
         <w:rPr>
-          <w:rFonts w:cs="Calibri" w:ascii="Calibri" w:hAnsi="Calibri" w:asciiTheme="minorHAnsi" w:cstheme="minorHAnsi" w:hAnsiTheme="minorHAnsi"/>
+          <w:rFonts w:cs="Calibri" w:ascii="Calibri" w:hAnsi="Calibri" w:asciiTheme="minorHAnsi" w:cstheme="minorHAnsi" w:hAnsiTheme="minorHAnsi" w:eastAsia="Calibri"/>
           <w:sz w:val="18"/>
           <w:szCs w:val="18"/>
         </w:rPr>
@@ -8416,7 +8416,7 @@
       </w:pPr>
       <w:r>
         <w:rPr>
-          <w:rFonts w:cs="Calibri" w:ascii="Calibri" w:hAnsi="Calibri" w:asciiTheme="minorHAnsi" w:cstheme="minorHAnsi" w:hAnsiTheme="minorHAnsi"/>
+          <w:rFonts w:cs="Calibri" w:ascii="Calibri" w:hAnsi="Calibri" w:asciiTheme="minorHAnsi" w:cstheme="minorHAnsi" w:hAnsiTheme="minorHAnsi" w:eastAsia="Calibri"/>
           <w:sz w:val="18"/>
           <w:szCs w:val="18"/>
         </w:rPr>
@@ -8440,7 +8440,7 @@
       </w:pPr>
       <w:r>
         <w:rPr>
-          <w:rFonts w:cs="Calibri" w:ascii="Calibri" w:hAnsi="Calibri" w:asciiTheme="minorHAnsi" w:cstheme="minorHAnsi" w:hAnsiTheme="minorHAnsi"/>
+          <w:rFonts w:cs="Calibri" w:ascii="Calibri" w:hAnsi="Calibri" w:asciiTheme="minorHAnsi" w:cstheme="minorHAnsi" w:hAnsiTheme="minorHAnsi" w:eastAsia="Calibri"/>
           <w:sz w:val="18"/>
           <w:szCs w:val="18"/>
         </w:rPr>
@@ -8464,7 +8464,7 @@
       </w:pPr>
       <w:r>
         <w:rPr>
-          <w:rFonts w:cs="Calibri" w:ascii="Calibri" w:hAnsi="Calibri" w:asciiTheme="minorHAnsi" w:cstheme="minorHAnsi" w:hAnsiTheme="minorHAnsi"/>
+          <w:rFonts w:cs="Calibri" w:ascii="Calibri" w:hAnsi="Calibri" w:asciiTheme="minorHAnsi" w:cstheme="minorHAnsi" w:hAnsiTheme="minorHAnsi" w:eastAsia="Calibri"/>
           <w:sz w:val="18"/>
           <w:szCs w:val="18"/>
         </w:rPr>
@@ -8488,7 +8488,7 @@
       </w:pPr>
       <w:r>
         <w:rPr>
-          <w:rFonts w:cs="Calibri" w:ascii="Calibri" w:hAnsi="Calibri" w:asciiTheme="minorHAnsi" w:cstheme="minorHAnsi" w:hAnsiTheme="minorHAnsi"/>
+          <w:rFonts w:cs="Calibri" w:ascii="Calibri" w:hAnsi="Calibri" w:asciiTheme="minorHAnsi" w:cstheme="minorHAnsi" w:hAnsiTheme="minorHAnsi" w:eastAsia="Calibri"/>
           <w:sz w:val="18"/>
           <w:szCs w:val="18"/>
         </w:rPr>
@@ -8512,7 +8512,7 @@
       </w:pPr>
       <w:r>
         <w:rPr>
-          <w:rFonts w:cs="Calibri" w:ascii="Calibri" w:hAnsi="Calibri" w:asciiTheme="minorHAnsi" w:cstheme="minorHAnsi" w:hAnsiTheme="minorHAnsi"/>
+          <w:rFonts w:cs="Calibri" w:ascii="Calibri" w:hAnsi="Calibri" w:asciiTheme="minorHAnsi" w:cstheme="minorHAnsi" w:hAnsiTheme="minorHAnsi" w:eastAsia="Calibri"/>
           <w:sz w:val="18"/>
           <w:szCs w:val="18"/>
         </w:rPr>
@@ -8536,7 +8536,7 @@
       </w:pPr>
       <w:r>
         <w:rPr>
-          <w:rFonts w:cs="Calibri" w:ascii="Calibri" w:hAnsi="Calibri" w:asciiTheme="minorHAnsi" w:cstheme="minorHAnsi" w:hAnsiTheme="minorHAnsi"/>
+          <w:rFonts w:cs="Calibri" w:ascii="Calibri" w:hAnsi="Calibri" w:asciiTheme="minorHAnsi" w:cstheme="minorHAnsi" w:hAnsiTheme="minorHAnsi" w:eastAsia="Calibri"/>
           <w:sz w:val="18"/>
           <w:szCs w:val="18"/>
         </w:rPr>
@@ -8559,7 +8559,7 @@
       </w:pPr>
       <w:r>
         <w:rPr>
-          <w:rFonts w:cs="Calibri" w:ascii="Calibri" w:hAnsi="Calibri" w:asciiTheme="minorHAnsi" w:cstheme="minorHAnsi" w:hAnsiTheme="minorHAnsi"/>
+          <w:rFonts w:cs="Calibri" w:ascii="Calibri" w:hAnsi="Calibri" w:asciiTheme="minorHAnsi" w:cstheme="minorHAnsi" w:hAnsiTheme="minorHAnsi" w:eastAsia="Calibri"/>
           <w:sz w:val="18"/>
           <w:szCs w:val="18"/>
         </w:rPr>
@@ -8622,7 +8622,7 @@
       </w:pPr>
       <w:r>
         <w:rPr>
-          <w:rFonts w:cs="Calibri" w:ascii="Calibri" w:hAnsi="Calibri" w:asciiTheme="minorHAnsi" w:cstheme="minorHAnsi" w:hAnsiTheme="minorHAnsi"/>
+          <w:rFonts w:cs="Calibri" w:ascii="Calibri" w:hAnsi="Calibri" w:asciiTheme="minorHAnsi" w:cstheme="minorHAnsi" w:hAnsiTheme="minorHAnsi" w:eastAsia="Calibri"/>
           <w:b/>
           <w:sz w:val="18"/>
           <w:szCs w:val="18"/>
@@ -8669,7 +8669,7 @@
       </w:pPr>
       <w:r>
         <w:rPr>
-          <w:rFonts w:cs="Calibri" w:ascii="Calibri" w:hAnsi="Calibri" w:asciiTheme="minorHAnsi" w:cstheme="minorHAnsi" w:hAnsiTheme="minorHAnsi"/>
+          <w:rFonts w:cs="Calibri" w:ascii="Calibri" w:hAnsi="Calibri" w:asciiTheme="minorHAnsi" w:cstheme="minorHAnsi" w:hAnsiTheme="minorHAnsi" w:eastAsia="Calibri"/>
           <w:sz w:val="18"/>
           <w:szCs w:val="18"/>
         </w:rPr>
@@ -8693,7 +8693,7 @@
       </w:pPr>
       <w:r>
         <w:rPr>
-          <w:rFonts w:cs="Calibri" w:ascii="Calibri" w:hAnsi="Calibri" w:asciiTheme="minorHAnsi" w:cstheme="minorHAnsi" w:hAnsiTheme="minorHAnsi"/>
+          <w:rFonts w:cs="Calibri" w:ascii="Calibri" w:hAnsi="Calibri" w:asciiTheme="minorHAnsi" w:cstheme="minorHAnsi" w:hAnsiTheme="minorHAnsi" w:eastAsia="Calibri"/>
           <w:sz w:val="18"/>
           <w:szCs w:val="18"/>
         </w:rPr>
@@ -8717,7 +8717,7 @@
       </w:pPr>
       <w:r>
         <w:rPr>
-          <w:rFonts w:cs="Calibri" w:ascii="Calibri" w:hAnsi="Calibri" w:asciiTheme="minorHAnsi" w:cstheme="minorHAnsi" w:hAnsiTheme="minorHAnsi"/>
+          <w:rFonts w:cs="Calibri" w:ascii="Calibri" w:hAnsi="Calibri" w:asciiTheme="minorHAnsi" w:cstheme="minorHAnsi" w:hAnsiTheme="minorHAnsi" w:eastAsia="Calibri"/>
           <w:sz w:val="18"/>
           <w:szCs w:val="18"/>
         </w:rPr>
@@ -8741,7 +8741,7 @@
       </w:pPr>
       <w:r>
         <w:rPr>
-          <w:rFonts w:cs="Calibri" w:ascii="Calibri" w:hAnsi="Calibri" w:asciiTheme="minorHAnsi" w:cstheme="minorHAnsi" w:hAnsiTheme="minorHAnsi"/>
+          <w:rFonts w:cs="Calibri" w:ascii="Calibri" w:hAnsi="Calibri" w:asciiTheme="minorHAnsi" w:cstheme="minorHAnsi" w:hAnsiTheme="minorHAnsi" w:eastAsia="Calibri"/>
           <w:sz w:val="18"/>
           <w:szCs w:val="18"/>
         </w:rPr>
@@ -8765,7 +8765,7 @@
       </w:pPr>
       <w:r>
         <w:rPr>
-          <w:rFonts w:cs="Calibri" w:ascii="Calibri" w:hAnsi="Calibri" w:asciiTheme="minorHAnsi" w:cstheme="minorHAnsi" w:hAnsiTheme="minorHAnsi"/>
+          <w:rFonts w:cs="Calibri" w:ascii="Calibri" w:hAnsi="Calibri" w:asciiTheme="minorHAnsi" w:cstheme="minorHAnsi" w:hAnsiTheme="minorHAnsi" w:eastAsia="Calibri"/>
           <w:sz w:val="18"/>
           <w:szCs w:val="18"/>
         </w:rPr>
@@ -8788,7 +8788,7 @@
       </w:pPr>
       <w:r>
         <w:rPr>
-          <w:rFonts w:cs="Calibri" w:ascii="Calibri" w:hAnsi="Calibri" w:asciiTheme="minorHAnsi" w:cstheme="minorHAnsi" w:hAnsiTheme="minorHAnsi"/>
+          <w:rFonts w:cs="Calibri" w:ascii="Calibri" w:hAnsi="Calibri" w:asciiTheme="minorHAnsi" w:cstheme="minorHAnsi" w:hAnsiTheme="minorHAnsi" w:eastAsia="Calibri"/>
           <w:sz w:val="18"/>
           <w:szCs w:val="18"/>
         </w:rPr>
@@ -8811,7 +8811,7 @@
       </w:pPr>
       <w:r>
         <w:rPr>
-          <w:rFonts w:cs="Calibri" w:ascii="Calibri" w:hAnsi="Calibri" w:asciiTheme="minorHAnsi" w:cstheme="minorHAnsi" w:hAnsiTheme="minorHAnsi"/>
+          <w:rFonts w:cs="Calibri" w:ascii="Calibri" w:hAnsi="Calibri" w:asciiTheme="minorHAnsi" w:cstheme="minorHAnsi" w:hAnsiTheme="minorHAnsi" w:eastAsia="Calibri"/>
           <w:sz w:val="18"/>
           <w:szCs w:val="18"/>
         </w:rPr>
@@ -8856,7 +8856,7 @@
       </w:pPr>
       <w:r>
         <w:rPr>
-          <w:rFonts w:cs="Calibri" w:ascii="Calibri" w:hAnsi="Calibri" w:asciiTheme="minorHAnsi" w:cstheme="minorHAnsi" w:hAnsiTheme="minorHAnsi"/>
+          <w:rFonts w:cs="Calibri" w:ascii="Calibri" w:hAnsi="Calibri" w:asciiTheme="minorHAnsi" w:cstheme="minorHAnsi" w:hAnsiTheme="minorHAnsi" w:eastAsia="Calibri"/>
           <w:b/>
           <w:sz w:val="18"/>
           <w:szCs w:val="18"/>
@@ -8902,7 +8902,7 @@
       </w:pPr>
       <w:r>
         <w:rPr>
-          <w:rFonts w:cs="Calibri" w:ascii="Calibri" w:hAnsi="Calibri" w:asciiTheme="minorHAnsi" w:cstheme="minorHAnsi" w:hAnsiTheme="minorHAnsi"/>
+          <w:rFonts w:cs="Calibri" w:ascii="Calibri" w:hAnsi="Calibri" w:asciiTheme="minorHAnsi" w:cstheme="minorHAnsi" w:hAnsiTheme="minorHAnsi" w:eastAsia="Calibri"/>
           <w:sz w:val="18"/>
           <w:szCs w:val="18"/>
         </w:rPr>
@@ -8926,7 +8926,7 @@
       </w:pPr>
       <w:r>
         <w:rPr>
-          <w:rFonts w:cs="Calibri" w:ascii="Calibri" w:hAnsi="Calibri" w:asciiTheme="minorHAnsi" w:cstheme="minorHAnsi" w:hAnsiTheme="minorHAnsi"/>
+          <w:rFonts w:cs="Calibri" w:ascii="Calibri" w:hAnsi="Calibri" w:asciiTheme="minorHAnsi" w:cstheme="minorHAnsi" w:hAnsiTheme="minorHAnsi" w:eastAsia="Calibri"/>
           <w:sz w:val="18"/>
           <w:szCs w:val="18"/>
         </w:rPr>
@@ -8950,7 +8950,7 @@
       </w:pPr>
       <w:r>
         <w:rPr>
-          <w:rFonts w:cs="Calibri" w:ascii="Calibri" w:hAnsi="Calibri" w:asciiTheme="minorHAnsi" w:cstheme="minorHAnsi" w:hAnsiTheme="minorHAnsi"/>
+          <w:rFonts w:cs="Calibri" w:ascii="Calibri" w:hAnsi="Calibri" w:asciiTheme="minorHAnsi" w:cstheme="minorHAnsi" w:hAnsiTheme="minorHAnsi" w:eastAsia="Calibri"/>
           <w:sz w:val="18"/>
           <w:szCs w:val="18"/>
         </w:rPr>
@@ -8974,7 +8974,7 @@
       </w:pPr>
       <w:r>
         <w:rPr>
-          <w:rFonts w:cs="Calibri" w:ascii="Calibri" w:hAnsi="Calibri" w:asciiTheme="minorHAnsi" w:cstheme="minorHAnsi" w:hAnsiTheme="minorHAnsi"/>
+          <w:rFonts w:cs="Calibri" w:ascii="Calibri" w:hAnsi="Calibri" w:asciiTheme="minorHAnsi" w:cstheme="minorHAnsi" w:hAnsiTheme="minorHAnsi" w:eastAsia="Calibri"/>
           <w:sz w:val="18"/>
           <w:szCs w:val="18"/>
         </w:rPr>
@@ -8998,7 +8998,7 @@
       </w:pPr>
       <w:r>
         <w:rPr>
-          <w:rFonts w:cs="Calibri" w:ascii="Calibri" w:hAnsi="Calibri" w:asciiTheme="minorHAnsi" w:cstheme="minorHAnsi" w:hAnsiTheme="minorHAnsi"/>
+          <w:rFonts w:cs="Calibri" w:ascii="Calibri" w:hAnsi="Calibri" w:asciiTheme="minorHAnsi" w:cstheme="minorHAnsi" w:hAnsiTheme="minorHAnsi" w:eastAsia="Calibri"/>
           <w:sz w:val="18"/>
           <w:szCs w:val="18"/>
         </w:rPr>
@@ -9022,7 +9022,7 @@
       </w:pPr>
       <w:r>
         <w:rPr>
-          <w:rFonts w:cs="Calibri" w:ascii="Calibri" w:hAnsi="Calibri" w:asciiTheme="minorHAnsi" w:cstheme="minorHAnsi" w:hAnsiTheme="minorHAnsi"/>
+          <w:rFonts w:cs="Calibri" w:ascii="Calibri" w:hAnsi="Calibri" w:asciiTheme="minorHAnsi" w:cstheme="minorHAnsi" w:hAnsiTheme="minorHAnsi" w:eastAsia="Calibri"/>
           <w:sz w:val="18"/>
           <w:szCs w:val="18"/>
         </w:rPr>
@@ -9046,7 +9046,7 @@
       </w:pPr>
       <w:r>
         <w:rPr>
-          <w:rFonts w:cs="Calibri" w:ascii="Calibri" w:hAnsi="Calibri" w:asciiTheme="minorHAnsi" w:cstheme="minorHAnsi" w:hAnsiTheme="minorHAnsi"/>
+          <w:rFonts w:cs="Calibri" w:ascii="Calibri" w:hAnsi="Calibri" w:asciiTheme="minorHAnsi" w:cstheme="minorHAnsi" w:hAnsiTheme="minorHAnsi" w:eastAsia="Calibri"/>
           <w:sz w:val="18"/>
           <w:szCs w:val="18"/>
         </w:rPr>
@@ -9070,7 +9070,7 @@
       </w:pPr>
       <w:r>
         <w:rPr>
-          <w:rFonts w:cs="Calibri" w:ascii="Calibri" w:hAnsi="Calibri" w:asciiTheme="minorHAnsi" w:cstheme="minorHAnsi" w:hAnsiTheme="minorHAnsi"/>
+          <w:rFonts w:cs="Calibri" w:ascii="Calibri" w:hAnsi="Calibri" w:asciiTheme="minorHAnsi" w:cstheme="minorHAnsi" w:hAnsiTheme="minorHAnsi" w:eastAsia="Calibri"/>
           <w:sz w:val="18"/>
           <w:szCs w:val="18"/>
         </w:rPr>
@@ -9091,7 +9091,7 @@
       </w:pPr>
       <w:r>
         <w:rPr>
-          <w:rFonts w:cs="Calibri" w:ascii="Calibri" w:hAnsi="Calibri" w:asciiTheme="minorHAnsi" w:cstheme="minorHAnsi" w:hAnsiTheme="minorHAnsi"/>
+          <w:rFonts w:cs="Calibri" w:ascii="Calibri" w:hAnsi="Calibri" w:asciiTheme="minorHAnsi" w:cstheme="minorHAnsi" w:hAnsiTheme="minorHAnsi" w:eastAsia="Calibri"/>
           <w:sz w:val="18"/>
           <w:szCs w:val="18"/>
         </w:rPr>
@@ -9115,7 +9115,7 @@
       </w:pPr>
       <w:r>
         <w:rPr>
-          <w:rFonts w:cs="Calibri" w:ascii="Calibri" w:hAnsi="Calibri" w:asciiTheme="minorHAnsi" w:cstheme="minorHAnsi" w:hAnsiTheme="minorHAnsi"/>
+          <w:rFonts w:cs="Calibri" w:ascii="Calibri" w:hAnsi="Calibri" w:asciiTheme="minorHAnsi" w:cstheme="minorHAnsi" w:hAnsiTheme="minorHAnsi" w:eastAsia="Calibri"/>
           <w:sz w:val="18"/>
           <w:szCs w:val="18"/>
         </w:rPr>
@@ -9139,7 +9139,7 @@
       </w:pPr>
       <w:r>
         <w:rPr>
-          <w:rFonts w:cs="Calibri" w:ascii="Calibri" w:hAnsi="Calibri" w:asciiTheme="minorHAnsi" w:cstheme="minorHAnsi" w:hAnsiTheme="minorHAnsi"/>
+          <w:rFonts w:cs="Calibri" w:ascii="Calibri" w:hAnsi="Calibri" w:asciiTheme="minorHAnsi" w:cstheme="minorHAnsi" w:hAnsiTheme="minorHAnsi" w:eastAsia="Calibri"/>
           <w:sz w:val="18"/>
           <w:szCs w:val="18"/>
         </w:rPr>
@@ -9160,7 +9160,7 @@
       </w:pPr>
       <w:r>
         <w:rPr>
-          <w:rFonts w:cs="Calibri" w:ascii="Calibri" w:hAnsi="Calibri" w:asciiTheme="minorHAnsi" w:cstheme="minorHAnsi" w:hAnsiTheme="minorHAnsi"/>
+          <w:rFonts w:cs="Calibri" w:ascii="Calibri" w:hAnsi="Calibri" w:asciiTheme="minorHAnsi" w:cstheme="minorHAnsi" w:hAnsiTheme="minorHAnsi" w:eastAsia="Calibri"/>
           <w:sz w:val="18"/>
           <w:szCs w:val="18"/>
         </w:rPr>
@@ -9429,7 +9429,7 @@
           </w:pPr>
           <w:r>
             <w:rPr>
-              <w:rFonts w:cs="Arial" w:ascii="Verdana" w:hAnsi="Verdana"/>
+              <w:rFonts w:cs="Calibri" w:ascii="Calibri" w:hAnsi="Calibri" w:eastAsia="Calibri"/>
               <w:color w:val="808080"/>
               <w:sz w:val="16"/>
             </w:rPr>
@@ -9462,7 +9462,7 @@
           <w:r>
             <w:rPr>
               <w:sz w:val="16"/>
-              <w:rFonts w:cs="Arial" w:ascii="Verdana" w:hAnsi="Verdana"/>
+              <w:rFonts w:cs="Calibri" w:ascii="Calibri" w:hAnsi="Calibri" w:eastAsia="Calibri"/>
               <w:color w:val="808080"/>
             </w:rPr>
             <w:t>6</w:t>
@@ -9477,7 +9477,7 @@
           </w:r>
           <w:r>
             <w:rPr>
-              <w:rFonts w:cs="Arial" w:ascii="Verdana" w:hAnsi="Verdana"/>
+              <w:rFonts w:cs="Calibri" w:ascii="Calibri" w:hAnsi="Calibri" w:eastAsia="Calibri"/>
               <w:color w:val="808080"/>
               <w:sz w:val="16"/>
             </w:rPr>
@@ -9510,7 +9510,7 @@
           <w:r>
             <w:rPr>
               <w:sz w:val="16"/>
-              <w:rFonts w:cs="Arial" w:ascii="Verdana" w:hAnsi="Verdana"/>
+              <w:rFonts w:cs="Calibri" w:ascii="Calibri" w:hAnsi="Calibri" w:eastAsia="Calibri"/>
               <w:color w:val="808080"/>
             </w:rPr>
             <w:t>6</w:t>
@@ -9589,7 +9589,7 @@
           </w:pPr>
           <w:r>
             <w:rPr>
-              <w:rFonts w:cs="Arial" w:ascii="Verdana" w:hAnsi="Verdana"/>
+              <w:rFonts w:cs="Calibri" w:ascii="Calibri" w:hAnsi="Calibri" w:eastAsia="Calibri"/>
               <w:color w:val="808080"/>
               <w:sz w:val="16"/>
             </w:rPr>
@@ -9622,7 +9622,7 @@
           <w:r>
             <w:rPr>
               <w:sz w:val="16"/>
-              <w:rFonts w:cs="Arial" w:ascii="Verdana" w:hAnsi="Verdana"/>
+              <w:rFonts w:cs="Calibri" w:ascii="Calibri" w:hAnsi="Calibri" w:eastAsia="Calibri"/>
               <w:color w:val="808080"/>
             </w:rPr>
             <w:t>1</w:t>
@@ -9637,7 +9637,7 @@
           </w:r>
           <w:r>
             <w:rPr>
-              <w:rFonts w:cs="Arial" w:ascii="Verdana" w:hAnsi="Verdana"/>
+              <w:rFonts w:cs="Calibri" w:ascii="Calibri" w:hAnsi="Calibri" w:eastAsia="Calibri"/>
               <w:color w:val="808080"/>
               <w:sz w:val="16"/>
             </w:rPr>
@@ -9670,7 +9670,7 @@
           <w:r>
             <w:rPr>
               <w:sz w:val="16"/>
-              <w:rFonts w:cs="Arial" w:ascii="Verdana" w:hAnsi="Verdana"/>
+              <w:rFonts w:cs="Calibri" w:ascii="Calibri" w:hAnsi="Calibri" w:eastAsia="Calibri"/>
               <w:color w:val="808080"/>
             </w:rPr>
             <w:t>6</w:t>

</xml_diff>